<commit_message>
Cahier des charges v2.0 : design du modele client, contenus finaux, 7 services, recette et risques
Co-Authored-By: Claude Sonnet 5.5 <noreply@anthropic.com>
</commit_message>
<xml_diff>
--- a/docs/CAHIER-DES-CHARGES.docx
+++ b/docs/CAHIER-DES-CHARGES.docx
@@ -81,7 +81,7 @@
           <w:sz w:val="21"/>
           <w:szCs w:val="21"/>
         </w:rPr>
-        <w:t xml:space="preserve">Version 1.0</w:t>
+        <w:t xml:space="preserve">Version 2.0</w:t>
       </w:r>
     </w:p>
     <w:p>
@@ -92,7 +92,7 @@
           <w:sz w:val="21"/>
           <w:szCs w:val="21"/>
         </w:rPr>
-        <w:t xml:space="preserve">Date : 8 octobre 2026</w:t>
+        <w:t xml:space="preserve">Date : 12 octobre 2026</w:t>
       </w:r>
     </w:p>
     <w:p>
@@ -503,6 +503,348 @@
       </w:r>
     </w:p>
     <w:p>
+      <w:pPr>
+        <w:pStyle w:val="Heading2"/>
+        <w:keepNext/>
+        <w:spacing w:after="100" w:before="280"/>
+      </w:pPr>
+      <w:r>
+        <w:rPr>
+          <w:rFonts w:ascii="Georgia" w:cs="Georgia" w:eastAsia="Georgia" w:hAnsi="Georgia"/>
+          <w:b/>
+          <w:bCs/>
+          <w:color w:val="0C2646"/>
+          <w:sz w:val="26"/>
+          <w:szCs w:val="26"/>
+        </w:rPr>
+        <w:t xml:space="preserve">Historique du document</w:t>
+      </w:r>
+    </w:p>
+    <w:tbl>
+      <w:tblPr>
+        <w:tblW w:type="dxa" w:w="9360"/>
+        <w:tblBorders>
+          <w:top w:val="single" w:color="auto" w:sz="4"/>
+          <w:left w:val="single" w:color="auto" w:sz="4"/>
+          <w:bottom w:val="single" w:color="auto" w:sz="4"/>
+          <w:right w:val="single" w:color="auto" w:sz="4"/>
+          <w:insideH w:val="single" w:color="auto" w:sz="4"/>
+          <w:insideV w:val="single" w:color="auto" w:sz="4"/>
+        </w:tblBorders>
+      </w:tblPr>
+      <w:tblGrid>
+        <w:gridCol w:w="1100"/>
+        <w:gridCol w:w="1900"/>
+        <w:gridCol w:w="6360"/>
+      </w:tblGrid>
+      <w:tr>
+        <w:trPr>
+          <w:tblHeader/>
+        </w:trPr>
+        <w:tc>
+          <w:tcPr>
+            <w:tcW w:type="dxa" w:w="1100"/>
+            <w:tcBorders>
+              <w:top w:val="single" w:color="C9D4E0" w:sz="4"/>
+              <w:left w:val="single" w:color="C9D4E0" w:sz="4"/>
+              <w:bottom w:val="single" w:color="C9D4E0" w:sz="4"/>
+              <w:right w:val="single" w:color="C9D4E0" w:sz="4"/>
+            </w:tcBorders>
+            <w:shd w:fill="0C2646" w:color="auto" w:val="clear"/>
+            <w:tcMar>
+              <w:top w:type="dxa" w:w="70"/>
+              <w:left w:type="dxa" w:w="110"/>
+              <w:bottom w:type="dxa" w:w="70"/>
+              <w:right w:type="dxa" w:w="110"/>
+            </w:tcMar>
+          </w:tcPr>
+          <w:p>
+            <w:pPr>
+              <w:spacing w:after="30"/>
+            </w:pPr>
+            <w:r>
+              <w:rPr>
+                <w:rFonts w:ascii="Calibri" w:cs="Calibri" w:eastAsia="Calibri" w:hAnsi="Calibri"/>
+                <w:b/>
+                <w:bCs/>
+                <w:color w:val="FFFFFF"/>
+                <w:sz w:val="19"/>
+                <w:szCs w:val="19"/>
+              </w:rPr>
+              <w:t xml:space="preserve">Version</w:t>
+            </w:r>
+          </w:p>
+        </w:tc>
+        <w:tc>
+          <w:tcPr>
+            <w:tcW w:type="dxa" w:w="1900"/>
+            <w:tcBorders>
+              <w:top w:val="single" w:color="C9D4E0" w:sz="4"/>
+              <w:left w:val="single" w:color="C9D4E0" w:sz="4"/>
+              <w:bottom w:val="single" w:color="C9D4E0" w:sz="4"/>
+              <w:right w:val="single" w:color="C9D4E0" w:sz="4"/>
+            </w:tcBorders>
+            <w:shd w:fill="0C2646" w:color="auto" w:val="clear"/>
+            <w:tcMar>
+              <w:top w:type="dxa" w:w="70"/>
+              <w:left w:type="dxa" w:w="110"/>
+              <w:bottom w:type="dxa" w:w="70"/>
+              <w:right w:type="dxa" w:w="110"/>
+            </w:tcMar>
+          </w:tcPr>
+          <w:p>
+            <w:pPr>
+              <w:spacing w:after="30"/>
+            </w:pPr>
+            <w:r>
+              <w:rPr>
+                <w:rFonts w:ascii="Calibri" w:cs="Calibri" w:eastAsia="Calibri" w:hAnsi="Calibri"/>
+                <w:b/>
+                <w:bCs/>
+                <w:color w:val="FFFFFF"/>
+                <w:sz w:val="19"/>
+                <w:szCs w:val="19"/>
+              </w:rPr>
+              <w:t xml:space="preserve">Date</w:t>
+            </w:r>
+          </w:p>
+        </w:tc>
+        <w:tc>
+          <w:tcPr>
+            <w:tcW w:type="dxa" w:w="6360"/>
+            <w:tcBorders>
+              <w:top w:val="single" w:color="C9D4E0" w:sz="4"/>
+              <w:left w:val="single" w:color="C9D4E0" w:sz="4"/>
+              <w:bottom w:val="single" w:color="C9D4E0" w:sz="4"/>
+              <w:right w:val="single" w:color="C9D4E0" w:sz="4"/>
+            </w:tcBorders>
+            <w:shd w:fill="0C2646" w:color="auto" w:val="clear"/>
+            <w:tcMar>
+              <w:top w:type="dxa" w:w="70"/>
+              <w:left w:type="dxa" w:w="110"/>
+              <w:bottom w:type="dxa" w:w="70"/>
+              <w:right w:type="dxa" w:w="110"/>
+            </w:tcMar>
+          </w:tcPr>
+          <w:p>
+            <w:pPr>
+              <w:spacing w:after="30"/>
+            </w:pPr>
+            <w:r>
+              <w:rPr>
+                <w:rFonts w:ascii="Calibri" w:cs="Calibri" w:eastAsia="Calibri" w:hAnsi="Calibri"/>
+                <w:b/>
+                <w:bCs/>
+                <w:color w:val="FFFFFF"/>
+                <w:sz w:val="19"/>
+                <w:szCs w:val="19"/>
+              </w:rPr>
+              <w:t xml:space="preserve">Évolutions</w:t>
+            </w:r>
+          </w:p>
+        </w:tc>
+      </w:tr>
+      <w:tr>
+        <w:trPr>
+          <w:cantSplit/>
+        </w:trPr>
+        <w:tc>
+          <w:tcPr>
+            <w:tcW w:type="dxa" w:w="1100"/>
+            <w:tcBorders>
+              <w:top w:val="single" w:color="C9D4E0" w:sz="4"/>
+              <w:left w:val="single" w:color="C9D4E0" w:sz="4"/>
+              <w:bottom w:val="single" w:color="C9D4E0" w:sz="4"/>
+              <w:right w:val="single" w:color="C9D4E0" w:sz="4"/>
+            </w:tcBorders>
+            <w:tcMar>
+              <w:top w:type="dxa" w:w="70"/>
+              <w:left w:type="dxa" w:w="110"/>
+              <w:bottom w:type="dxa" w:w="70"/>
+              <w:right w:type="dxa" w:w="110"/>
+            </w:tcMar>
+          </w:tcPr>
+          <w:p>
+            <w:pPr>
+              <w:spacing w:after="30"/>
+            </w:pPr>
+            <w:r>
+              <w:rPr>
+                <w:rFonts w:ascii="Calibri" w:cs="Calibri" w:eastAsia="Calibri" w:hAnsi="Calibri"/>
+                <w:color w:val="222B36"/>
+                <w:sz w:val="19"/>
+                <w:szCs w:val="19"/>
+              </w:rPr>
+              <w:t xml:space="preserve">1.0</w:t>
+            </w:r>
+          </w:p>
+        </w:tc>
+        <w:tc>
+          <w:tcPr>
+            <w:tcW w:type="dxa" w:w="1900"/>
+            <w:tcBorders>
+              <w:top w:val="single" w:color="C9D4E0" w:sz="4"/>
+              <w:left w:val="single" w:color="C9D4E0" w:sz="4"/>
+              <w:bottom w:val="single" w:color="C9D4E0" w:sz="4"/>
+              <w:right w:val="single" w:color="C9D4E0" w:sz="4"/>
+            </w:tcBorders>
+            <w:tcMar>
+              <w:top w:type="dxa" w:w="70"/>
+              <w:left w:type="dxa" w:w="110"/>
+              <w:bottom w:type="dxa" w:w="70"/>
+              <w:right w:type="dxa" w:w="110"/>
+            </w:tcMar>
+          </w:tcPr>
+          <w:p>
+            <w:pPr>
+              <w:spacing w:after="30"/>
+            </w:pPr>
+            <w:r>
+              <w:rPr>
+                <w:rFonts w:ascii="Calibri" w:cs="Calibri" w:eastAsia="Calibri" w:hAnsi="Calibri"/>
+                <w:color w:val="222B36"/>
+                <w:sz w:val="19"/>
+                <w:szCs w:val="19"/>
+              </w:rPr>
+              <w:t xml:space="preserve">8 octobre 2026</w:t>
+            </w:r>
+          </w:p>
+        </w:tc>
+        <w:tc>
+          <w:tcPr>
+            <w:tcW w:type="dxa" w:w="6360"/>
+            <w:tcBorders>
+              <w:top w:val="single" w:color="C9D4E0" w:sz="4"/>
+              <w:left w:val="single" w:color="C9D4E0" w:sz="4"/>
+              <w:bottom w:val="single" w:color="C9D4E0" w:sz="4"/>
+              <w:right w:val="single" w:color="C9D4E0" w:sz="4"/>
+            </w:tcBorders>
+            <w:tcMar>
+              <w:top w:type="dxa" w:w="70"/>
+              <w:left w:type="dxa" w:w="110"/>
+              <w:bottom w:type="dxa" w:w="70"/>
+              <w:right w:type="dxa" w:w="110"/>
+            </w:tcMar>
+          </w:tcPr>
+          <w:p>
+            <w:pPr>
+              <w:spacing w:after="30"/>
+            </w:pPr>
+            <w:r>
+              <w:rPr>
+                <w:rFonts w:ascii="Calibri" w:cs="Calibri" w:eastAsia="Calibri" w:hAnsi="Calibri"/>
+                <w:color w:val="222B36"/>
+                <w:sz w:val="19"/>
+                <w:szCs w:val="19"/>
+              </w:rPr>
+              <w:t xml:space="preserve">Version initiale : périmètre, pages, exigences, charte, planning, recette</w:t>
+            </w:r>
+          </w:p>
+        </w:tc>
+      </w:tr>
+      <w:tr>
+        <w:trPr>
+          <w:cantSplit/>
+        </w:trPr>
+        <w:tc>
+          <w:tcPr>
+            <w:tcW w:type="dxa" w:w="1100"/>
+            <w:tcBorders>
+              <w:top w:val="single" w:color="C9D4E0" w:sz="4"/>
+              <w:left w:val="single" w:color="C9D4E0" w:sz="4"/>
+              <w:bottom w:val="single" w:color="C9D4E0" w:sz="4"/>
+              <w:right w:val="single" w:color="C9D4E0" w:sz="4"/>
+            </w:tcBorders>
+            <w:shd w:fill="EEF2F7" w:color="auto" w:val="clear"/>
+            <w:tcMar>
+              <w:top w:type="dxa" w:w="70"/>
+              <w:left w:type="dxa" w:w="110"/>
+              <w:bottom w:type="dxa" w:w="70"/>
+              <w:right w:type="dxa" w:w="110"/>
+            </w:tcMar>
+          </w:tcPr>
+          <w:p>
+            <w:pPr>
+              <w:spacing w:after="30"/>
+            </w:pPr>
+            <w:r>
+              <w:rPr>
+                <w:rFonts w:ascii="Calibri" w:cs="Calibri" w:eastAsia="Calibri" w:hAnsi="Calibri"/>
+                <w:color w:val="222B36"/>
+                <w:sz w:val="19"/>
+                <w:szCs w:val="19"/>
+              </w:rPr>
+              <w:t xml:space="preserve">2.0</w:t>
+            </w:r>
+          </w:p>
+        </w:tc>
+        <w:tc>
+          <w:tcPr>
+            <w:tcW w:type="dxa" w:w="1900"/>
+            <w:tcBorders>
+              <w:top w:val="single" w:color="C9D4E0" w:sz="4"/>
+              <w:left w:val="single" w:color="C9D4E0" w:sz="4"/>
+              <w:bottom w:val="single" w:color="C9D4E0" w:sz="4"/>
+              <w:right w:val="single" w:color="C9D4E0" w:sz="4"/>
+            </w:tcBorders>
+            <w:shd w:fill="EEF2F7" w:color="auto" w:val="clear"/>
+            <w:tcMar>
+              <w:top w:type="dxa" w:w="70"/>
+              <w:left w:type="dxa" w:w="110"/>
+              <w:bottom w:type="dxa" w:w="70"/>
+              <w:right w:type="dxa" w:w="110"/>
+            </w:tcMar>
+          </w:tcPr>
+          <w:p>
+            <w:pPr>
+              <w:spacing w:after="30"/>
+            </w:pPr>
+            <w:r>
+              <w:rPr>
+                <w:rFonts w:ascii="Calibri" w:cs="Calibri" w:eastAsia="Calibri" w:hAnsi="Calibri"/>
+                <w:color w:val="222B36"/>
+                <w:sz w:val="19"/>
+                <w:szCs w:val="19"/>
+              </w:rPr>
+              <w:t xml:space="preserve">12 octobre 2026</w:t>
+            </w:r>
+          </w:p>
+        </w:tc>
+        <w:tc>
+          <w:tcPr>
+            <w:tcW w:type="dxa" w:w="6360"/>
+            <w:tcBorders>
+              <w:top w:val="single" w:color="C9D4E0" w:sz="4"/>
+              <w:left w:val="single" w:color="C9D4E0" w:sz="4"/>
+              <w:bottom w:val="single" w:color="C9D4E0" w:sz="4"/>
+              <w:right w:val="single" w:color="C9D4E0" w:sz="4"/>
+            </w:tcBorders>
+            <w:shd w:fill="EEF2F7" w:color="auto" w:val="clear"/>
+            <w:tcMar>
+              <w:top w:type="dxa" w:w="70"/>
+              <w:left w:type="dxa" w:w="110"/>
+              <w:bottom w:type="dxa" w:w="70"/>
+              <w:right w:type="dxa" w:w="110"/>
+            </w:tcMar>
+          </w:tcPr>
+          <w:p>
+            <w:pPr>
+              <w:spacing w:after="30"/>
+            </w:pPr>
+            <w:r>
+              <w:rPr>
+                <w:rFonts w:ascii="Calibri" w:cs="Calibri" w:eastAsia="Calibri" w:hAnsi="Calibri"/>
+                <w:color w:val="222B36"/>
+                <w:sz w:val="19"/>
+                <w:szCs w:val="19"/>
+              </w:rPr>
+              <w:t xml:space="preserve">Nouveau design d'après le modèle validé par le client (hero sombre, mosaïque de services numérotés, bloc clair, pied de page clair, accent bleu acier sans doré). Contenus finaux du client : slogan « Beyond Transportation », accroche, trois valeurs, sept services avec leurs boutons, page À propos. Nouveaux champs de service dans l'administration.</w:t>
+            </w:r>
+          </w:p>
+        </w:tc>
+      </w:tr>
+    </w:tbl>
+    <w:p>
       <w:r>
         <w:br w:type="page"/>
       </w:r>
@@ -555,7 +897,7 @@
           <w:sz w:val="21"/>
           <w:szCs w:val="21"/>
         </w:rPr>
-        <w:t xml:space="preserve">TS EXCLUSIVE est une entreprise de mobilité privée et professionnelle avec chauffeur, basée à Antananarivo (Madagascar). Elle accompagne des dirigeants, des entreprises, des organisations internationales, des hôtels et des voyageurs exigeants dans leurs déplacements : transferts aéroport, mise à disposition de véhicules avec chauffeur, mobilité corporate, événements et délégations, tourisme et conciergerie.</w:t>
+        <w:t xml:space="preserve">TS EXCLUSIVE est une entreprise de mobilité privée et professionnelle avec chauffeur, basée à Antananarivo (Madagascar). Elle accompagne des dirigeants, des entreprises, des organisations internationales, des hôtels et des voyageurs exigeants dans leurs déplacements : transferts aéroportuaires, mobilité exécutive, solutions pour entreprises, mobilité événementielle et protocole, mise à disposition de véhicules avec chauffeur, voyage privé et conciergerie privée VIP.</w:t>
       </w:r>
     </w:p>
     <w:p>
@@ -778,7 +1120,7 @@
                 <w:sz w:val="19"/>
                 <w:szCs w:val="19"/>
               </w:rPr>
-              <w:t xml:space="preserve">Signature</w:t>
+              <w:t xml:space="preserve">Slogan</w:t>
             </w:r>
           </w:p>
         </w:tc>
@@ -810,7 +1152,7 @@
                 <w:sz w:val="19"/>
                 <w:szCs w:val="19"/>
               </w:rPr>
-              <w:t xml:space="preserve">« More than a ride. »</w:t>
+              <w:t xml:space="preserve">« Beyond Transportation »</w:t>
             </w:r>
           </w:p>
         </w:tc>
@@ -2912,6 +3254,858 @@
           <w:szCs w:val="21"/>
         </w:rPr>
         <w:t xml:space="preserve">Les capacités en passagers et en bagages sont des valeurs de départ à confirmer par l'entreprise ; elles sont modifiables à tout moment dans l'espace d'administration.</w:t>
+      </w:r>
+    </w:p>
+    <w:p>
+      <w:pPr>
+        <w:pStyle w:val="Heading2"/>
+        <w:keepNext/>
+        <w:spacing w:after="100" w:before="280"/>
+      </w:pPr>
+      <w:r>
+        <w:rPr>
+          <w:rFonts w:ascii="Georgia" w:cs="Georgia" w:eastAsia="Georgia" w:hAnsi="Georgia"/>
+          <w:b/>
+          <w:bCs/>
+          <w:color w:val="0C2646"/>
+          <w:sz w:val="26"/>
+          <w:szCs w:val="26"/>
+        </w:rPr>
+        <w:t xml:space="preserve">1.5 Services (source : contenus finaux du client)</w:t>
+      </w:r>
+    </w:p>
+    <w:tbl>
+      <w:tblPr>
+        <w:tblW w:type="dxa" w:w="9360"/>
+        <w:tblBorders>
+          <w:top w:val="single" w:color="auto" w:sz="4"/>
+          <w:left w:val="single" w:color="auto" w:sz="4"/>
+          <w:bottom w:val="single" w:color="auto" w:sz="4"/>
+          <w:right w:val="single" w:color="auto" w:sz="4"/>
+          <w:insideH w:val="single" w:color="auto" w:sz="4"/>
+          <w:insideV w:val="single" w:color="auto" w:sz="4"/>
+        </w:tblBorders>
+      </w:tblPr>
+      <w:tblGrid>
+        <w:gridCol w:w="3300"/>
+        <w:gridCol w:w="3700"/>
+        <w:gridCol w:w="2360"/>
+      </w:tblGrid>
+      <w:tr>
+        <w:trPr>
+          <w:tblHeader/>
+        </w:trPr>
+        <w:tc>
+          <w:tcPr>
+            <w:tcW w:type="dxa" w:w="3300"/>
+            <w:tcBorders>
+              <w:top w:val="single" w:color="C9D4E0" w:sz="4"/>
+              <w:left w:val="single" w:color="C9D4E0" w:sz="4"/>
+              <w:bottom w:val="single" w:color="C9D4E0" w:sz="4"/>
+              <w:right w:val="single" w:color="C9D4E0" w:sz="4"/>
+            </w:tcBorders>
+            <w:shd w:fill="0C2646" w:color="auto" w:val="clear"/>
+            <w:tcMar>
+              <w:top w:type="dxa" w:w="70"/>
+              <w:left w:type="dxa" w:w="110"/>
+              <w:bottom w:type="dxa" w:w="70"/>
+              <w:right w:type="dxa" w:w="110"/>
+            </w:tcMar>
+          </w:tcPr>
+          <w:p>
+            <w:pPr>
+              <w:spacing w:after="30"/>
+            </w:pPr>
+            <w:r>
+              <w:rPr>
+                <w:rFonts w:ascii="Calibri" w:cs="Calibri" w:eastAsia="Calibri" w:hAnsi="Calibri"/>
+                <w:b/>
+                <w:bCs/>
+                <w:color w:val="FFFFFF"/>
+                <w:sz w:val="19"/>
+                <w:szCs w:val="19"/>
+              </w:rPr>
+              <w:t xml:space="preserve">Service</w:t>
+            </w:r>
+          </w:p>
+        </w:tc>
+        <w:tc>
+          <w:tcPr>
+            <w:tcW w:type="dxa" w:w="3700"/>
+            <w:tcBorders>
+              <w:top w:val="single" w:color="C9D4E0" w:sz="4"/>
+              <w:left w:val="single" w:color="C9D4E0" w:sz="4"/>
+              <w:bottom w:val="single" w:color="C9D4E0" w:sz="4"/>
+              <w:right w:val="single" w:color="C9D4E0" w:sz="4"/>
+            </w:tcBorders>
+            <w:shd w:fill="0C2646" w:color="auto" w:val="clear"/>
+            <w:tcMar>
+              <w:top w:type="dxa" w:w="70"/>
+              <w:left w:type="dxa" w:w="110"/>
+              <w:bottom w:type="dxa" w:w="70"/>
+              <w:right w:type="dxa" w:w="110"/>
+            </w:tcMar>
+          </w:tcPr>
+          <w:p>
+            <w:pPr>
+              <w:spacing w:after="30"/>
+            </w:pPr>
+            <w:r>
+              <w:rPr>
+                <w:rFonts w:ascii="Calibri" w:cs="Calibri" w:eastAsia="Calibri" w:hAnsi="Calibri"/>
+                <w:b/>
+                <w:bCs/>
+                <w:color w:val="FFFFFF"/>
+                <w:sz w:val="19"/>
+                <w:szCs w:val="19"/>
+              </w:rPr>
+              <w:t xml:space="preserve">Promesse</w:t>
+            </w:r>
+          </w:p>
+        </w:tc>
+        <w:tc>
+          <w:tcPr>
+            <w:tcW w:type="dxa" w:w="2360"/>
+            <w:tcBorders>
+              <w:top w:val="single" w:color="C9D4E0" w:sz="4"/>
+              <w:left w:val="single" w:color="C9D4E0" w:sz="4"/>
+              <w:bottom w:val="single" w:color="C9D4E0" w:sz="4"/>
+              <w:right w:val="single" w:color="C9D4E0" w:sz="4"/>
+            </w:tcBorders>
+            <w:shd w:fill="0C2646" w:color="auto" w:val="clear"/>
+            <w:tcMar>
+              <w:top w:type="dxa" w:w="70"/>
+              <w:left w:type="dxa" w:w="110"/>
+              <w:bottom w:type="dxa" w:w="70"/>
+              <w:right w:type="dxa" w:w="110"/>
+            </w:tcMar>
+          </w:tcPr>
+          <w:p>
+            <w:pPr>
+              <w:spacing w:after="30"/>
+            </w:pPr>
+            <w:r>
+              <w:rPr>
+                <w:rFonts w:ascii="Calibri" w:cs="Calibri" w:eastAsia="Calibri" w:hAnsi="Calibri"/>
+                <w:b/>
+                <w:bCs/>
+                <w:color w:val="FFFFFF"/>
+                <w:sz w:val="19"/>
+                <w:szCs w:val="19"/>
+              </w:rPr>
+              <w:t xml:space="preserve">Bouton d'action</w:t>
+            </w:r>
+          </w:p>
+        </w:tc>
+      </w:tr>
+      <w:tr>
+        <w:trPr>
+          <w:cantSplit/>
+        </w:trPr>
+        <w:tc>
+          <w:tcPr>
+            <w:tcW w:type="dxa" w:w="3300"/>
+            <w:tcBorders>
+              <w:top w:val="single" w:color="C9D4E0" w:sz="4"/>
+              <w:left w:val="single" w:color="C9D4E0" w:sz="4"/>
+              <w:bottom w:val="single" w:color="C9D4E0" w:sz="4"/>
+              <w:right w:val="single" w:color="C9D4E0" w:sz="4"/>
+            </w:tcBorders>
+            <w:tcMar>
+              <w:top w:type="dxa" w:w="70"/>
+              <w:left w:type="dxa" w:w="110"/>
+              <w:bottom w:type="dxa" w:w="70"/>
+              <w:right w:type="dxa" w:w="110"/>
+            </w:tcMar>
+          </w:tcPr>
+          <w:p>
+            <w:pPr>
+              <w:spacing w:after="30"/>
+            </w:pPr>
+            <w:r>
+              <w:rPr>
+                <w:rFonts w:ascii="Calibri" w:cs="Calibri" w:eastAsia="Calibri" w:hAnsi="Calibri"/>
+                <w:color w:val="222B36"/>
+                <w:sz w:val="19"/>
+                <w:szCs w:val="19"/>
+              </w:rPr>
+              <w:t xml:space="preserve">01 Transferts Aéroportuaires</w:t>
+            </w:r>
+          </w:p>
+        </w:tc>
+        <w:tc>
+          <w:tcPr>
+            <w:tcW w:type="dxa" w:w="3700"/>
+            <w:tcBorders>
+              <w:top w:val="single" w:color="C9D4E0" w:sz="4"/>
+              <w:left w:val="single" w:color="C9D4E0" w:sz="4"/>
+              <w:bottom w:val="single" w:color="C9D4E0" w:sz="4"/>
+              <w:right w:val="single" w:color="C9D4E0" w:sz="4"/>
+            </w:tcBorders>
+            <w:tcMar>
+              <w:top w:type="dxa" w:w="70"/>
+              <w:left w:type="dxa" w:w="110"/>
+              <w:bottom w:type="dxa" w:w="70"/>
+              <w:right w:type="dxa" w:w="110"/>
+            </w:tcMar>
+          </w:tcPr>
+          <w:p>
+            <w:pPr>
+              <w:spacing w:after="30"/>
+            </w:pPr>
+            <w:r>
+              <w:rPr>
+                <w:rFonts w:ascii="Calibri" w:cs="Calibri" w:eastAsia="Calibri" w:hAnsi="Calibri"/>
+                <w:color w:val="222B36"/>
+                <w:sz w:val="19"/>
+                <w:szCs w:val="19"/>
+              </w:rPr>
+              <w:t xml:space="preserve">Votre arrivée, orchestrée avec soin.</w:t>
+            </w:r>
+          </w:p>
+        </w:tc>
+        <w:tc>
+          <w:tcPr>
+            <w:tcW w:type="dxa" w:w="2360"/>
+            <w:tcBorders>
+              <w:top w:val="single" w:color="C9D4E0" w:sz="4"/>
+              <w:left w:val="single" w:color="C9D4E0" w:sz="4"/>
+              <w:bottom w:val="single" w:color="C9D4E0" w:sz="4"/>
+              <w:right w:val="single" w:color="C9D4E0" w:sz="4"/>
+            </w:tcBorders>
+            <w:tcMar>
+              <w:top w:type="dxa" w:w="70"/>
+              <w:left w:type="dxa" w:w="110"/>
+              <w:bottom w:type="dxa" w:w="70"/>
+              <w:right w:type="dxa" w:w="110"/>
+            </w:tcMar>
+          </w:tcPr>
+          <w:p>
+            <w:pPr>
+              <w:spacing w:after="30"/>
+            </w:pPr>
+            <w:r>
+              <w:rPr>
+                <w:rFonts w:ascii="Calibri" w:cs="Calibri" w:eastAsia="Calibri" w:hAnsi="Calibri"/>
+                <w:color w:val="222B36"/>
+                <w:sz w:val="19"/>
+                <w:szCs w:val="19"/>
+              </w:rPr>
+              <w:t xml:space="preserve">Organiser mon transfert</w:t>
+            </w:r>
+          </w:p>
+        </w:tc>
+      </w:tr>
+      <w:tr>
+        <w:trPr>
+          <w:cantSplit/>
+        </w:trPr>
+        <w:tc>
+          <w:tcPr>
+            <w:tcW w:type="dxa" w:w="3300"/>
+            <w:tcBorders>
+              <w:top w:val="single" w:color="C9D4E0" w:sz="4"/>
+              <w:left w:val="single" w:color="C9D4E0" w:sz="4"/>
+              <w:bottom w:val="single" w:color="C9D4E0" w:sz="4"/>
+              <w:right w:val="single" w:color="C9D4E0" w:sz="4"/>
+            </w:tcBorders>
+            <w:shd w:fill="EEF2F7" w:color="auto" w:val="clear"/>
+            <w:tcMar>
+              <w:top w:type="dxa" w:w="70"/>
+              <w:left w:type="dxa" w:w="110"/>
+              <w:bottom w:type="dxa" w:w="70"/>
+              <w:right w:type="dxa" w:w="110"/>
+            </w:tcMar>
+          </w:tcPr>
+          <w:p>
+            <w:pPr>
+              <w:spacing w:after="30"/>
+            </w:pPr>
+            <w:r>
+              <w:rPr>
+                <w:rFonts w:ascii="Calibri" w:cs="Calibri" w:eastAsia="Calibri" w:hAnsi="Calibri"/>
+                <w:color w:val="222B36"/>
+                <w:sz w:val="19"/>
+                <w:szCs w:val="19"/>
+              </w:rPr>
+              <w:t xml:space="preserve">02 Mobilité Exécutive</w:t>
+            </w:r>
+          </w:p>
+        </w:tc>
+        <w:tc>
+          <w:tcPr>
+            <w:tcW w:type="dxa" w:w="3700"/>
+            <w:tcBorders>
+              <w:top w:val="single" w:color="C9D4E0" w:sz="4"/>
+              <w:left w:val="single" w:color="C9D4E0" w:sz="4"/>
+              <w:bottom w:val="single" w:color="C9D4E0" w:sz="4"/>
+              <w:right w:val="single" w:color="C9D4E0" w:sz="4"/>
+            </w:tcBorders>
+            <w:shd w:fill="EEF2F7" w:color="auto" w:val="clear"/>
+            <w:tcMar>
+              <w:top w:type="dxa" w:w="70"/>
+              <w:left w:type="dxa" w:w="110"/>
+              <w:bottom w:type="dxa" w:w="70"/>
+              <w:right w:type="dxa" w:w="110"/>
+            </w:tcMar>
+          </w:tcPr>
+          <w:p>
+            <w:pPr>
+              <w:spacing w:after="30"/>
+            </w:pPr>
+            <w:r>
+              <w:rPr>
+                <w:rFonts w:ascii="Calibri" w:cs="Calibri" w:eastAsia="Calibri" w:hAnsi="Calibri"/>
+                <w:color w:val="222B36"/>
+                <w:sz w:val="19"/>
+                <w:szCs w:val="19"/>
+              </w:rPr>
+              <w:t xml:space="preserve">La mobilité au service de vos exigences.</w:t>
+            </w:r>
+          </w:p>
+        </w:tc>
+        <w:tc>
+          <w:tcPr>
+            <w:tcW w:type="dxa" w:w="2360"/>
+            <w:tcBorders>
+              <w:top w:val="single" w:color="C9D4E0" w:sz="4"/>
+              <w:left w:val="single" w:color="C9D4E0" w:sz="4"/>
+              <w:bottom w:val="single" w:color="C9D4E0" w:sz="4"/>
+              <w:right w:val="single" w:color="C9D4E0" w:sz="4"/>
+            </w:tcBorders>
+            <w:shd w:fill="EEF2F7" w:color="auto" w:val="clear"/>
+            <w:tcMar>
+              <w:top w:type="dxa" w:w="70"/>
+              <w:left w:type="dxa" w:w="110"/>
+              <w:bottom w:type="dxa" w:w="70"/>
+              <w:right w:type="dxa" w:w="110"/>
+            </w:tcMar>
+          </w:tcPr>
+          <w:p>
+            <w:pPr>
+              <w:spacing w:after="30"/>
+            </w:pPr>
+            <w:r>
+              <w:rPr>
+                <w:rFonts w:ascii="Calibri" w:cs="Calibri" w:eastAsia="Calibri" w:hAnsi="Calibri"/>
+                <w:color w:val="222B36"/>
+                <w:sz w:val="19"/>
+                <w:szCs w:val="19"/>
+              </w:rPr>
+              <w:t xml:space="preserve">Organiser mon arrivée / mes déplacements</w:t>
+            </w:r>
+          </w:p>
+        </w:tc>
+      </w:tr>
+      <w:tr>
+        <w:trPr>
+          <w:cantSplit/>
+        </w:trPr>
+        <w:tc>
+          <w:tcPr>
+            <w:tcW w:type="dxa" w:w="3300"/>
+            <w:tcBorders>
+              <w:top w:val="single" w:color="C9D4E0" w:sz="4"/>
+              <w:left w:val="single" w:color="C9D4E0" w:sz="4"/>
+              <w:bottom w:val="single" w:color="C9D4E0" w:sz="4"/>
+              <w:right w:val="single" w:color="C9D4E0" w:sz="4"/>
+            </w:tcBorders>
+            <w:tcMar>
+              <w:top w:type="dxa" w:w="70"/>
+              <w:left w:type="dxa" w:w="110"/>
+              <w:bottom w:type="dxa" w:w="70"/>
+              <w:right w:type="dxa" w:w="110"/>
+            </w:tcMar>
+          </w:tcPr>
+          <w:p>
+            <w:pPr>
+              <w:spacing w:after="30"/>
+            </w:pPr>
+            <w:r>
+              <w:rPr>
+                <w:rFonts w:ascii="Calibri" w:cs="Calibri" w:eastAsia="Calibri" w:hAnsi="Calibri"/>
+                <w:color w:val="222B36"/>
+                <w:sz w:val="19"/>
+                <w:szCs w:val="19"/>
+              </w:rPr>
+              <w:t xml:space="preserve">03 Solutions de Mobilité pour Entreprises</w:t>
+            </w:r>
+          </w:p>
+        </w:tc>
+        <w:tc>
+          <w:tcPr>
+            <w:tcW w:type="dxa" w:w="3700"/>
+            <w:tcBorders>
+              <w:top w:val="single" w:color="C9D4E0" w:sz="4"/>
+              <w:left w:val="single" w:color="C9D4E0" w:sz="4"/>
+              <w:bottom w:val="single" w:color="C9D4E0" w:sz="4"/>
+              <w:right w:val="single" w:color="C9D4E0" w:sz="4"/>
+            </w:tcBorders>
+            <w:tcMar>
+              <w:top w:type="dxa" w:w="70"/>
+              <w:left w:type="dxa" w:w="110"/>
+              <w:bottom w:type="dxa" w:w="70"/>
+              <w:right w:type="dxa" w:w="110"/>
+            </w:tcMar>
+          </w:tcPr>
+          <w:p>
+            <w:pPr>
+              <w:spacing w:after="30"/>
+            </w:pPr>
+            <w:r>
+              <w:rPr>
+                <w:rFonts w:ascii="Calibri" w:cs="Calibri" w:eastAsia="Calibri" w:hAnsi="Calibri"/>
+                <w:color w:val="222B36"/>
+                <w:sz w:val="19"/>
+                <w:szCs w:val="19"/>
+              </w:rPr>
+              <w:t xml:space="preserve">Un partenaire de mobilité pour votre organisation.</w:t>
+            </w:r>
+          </w:p>
+        </w:tc>
+        <w:tc>
+          <w:tcPr>
+            <w:tcW w:type="dxa" w:w="2360"/>
+            <w:tcBorders>
+              <w:top w:val="single" w:color="C9D4E0" w:sz="4"/>
+              <w:left w:val="single" w:color="C9D4E0" w:sz="4"/>
+              <w:bottom w:val="single" w:color="C9D4E0" w:sz="4"/>
+              <w:right w:val="single" w:color="C9D4E0" w:sz="4"/>
+            </w:tcBorders>
+            <w:tcMar>
+              <w:top w:type="dxa" w:w="70"/>
+              <w:left w:type="dxa" w:w="110"/>
+              <w:bottom w:type="dxa" w:w="70"/>
+              <w:right w:type="dxa" w:w="110"/>
+            </w:tcMar>
+          </w:tcPr>
+          <w:p>
+            <w:pPr>
+              <w:spacing w:after="30"/>
+            </w:pPr>
+            <w:r>
+              <w:rPr>
+                <w:rFonts w:ascii="Calibri" w:cs="Calibri" w:eastAsia="Calibri" w:hAnsi="Calibri"/>
+                <w:color w:val="222B36"/>
+                <w:sz w:val="19"/>
+                <w:szCs w:val="19"/>
+              </w:rPr>
+              <w:t xml:space="preserve">Demander une offre corporate</w:t>
+            </w:r>
+          </w:p>
+        </w:tc>
+      </w:tr>
+      <w:tr>
+        <w:trPr>
+          <w:cantSplit/>
+        </w:trPr>
+        <w:tc>
+          <w:tcPr>
+            <w:tcW w:type="dxa" w:w="3300"/>
+            <w:tcBorders>
+              <w:top w:val="single" w:color="C9D4E0" w:sz="4"/>
+              <w:left w:val="single" w:color="C9D4E0" w:sz="4"/>
+              <w:bottom w:val="single" w:color="C9D4E0" w:sz="4"/>
+              <w:right w:val="single" w:color="C9D4E0" w:sz="4"/>
+            </w:tcBorders>
+            <w:shd w:fill="EEF2F7" w:color="auto" w:val="clear"/>
+            <w:tcMar>
+              <w:top w:type="dxa" w:w="70"/>
+              <w:left w:type="dxa" w:w="110"/>
+              <w:bottom w:type="dxa" w:w="70"/>
+              <w:right w:type="dxa" w:w="110"/>
+            </w:tcMar>
+          </w:tcPr>
+          <w:p>
+            <w:pPr>
+              <w:spacing w:after="30"/>
+            </w:pPr>
+            <w:r>
+              <w:rPr>
+                <w:rFonts w:ascii="Calibri" w:cs="Calibri" w:eastAsia="Calibri" w:hAnsi="Calibri"/>
+                <w:color w:val="222B36"/>
+                <w:sz w:val="19"/>
+                <w:szCs w:val="19"/>
+              </w:rPr>
+              <w:t xml:space="preserve">04 Mobilité Événementielle &amp; Protocole</w:t>
+            </w:r>
+          </w:p>
+        </w:tc>
+        <w:tc>
+          <w:tcPr>
+            <w:tcW w:type="dxa" w:w="3700"/>
+            <w:tcBorders>
+              <w:top w:val="single" w:color="C9D4E0" w:sz="4"/>
+              <w:left w:val="single" w:color="C9D4E0" w:sz="4"/>
+              <w:bottom w:val="single" w:color="C9D4E0" w:sz="4"/>
+              <w:right w:val="single" w:color="C9D4E0" w:sz="4"/>
+            </w:tcBorders>
+            <w:shd w:fill="EEF2F7" w:color="auto" w:val="clear"/>
+            <w:tcMar>
+              <w:top w:type="dxa" w:w="70"/>
+              <w:left w:type="dxa" w:w="110"/>
+              <w:bottom w:type="dxa" w:w="70"/>
+              <w:right w:type="dxa" w:w="110"/>
+            </w:tcMar>
+          </w:tcPr>
+          <w:p>
+            <w:pPr>
+              <w:spacing w:after="30"/>
+            </w:pPr>
+            <w:r>
+              <w:rPr>
+                <w:rFonts w:ascii="Calibri" w:cs="Calibri" w:eastAsia="Calibri" w:hAnsi="Calibri"/>
+                <w:color w:val="222B36"/>
+                <w:sz w:val="19"/>
+                <w:szCs w:val="19"/>
+              </w:rPr>
+              <w:t xml:space="preserve">Au service de vos événements les plus exigeants.</w:t>
+            </w:r>
+          </w:p>
+        </w:tc>
+        <w:tc>
+          <w:tcPr>
+            <w:tcW w:type="dxa" w:w="2360"/>
+            <w:tcBorders>
+              <w:top w:val="single" w:color="C9D4E0" w:sz="4"/>
+              <w:left w:val="single" w:color="C9D4E0" w:sz="4"/>
+              <w:bottom w:val="single" w:color="C9D4E0" w:sz="4"/>
+              <w:right w:val="single" w:color="C9D4E0" w:sz="4"/>
+            </w:tcBorders>
+            <w:shd w:fill="EEF2F7" w:color="auto" w:val="clear"/>
+            <w:tcMar>
+              <w:top w:type="dxa" w:w="70"/>
+              <w:left w:type="dxa" w:w="110"/>
+              <w:bottom w:type="dxa" w:w="70"/>
+              <w:right w:type="dxa" w:w="110"/>
+            </w:tcMar>
+          </w:tcPr>
+          <w:p>
+            <w:pPr>
+              <w:spacing w:after="30"/>
+            </w:pPr>
+            <w:r>
+              <w:rPr>
+                <w:rFonts w:ascii="Calibri" w:cs="Calibri" w:eastAsia="Calibri" w:hAnsi="Calibri"/>
+                <w:color w:val="222B36"/>
+                <w:sz w:val="19"/>
+                <w:szCs w:val="19"/>
+              </w:rPr>
+              <w:t xml:space="preserve">Préparer la mobilité de mon événement</w:t>
+            </w:r>
+          </w:p>
+        </w:tc>
+      </w:tr>
+      <w:tr>
+        <w:trPr>
+          <w:cantSplit/>
+        </w:trPr>
+        <w:tc>
+          <w:tcPr>
+            <w:tcW w:type="dxa" w:w="3300"/>
+            <w:tcBorders>
+              <w:top w:val="single" w:color="C9D4E0" w:sz="4"/>
+              <w:left w:val="single" w:color="C9D4E0" w:sz="4"/>
+              <w:bottom w:val="single" w:color="C9D4E0" w:sz="4"/>
+              <w:right w:val="single" w:color="C9D4E0" w:sz="4"/>
+            </w:tcBorders>
+            <w:tcMar>
+              <w:top w:type="dxa" w:w="70"/>
+              <w:left w:type="dxa" w:w="110"/>
+              <w:bottom w:type="dxa" w:w="70"/>
+              <w:right w:type="dxa" w:w="110"/>
+            </w:tcMar>
+          </w:tcPr>
+          <w:p>
+            <w:pPr>
+              <w:spacing w:after="30"/>
+            </w:pPr>
+            <w:r>
+              <w:rPr>
+                <w:rFonts w:ascii="Calibri" w:cs="Calibri" w:eastAsia="Calibri" w:hAnsi="Calibri"/>
+                <w:color w:val="222B36"/>
+                <w:sz w:val="19"/>
+                <w:szCs w:val="19"/>
+              </w:rPr>
+              <w:t xml:space="preserve">05 Mise à disposition de véhicule</w:t>
+            </w:r>
+          </w:p>
+        </w:tc>
+        <w:tc>
+          <w:tcPr>
+            <w:tcW w:type="dxa" w:w="3700"/>
+            <w:tcBorders>
+              <w:top w:val="single" w:color="C9D4E0" w:sz="4"/>
+              <w:left w:val="single" w:color="C9D4E0" w:sz="4"/>
+              <w:bottom w:val="single" w:color="C9D4E0" w:sz="4"/>
+              <w:right w:val="single" w:color="C9D4E0" w:sz="4"/>
+            </w:tcBorders>
+            <w:tcMar>
+              <w:top w:type="dxa" w:w="70"/>
+              <w:left w:type="dxa" w:w="110"/>
+              <w:bottom w:type="dxa" w:w="70"/>
+              <w:right w:type="dxa" w:w="110"/>
+            </w:tcMar>
+          </w:tcPr>
+          <w:p>
+            <w:pPr>
+              <w:spacing w:after="30"/>
+            </w:pPr>
+            <w:r>
+              <w:rPr>
+                <w:rFonts w:ascii="Calibri" w:cs="Calibri" w:eastAsia="Calibri" w:hAnsi="Calibri"/>
+                <w:color w:val="222B36"/>
+                <w:sz w:val="19"/>
+                <w:szCs w:val="19"/>
+              </w:rPr>
+              <w:t xml:space="preserve">Votre temps, votre programme, votre mobilité.</w:t>
+            </w:r>
+          </w:p>
+        </w:tc>
+        <w:tc>
+          <w:tcPr>
+            <w:tcW w:type="dxa" w:w="2360"/>
+            <w:tcBorders>
+              <w:top w:val="single" w:color="C9D4E0" w:sz="4"/>
+              <w:left w:val="single" w:color="C9D4E0" w:sz="4"/>
+              <w:bottom w:val="single" w:color="C9D4E0" w:sz="4"/>
+              <w:right w:val="single" w:color="C9D4E0" w:sz="4"/>
+            </w:tcBorders>
+            <w:tcMar>
+              <w:top w:type="dxa" w:w="70"/>
+              <w:left w:type="dxa" w:w="110"/>
+              <w:bottom w:type="dxa" w:w="70"/>
+              <w:right w:type="dxa" w:w="110"/>
+            </w:tcMar>
+          </w:tcPr>
+          <w:p>
+            <w:pPr>
+              <w:spacing w:after="30"/>
+            </w:pPr>
+            <w:r>
+              <w:rPr>
+                <w:rFonts w:ascii="Calibri" w:cs="Calibri" w:eastAsia="Calibri" w:hAnsi="Calibri"/>
+                <w:color w:val="222B36"/>
+                <w:sz w:val="19"/>
+                <w:szCs w:val="19"/>
+              </w:rPr>
+              <w:t xml:space="preserve">Choisir ma formule</w:t>
+            </w:r>
+          </w:p>
+        </w:tc>
+      </w:tr>
+      <w:tr>
+        <w:trPr>
+          <w:cantSplit/>
+        </w:trPr>
+        <w:tc>
+          <w:tcPr>
+            <w:tcW w:type="dxa" w:w="3300"/>
+            <w:tcBorders>
+              <w:top w:val="single" w:color="C9D4E0" w:sz="4"/>
+              <w:left w:val="single" w:color="C9D4E0" w:sz="4"/>
+              <w:bottom w:val="single" w:color="C9D4E0" w:sz="4"/>
+              <w:right w:val="single" w:color="C9D4E0" w:sz="4"/>
+            </w:tcBorders>
+            <w:shd w:fill="EEF2F7" w:color="auto" w:val="clear"/>
+            <w:tcMar>
+              <w:top w:type="dxa" w:w="70"/>
+              <w:left w:type="dxa" w:w="110"/>
+              <w:bottom w:type="dxa" w:w="70"/>
+              <w:right w:type="dxa" w:w="110"/>
+            </w:tcMar>
+          </w:tcPr>
+          <w:p>
+            <w:pPr>
+              <w:spacing w:after="30"/>
+            </w:pPr>
+            <w:r>
+              <w:rPr>
+                <w:rFonts w:ascii="Calibri" w:cs="Calibri" w:eastAsia="Calibri" w:hAnsi="Calibri"/>
+                <w:color w:val="222B36"/>
+                <w:sz w:val="19"/>
+                <w:szCs w:val="19"/>
+              </w:rPr>
+              <w:t xml:space="preserve">06 Voyage Privé</w:t>
+            </w:r>
+          </w:p>
+        </w:tc>
+        <w:tc>
+          <w:tcPr>
+            <w:tcW w:type="dxa" w:w="3700"/>
+            <w:tcBorders>
+              <w:top w:val="single" w:color="C9D4E0" w:sz="4"/>
+              <w:left w:val="single" w:color="C9D4E0" w:sz="4"/>
+              <w:bottom w:val="single" w:color="C9D4E0" w:sz="4"/>
+              <w:right w:val="single" w:color="C9D4E0" w:sz="4"/>
+            </w:tcBorders>
+            <w:shd w:fill="EEF2F7" w:color="auto" w:val="clear"/>
+            <w:tcMar>
+              <w:top w:type="dxa" w:w="70"/>
+              <w:left w:type="dxa" w:w="110"/>
+              <w:bottom w:type="dxa" w:w="70"/>
+              <w:right w:type="dxa" w:w="110"/>
+            </w:tcMar>
+          </w:tcPr>
+          <w:p>
+            <w:pPr>
+              <w:spacing w:after="30"/>
+            </w:pPr>
+            <w:r>
+              <w:rPr>
+                <w:rFonts w:ascii="Calibri" w:cs="Calibri" w:eastAsia="Calibri" w:hAnsi="Calibri"/>
+                <w:color w:val="222B36"/>
+                <w:sz w:val="19"/>
+                <w:szCs w:val="19"/>
+              </w:rPr>
+              <w:t xml:space="preserve">Madagascar, à votre rythme et selon vos envies.</w:t>
+            </w:r>
+          </w:p>
+        </w:tc>
+        <w:tc>
+          <w:tcPr>
+            <w:tcW w:type="dxa" w:w="2360"/>
+            <w:tcBorders>
+              <w:top w:val="single" w:color="C9D4E0" w:sz="4"/>
+              <w:left w:val="single" w:color="C9D4E0" w:sz="4"/>
+              <w:bottom w:val="single" w:color="C9D4E0" w:sz="4"/>
+              <w:right w:val="single" w:color="C9D4E0" w:sz="4"/>
+            </w:tcBorders>
+            <w:shd w:fill="EEF2F7" w:color="auto" w:val="clear"/>
+            <w:tcMar>
+              <w:top w:type="dxa" w:w="70"/>
+              <w:left w:type="dxa" w:w="110"/>
+              <w:bottom w:type="dxa" w:w="70"/>
+              <w:right w:type="dxa" w:w="110"/>
+            </w:tcMar>
+          </w:tcPr>
+          <w:p>
+            <w:pPr>
+              <w:spacing w:after="30"/>
+            </w:pPr>
+            <w:r>
+              <w:rPr>
+                <w:rFonts w:ascii="Calibri" w:cs="Calibri" w:eastAsia="Calibri" w:hAnsi="Calibri"/>
+                <w:color w:val="222B36"/>
+                <w:sz w:val="19"/>
+                <w:szCs w:val="19"/>
+              </w:rPr>
+              <w:t xml:space="preserve">Créer mon expérience sur mesure</w:t>
+            </w:r>
+          </w:p>
+        </w:tc>
+      </w:tr>
+      <w:tr>
+        <w:trPr>
+          <w:cantSplit/>
+        </w:trPr>
+        <w:tc>
+          <w:tcPr>
+            <w:tcW w:type="dxa" w:w="3300"/>
+            <w:tcBorders>
+              <w:top w:val="single" w:color="C9D4E0" w:sz="4"/>
+              <w:left w:val="single" w:color="C9D4E0" w:sz="4"/>
+              <w:bottom w:val="single" w:color="C9D4E0" w:sz="4"/>
+              <w:right w:val="single" w:color="C9D4E0" w:sz="4"/>
+            </w:tcBorders>
+            <w:tcMar>
+              <w:top w:type="dxa" w:w="70"/>
+              <w:left w:type="dxa" w:w="110"/>
+              <w:bottom w:type="dxa" w:w="70"/>
+              <w:right w:type="dxa" w:w="110"/>
+            </w:tcMar>
+          </w:tcPr>
+          <w:p>
+            <w:pPr>
+              <w:spacing w:after="30"/>
+            </w:pPr>
+            <w:r>
+              <w:rPr>
+                <w:rFonts w:ascii="Calibri" w:cs="Calibri" w:eastAsia="Calibri" w:hAnsi="Calibri"/>
+                <w:color w:val="222B36"/>
+                <w:sz w:val="19"/>
+                <w:szCs w:val="19"/>
+              </w:rPr>
+              <w:t xml:space="preserve">07 Conciergerie Privée VIP</w:t>
+            </w:r>
+          </w:p>
+        </w:tc>
+        <w:tc>
+          <w:tcPr>
+            <w:tcW w:type="dxa" w:w="3700"/>
+            <w:tcBorders>
+              <w:top w:val="single" w:color="C9D4E0" w:sz="4"/>
+              <w:left w:val="single" w:color="C9D4E0" w:sz="4"/>
+              <w:bottom w:val="single" w:color="C9D4E0" w:sz="4"/>
+              <w:right w:val="single" w:color="C9D4E0" w:sz="4"/>
+            </w:tcBorders>
+            <w:tcMar>
+              <w:top w:type="dxa" w:w="70"/>
+              <w:left w:type="dxa" w:w="110"/>
+              <w:bottom w:type="dxa" w:w="70"/>
+              <w:right w:type="dxa" w:w="110"/>
+            </w:tcMar>
+          </w:tcPr>
+          <w:p>
+            <w:pPr>
+              <w:spacing w:after="30"/>
+            </w:pPr>
+            <w:r>
+              <w:rPr>
+                <w:rFonts w:ascii="Calibri" w:cs="Calibri" w:eastAsia="Calibri" w:hAnsi="Calibri"/>
+                <w:color w:val="222B36"/>
+                <w:sz w:val="19"/>
+                <w:szCs w:val="19"/>
+              </w:rPr>
+              <w:t xml:space="preserve">Des solutions pensées pour vous.</w:t>
+            </w:r>
+          </w:p>
+        </w:tc>
+        <w:tc>
+          <w:tcPr>
+            <w:tcW w:type="dxa" w:w="2360"/>
+            <w:tcBorders>
+              <w:top w:val="single" w:color="C9D4E0" w:sz="4"/>
+              <w:left w:val="single" w:color="C9D4E0" w:sz="4"/>
+              <w:bottom w:val="single" w:color="C9D4E0" w:sz="4"/>
+              <w:right w:val="single" w:color="C9D4E0" w:sz="4"/>
+            </w:tcBorders>
+            <w:tcMar>
+              <w:top w:type="dxa" w:w="70"/>
+              <w:left w:type="dxa" w:w="110"/>
+              <w:bottom w:type="dxa" w:w="70"/>
+              <w:right w:type="dxa" w:w="110"/>
+            </w:tcMar>
+          </w:tcPr>
+          <w:p>
+            <w:pPr>
+              <w:spacing w:after="30"/>
+            </w:pPr>
+            <w:r>
+              <w:rPr>
+                <w:rFonts w:ascii="Calibri" w:cs="Calibri" w:eastAsia="Calibri" w:hAnsi="Calibri"/>
+                <w:color w:val="222B36"/>
+                <w:sz w:val="19"/>
+                <w:szCs w:val="19"/>
+              </w:rPr>
+              <w:t xml:space="preserve">Répondre à mes besoins</w:t>
+            </w:r>
+          </w:p>
+        </w:tc>
+      </w:tr>
+    </w:tbl>
+    <w:p>
+      <w:pPr>
+        <w:spacing w:after="120" w:before="100"/>
+      </w:pPr>
+      <w:r>
+        <w:rPr>
+          <w:rFonts w:ascii="Calibri" w:cs="Calibri" w:eastAsia="Calibri" w:hAnsi="Calibri"/>
+          <w:color w:val="222B36"/>
+          <w:sz w:val="21"/>
+          <w:szCs w:val="21"/>
+        </w:rPr>
+        <w:t xml:space="preserve">Chaque service dispose de sa page avec accroche, texte, liste détaillée, phrase de clôture et bouton. Les textes complets sont ceux du document « contenus Site final » du client et se modifient dans l'administration.</w:t>
       </w:r>
     </w:p>
     <w:p>
@@ -4291,7 +5485,7 @@
           <w:sz w:val="21"/>
           <w:szCs w:val="21"/>
         </w:rPr>
-        <w:t xml:space="preserve">Le visiteur arrive sur l'accueil, comprend en quelques secondes ce que fait l'entreprise (hero, piliers, chiffres clés).</w:t>
+        <w:t xml:space="preserve">Le visiteur arrive sur l'accueil, comprend en quelques secondes ce que fait l'entreprise (hero, slogan, trois valeurs, chiffres clés).</w:t>
       </w:r>
     </w:p>
     <w:p>
@@ -4678,7 +5872,7 @@
           <w:sz w:val="21"/>
           <w:szCs w:val="21"/>
         </w:rPr>
-        <w:t xml:space="preserve">Chaque page existe en français (à la racine) et en anglais (préfixe /en). Le menu plein écran donne accès à toutes les pages ; l'en-tête affiche en permanence Services, Fleet, Expériences, Destinations, le sélecteur de langue, Contact et Menu.</w:t>
+        <w:t xml:space="preserve">Chaque page existe en français (à la racine) et en anglais (préfixe /en). Le menu plein écran donne accès à toutes les pages ; l'en-tête affiche en permanence le logo, le sélecteur de langue, le bouton Demander un devis et le menu burger, avec un filet fin dessous.</w:t>
       </w:r>
     </w:p>
     <w:tbl>
@@ -4964,7 +6158,7 @@
                 <w:sz w:val="19"/>
                 <w:szCs w:val="19"/>
               </w:rPr>
-              <w:t xml:space="preserve">Hero avec voiture, chiffres clés, cinq piliers, introduction, mosaïque de services, flotte, destinations avec carte, parcours The TS Experience, Why TS EXCLUSIVE, partenaires, témoignages, FAQ, appel final</w:t>
+              <w:t xml:space="preserve">Hero (photo de voiture, slogan, lien « Voir les offres », chiffres clés), accroche et trois valeurs, mosaïque des 7 services, bloc clair (flotte à parcourir, à propos, téléphone), destinations avec carte, parcours The TS Experience, Why TS EXCLUSIVE, partenaires, témoignages, FAQ, appel final</w:t>
             </w:r>
           </w:p>
         </w:tc>
@@ -5097,7 +6291,7 @@
                 <w:sz w:val="19"/>
                 <w:szCs w:val="19"/>
               </w:rPr>
-              <w:t xml:space="preserve">Mosaïque numérotée des 6 services, offres et prix de départ</w:t>
+              <w:t xml:space="preserve">Mosaïque numérotée des 7 services, offres et prix de départ</w:t>
             </w:r>
           </w:p>
         </w:tc>
@@ -5226,7 +6420,7 @@
                 <w:sz w:val="19"/>
                 <w:szCs w:val="19"/>
               </w:rPr>
-              <w:t xml:space="preserve">Photo, description, points inclus, parcours Airport Transfer, autres services</w:t>
+              <w:t xml:space="preserve">Photo, accroches, texte, liste détaillée, note, phrase de clôture, bouton propre au service, parcours Airport Transfer, autres services</w:t>
             </w:r>
           </w:p>
         </w:tc>
@@ -6012,7 +7206,7 @@
                 <w:sz w:val="19"/>
                 <w:szCs w:val="19"/>
               </w:rPr>
-              <w:t xml:space="preserve">Cinq exigences, soin des véhicules, Why TS EXCLUSIVE</w:t>
+              <w:t xml:space="preserve">Texte de présentation, engagement, trois valeurs, soin des véhicules</w:t>
             </w:r>
           </w:p>
         </w:tc>
@@ -6747,7 +7941,7 @@
                 <w:sz w:val="19"/>
                 <w:szCs w:val="19"/>
               </w:rPr>
-              <w:t xml:space="preserve">Navigation : en-tête transparent sur la photo puis marine translucide au défilement, menu plein écran avec apparition échelonnée et image au survol des services et destinations, sélecteur FR / EN sur chaque page.</w:t>
+              <w:t xml:space="preserve">Navigation : en-tête minimal (logo, langue, devis, menu burger) avec filet fin, transparent sur la photo puis marine flouté au défilement, menu plein écran avec apparition échelonnée et image au survol des services et destinations, sélecteur FR / EN sur chaque page.</w:t>
             </w:r>
           </w:p>
         </w:tc>
@@ -6847,7 +8041,7 @@
                 <w:sz w:val="19"/>
                 <w:szCs w:val="19"/>
               </w:rPr>
-              <w:t xml:space="preserve">Hero plein écran avec photographie d'une voiture executive, titre « More than a ride. », deux appels à l'action (devis, WhatsApp) et chiffres clés calculés à partir des données réelles (nombre de véhicules, capacité maximale, assistance 24/7, prix de départ).</w:t>
+              <w:t xml:space="preserve">Hero plein écran avec photographie sombre d'une voiture executive teintée marine, slogan « Beyond Transportation » à droite, lien vertical « Voir les offres », deux appels à l'action (devis, WhatsApp) et chiffres clés calculés à partir des données réelles (nombre de véhicules, capacité maximale, assistance 24/7, prix de départ).</w:t>
             </w:r>
           </w:p>
         </w:tc>
@@ -6946,7 +8140,7 @@
                 <w:sz w:val="19"/>
                 <w:szCs w:val="19"/>
               </w:rPr>
-              <w:t xml:space="preserve">Bandeau des cinq piliers : Discrétion, Ponctualité, Confort, Service personnalisé, Fiabilité.</w:t>
+              <w:t xml:space="preserve">Accroche de présentation suivie des trois valeurs : Discrétion, Maîtrise du temps, Attention personnalisée.</w:t>
             </w:r>
           </w:p>
         </w:tc>
@@ -7046,7 +8240,7 @@
                 <w:sz w:val="19"/>
                 <w:szCs w:val="19"/>
               </w:rPr>
-              <w:t xml:space="preserve">Services présentés en mosaïque de tuiles numérotées avec grandes photographies ; chaque service a sa page de détail.</w:t>
+              <w:t xml:space="preserve">Sept services présentés en mosaïque de tuiles numérotées (01 à 07) de couleurs variées, avec photographies ou dessin au trait ; chaque service a sa page de détail.</w:t>
             </w:r>
           </w:p>
         </w:tc>
@@ -7145,7 +8339,7 @@
                 <w:sz w:val="19"/>
                 <w:szCs w:val="19"/>
               </w:rPr>
-              <w:t xml:space="preserve">Flotte présentée comme un catalogue : un véhicule par écran, nom, catégorie, passagers, bagages, bouton de demande de disponibilité qui préremplit le devis ; filtre par catégorie.</w:t>
+              <w:t xml:space="preserve">Flotte présentée comme un catalogue : un véhicule par écran, nom, catégorie, passagers, bagages, bouton de demande de disponibilité qui préremplit le devis ; filtre par catégorie. Sur l'accueil, la tuile « Notre flotte » permet de parcourir les véhicules avec des flèches.</w:t>
             </w:r>
           </w:p>
         </w:tc>
@@ -7973,6 +9167,205 @@
                 <w:szCs w:val="19"/>
               </w:rPr>
               <w:t xml:space="preserve">Moyenne</w:t>
+            </w:r>
+          </w:p>
+        </w:tc>
+      </w:tr>
+      <w:tr>
+        <w:trPr>
+          <w:cantSplit/>
+        </w:trPr>
+        <w:tc>
+          <w:tcPr>
+            <w:tcW w:type="dxa" w:w="900"/>
+            <w:tcBorders>
+              <w:top w:val="single" w:color="C9D4E0" w:sz="4"/>
+              <w:left w:val="single" w:color="C9D4E0" w:sz="4"/>
+              <w:bottom w:val="single" w:color="C9D4E0" w:sz="4"/>
+              <w:right w:val="single" w:color="C9D4E0" w:sz="4"/>
+            </w:tcBorders>
+            <w:shd w:fill="EEF2F7" w:color="auto" w:val="clear"/>
+            <w:tcMar>
+              <w:top w:type="dxa" w:w="70"/>
+              <w:left w:type="dxa" w:w="110"/>
+              <w:bottom w:type="dxa" w:w="70"/>
+              <w:right w:type="dxa" w:w="110"/>
+            </w:tcMar>
+          </w:tcPr>
+          <w:p>
+            <w:pPr>
+              <w:spacing w:after="30"/>
+            </w:pPr>
+            <w:r>
+              <w:rPr>
+                <w:rFonts w:ascii="Calibri" w:cs="Calibri" w:eastAsia="Calibri" w:hAnsi="Calibri"/>
+                <w:color w:val="222B36"/>
+                <w:sz w:val="19"/>
+                <w:szCs w:val="19"/>
+              </w:rPr>
+              <w:t xml:space="preserve">EF-14</w:t>
+            </w:r>
+          </w:p>
+        </w:tc>
+        <w:tc>
+          <w:tcPr>
+            <w:tcW w:type="dxa" w:w="7000"/>
+            <w:tcBorders>
+              <w:top w:val="single" w:color="C9D4E0" w:sz="4"/>
+              <w:left w:val="single" w:color="C9D4E0" w:sz="4"/>
+              <w:bottom w:val="single" w:color="C9D4E0" w:sz="4"/>
+              <w:right w:val="single" w:color="C9D4E0" w:sz="4"/>
+            </w:tcBorders>
+            <w:shd w:fill="EEF2F7" w:color="auto" w:val="clear"/>
+            <w:tcMar>
+              <w:top w:type="dxa" w:w="70"/>
+              <w:left w:type="dxa" w:w="110"/>
+              <w:bottom w:type="dxa" w:w="70"/>
+              <w:right w:type="dxa" w:w="110"/>
+            </w:tcMar>
+          </w:tcPr>
+          <w:p>
+            <w:pPr>
+              <w:spacing w:after="30"/>
+            </w:pPr>
+            <w:r>
+              <w:rPr>
+                <w:rFonts w:ascii="Calibri" w:cs="Calibri" w:eastAsia="Calibri" w:hAnsi="Calibri"/>
+                <w:color w:val="222B36"/>
+                <w:sz w:val="19"/>
+                <w:szCs w:val="19"/>
+              </w:rPr>
+              <w:t xml:space="preserve">Page de service : accroche, deuxième accroche éventuelle, texte en paragraphes, liste titrée (avec sous-textes possibles), note, phrase de clôture et bouton d'action propre au service qui ouvre le devis avec le service déjà coché.</w:t>
+            </w:r>
+          </w:p>
+        </w:tc>
+        <w:tc>
+          <w:tcPr>
+            <w:tcW w:type="dxa" w:w="1460"/>
+            <w:tcBorders>
+              <w:top w:val="single" w:color="C9D4E0" w:sz="4"/>
+              <w:left w:val="single" w:color="C9D4E0" w:sz="4"/>
+              <w:bottom w:val="single" w:color="C9D4E0" w:sz="4"/>
+              <w:right w:val="single" w:color="C9D4E0" w:sz="4"/>
+            </w:tcBorders>
+            <w:shd w:fill="EEF2F7" w:color="auto" w:val="clear"/>
+            <w:tcMar>
+              <w:top w:type="dxa" w:w="70"/>
+              <w:left w:type="dxa" w:w="110"/>
+              <w:bottom w:type="dxa" w:w="70"/>
+              <w:right w:type="dxa" w:w="110"/>
+            </w:tcMar>
+          </w:tcPr>
+          <w:p>
+            <w:pPr>
+              <w:spacing w:after="30"/>
+            </w:pPr>
+            <w:r>
+              <w:rPr>
+                <w:rFonts w:ascii="Calibri" w:cs="Calibri" w:eastAsia="Calibri" w:hAnsi="Calibri"/>
+                <w:color w:val="222B36"/>
+                <w:sz w:val="19"/>
+                <w:szCs w:val="19"/>
+              </w:rPr>
+              <w:t xml:space="preserve">Essentielle</w:t>
+            </w:r>
+          </w:p>
+        </w:tc>
+      </w:tr>
+      <w:tr>
+        <w:trPr>
+          <w:cantSplit/>
+        </w:trPr>
+        <w:tc>
+          <w:tcPr>
+            <w:tcW w:type="dxa" w:w="900"/>
+            <w:tcBorders>
+              <w:top w:val="single" w:color="C9D4E0" w:sz="4"/>
+              <w:left w:val="single" w:color="C9D4E0" w:sz="4"/>
+              <w:bottom w:val="single" w:color="C9D4E0" w:sz="4"/>
+              <w:right w:val="single" w:color="C9D4E0" w:sz="4"/>
+            </w:tcBorders>
+            <w:tcMar>
+              <w:top w:type="dxa" w:w="70"/>
+              <w:left w:type="dxa" w:w="110"/>
+              <w:bottom w:type="dxa" w:w="70"/>
+              <w:right w:type="dxa" w:w="110"/>
+            </w:tcMar>
+          </w:tcPr>
+          <w:p>
+            <w:pPr>
+              <w:spacing w:after="30"/>
+            </w:pPr>
+            <w:r>
+              <w:rPr>
+                <w:rFonts w:ascii="Calibri" w:cs="Calibri" w:eastAsia="Calibri" w:hAnsi="Calibri"/>
+                <w:color w:val="222B36"/>
+                <w:sz w:val="19"/>
+                <w:szCs w:val="19"/>
+              </w:rPr>
+              <w:t xml:space="preserve">EF-15</w:t>
+            </w:r>
+          </w:p>
+        </w:tc>
+        <w:tc>
+          <w:tcPr>
+            <w:tcW w:type="dxa" w:w="7000"/>
+            <w:tcBorders>
+              <w:top w:val="single" w:color="C9D4E0" w:sz="4"/>
+              <w:left w:val="single" w:color="C9D4E0" w:sz="4"/>
+              <w:bottom w:val="single" w:color="C9D4E0" w:sz="4"/>
+              <w:right w:val="single" w:color="C9D4E0" w:sz="4"/>
+            </w:tcBorders>
+            <w:tcMar>
+              <w:top w:type="dxa" w:w="70"/>
+              <w:left w:type="dxa" w:w="110"/>
+              <w:bottom w:type="dxa" w:w="70"/>
+              <w:right w:type="dxa" w:w="110"/>
+            </w:tcMar>
+          </w:tcPr>
+          <w:p>
+            <w:pPr>
+              <w:spacing w:after="30"/>
+            </w:pPr>
+            <w:r>
+              <w:rPr>
+                <w:rFonts w:ascii="Calibri" w:cs="Calibri" w:eastAsia="Calibri" w:hAnsi="Calibri"/>
+                <w:color w:val="222B36"/>
+                <w:sz w:val="19"/>
+                <w:szCs w:val="19"/>
+              </w:rPr>
+              <w:t xml:space="preserve">Page À propos : texte de présentation, engagement de l'entreprise, trois valeurs, soin apporté aux véhicules.</w:t>
+            </w:r>
+          </w:p>
+        </w:tc>
+        <w:tc>
+          <w:tcPr>
+            <w:tcW w:type="dxa" w:w="1460"/>
+            <w:tcBorders>
+              <w:top w:val="single" w:color="C9D4E0" w:sz="4"/>
+              <w:left w:val="single" w:color="C9D4E0" w:sz="4"/>
+              <w:bottom w:val="single" w:color="C9D4E0" w:sz="4"/>
+              <w:right w:val="single" w:color="C9D4E0" w:sz="4"/>
+            </w:tcBorders>
+            <w:tcMar>
+              <w:top w:type="dxa" w:w="70"/>
+              <w:left w:type="dxa" w:w="110"/>
+              <w:bottom w:type="dxa" w:w="70"/>
+              <w:right w:type="dxa" w:w="110"/>
+            </w:tcMar>
+          </w:tcPr>
+          <w:p>
+            <w:pPr>
+              <w:spacing w:after="30"/>
+            </w:pPr>
+            <w:r>
+              <w:rPr>
+                <w:rFonts w:ascii="Calibri" w:cs="Calibri" w:eastAsia="Calibri" w:hAnsi="Calibri"/>
+                <w:color w:val="222B36"/>
+                <w:sz w:val="19"/>
+                <w:szCs w:val="19"/>
+              </w:rPr>
+              <w:t xml:space="preserve">Haute</w:t>
             </w:r>
           </w:p>
         </w:tc>
@@ -8112,6 +9505,25 @@
     </w:p>
     <w:p>
       <w:pPr>
+        <w:pStyle w:val="ListParagraph"/>
+        <w:numPr>
+          <w:ilvl w:val="0"/>
+          <w:numId w:val="2"/>
+        </w:numPr>
+        <w:spacing w:after="70" w:line="280"/>
+      </w:pPr>
+      <w:r>
+        <w:rPr>
+          <w:rFonts w:ascii="Calibri" w:cs="Calibri" w:eastAsia="Calibri" w:hAnsi="Calibri"/>
+          <w:color w:val="222B36"/>
+          <w:sz w:val="21"/>
+          <w:szCs w:val="21"/>
+        </w:rPr>
+        <w:t xml:space="preserve">Le formulaire propose les sept services ; l'adresse /contact?service=identifiant-du-service coche le service concerné.</w:t>
+      </w:r>
+    </w:p>
+    <w:p>
+      <w:pPr>
         <w:pStyle w:val="Heading1"/>
         <w:keepNext/>
         <w:pBdr>
@@ -8499,7 +9911,7 @@
                 <w:sz w:val="19"/>
                 <w:szCs w:val="19"/>
               </w:rPr>
-              <w:t xml:space="preserve">Titre, identifiant, sous-titre, description, points inclus, icône, image ; traduction anglaise</w:t>
+              <w:t xml:space="preserve">Titre, identifiant, accroche, deuxième accroche, texte en paragraphes, titre et points de la liste, note, phrase de clôture, texte du bouton, icône, image ; traduction anglaise de chaque champ</w:t>
             </w:r>
           </w:p>
         </w:tc>
@@ -8907,7 +10319,7 @@
                 <w:sz w:val="19"/>
                 <w:szCs w:val="19"/>
               </w:rPr>
-              <w:t xml:space="preserve">Titres et phrases de l'accueil et sous-titres des pages, en français et en anglais, avec retour au texte d'origine</w:t>
+              <w:t xml:space="preserve">Slogan et accroche de l'accueil, texte de la tuile À propos, titres de sections et sous-titres des pages, en français et en anglais, avec retour au texte d'origine</w:t>
             </w:r>
           </w:p>
         </w:tc>
@@ -9817,7 +11229,7 @@
           <w:sz w:val="21"/>
           <w:szCs w:val="21"/>
         </w:rPr>
-        <w:t xml:space="preserve">Le site doit évoquer l'automobile de luxe, l'édition de mode et l'hôtellerie cinq étoiles, et non un site de transport. Mots d'ordre : moins de texte, plus d'image, plus d'espace, plus d'émotion, plus de précision. La chaleur malgache est présente par petites touches (« Tonga soa », « Misaotra »).</w:t>
+        <w:t xml:space="preserve">Le site doit évoquer l'automobile de luxe, l'édition de mode et l'hôtellerie cinq étoiles, et non un site de transport. Mots d'ordre : moins de texte, plus d'image, plus d'espace, plus d'émotion, plus de précision. La chaleur malgache est présente par petites touches (« Tonga soa », « Misaotra »). Le client a jugé la première version insuffisamment premium et a fourni un modèle de référence : le site le suit fidèlement avec l'identité TS EXCLUSIVE.</w:t>
       </w:r>
     </w:p>
     <w:p>
@@ -9854,7 +11266,7 @@
           <w:sz w:val="21"/>
           <w:szCs w:val="21"/>
         </w:rPr>
-        <w:t xml:space="preserve">Visuel client TS EXCLUSIVE : logo, bleu marine et acier, cinq piliers, carte de Madagascar, forme diagonale.</w:t>
+        <w:t xml:space="preserve">Modèle validé par le client (type « Detailing ») : hero sombre avec titre fin à droite et lien vertical, mosaïque de tuiles numérotées 01 à 05 aux couleurs variées, bloc clair avec tuiles 06 et 07 et cadre téléphone, pied de page clair avec réseaux et signature. Version TS EXCLUSIVE du même modèle fournie par le client.</w:t>
       </w:r>
     </w:p>
     <w:p>
@@ -9873,7 +11285,7 @@
           <w:sz w:val="21"/>
           <w:szCs w:val="21"/>
         </w:rPr>
-        <w:t xml:space="preserve">Modèle Detailing : mosaïque de services numérotés et grands chiffres fins.</w:t>
+        <w:t xml:space="preserve">Visuel client TS EXCLUSIVE : logo, bleu marine et acier, valeurs, carte de Madagascar.</w:t>
       </w:r>
     </w:p>
     <w:p>
@@ -9892,7 +11304,7 @@
           <w:sz w:val="21"/>
           <w:szCs w:val="21"/>
         </w:rPr>
-        <w:t xml:space="preserve">Modèle Tesla : chiffres clés fins séparés par des pointillés, blocs alternés image et texte.</w:t>
+        <w:t xml:space="preserve">Modèle Tesla : chiffres clés fins séparés par des filets.</w:t>
       </w:r>
     </w:p>
     <w:p>
@@ -9911,7 +11323,7 @@
           <w:sz w:val="21"/>
           <w:szCs w:val="21"/>
         </w:rPr>
-        <w:t xml:space="preserve">Brief premium : minimalisme, photographie plein cadre, typographie éditoriale, animations lentes.</w:t>
+        <w:t xml:space="preserve">Consigne du client : ne pas mettre le doré en évidence ; l'accent est le bleu acier.</w:t>
       </w:r>
     </w:p>
     <w:p>
@@ -10083,7 +11495,7 @@
                 <w:sz w:val="19"/>
                 <w:szCs w:val="19"/>
               </w:rPr>
-              <w:t xml:space="preserve">Marine profond #07182E (fonds sombres) · Marine #0C2646 (logo, boutons) · Bleu acier #8AA4BD (accent) · Gris-bleu clair #EEF2F7 (fonds clairs) · Blanc #FFFFFF</w:t>
+              <w:t xml:space="preserve">Marine profond #07182E (fonds sombres) · Marine #0C2646 (logo, boutons) · Bleu acier #4B7096 et #8AA4BD (accent, tuile 01) · Gris-bleu #A7B5C6 (tuile 03) · Gris clair #C9D2DE (tuile 04) · Ardoise #33465E (tuile 05) · Fond clair #E1E6ED · Blanc #FFFFFF. Aucun doré.</w:t>
             </w:r>
           </w:p>
         </w:tc>
@@ -10152,7 +11564,7 @@
                 <w:sz w:val="19"/>
                 <w:szCs w:val="19"/>
               </w:rPr>
-              <w:t xml:space="preserve">Cormorant Garamond, poids léger, phrases en minuscules avec un mot clé en italique ; majuscules réservées aux petites étiquettes espacées</w:t>
+              <w:t xml:space="preserve">Roboto fin (100 à 300), en capitales avec léger espacement ; grands chiffres des tuiles en Roboto 100</w:t>
             </w:r>
           </w:p>
         </w:tc>
@@ -10219,7 +11631,7 @@
                 <w:sz w:val="19"/>
                 <w:szCs w:val="19"/>
               </w:rPr>
-              <w:t xml:space="preserve">Inter (poids 300 à 500), Manrope en appui pour les chiffres et l'interface</w:t>
+              <w:t xml:space="preserve">Roboto Slab léger pour les petits textes (tuiles, citations, pied de page) ; Roboto 500 à 700 pour les titres de tuiles et les étiquettes en capitales espacées ; Cormorant Garamond italique réservé aux touches malgaches (« Tonga soa », « Misaotra »)</w:t>
             </w:r>
           </w:p>
         </w:tc>
@@ -10355,7 +11767,7 @@
                 <w:sz w:val="19"/>
                 <w:szCs w:val="19"/>
               </w:rPr>
-              <w:t xml:space="preserve">Toujours avec une bordure fine ; inversion de couleur au survol ; flèche animée</w:t>
+              <w:t xml:space="preserve">Toujours avec une bordure fine, coins à peine adoucis ; inversion de couleur au survol ; flèche animée</w:t>
             </w:r>
           </w:p>
         </w:tc>
@@ -10392,7 +11804,7 @@
                 <w:sz w:val="19"/>
                 <w:szCs w:val="19"/>
               </w:rPr>
-              <w:t xml:space="preserve">Bordures et cadres</w:t>
+              <w:t xml:space="preserve">Bordures et formes</w:t>
             </w:r>
           </w:p>
         </w:tc>
@@ -10424,7 +11836,7 @@
                 <w:sz w:val="19"/>
                 <w:szCs w:val="19"/>
               </w:rPr>
-              <w:t xml:space="preserve">Filets fins, cadre intérieur sur les héros et les tuiles, contour décalé sur les photos, séparateurs pointillés pour les chiffres</w:t>
+              <w:t xml:space="preserve">Filets fins sous l'en-tête et autour des titres de section, tuile filaire, séparateurs fins pour les chiffres ; coins presque droits (8 px sur les tuiles, 6 px sur les boutons), réglables par deux variables de style</w:t>
             </w:r>
           </w:p>
         </w:tc>
@@ -10491,7 +11903,7 @@
                 <w:sz w:val="19"/>
                 <w:szCs w:val="19"/>
               </w:rPr>
-              <w:t xml:space="preserve">Traits fins, utilisées avec parcimonie (piliers, services)</w:t>
+              <w:t xml:space="preserve">Traits fins, utilisées avec parcimonie (valeurs, services, dessin au trait de la tuile 02)</w:t>
             </w:r>
           </w:p>
         </w:tc>
@@ -10560,7 +11972,7 @@
                 <w:sz w:val="19"/>
                 <w:szCs w:val="19"/>
               </w:rPr>
-              <w:t xml:space="preserve">Voitures executive, aéroport, hôtellerie, Madagascar ; même traitement de couleur sur toutes les images (désaturation légère, voile marine)</w:t>
+              <w:t xml:space="preserve">Voitures executive, aéroport, hôtellerie, Madagascar ; traitement uniforme : désaturation, teinte marine, dégradé vers le fond de page</w:t>
             </w:r>
           </w:p>
         </w:tc>
@@ -10627,7 +12039,7 @@
                 <w:sz w:val="19"/>
                 <w:szCs w:val="19"/>
               </w:rPr>
-              <w:t xml:space="preserve">Salutations malgaches, pancarte d'accueil à l'aéroport, parcours en pointillés, grande signature en pied de page</w:t>
+              <w:t xml:space="preserve">Salutations malgaches, pancarte d'accueil à l'aéroport, parcours en pointillés, logo en pied de page</w:t>
             </w:r>
           </w:p>
         </w:tc>
@@ -10667,7 +12079,7 @@
           <w:sz w:val="21"/>
           <w:szCs w:val="21"/>
         </w:rPr>
-        <w:t xml:space="preserve">Entrée du hero : image qui se révèle avec un léger zoom, titre qui monte, puis sous-titre et boutons.</w:t>
+        <w:t xml:space="preserve">Rideau d'intro avec le logo, joué une seule fois par visite, puis rideau marine à chaque changement de page.</w:t>
       </w:r>
     </w:p>
     <w:p>
@@ -10686,7 +12098,26 @@
           <w:sz w:val="21"/>
           <w:szCs w:val="21"/>
         </w:rPr>
-        <w:t xml:space="preserve">Apparition progressive au défilement, léger décalage de profondeur des photographies (parallaxe), zoom doux au survol.</w:t>
+        <w:t xml:space="preserve">Défilement fluide, titres qui se révèlent mot à mot, apparition progressive au défilement, léger décalage de profondeur des photographies (parallaxe).</w:t>
+      </w:r>
+    </w:p>
+    <w:p>
+      <w:pPr>
+        <w:pStyle w:val="ListParagraph"/>
+        <w:numPr>
+          <w:ilvl w:val="0"/>
+          <w:numId w:val="2"/>
+        </w:numPr>
+        <w:spacing w:after="70" w:line="280"/>
+      </w:pPr>
+      <w:r>
+        <w:rPr>
+          <w:rFonts w:ascii="Calibri" w:cs="Calibri" w:eastAsia="Calibri" w:hAnsi="Calibri"/>
+          <w:color w:val="222B36"/>
+          <w:sz w:val="21"/>
+          <w:szCs w:val="21"/>
+        </w:rPr>
+        <w:t xml:space="preserve">Tuiles qui se soulèvent au survol, flèches qui parcourent les véhicules de la tuile flotte, lien « Voir les offres » dont la flèche bouge.</w:t>
       </w:r>
     </w:p>
     <w:p>
@@ -10724,26 +12155,7 @@
           <w:sz w:val="21"/>
           <w:szCs w:val="21"/>
         </w:rPr>
-        <w:t xml:space="preserve">Chiffres clés qui se comptent, bandeau de partenaires qui défile, curseur discret sur ordinateur, barre de progression de lecture.</w:t>
-      </w:r>
-    </w:p>
-    <w:p>
-      <w:pPr>
-        <w:pStyle w:val="ListParagraph"/>
-        <w:numPr>
-          <w:ilvl w:val="0"/>
-          <w:numId w:val="2"/>
-        </w:numPr>
-        <w:spacing w:after="70" w:line="280"/>
-      </w:pPr>
-      <w:r>
-        <w:rPr>
-          <w:rFonts w:ascii="Calibri" w:cs="Calibri" w:eastAsia="Calibri" w:hAnsi="Calibri"/>
-          <w:color w:val="222B36"/>
-          <w:sz w:val="21"/>
-          <w:szCs w:val="21"/>
-        </w:rPr>
-        <w:t xml:space="preserve">Transition douce entre les pages.</w:t>
+        <w:t xml:space="preserve">Chiffres clés qui se comptent, bandeau de partenaires qui défile, curseur discret sur ordinateur, barre de lecture qui remplit le filet de l'en-tête.</w:t>
       </w:r>
     </w:p>
     <w:p>
@@ -10794,7 +12206,7 @@
           <w:sz w:val="21"/>
           <w:szCs w:val="21"/>
         </w:rPr>
-        <w:t xml:space="preserve">Le site est conçu pour téléphone, tablette, portable et grand écran. Sur mobile : en-tête réduit, menu plein écran, grandes images, barre d'action fixe en bas (Devis et WhatsApp), boutons faciles à atteindre, aucun défilement horizontal. La mise en page reste correcte pour les zooms navigateur de 80 % à 125 %.</w:t>
+        <w:t xml:space="preserve">Le site est conçu pour téléphone, tablette, portable et grand écran. Sur mobile : en-tête réduit, menu plein écran, grandes images, barre d'action fixe en bas (Devis et WhatsApp), boutons faciles à atteindre, aucun défilement horizontal, mosaïque en une colonne, voiture du hero recadrée sur l'avant avec le titre en haut. La mise en page reste correcte pour les zooms navigateur de 80 % à 125 %.</w:t>
       </w:r>
     </w:p>
     <w:p>
@@ -11003,7 +12415,7 @@
                 <w:sz w:val="19"/>
                 <w:szCs w:val="19"/>
               </w:rPr>
-              <w:t xml:space="preserve">Textes des pages, services, offres, FAQ</w:t>
+              <w:t xml:space="preserve">Contenus finaux : slogan, accroche, trois valeurs, sept services, À propos</w:t>
             </w:r>
           </w:p>
         </w:tc>
@@ -11034,7 +12446,7 @@
                 <w:sz w:val="19"/>
                 <w:szCs w:val="19"/>
               </w:rPr>
-              <w:t xml:space="preserve">Arborescence Toky Service, document d'architecture TS EXCLUSIVE, plaquette V3</w:t>
+              <w:t xml:space="preserve">Document « contenus Site final » du client</w:t>
             </w:r>
           </w:p>
         </w:tc>
@@ -11065,7 +12477,7 @@
                 <w:sz w:val="19"/>
                 <w:szCs w:val="19"/>
               </w:rPr>
-              <w:t xml:space="preserve">Rédigés, FR et EN</w:t>
+              <w:t xml:space="preserve">Intégrés en français ; traduction anglaise rédigée, à faire relire</w:t>
             </w:r>
           </w:p>
         </w:tc>
@@ -11102,7 +12514,7 @@
                 <w:sz w:val="19"/>
                 <w:szCs w:val="19"/>
               </w:rPr>
-              <w:t xml:space="preserve">Prix et conditions de location</w:t>
+              <w:t xml:space="preserve">Textes des pages, services, offres, FAQ</w:t>
             </w:r>
           </w:p>
         </w:tc>
@@ -11134,7 +12546,7 @@
                 <w:sz w:val="19"/>
                 <w:szCs w:val="19"/>
               </w:rPr>
-              <w:t xml:space="preserve">Plaquette V3</w:t>
+              <w:t xml:space="preserve">Arborescence Toky Service, document d'architecture TS EXCLUSIVE, plaquette V3</w:t>
             </w:r>
           </w:p>
         </w:tc>
@@ -11166,7 +12578,7 @@
                 <w:sz w:val="19"/>
                 <w:szCs w:val="19"/>
               </w:rPr>
-              <w:t xml:space="preserve">Intégrés, à valider</w:t>
+              <w:t xml:space="preserve">Rédigés, FR et EN</w:t>
             </w:r>
           </w:p>
         </w:tc>
@@ -11202,7 +12614,7 @@
                 <w:sz w:val="19"/>
                 <w:szCs w:val="19"/>
               </w:rPr>
-              <w:t xml:space="preserve">Véhicules et caractéristiques</w:t>
+              <w:t xml:space="preserve">Prix et conditions de location</w:t>
             </w:r>
           </w:p>
         </w:tc>
@@ -11264,7 +12676,7 @@
                 <w:sz w:val="19"/>
                 <w:szCs w:val="19"/>
               </w:rPr>
-              <w:t xml:space="preserve">Intégrés ; passagers et bagages à confirmer</w:t>
+              <w:t xml:space="preserve">Intégrés, à valider</w:t>
             </w:r>
           </w:p>
         </w:tc>
@@ -11301,7 +12713,7 @@
                 <w:sz w:val="19"/>
                 <w:szCs w:val="19"/>
               </w:rPr>
-              <w:t xml:space="preserve">Coordonnées</w:t>
+              <w:t xml:space="preserve">Véhicules et caractéristiques</w:t>
             </w:r>
           </w:p>
         </w:tc>
@@ -11365,7 +12777,7 @@
                 <w:sz w:val="19"/>
                 <w:szCs w:val="19"/>
               </w:rPr>
-              <w:t xml:space="preserve">Intégrées</w:t>
+              <w:t xml:space="preserve">Intégrés ; passagers et bagages à confirmer</w:t>
             </w:r>
           </w:p>
         </w:tc>
@@ -11401,7 +12813,7 @@
                 <w:sz w:val="19"/>
                 <w:szCs w:val="19"/>
               </w:rPr>
-              <w:t xml:space="preserve">Logo</w:t>
+              <w:t xml:space="preserve">Coordonnées</w:t>
             </w:r>
           </w:p>
         </w:tc>
@@ -11432,7 +12844,7 @@
                 <w:sz w:val="19"/>
                 <w:szCs w:val="19"/>
               </w:rPr>
-              <w:t xml:space="preserve">Visuel client</w:t>
+              <w:t xml:space="preserve">Plaquette V3</w:t>
             </w:r>
           </w:p>
         </w:tc>
@@ -11463,7 +12875,7 @@
                 <w:sz w:val="19"/>
                 <w:szCs w:val="19"/>
               </w:rPr>
-              <w:t xml:space="preserve">Redessiné en vectoriel ; fichier d'origine en haute définition souhaité</w:t>
+              <w:t xml:space="preserve">Intégrées</w:t>
             </w:r>
           </w:p>
         </w:tc>
@@ -11500,6 +12912,106 @@
                 <w:sz w:val="19"/>
                 <w:szCs w:val="19"/>
               </w:rPr>
+              <w:t xml:space="preserve">Logo</w:t>
+            </w:r>
+          </w:p>
+        </w:tc>
+        <w:tc>
+          <w:tcPr>
+            <w:tcW w:type="dxa" w:w="3560"/>
+            <w:tcBorders>
+              <w:top w:val="single" w:color="C9D4E0" w:sz="4"/>
+              <w:left w:val="single" w:color="C9D4E0" w:sz="4"/>
+              <w:bottom w:val="single" w:color="C9D4E0" w:sz="4"/>
+              <w:right w:val="single" w:color="C9D4E0" w:sz="4"/>
+            </w:tcBorders>
+            <w:shd w:fill="EEF2F7" w:color="auto" w:val="clear"/>
+            <w:tcMar>
+              <w:top w:type="dxa" w:w="70"/>
+              <w:left w:type="dxa" w:w="110"/>
+              <w:bottom w:type="dxa" w:w="70"/>
+              <w:right w:type="dxa" w:w="110"/>
+            </w:tcMar>
+          </w:tcPr>
+          <w:p>
+            <w:pPr>
+              <w:spacing w:after="30"/>
+            </w:pPr>
+            <w:r>
+              <w:rPr>
+                <w:rFonts w:ascii="Calibri" w:cs="Calibri" w:eastAsia="Calibri" w:hAnsi="Calibri"/>
+                <w:color w:val="222B36"/>
+                <w:sz w:val="19"/>
+                <w:szCs w:val="19"/>
+              </w:rPr>
+              <w:t xml:space="preserve">Visuel client</w:t>
+            </w:r>
+          </w:p>
+        </w:tc>
+        <w:tc>
+          <w:tcPr>
+            <w:tcW w:type="dxa" w:w="2500"/>
+            <w:tcBorders>
+              <w:top w:val="single" w:color="C9D4E0" w:sz="4"/>
+              <w:left w:val="single" w:color="C9D4E0" w:sz="4"/>
+              <w:bottom w:val="single" w:color="C9D4E0" w:sz="4"/>
+              <w:right w:val="single" w:color="C9D4E0" w:sz="4"/>
+            </w:tcBorders>
+            <w:shd w:fill="EEF2F7" w:color="auto" w:val="clear"/>
+            <w:tcMar>
+              <w:top w:type="dxa" w:w="70"/>
+              <w:left w:type="dxa" w:w="110"/>
+              <w:bottom w:type="dxa" w:w="70"/>
+              <w:right w:type="dxa" w:w="110"/>
+            </w:tcMar>
+          </w:tcPr>
+          <w:p>
+            <w:pPr>
+              <w:spacing w:after="30"/>
+            </w:pPr>
+            <w:r>
+              <w:rPr>
+                <w:rFonts w:ascii="Calibri" w:cs="Calibri" w:eastAsia="Calibri" w:hAnsi="Calibri"/>
+                <w:color w:val="222B36"/>
+                <w:sz w:val="19"/>
+                <w:szCs w:val="19"/>
+              </w:rPr>
+              <w:t xml:space="preserve">Redessiné en vectoriel ; fichier d'origine en haute définition souhaité</w:t>
+            </w:r>
+          </w:p>
+        </w:tc>
+      </w:tr>
+      <w:tr>
+        <w:trPr>
+          <w:cantSplit/>
+        </w:trPr>
+        <w:tc>
+          <w:tcPr>
+            <w:tcW w:type="dxa" w:w="3300"/>
+            <w:tcBorders>
+              <w:top w:val="single" w:color="C9D4E0" w:sz="4"/>
+              <w:left w:val="single" w:color="C9D4E0" w:sz="4"/>
+              <w:bottom w:val="single" w:color="C9D4E0" w:sz="4"/>
+              <w:right w:val="single" w:color="C9D4E0" w:sz="4"/>
+            </w:tcBorders>
+            <w:tcMar>
+              <w:top w:type="dxa" w:w="70"/>
+              <w:left w:type="dxa" w:w="110"/>
+              <w:bottom w:type="dxa" w:w="70"/>
+              <w:right w:type="dxa" w:w="110"/>
+            </w:tcMar>
+          </w:tcPr>
+          <w:p>
+            <w:pPr>
+              <w:spacing w:after="30"/>
+            </w:pPr>
+            <w:r>
+              <w:rPr>
+                <w:rFonts w:ascii="Calibri" w:cs="Calibri" w:eastAsia="Calibri" w:hAnsi="Calibri"/>
+                <w:color w:val="222B36"/>
+                <w:sz w:val="19"/>
+                <w:szCs w:val="19"/>
+              </w:rPr>
               <w:t xml:space="preserve">Photographies d'ambiance</w:t>
             </w:r>
           </w:p>
@@ -11513,26 +13025,25 @@
               <w:bottom w:val="single" w:color="C9D4E0" w:sz="4"/>
               <w:right w:val="single" w:color="C9D4E0" w:sz="4"/>
             </w:tcBorders>
-            <w:shd w:fill="EEF2F7" w:color="auto" w:val="clear"/>
-            <w:tcMar>
-              <w:top w:type="dxa" w:w="70"/>
-              <w:left w:type="dxa" w:w="110"/>
-              <w:bottom w:type="dxa" w:w="70"/>
-              <w:right w:type="dxa" w:w="110"/>
-            </w:tcMar>
-          </w:tcPr>
-          <w:p>
-            <w:pPr>
-              <w:spacing w:after="30"/>
-            </w:pPr>
-            <w:r>
-              <w:rPr>
-                <w:rFonts w:ascii="Calibri" w:cs="Calibri" w:eastAsia="Calibri" w:hAnsi="Calibri"/>
-                <w:color w:val="222B36"/>
-                <w:sz w:val="19"/>
-                <w:szCs w:val="19"/>
-              </w:rPr>
-              <w:t xml:space="preserve">Banque d'images libre de droits (Unsplash)</w:t>
+            <w:tcMar>
+              <w:top w:type="dxa" w:w="70"/>
+              <w:left w:type="dxa" w:w="110"/>
+              <w:bottom w:type="dxa" w:w="70"/>
+              <w:right w:type="dxa" w:w="110"/>
+            </w:tcMar>
+          </w:tcPr>
+          <w:p>
+            <w:pPr>
+              <w:spacing w:after="30"/>
+            </w:pPr>
+            <w:r>
+              <w:rPr>
+                <w:rFonts w:ascii="Calibri" w:cs="Calibri" w:eastAsia="Calibri" w:hAnsi="Calibri"/>
+                <w:color w:val="222B36"/>
+                <w:sz w:val="19"/>
+                <w:szCs w:val="19"/>
+              </w:rPr>
+              <w:t xml:space="preserve">Banques d'images libres de droits (Unsplash, Pexels)</w:t>
             </w:r>
           </w:p>
         </w:tc>
@@ -11545,7 +13056,6 @@
               <w:bottom w:val="single" w:color="C9D4E0" w:sz="4"/>
               <w:right w:val="single" w:color="C9D4E0" w:sz="4"/>
             </w:tcBorders>
-            <w:shd w:fill="EEF2F7" w:color="auto" w:val="clear"/>
             <w:tcMar>
               <w:top w:type="dxa" w:w="70"/>
               <w:left w:type="dxa" w:w="110"/>
@@ -11565,6 +13075,107 @@
                 <w:szCs w:val="19"/>
               </w:rPr>
               <w:t xml:space="preserve">Provisoires ; à remplacer par des photos propres à l'entreprise</w:t>
+            </w:r>
+          </w:p>
+        </w:tc>
+      </w:tr>
+      <w:tr>
+        <w:trPr>
+          <w:cantSplit/>
+        </w:trPr>
+        <w:tc>
+          <w:tcPr>
+            <w:tcW w:type="dxa" w:w="3300"/>
+            <w:tcBorders>
+              <w:top w:val="single" w:color="C9D4E0" w:sz="4"/>
+              <w:left w:val="single" w:color="C9D4E0" w:sz="4"/>
+              <w:bottom w:val="single" w:color="C9D4E0" w:sz="4"/>
+              <w:right w:val="single" w:color="C9D4E0" w:sz="4"/>
+            </w:tcBorders>
+            <w:shd w:fill="EEF2F7" w:color="auto" w:val="clear"/>
+            <w:tcMar>
+              <w:top w:type="dxa" w:w="70"/>
+              <w:left w:type="dxa" w:w="110"/>
+              <w:bottom w:type="dxa" w:w="70"/>
+              <w:right w:type="dxa" w:w="110"/>
+            </w:tcMar>
+          </w:tcPr>
+          <w:p>
+            <w:pPr>
+              <w:spacing w:after="30"/>
+            </w:pPr>
+            <w:r>
+              <w:rPr>
+                <w:rFonts w:ascii="Calibri" w:cs="Calibri" w:eastAsia="Calibri" w:hAnsi="Calibri"/>
+                <w:color w:val="222B36"/>
+                <w:sz w:val="19"/>
+                <w:szCs w:val="19"/>
+              </w:rPr>
+              <w:t xml:space="preserve">Photographie du hero (Maybach, format paysage)</w:t>
+            </w:r>
+          </w:p>
+        </w:tc>
+        <w:tc>
+          <w:tcPr>
+            <w:tcW w:type="dxa" w:w="3560"/>
+            <w:tcBorders>
+              <w:top w:val="single" w:color="C9D4E0" w:sz="4"/>
+              <w:left w:val="single" w:color="C9D4E0" w:sz="4"/>
+              <w:bottom w:val="single" w:color="C9D4E0" w:sz="4"/>
+              <w:right w:val="single" w:color="C9D4E0" w:sz="4"/>
+            </w:tcBorders>
+            <w:shd w:fill="EEF2F7" w:color="auto" w:val="clear"/>
+            <w:tcMar>
+              <w:top w:type="dxa" w:w="70"/>
+              <w:left w:type="dxa" w:w="110"/>
+              <w:bottom w:type="dxa" w:w="70"/>
+              <w:right w:type="dxa" w:w="110"/>
+            </w:tcMar>
+          </w:tcPr>
+          <w:p>
+            <w:pPr>
+              <w:spacing w:after="30"/>
+            </w:pPr>
+            <w:r>
+              <w:rPr>
+                <w:rFonts w:ascii="Calibri" w:cs="Calibri" w:eastAsia="Calibri" w:hAnsi="Calibri"/>
+                <w:color w:val="222B36"/>
+                <w:sz w:val="19"/>
+                <w:szCs w:val="19"/>
+              </w:rPr>
+              <w:t xml:space="preserve">Pexels</w:t>
+            </w:r>
+          </w:p>
+        </w:tc>
+        <w:tc>
+          <w:tcPr>
+            <w:tcW w:type="dxa" w:w="2500"/>
+            <w:tcBorders>
+              <w:top w:val="single" w:color="C9D4E0" w:sz="4"/>
+              <w:left w:val="single" w:color="C9D4E0" w:sz="4"/>
+              <w:bottom w:val="single" w:color="C9D4E0" w:sz="4"/>
+              <w:right w:val="single" w:color="C9D4E0" w:sz="4"/>
+            </w:tcBorders>
+            <w:shd w:fill="EEF2F7" w:color="auto" w:val="clear"/>
+            <w:tcMar>
+              <w:top w:type="dxa" w:w="70"/>
+              <w:left w:type="dxa" w:w="110"/>
+              <w:bottom w:type="dxa" w:w="70"/>
+              <w:right w:type="dxa" w:w="110"/>
+            </w:tcMar>
+          </w:tcPr>
+          <w:p>
+            <w:pPr>
+              <w:spacing w:after="30"/>
+            </w:pPr>
+            <w:r>
+              <w:rPr>
+                <w:rFonts w:ascii="Calibri" w:cs="Calibri" w:eastAsia="Calibri" w:hAnsi="Calibri"/>
+                <w:color w:val="222B36"/>
+                <w:sz w:val="19"/>
+                <w:szCs w:val="19"/>
+              </w:rPr>
+              <w:t xml:space="preserve">Provisoire ; à remplacer par une photo d'un véhicule de la flotte</w:t>
             </w:r>
           </w:p>
         </w:tc>
@@ -12480,6 +14091,142 @@
                 <w:szCs w:val="19"/>
               </w:rPr>
               <w:t xml:space="preserve">Photographies chargées à la demande et redimensionnées ; images téléversées stockées en base et servies avec cache longue durée</w:t>
+            </w:r>
+          </w:p>
+        </w:tc>
+      </w:tr>
+      <w:tr>
+        <w:trPr>
+          <w:cantSplit/>
+        </w:trPr>
+        <w:tc>
+          <w:tcPr>
+            <w:tcW w:type="dxa" w:w="2300"/>
+            <w:tcBorders>
+              <w:top w:val="single" w:color="C9D4E0" w:sz="4"/>
+              <w:left w:val="single" w:color="C9D4E0" w:sz="4"/>
+              <w:bottom w:val="single" w:color="C9D4E0" w:sz="4"/>
+              <w:right w:val="single" w:color="C9D4E0" w:sz="4"/>
+            </w:tcBorders>
+            <w:tcMar>
+              <w:top w:type="dxa" w:w="70"/>
+              <w:left w:type="dxa" w:w="110"/>
+              <w:bottom w:type="dxa" w:w="70"/>
+              <w:right w:type="dxa" w:w="110"/>
+            </w:tcMar>
+          </w:tcPr>
+          <w:p>
+            <w:pPr>
+              <w:spacing w:after="30"/>
+            </w:pPr>
+            <w:r>
+              <w:rPr>
+                <w:rFonts w:ascii="Calibri" w:cs="Calibri" w:eastAsia="Calibri" w:hAnsi="Calibri"/>
+                <w:color w:val="222B36"/>
+                <w:sz w:val="19"/>
+                <w:szCs w:val="19"/>
+              </w:rPr>
+              <w:t xml:space="preserve">Polices</w:t>
+            </w:r>
+          </w:p>
+        </w:tc>
+        <w:tc>
+          <w:tcPr>
+            <w:tcW w:type="dxa" w:w="7060"/>
+            <w:tcBorders>
+              <w:top w:val="single" w:color="C9D4E0" w:sz="4"/>
+              <w:left w:val="single" w:color="C9D4E0" w:sz="4"/>
+              <w:bottom w:val="single" w:color="C9D4E0" w:sz="4"/>
+              <w:right w:val="single" w:color="C9D4E0" w:sz="4"/>
+            </w:tcBorders>
+            <w:tcMar>
+              <w:top w:type="dxa" w:w="70"/>
+              <w:left w:type="dxa" w:w="110"/>
+              <w:bottom w:type="dxa" w:w="70"/>
+              <w:right w:type="dxa" w:w="110"/>
+            </w:tcMar>
+          </w:tcPr>
+          <w:p>
+            <w:pPr>
+              <w:spacing w:after="30"/>
+            </w:pPr>
+            <w:r>
+              <w:rPr>
+                <w:rFonts w:ascii="Calibri" w:cs="Calibri" w:eastAsia="Calibri" w:hAnsi="Calibri"/>
+                <w:color w:val="222B36"/>
+                <w:sz w:val="19"/>
+                <w:szCs w:val="19"/>
+              </w:rPr>
+              <w:t xml:space="preserve">Roboto, Roboto Slab, Cormorant Garamond, Inter et Manrope (Google Fonts)</w:t>
+            </w:r>
+          </w:p>
+        </w:tc>
+      </w:tr>
+      <w:tr>
+        <w:trPr>
+          <w:cantSplit/>
+        </w:trPr>
+        <w:tc>
+          <w:tcPr>
+            <w:tcW w:type="dxa" w:w="2300"/>
+            <w:tcBorders>
+              <w:top w:val="single" w:color="C9D4E0" w:sz="4"/>
+              <w:left w:val="single" w:color="C9D4E0" w:sz="4"/>
+              <w:bottom w:val="single" w:color="C9D4E0" w:sz="4"/>
+              <w:right w:val="single" w:color="C9D4E0" w:sz="4"/>
+            </w:tcBorders>
+            <w:shd w:fill="EEF2F7" w:color="auto" w:val="clear"/>
+            <w:tcMar>
+              <w:top w:type="dxa" w:w="70"/>
+              <w:left w:type="dxa" w:w="110"/>
+              <w:bottom w:type="dxa" w:w="70"/>
+              <w:right w:type="dxa" w:w="110"/>
+            </w:tcMar>
+          </w:tcPr>
+          <w:p>
+            <w:pPr>
+              <w:spacing w:after="30"/>
+            </w:pPr>
+            <w:r>
+              <w:rPr>
+                <w:rFonts w:ascii="Calibri" w:cs="Calibri" w:eastAsia="Calibri" w:hAnsi="Calibri"/>
+                <w:color w:val="222B36"/>
+                <w:sz w:val="19"/>
+                <w:szCs w:val="19"/>
+              </w:rPr>
+              <w:t xml:space="preserve">Défilement</w:t>
+            </w:r>
+          </w:p>
+        </w:tc>
+        <w:tc>
+          <w:tcPr>
+            <w:tcW w:type="dxa" w:w="7060"/>
+            <w:tcBorders>
+              <w:top w:val="single" w:color="C9D4E0" w:sz="4"/>
+              <w:left w:val="single" w:color="C9D4E0" w:sz="4"/>
+              <w:bottom w:val="single" w:color="C9D4E0" w:sz="4"/>
+              <w:right w:val="single" w:color="C9D4E0" w:sz="4"/>
+            </w:tcBorders>
+            <w:shd w:fill="EEF2F7" w:color="auto" w:val="clear"/>
+            <w:tcMar>
+              <w:top w:type="dxa" w:w="70"/>
+              <w:left w:type="dxa" w:w="110"/>
+              <w:bottom w:type="dxa" w:w="70"/>
+              <w:right w:type="dxa" w:w="110"/>
+            </w:tcMar>
+          </w:tcPr>
+          <w:p>
+            <w:pPr>
+              <w:spacing w:after="30"/>
+            </w:pPr>
+            <w:r>
+              <w:rPr>
+                <w:rFonts w:ascii="Calibri" w:cs="Calibri" w:eastAsia="Calibri" w:hAnsi="Calibri"/>
+                <w:color w:val="222B36"/>
+                <w:sz w:val="19"/>
+                <w:szCs w:val="19"/>
+              </w:rPr>
+              <w:t xml:space="preserve">Lenis, bibliothèque légère de défilement fluide</w:t>
             </w:r>
           </w:p>
         </w:tc>
@@ -13333,7 +15080,7 @@
           <w:sz w:val="21"/>
           <w:szCs w:val="21"/>
         </w:rPr>
-        <w:t xml:space="preserve">server/utils et server/plugins : base de données, authentification, emails, contenu de départ.</w:t>
+        <w:t xml:space="preserve">server/utils et server/plugins : base de données, authentification, emails, contenu de départ et contenus finaux des services (finalContent.ts, appliqués une seule fois).</w:t>
       </w:r>
     </w:p>
     <w:p>
@@ -13617,7 +15364,7 @@
           <w:sz w:val="21"/>
           <w:szCs w:val="21"/>
         </w:rPr>
-        <w:t xml:space="preserve">Animations limitées à la transparence et au déplacement, aucune bibliothèque d'animation lourde.</w:t>
+        <w:t xml:space="preserve">Animations limitées à la transparence et au déplacement ; seule bibliothèque ajoutée : Lenis (défilement fluide, quelques ko).</w:t>
       </w:r>
     </w:p>
     <w:p>
@@ -14250,7 +15997,7 @@
                 <w:sz w:val="19"/>
                 <w:szCs w:val="19"/>
               </w:rPr>
-              <w:t xml:space="preserve">Titre, identifiant, sous-titre, description, points inclus, icône, image, ordre, visibilité</w:t>
+              <w:t xml:space="preserve">Titre, identifiant, accroche, deuxième accroche, texte, titre et points de la liste, note, phrase de clôture, bouton, icône, image, ordre, visibilité</w:t>
             </w:r>
           </w:p>
         </w:tc>
@@ -15160,6 +16907,104 @@
               <w:right w:val="single" w:color="C9D4E0" w:sz="4"/>
             </w:tcBorders>
             <w:shd w:fill="EEF2F7" w:color="auto" w:val="clear"/>
+            <w:tcMar>
+              <w:top w:type="dxa" w:w="70"/>
+              <w:left w:type="dxa" w:w="110"/>
+              <w:bottom w:type="dxa" w:w="70"/>
+              <w:right w:type="dxa" w:w="110"/>
+            </w:tcMar>
+          </w:tcPr>
+          <w:p>
+            <w:pPr>
+              <w:spacing w:after="30"/>
+            </w:pPr>
+            <w:r>
+              <w:rPr>
+                <w:rFonts w:ascii="Calibri" w:cs="Calibri" w:eastAsia="Calibri" w:hAnsi="Calibri"/>
+                <w:color w:val="222B36"/>
+                <w:sz w:val="19"/>
+                <w:szCs w:val="19"/>
+              </w:rPr>
+              <w:t xml:space="preserve">Non</w:t>
+            </w:r>
+          </w:p>
+        </w:tc>
+      </w:tr>
+      <w:tr>
+        <w:trPr>
+          <w:cantSplit/>
+        </w:trPr>
+        <w:tc>
+          <w:tcPr>
+            <w:tcW w:type="dxa" w:w="1800"/>
+            <w:tcBorders>
+              <w:top w:val="single" w:color="C9D4E0" w:sz="4"/>
+              <w:left w:val="single" w:color="C9D4E0" w:sz="4"/>
+              <w:bottom w:val="single" w:color="C9D4E0" w:sz="4"/>
+              <w:right w:val="single" w:color="C9D4E0" w:sz="4"/>
+            </w:tcBorders>
+            <w:tcMar>
+              <w:top w:type="dxa" w:w="70"/>
+              <w:left w:type="dxa" w:w="110"/>
+              <w:bottom w:type="dxa" w:w="70"/>
+              <w:right w:type="dxa" w:w="110"/>
+            </w:tcMar>
+          </w:tcPr>
+          <w:p>
+            <w:pPr>
+              <w:spacing w:after="30"/>
+            </w:pPr>
+            <w:r>
+              <w:rPr>
+                <w:rFonts w:ascii="Calibri" w:cs="Calibri" w:eastAsia="Calibri" w:hAnsi="Calibri"/>
+                <w:color w:val="222B36"/>
+                <w:sz w:val="19"/>
+                <w:szCs w:val="19"/>
+              </w:rPr>
+              <w:t xml:space="preserve">migrations</w:t>
+            </w:r>
+          </w:p>
+        </w:tc>
+        <w:tc>
+          <w:tcPr>
+            <w:tcW w:type="dxa" w:w="6000"/>
+            <w:tcBorders>
+              <w:top w:val="single" w:color="C9D4E0" w:sz="4"/>
+              <w:left w:val="single" w:color="C9D4E0" w:sz="4"/>
+              <w:bottom w:val="single" w:color="C9D4E0" w:sz="4"/>
+              <w:right w:val="single" w:color="C9D4E0" w:sz="4"/>
+            </w:tcBorders>
+            <w:tcMar>
+              <w:top w:type="dxa" w:w="70"/>
+              <w:left w:type="dxa" w:w="110"/>
+              <w:bottom w:type="dxa" w:w="70"/>
+              <w:right w:type="dxa" w:w="110"/>
+            </w:tcMar>
+          </w:tcPr>
+          <w:p>
+            <w:pPr>
+              <w:spacing w:after="30"/>
+            </w:pPr>
+            <w:r>
+              <w:rPr>
+                <w:rFonts w:ascii="Calibri" w:cs="Calibri" w:eastAsia="Calibri" w:hAnsi="Calibri"/>
+                <w:color w:val="222B36"/>
+                <w:sz w:val="19"/>
+                <w:szCs w:val="19"/>
+              </w:rPr>
+              <w:t xml:space="preserve">Repères des contenus appliqués une seule fois (ex : contenus finaux des services)</w:t>
+            </w:r>
+          </w:p>
+        </w:tc>
+        <w:tc>
+          <w:tcPr>
+            <w:tcW w:type="dxa" w:w="1560"/>
+            <w:tcBorders>
+              <w:top w:val="single" w:color="C9D4E0" w:sz="4"/>
+              <w:left w:val="single" w:color="C9D4E0" w:sz="4"/>
+              <w:bottom w:val="single" w:color="C9D4E0" w:sz="4"/>
+              <w:right w:val="single" w:color="C9D4E0" w:sz="4"/>
+            </w:tcBorders>
             <w:tcMar>
               <w:top w:type="dxa" w:w="70"/>
               <w:left w:type="dxa" w:w="110"/>
@@ -16730,7 +18575,7 @@
           <w:sz w:val="26"/>
           <w:szCs w:val="26"/>
         </w:rPr>
-        <w:t xml:space="preserve">14.1 État d'avancement au 8 octobre 2026</w:t>
+        <w:t xml:space="preserve">14.1 État d'avancement au 12 octobre 2026</w:t>
       </w:r>
     </w:p>
     <w:tbl>
@@ -16989,7 +18834,7 @@
                 <w:sz w:val="19"/>
                 <w:szCs w:val="19"/>
               </w:rPr>
-              <w:t xml:space="preserve">Envoi réel des emails</w:t>
+              <w:t xml:space="preserve">Nouveau design d'après le modèle validé par le client (hero sombre, mosaïque, bloc clair, pied de page clair, sans doré)</w:t>
             </w:r>
           </w:p>
         </w:tc>
@@ -17020,7 +18865,7 @@
                 <w:sz w:val="19"/>
                 <w:szCs w:val="19"/>
               </w:rPr>
-              <w:t xml:space="preserve">À configurer (paramètres SMTP à fournir)</w:t>
+              <w:t xml:space="preserve">Livré et en ligne</w:t>
             </w:r>
           </w:p>
         </w:tc>
@@ -17057,7 +18902,7 @@
                 <w:sz w:val="19"/>
                 <w:szCs w:val="19"/>
               </w:rPr>
-              <w:t xml:space="preserve">Photographies propres à l'entreprise, témoignages, réseaux sociaux</w:t>
+              <w:t xml:space="preserve">Contenus finaux du client (slogan, trois valeurs, sept services, À propos)</w:t>
             </w:r>
           </w:p>
         </w:tc>
@@ -17089,7 +18934,7 @@
                 <w:sz w:val="19"/>
                 <w:szCs w:val="19"/>
               </w:rPr>
-              <w:t xml:space="preserve">À fournir</w:t>
+              <w:t xml:space="preserve">Intégrés et en ligne</w:t>
             </w:r>
           </w:p>
         </w:tc>
@@ -17125,7 +18970,7 @@
                 <w:sz w:val="19"/>
                 <w:szCs w:val="19"/>
               </w:rPr>
-              <w:t xml:space="preserve">Nom de domaine et pages légales</w:t>
+              <w:t xml:space="preserve">Relecture de la traduction anglaise des contenus finaux</w:t>
             </w:r>
           </w:p>
         </w:tc>
@@ -17156,7 +19001,7 @@
                 <w:sz w:val="19"/>
                 <w:szCs w:val="19"/>
               </w:rPr>
-              <w:t xml:space="preserve">À fournir</w:t>
+              <w:t xml:space="preserve">À faire par le client</w:t>
             </w:r>
           </w:p>
         </w:tc>
@@ -17193,6 +19038,210 @@
                 <w:sz w:val="19"/>
                 <w:szCs w:val="19"/>
               </w:rPr>
+              <w:t xml:space="preserve">Envoi réel des emails</w:t>
+            </w:r>
+          </w:p>
+        </w:tc>
+        <w:tc>
+          <w:tcPr>
+            <w:tcW w:type="dxa" w:w="2560"/>
+            <w:tcBorders>
+              <w:top w:val="single" w:color="C9D4E0" w:sz="4"/>
+              <w:left w:val="single" w:color="C9D4E0" w:sz="4"/>
+              <w:bottom w:val="single" w:color="C9D4E0" w:sz="4"/>
+              <w:right w:val="single" w:color="C9D4E0" w:sz="4"/>
+            </w:tcBorders>
+            <w:shd w:fill="EEF2F7" w:color="auto" w:val="clear"/>
+            <w:tcMar>
+              <w:top w:type="dxa" w:w="70"/>
+              <w:left w:type="dxa" w:w="110"/>
+              <w:bottom w:type="dxa" w:w="70"/>
+              <w:right w:type="dxa" w:w="110"/>
+            </w:tcMar>
+          </w:tcPr>
+          <w:p>
+            <w:pPr>
+              <w:spacing w:after="30"/>
+            </w:pPr>
+            <w:r>
+              <w:rPr>
+                <w:rFonts w:ascii="Calibri" w:cs="Calibri" w:eastAsia="Calibri" w:hAnsi="Calibri"/>
+                <w:color w:val="222B36"/>
+                <w:sz w:val="19"/>
+                <w:szCs w:val="19"/>
+              </w:rPr>
+              <w:t xml:space="preserve">À configurer (paramètres SMTP à fournir)</w:t>
+            </w:r>
+          </w:p>
+        </w:tc>
+      </w:tr>
+      <w:tr>
+        <w:trPr>
+          <w:cantSplit/>
+        </w:trPr>
+        <w:tc>
+          <w:tcPr>
+            <w:tcW w:type="dxa" w:w="6800"/>
+            <w:tcBorders>
+              <w:top w:val="single" w:color="C9D4E0" w:sz="4"/>
+              <w:left w:val="single" w:color="C9D4E0" w:sz="4"/>
+              <w:bottom w:val="single" w:color="C9D4E0" w:sz="4"/>
+              <w:right w:val="single" w:color="C9D4E0" w:sz="4"/>
+            </w:tcBorders>
+            <w:tcMar>
+              <w:top w:type="dxa" w:w="70"/>
+              <w:left w:type="dxa" w:w="110"/>
+              <w:bottom w:type="dxa" w:w="70"/>
+              <w:right w:type="dxa" w:w="110"/>
+            </w:tcMar>
+          </w:tcPr>
+          <w:p>
+            <w:pPr>
+              <w:spacing w:after="30"/>
+            </w:pPr>
+            <w:r>
+              <w:rPr>
+                <w:rFonts w:ascii="Calibri" w:cs="Calibri" w:eastAsia="Calibri" w:hAnsi="Calibri"/>
+                <w:color w:val="222B36"/>
+                <w:sz w:val="19"/>
+                <w:szCs w:val="19"/>
+              </w:rPr>
+              <w:t xml:space="preserve">Photographies propres à l'entreprise, témoignages, réseaux sociaux</w:t>
+            </w:r>
+          </w:p>
+        </w:tc>
+        <w:tc>
+          <w:tcPr>
+            <w:tcW w:type="dxa" w:w="2560"/>
+            <w:tcBorders>
+              <w:top w:val="single" w:color="C9D4E0" w:sz="4"/>
+              <w:left w:val="single" w:color="C9D4E0" w:sz="4"/>
+              <w:bottom w:val="single" w:color="C9D4E0" w:sz="4"/>
+              <w:right w:val="single" w:color="C9D4E0" w:sz="4"/>
+            </w:tcBorders>
+            <w:tcMar>
+              <w:top w:type="dxa" w:w="70"/>
+              <w:left w:type="dxa" w:w="110"/>
+              <w:bottom w:type="dxa" w:w="70"/>
+              <w:right w:type="dxa" w:w="110"/>
+            </w:tcMar>
+          </w:tcPr>
+          <w:p>
+            <w:pPr>
+              <w:spacing w:after="30"/>
+            </w:pPr>
+            <w:r>
+              <w:rPr>
+                <w:rFonts w:ascii="Calibri" w:cs="Calibri" w:eastAsia="Calibri" w:hAnsi="Calibri"/>
+                <w:color w:val="222B36"/>
+                <w:sz w:val="19"/>
+                <w:szCs w:val="19"/>
+              </w:rPr>
+              <w:t xml:space="preserve">À fournir</w:t>
+            </w:r>
+          </w:p>
+        </w:tc>
+      </w:tr>
+      <w:tr>
+        <w:trPr>
+          <w:cantSplit/>
+        </w:trPr>
+        <w:tc>
+          <w:tcPr>
+            <w:tcW w:type="dxa" w:w="6800"/>
+            <w:tcBorders>
+              <w:top w:val="single" w:color="C9D4E0" w:sz="4"/>
+              <w:left w:val="single" w:color="C9D4E0" w:sz="4"/>
+              <w:bottom w:val="single" w:color="C9D4E0" w:sz="4"/>
+              <w:right w:val="single" w:color="C9D4E0" w:sz="4"/>
+            </w:tcBorders>
+            <w:shd w:fill="EEF2F7" w:color="auto" w:val="clear"/>
+            <w:tcMar>
+              <w:top w:type="dxa" w:w="70"/>
+              <w:left w:type="dxa" w:w="110"/>
+              <w:bottom w:type="dxa" w:w="70"/>
+              <w:right w:type="dxa" w:w="110"/>
+            </w:tcMar>
+          </w:tcPr>
+          <w:p>
+            <w:pPr>
+              <w:spacing w:after="30"/>
+            </w:pPr>
+            <w:r>
+              <w:rPr>
+                <w:rFonts w:ascii="Calibri" w:cs="Calibri" w:eastAsia="Calibri" w:hAnsi="Calibri"/>
+                <w:color w:val="222B36"/>
+                <w:sz w:val="19"/>
+                <w:szCs w:val="19"/>
+              </w:rPr>
+              <w:t xml:space="preserve">Nom de domaine et pages légales</w:t>
+            </w:r>
+          </w:p>
+        </w:tc>
+        <w:tc>
+          <w:tcPr>
+            <w:tcW w:type="dxa" w:w="2560"/>
+            <w:tcBorders>
+              <w:top w:val="single" w:color="C9D4E0" w:sz="4"/>
+              <w:left w:val="single" w:color="C9D4E0" w:sz="4"/>
+              <w:bottom w:val="single" w:color="C9D4E0" w:sz="4"/>
+              <w:right w:val="single" w:color="C9D4E0" w:sz="4"/>
+            </w:tcBorders>
+            <w:shd w:fill="EEF2F7" w:color="auto" w:val="clear"/>
+            <w:tcMar>
+              <w:top w:type="dxa" w:w="70"/>
+              <w:left w:type="dxa" w:w="110"/>
+              <w:bottom w:type="dxa" w:w="70"/>
+              <w:right w:type="dxa" w:w="110"/>
+            </w:tcMar>
+          </w:tcPr>
+          <w:p>
+            <w:pPr>
+              <w:spacing w:after="30"/>
+            </w:pPr>
+            <w:r>
+              <w:rPr>
+                <w:rFonts w:ascii="Calibri" w:cs="Calibri" w:eastAsia="Calibri" w:hAnsi="Calibri"/>
+                <w:color w:val="222B36"/>
+                <w:sz w:val="19"/>
+                <w:szCs w:val="19"/>
+              </w:rPr>
+              <w:t xml:space="preserve">À fournir</w:t>
+            </w:r>
+          </w:p>
+        </w:tc>
+      </w:tr>
+      <w:tr>
+        <w:trPr>
+          <w:cantSplit/>
+        </w:trPr>
+        <w:tc>
+          <w:tcPr>
+            <w:tcW w:type="dxa" w:w="6800"/>
+            <w:tcBorders>
+              <w:top w:val="single" w:color="C9D4E0" w:sz="4"/>
+              <w:left w:val="single" w:color="C9D4E0" w:sz="4"/>
+              <w:bottom w:val="single" w:color="C9D4E0" w:sz="4"/>
+              <w:right w:val="single" w:color="C9D4E0" w:sz="4"/>
+            </w:tcBorders>
+            <w:tcMar>
+              <w:top w:type="dxa" w:w="70"/>
+              <w:left w:type="dxa" w:w="110"/>
+              <w:bottom w:type="dxa" w:w="70"/>
+              <w:right w:type="dxa" w:w="110"/>
+            </w:tcMar>
+          </w:tcPr>
+          <w:p>
+            <w:pPr>
+              <w:spacing w:after="30"/>
+            </w:pPr>
+            <w:r>
+              <w:rPr>
+                <w:rFonts w:ascii="Calibri" w:cs="Calibri" w:eastAsia="Calibri" w:hAnsi="Calibri"/>
+                <w:color w:val="222B36"/>
+                <w:sz w:val="19"/>
+                <w:szCs w:val="19"/>
+              </w:rPr>
               <w:t xml:space="preserve">Recette finale par le client</w:t>
             </w:r>
           </w:p>
@@ -17206,7 +19255,6 @@
               <w:bottom w:val="single" w:color="C9D4E0" w:sz="4"/>
               <w:right w:val="single" w:color="C9D4E0" w:sz="4"/>
             </w:tcBorders>
-            <w:shd w:fill="EEF2F7" w:color="auto" w:val="clear"/>
             <w:tcMar>
               <w:top w:type="dxa" w:w="70"/>
               <w:left w:type="dxa" w:w="110"/>
@@ -17304,7 +19352,7 @@
           <w:sz w:val="21"/>
           <w:szCs w:val="21"/>
         </w:rPr>
-        <w:t xml:space="preserve">Base de données initialisée avec le contenu de départ.</w:t>
+        <w:t xml:space="preserve">Base de données initialisée avec le contenu de départ et les contenus finaux du client (français et anglais).</w:t>
       </w:r>
     </w:p>
     <w:p>
@@ -17633,7 +19681,7 @@
                 <w:sz w:val="19"/>
                 <w:szCs w:val="19"/>
               </w:rPr>
-              <w:t xml:space="preserve">Hero avec voiture, chiffres, piliers, aucune zone vide, aucun défilement horizontal</w:t>
+              <w:t xml:space="preserve">Hero avec voiture sombre et slogan, chiffres, trois valeurs, aucune zone vide, aucun défilement horizontal</w:t>
             </w:r>
           </w:p>
         </w:tc>
@@ -18929,6 +20977,303 @@
                 <w:szCs w:val="19"/>
               </w:rPr>
               <w:t xml:space="preserve">Page 404 de la marque</w:t>
+            </w:r>
+          </w:p>
+        </w:tc>
+      </w:tr>
+      <w:tr>
+        <w:trPr>
+          <w:cantSplit/>
+        </w:trPr>
+        <w:tc>
+          <w:tcPr>
+            <w:tcW w:type="dxa" w:w="700"/>
+            <w:tcBorders>
+              <w:top w:val="single" w:color="C9D4E0" w:sz="4"/>
+              <w:left w:val="single" w:color="C9D4E0" w:sz="4"/>
+              <w:bottom w:val="single" w:color="C9D4E0" w:sz="4"/>
+              <w:right w:val="single" w:color="C9D4E0" w:sz="4"/>
+            </w:tcBorders>
+            <w:tcMar>
+              <w:top w:type="dxa" w:w="70"/>
+              <w:left w:type="dxa" w:w="110"/>
+              <w:bottom w:type="dxa" w:w="70"/>
+              <w:right w:type="dxa" w:w="110"/>
+            </w:tcMar>
+          </w:tcPr>
+          <w:p>
+            <w:pPr>
+              <w:spacing w:after="30"/>
+            </w:pPr>
+            <w:r>
+              <w:rPr>
+                <w:rFonts w:ascii="Calibri" w:cs="Calibri" w:eastAsia="Calibri" w:hAnsi="Calibri"/>
+                <w:color w:val="222B36"/>
+                <w:sz w:val="19"/>
+                <w:szCs w:val="19"/>
+              </w:rPr>
+              <w:t xml:space="preserve">15</w:t>
+            </w:r>
+          </w:p>
+        </w:tc>
+        <w:tc>
+          <w:tcPr>
+            <w:tcW w:type="dxa" w:w="4300"/>
+            <w:tcBorders>
+              <w:top w:val="single" w:color="C9D4E0" w:sz="4"/>
+              <w:left w:val="single" w:color="C9D4E0" w:sz="4"/>
+              <w:bottom w:val="single" w:color="C9D4E0" w:sz="4"/>
+              <w:right w:val="single" w:color="C9D4E0" w:sz="4"/>
+            </w:tcBorders>
+            <w:tcMar>
+              <w:top w:type="dxa" w:w="70"/>
+              <w:left w:type="dxa" w:w="110"/>
+              <w:bottom w:type="dxa" w:w="70"/>
+              <w:right w:type="dxa" w:w="110"/>
+            </w:tcMar>
+          </w:tcPr>
+          <w:p>
+            <w:pPr>
+              <w:spacing w:after="30"/>
+            </w:pPr>
+            <w:r>
+              <w:rPr>
+                <w:rFonts w:ascii="Calibri" w:cs="Calibri" w:eastAsia="Calibri" w:hAnsi="Calibri"/>
+                <w:color w:val="222B36"/>
+                <w:sz w:val="19"/>
+                <w:szCs w:val="19"/>
+              </w:rPr>
+              <w:t xml:space="preserve">Ouvrir chacun des sept services et cliquer sur son bouton</w:t>
+            </w:r>
+          </w:p>
+        </w:tc>
+        <w:tc>
+          <w:tcPr>
+            <w:tcW w:type="dxa" w:w="4360"/>
+            <w:tcBorders>
+              <w:top w:val="single" w:color="C9D4E0" w:sz="4"/>
+              <w:left w:val="single" w:color="C9D4E0" w:sz="4"/>
+              <w:bottom w:val="single" w:color="C9D4E0" w:sz="4"/>
+              <w:right w:val="single" w:color="C9D4E0" w:sz="4"/>
+            </w:tcBorders>
+            <w:tcMar>
+              <w:top w:type="dxa" w:w="70"/>
+              <w:left w:type="dxa" w:w="110"/>
+              <w:bottom w:type="dxa" w:w="70"/>
+              <w:right w:type="dxa" w:w="110"/>
+            </w:tcMar>
+          </w:tcPr>
+          <w:p>
+            <w:pPr>
+              <w:spacing w:after="30"/>
+            </w:pPr>
+            <w:r>
+              <w:rPr>
+                <w:rFonts w:ascii="Calibri" w:cs="Calibri" w:eastAsia="Calibri" w:hAnsi="Calibri"/>
+                <w:color w:val="222B36"/>
+                <w:sz w:val="19"/>
+                <w:szCs w:val="19"/>
+              </w:rPr>
+              <w:t xml:space="preserve">Texte conforme au document du client, bouton ouvrant le devis avec le service coché</w:t>
+            </w:r>
+          </w:p>
+        </w:tc>
+      </w:tr>
+      <w:tr>
+        <w:trPr>
+          <w:cantSplit/>
+        </w:trPr>
+        <w:tc>
+          <w:tcPr>
+            <w:tcW w:type="dxa" w:w="700"/>
+            <w:tcBorders>
+              <w:top w:val="single" w:color="C9D4E0" w:sz="4"/>
+              <w:left w:val="single" w:color="C9D4E0" w:sz="4"/>
+              <w:bottom w:val="single" w:color="C9D4E0" w:sz="4"/>
+              <w:right w:val="single" w:color="C9D4E0" w:sz="4"/>
+            </w:tcBorders>
+            <w:shd w:fill="EEF2F7" w:color="auto" w:val="clear"/>
+            <w:tcMar>
+              <w:top w:type="dxa" w:w="70"/>
+              <w:left w:type="dxa" w:w="110"/>
+              <w:bottom w:type="dxa" w:w="70"/>
+              <w:right w:type="dxa" w:w="110"/>
+            </w:tcMar>
+          </w:tcPr>
+          <w:p>
+            <w:pPr>
+              <w:spacing w:after="30"/>
+            </w:pPr>
+            <w:r>
+              <w:rPr>
+                <w:rFonts w:ascii="Calibri" w:cs="Calibri" w:eastAsia="Calibri" w:hAnsi="Calibri"/>
+                <w:color w:val="222B36"/>
+                <w:sz w:val="19"/>
+                <w:szCs w:val="19"/>
+              </w:rPr>
+              <w:t xml:space="preserve">16</w:t>
+            </w:r>
+          </w:p>
+        </w:tc>
+        <w:tc>
+          <w:tcPr>
+            <w:tcW w:type="dxa" w:w="4300"/>
+            <w:tcBorders>
+              <w:top w:val="single" w:color="C9D4E0" w:sz="4"/>
+              <w:left w:val="single" w:color="C9D4E0" w:sz="4"/>
+              <w:bottom w:val="single" w:color="C9D4E0" w:sz="4"/>
+              <w:right w:val="single" w:color="C9D4E0" w:sz="4"/>
+            </w:tcBorders>
+            <w:shd w:fill="EEF2F7" w:color="auto" w:val="clear"/>
+            <w:tcMar>
+              <w:top w:type="dxa" w:w="70"/>
+              <w:left w:type="dxa" w:w="110"/>
+              <w:bottom w:type="dxa" w:w="70"/>
+              <w:right w:type="dxa" w:w="110"/>
+            </w:tcMar>
+          </w:tcPr>
+          <w:p>
+            <w:pPr>
+              <w:spacing w:after="30"/>
+            </w:pPr>
+            <w:r>
+              <w:rPr>
+                <w:rFonts w:ascii="Calibri" w:cs="Calibri" w:eastAsia="Calibri" w:hAnsi="Calibri"/>
+                <w:color w:val="222B36"/>
+                <w:sz w:val="19"/>
+                <w:szCs w:val="19"/>
+              </w:rPr>
+              <w:t xml:space="preserve">Parcourir la tuile « Notre flotte » avec les flèches</w:t>
+            </w:r>
+          </w:p>
+        </w:tc>
+        <w:tc>
+          <w:tcPr>
+            <w:tcW w:type="dxa" w:w="4360"/>
+            <w:tcBorders>
+              <w:top w:val="single" w:color="C9D4E0" w:sz="4"/>
+              <w:left w:val="single" w:color="C9D4E0" w:sz="4"/>
+              <w:bottom w:val="single" w:color="C9D4E0" w:sz="4"/>
+              <w:right w:val="single" w:color="C9D4E0" w:sz="4"/>
+            </w:tcBorders>
+            <w:shd w:fill="EEF2F7" w:color="auto" w:val="clear"/>
+            <w:tcMar>
+              <w:top w:type="dxa" w:w="70"/>
+              <w:left w:type="dxa" w:w="110"/>
+              <w:bottom w:type="dxa" w:w="70"/>
+              <w:right w:type="dxa" w:w="110"/>
+            </w:tcMar>
+          </w:tcPr>
+          <w:p>
+            <w:pPr>
+              <w:spacing w:after="30"/>
+            </w:pPr>
+            <w:r>
+              <w:rPr>
+                <w:rFonts w:ascii="Calibri" w:cs="Calibri" w:eastAsia="Calibri" w:hAnsi="Calibri"/>
+                <w:color w:val="222B36"/>
+                <w:sz w:val="19"/>
+                <w:szCs w:val="19"/>
+              </w:rPr>
+              <w:t xml:space="preserve">Les véhicules défilent, la tuile s'adapte au fond de la photo</w:t>
+            </w:r>
+          </w:p>
+        </w:tc>
+      </w:tr>
+      <w:tr>
+        <w:trPr>
+          <w:cantSplit/>
+        </w:trPr>
+        <w:tc>
+          <w:tcPr>
+            <w:tcW w:type="dxa" w:w="700"/>
+            <w:tcBorders>
+              <w:top w:val="single" w:color="C9D4E0" w:sz="4"/>
+              <w:left w:val="single" w:color="C9D4E0" w:sz="4"/>
+              <w:bottom w:val="single" w:color="C9D4E0" w:sz="4"/>
+              <w:right w:val="single" w:color="C9D4E0" w:sz="4"/>
+            </w:tcBorders>
+            <w:tcMar>
+              <w:top w:type="dxa" w:w="70"/>
+              <w:left w:type="dxa" w:w="110"/>
+              <w:bottom w:type="dxa" w:w="70"/>
+              <w:right w:type="dxa" w:w="110"/>
+            </w:tcMar>
+          </w:tcPr>
+          <w:p>
+            <w:pPr>
+              <w:spacing w:after="30"/>
+            </w:pPr>
+            <w:r>
+              <w:rPr>
+                <w:rFonts w:ascii="Calibri" w:cs="Calibri" w:eastAsia="Calibri" w:hAnsi="Calibri"/>
+                <w:color w:val="222B36"/>
+                <w:sz w:val="19"/>
+                <w:szCs w:val="19"/>
+              </w:rPr>
+              <w:t xml:space="preserve">17</w:t>
+            </w:r>
+          </w:p>
+        </w:tc>
+        <w:tc>
+          <w:tcPr>
+            <w:tcW w:type="dxa" w:w="4300"/>
+            <w:tcBorders>
+              <w:top w:val="single" w:color="C9D4E0" w:sz="4"/>
+              <w:left w:val="single" w:color="C9D4E0" w:sz="4"/>
+              <w:bottom w:val="single" w:color="C9D4E0" w:sz="4"/>
+              <w:right w:val="single" w:color="C9D4E0" w:sz="4"/>
+            </w:tcBorders>
+            <w:tcMar>
+              <w:top w:type="dxa" w:w="70"/>
+              <w:left w:type="dxa" w:w="110"/>
+              <w:bottom w:type="dxa" w:w="70"/>
+              <w:right w:type="dxa" w:w="110"/>
+            </w:tcMar>
+          </w:tcPr>
+          <w:p>
+            <w:pPr>
+              <w:spacing w:after="30"/>
+            </w:pPr>
+            <w:r>
+              <w:rPr>
+                <w:rFonts w:ascii="Calibri" w:cs="Calibri" w:eastAsia="Calibri" w:hAnsi="Calibri"/>
+                <w:color w:val="222B36"/>
+                <w:sz w:val="19"/>
+                <w:szCs w:val="19"/>
+              </w:rPr>
+              <w:t xml:space="preserve">Comparer l'accueil au modèle de référence du client</w:t>
+            </w:r>
+          </w:p>
+        </w:tc>
+        <w:tc>
+          <w:tcPr>
+            <w:tcW w:type="dxa" w:w="4360"/>
+            <w:tcBorders>
+              <w:top w:val="single" w:color="C9D4E0" w:sz="4"/>
+              <w:left w:val="single" w:color="C9D4E0" w:sz="4"/>
+              <w:bottom w:val="single" w:color="C9D4E0" w:sz="4"/>
+              <w:right w:val="single" w:color="C9D4E0" w:sz="4"/>
+            </w:tcBorders>
+            <w:tcMar>
+              <w:top w:type="dxa" w:w="70"/>
+              <w:left w:type="dxa" w:w="110"/>
+              <w:bottom w:type="dxa" w:w="70"/>
+              <w:right w:type="dxa" w:w="110"/>
+            </w:tcMar>
+          </w:tcPr>
+          <w:p>
+            <w:pPr>
+              <w:spacing w:after="30"/>
+            </w:pPr>
+            <w:r>
+              <w:rPr>
+                <w:rFonts w:ascii="Calibri" w:cs="Calibri" w:eastAsia="Calibri" w:hAnsi="Calibri"/>
+                <w:color w:val="222B36"/>
+                <w:sz w:val="19"/>
+                <w:szCs w:val="19"/>
+              </w:rPr>
+              <w:t xml:space="preserve">Même structure : hero sombre, mosaïque 01 à 05, bloc clair, pied de page clair ; aucun doré mis en avant</w:t>
             </w:r>
           </w:p>
         </w:tc>
@@ -20027,7 +22372,7 @@
                 <w:sz w:val="19"/>
                 <w:szCs w:val="19"/>
               </w:rPr>
-              <w:t xml:space="preserve">Mot de passe administrateur partagé ou perdu</w:t>
+              <w:t xml:space="preserve">Mot de passe administrateur provisoire et très simple sur un site public</w:t>
             </w:r>
           </w:p>
         </w:tc>
@@ -20058,7 +22403,7 @@
                 <w:sz w:val="19"/>
                 <w:szCs w:val="19"/>
               </w:rPr>
-              <w:t xml:space="preserve">Accès non maîtrisé</w:t>
+              <w:t xml:space="preserve">Accès non maîtrisé à l'administration</w:t>
             </w:r>
           </w:p>
         </w:tc>
@@ -20089,7 +22434,206 @@
                 <w:sz w:val="19"/>
                 <w:szCs w:val="19"/>
               </w:rPr>
-              <w:t xml:space="preserve">Le changer dès la première connexion, créer des comptes nominatifs</w:t>
+              <w:t xml:space="preserve">Le remplacer avant le lancement officiel, créer des comptes nominatifs ; la limitation des essais de connexion est en place</w:t>
+            </w:r>
+          </w:p>
+        </w:tc>
+      </w:tr>
+      <w:tr>
+        <w:trPr>
+          <w:cantSplit/>
+        </w:trPr>
+        <w:tc>
+          <w:tcPr>
+            <w:tcW w:type="dxa" w:w="3300"/>
+            <w:tcBorders>
+              <w:top w:val="single" w:color="C9D4E0" w:sz="4"/>
+              <w:left w:val="single" w:color="C9D4E0" w:sz="4"/>
+              <w:bottom w:val="single" w:color="C9D4E0" w:sz="4"/>
+              <w:right w:val="single" w:color="C9D4E0" w:sz="4"/>
+            </w:tcBorders>
+            <w:shd w:fill="EEF2F7" w:color="auto" w:val="clear"/>
+            <w:tcMar>
+              <w:top w:type="dxa" w:w="70"/>
+              <w:left w:type="dxa" w:w="110"/>
+              <w:bottom w:type="dxa" w:w="70"/>
+              <w:right w:type="dxa" w:w="110"/>
+            </w:tcMar>
+          </w:tcPr>
+          <w:p>
+            <w:pPr>
+              <w:spacing w:after="30"/>
+            </w:pPr>
+            <w:r>
+              <w:rPr>
+                <w:rFonts w:ascii="Calibri" w:cs="Calibri" w:eastAsia="Calibri" w:hAnsi="Calibri"/>
+                <w:color w:val="222B36"/>
+                <w:sz w:val="19"/>
+                <w:szCs w:val="19"/>
+              </w:rPr>
+              <w:t xml:space="preserve">Traduction anglaise des contenus finaux rédigée sans validation</w:t>
+            </w:r>
+          </w:p>
+        </w:tc>
+        <w:tc>
+          <w:tcPr>
+            <w:tcW w:type="dxa" w:w="2700"/>
+            <w:tcBorders>
+              <w:top w:val="single" w:color="C9D4E0" w:sz="4"/>
+              <w:left w:val="single" w:color="C9D4E0" w:sz="4"/>
+              <w:bottom w:val="single" w:color="C9D4E0" w:sz="4"/>
+              <w:right w:val="single" w:color="C9D4E0" w:sz="4"/>
+            </w:tcBorders>
+            <w:shd w:fill="EEF2F7" w:color="auto" w:val="clear"/>
+            <w:tcMar>
+              <w:top w:type="dxa" w:w="70"/>
+              <w:left w:type="dxa" w:w="110"/>
+              <w:bottom w:type="dxa" w:w="70"/>
+              <w:right w:type="dxa" w:w="110"/>
+            </w:tcMar>
+          </w:tcPr>
+          <w:p>
+            <w:pPr>
+              <w:spacing w:after="30"/>
+            </w:pPr>
+            <w:r>
+              <w:rPr>
+                <w:rFonts w:ascii="Calibri" w:cs="Calibri" w:eastAsia="Calibri" w:hAnsi="Calibri"/>
+                <w:color w:val="222B36"/>
+                <w:sz w:val="19"/>
+                <w:szCs w:val="19"/>
+              </w:rPr>
+              <w:t xml:space="preserve">Terme ou ton inexact</w:t>
+            </w:r>
+          </w:p>
+        </w:tc>
+        <w:tc>
+          <w:tcPr>
+            <w:tcW w:type="dxa" w:w="3360"/>
+            <w:tcBorders>
+              <w:top w:val="single" w:color="C9D4E0" w:sz="4"/>
+              <w:left w:val="single" w:color="C9D4E0" w:sz="4"/>
+              <w:bottom w:val="single" w:color="C9D4E0" w:sz="4"/>
+              <w:right w:val="single" w:color="C9D4E0" w:sz="4"/>
+            </w:tcBorders>
+            <w:shd w:fill="EEF2F7" w:color="auto" w:val="clear"/>
+            <w:tcMar>
+              <w:top w:type="dxa" w:w="70"/>
+              <w:left w:type="dxa" w:w="110"/>
+              <w:bottom w:type="dxa" w:w="70"/>
+              <w:right w:type="dxa" w:w="110"/>
+            </w:tcMar>
+          </w:tcPr>
+          <w:p>
+            <w:pPr>
+              <w:spacing w:after="30"/>
+            </w:pPr>
+            <w:r>
+              <w:rPr>
+                <w:rFonts w:ascii="Calibri" w:cs="Calibri" w:eastAsia="Calibri" w:hAnsi="Calibri"/>
+                <w:color w:val="222B36"/>
+                <w:sz w:val="19"/>
+                <w:szCs w:val="19"/>
+              </w:rPr>
+              <w:t xml:space="preserve">Relecture par le client avant le lancement</w:t>
+            </w:r>
+          </w:p>
+        </w:tc>
+      </w:tr>
+      <w:tr>
+        <w:trPr>
+          <w:cantSplit/>
+        </w:trPr>
+        <w:tc>
+          <w:tcPr>
+            <w:tcW w:type="dxa" w:w="3300"/>
+            <w:tcBorders>
+              <w:top w:val="single" w:color="C9D4E0" w:sz="4"/>
+              <w:left w:val="single" w:color="C9D4E0" w:sz="4"/>
+              <w:bottom w:val="single" w:color="C9D4E0" w:sz="4"/>
+              <w:right w:val="single" w:color="C9D4E0" w:sz="4"/>
+            </w:tcBorders>
+            <w:tcMar>
+              <w:top w:type="dxa" w:w="70"/>
+              <w:left w:type="dxa" w:w="110"/>
+              <w:bottom w:type="dxa" w:w="70"/>
+              <w:right w:type="dxa" w:w="110"/>
+            </w:tcMar>
+          </w:tcPr>
+          <w:p>
+            <w:pPr>
+              <w:spacing w:after="30"/>
+            </w:pPr>
+            <w:r>
+              <w:rPr>
+                <w:rFonts w:ascii="Calibri" w:cs="Calibri" w:eastAsia="Calibri" w:hAnsi="Calibri"/>
+                <w:color w:val="222B36"/>
+                <w:sz w:val="19"/>
+                <w:szCs w:val="19"/>
+              </w:rPr>
+              <w:t xml:space="preserve">Phrase « offres installation, offres vie quotidienne » de la conciergerie</w:t>
+            </w:r>
+          </w:p>
+        </w:tc>
+        <w:tc>
+          <w:tcPr>
+            <w:tcW w:type="dxa" w:w="2700"/>
+            <w:tcBorders>
+              <w:top w:val="single" w:color="C9D4E0" w:sz="4"/>
+              <w:left w:val="single" w:color="C9D4E0" w:sz="4"/>
+              <w:bottom w:val="single" w:color="C9D4E0" w:sz="4"/>
+              <w:right w:val="single" w:color="C9D4E0" w:sz="4"/>
+            </w:tcBorders>
+            <w:tcMar>
+              <w:top w:type="dxa" w:w="70"/>
+              <w:left w:type="dxa" w:w="110"/>
+              <w:bottom w:type="dxa" w:w="70"/>
+              <w:right w:type="dxa" w:w="110"/>
+            </w:tcMar>
+          </w:tcPr>
+          <w:p>
+            <w:pPr>
+              <w:spacing w:after="30"/>
+            </w:pPr>
+            <w:r>
+              <w:rPr>
+                <w:rFonts w:ascii="Calibri" w:cs="Calibri" w:eastAsia="Calibri" w:hAnsi="Calibri"/>
+                <w:color w:val="222B36"/>
+                <w:sz w:val="19"/>
+                <w:szCs w:val="19"/>
+              </w:rPr>
+              <w:t xml:space="preserve">Offres annoncées mais non détaillées</w:t>
+            </w:r>
+          </w:p>
+        </w:tc>
+        <w:tc>
+          <w:tcPr>
+            <w:tcW w:type="dxa" w:w="3360"/>
+            <w:tcBorders>
+              <w:top w:val="single" w:color="C9D4E0" w:sz="4"/>
+              <w:left w:val="single" w:color="C9D4E0" w:sz="4"/>
+              <w:bottom w:val="single" w:color="C9D4E0" w:sz="4"/>
+              <w:right w:val="single" w:color="C9D4E0" w:sz="4"/>
+            </w:tcBorders>
+            <w:tcMar>
+              <w:top w:type="dxa" w:w="70"/>
+              <w:left w:type="dxa" w:w="110"/>
+              <w:bottom w:type="dxa" w:w="70"/>
+              <w:right w:type="dxa" w:w="110"/>
+            </w:tcMar>
+          </w:tcPr>
+          <w:p>
+            <w:pPr>
+              <w:spacing w:after="30"/>
+            </w:pPr>
+            <w:r>
+              <w:rPr>
+                <w:rFonts w:ascii="Calibri" w:cs="Calibri" w:eastAsia="Calibri" w:hAnsi="Calibri"/>
+                <w:color w:val="222B36"/>
+                <w:sz w:val="19"/>
+                <w:szCs w:val="19"/>
+              </w:rPr>
+              <w:t xml:space="preserve">Fournir le détail pour créer des cartes d'offres, ou retirer la phrase</w:t>
             </w:r>
           </w:p>
         </w:tc>
@@ -20664,6 +23208,142 @@
                 <w:szCs w:val="19"/>
               </w:rPr>
               <w:t xml:space="preserve">Grande image d'ouverture en haut de la page d'accueil</w:t>
+            </w:r>
+          </w:p>
+        </w:tc>
+      </w:tr>
+      <w:tr>
+        <w:trPr>
+          <w:cantSplit/>
+        </w:trPr>
+        <w:tc>
+          <w:tcPr>
+            <w:tcW w:type="dxa" w:w="2600"/>
+            <w:tcBorders>
+              <w:top w:val="single" w:color="C9D4E0" w:sz="4"/>
+              <w:left w:val="single" w:color="C9D4E0" w:sz="4"/>
+              <w:bottom w:val="single" w:color="C9D4E0" w:sz="4"/>
+              <w:right w:val="single" w:color="C9D4E0" w:sz="4"/>
+            </w:tcBorders>
+            <w:shd w:fill="EEF2F7" w:color="auto" w:val="clear"/>
+            <w:tcMar>
+              <w:top w:type="dxa" w:w="70"/>
+              <w:left w:type="dxa" w:w="110"/>
+              <w:bottom w:type="dxa" w:w="70"/>
+              <w:right w:type="dxa" w:w="110"/>
+            </w:tcMar>
+          </w:tcPr>
+          <w:p>
+            <w:pPr>
+              <w:spacing w:after="30"/>
+            </w:pPr>
+            <w:r>
+              <w:rPr>
+                <w:rFonts w:ascii="Calibri" w:cs="Calibri" w:eastAsia="Calibri" w:hAnsi="Calibri"/>
+                <w:color w:val="222B36"/>
+                <w:sz w:val="19"/>
+                <w:szCs w:val="19"/>
+              </w:rPr>
+              <w:t xml:space="preserve">Tuile</w:t>
+            </w:r>
+          </w:p>
+        </w:tc>
+        <w:tc>
+          <w:tcPr>
+            <w:tcW w:type="dxa" w:w="6760"/>
+            <w:tcBorders>
+              <w:top w:val="single" w:color="C9D4E0" w:sz="4"/>
+              <w:left w:val="single" w:color="C9D4E0" w:sz="4"/>
+              <w:bottom w:val="single" w:color="C9D4E0" w:sz="4"/>
+              <w:right w:val="single" w:color="C9D4E0" w:sz="4"/>
+            </w:tcBorders>
+            <w:shd w:fill="EEF2F7" w:color="auto" w:val="clear"/>
+            <w:tcMar>
+              <w:top w:type="dxa" w:w="70"/>
+              <w:left w:type="dxa" w:w="110"/>
+              <w:bottom w:type="dxa" w:w="70"/>
+              <w:right w:type="dxa" w:w="110"/>
+            </w:tcMar>
+          </w:tcPr>
+          <w:p>
+            <w:pPr>
+              <w:spacing w:after="30"/>
+            </w:pPr>
+            <w:r>
+              <w:rPr>
+                <w:rFonts w:ascii="Calibri" w:cs="Calibri" w:eastAsia="Calibri" w:hAnsi="Calibri"/>
+                <w:color w:val="222B36"/>
+                <w:sz w:val="19"/>
+                <w:szCs w:val="19"/>
+              </w:rPr>
+              <w:t xml:space="preserve">Bloc rectangulaire numéroté de la page d'accueil (services, flotte, à propos)</w:t>
+            </w:r>
+          </w:p>
+        </w:tc>
+      </w:tr>
+      <w:tr>
+        <w:trPr>
+          <w:cantSplit/>
+        </w:trPr>
+        <w:tc>
+          <w:tcPr>
+            <w:tcW w:type="dxa" w:w="2600"/>
+            <w:tcBorders>
+              <w:top w:val="single" w:color="C9D4E0" w:sz="4"/>
+              <w:left w:val="single" w:color="C9D4E0" w:sz="4"/>
+              <w:bottom w:val="single" w:color="C9D4E0" w:sz="4"/>
+              <w:right w:val="single" w:color="C9D4E0" w:sz="4"/>
+            </w:tcBorders>
+            <w:tcMar>
+              <w:top w:type="dxa" w:w="70"/>
+              <w:left w:type="dxa" w:w="110"/>
+              <w:bottom w:type="dxa" w:w="70"/>
+              <w:right w:type="dxa" w:w="110"/>
+            </w:tcMar>
+          </w:tcPr>
+          <w:p>
+            <w:pPr>
+              <w:spacing w:after="30"/>
+            </w:pPr>
+            <w:r>
+              <w:rPr>
+                <w:rFonts w:ascii="Calibri" w:cs="Calibri" w:eastAsia="Calibri" w:hAnsi="Calibri"/>
+                <w:color w:val="222B36"/>
+                <w:sz w:val="19"/>
+                <w:szCs w:val="19"/>
+              </w:rPr>
+              <w:t xml:space="preserve">Migration</w:t>
+            </w:r>
+          </w:p>
+        </w:tc>
+        <w:tc>
+          <w:tcPr>
+            <w:tcW w:type="dxa" w:w="6760"/>
+            <w:tcBorders>
+              <w:top w:val="single" w:color="C9D4E0" w:sz="4"/>
+              <w:left w:val="single" w:color="C9D4E0" w:sz="4"/>
+              <w:bottom w:val="single" w:color="C9D4E0" w:sz="4"/>
+              <w:right w:val="single" w:color="C9D4E0" w:sz="4"/>
+            </w:tcBorders>
+            <w:tcMar>
+              <w:top w:type="dxa" w:w="70"/>
+              <w:left w:type="dxa" w:w="110"/>
+              <w:bottom w:type="dxa" w:w="70"/>
+              <w:right w:type="dxa" w:w="110"/>
+            </w:tcMar>
+          </w:tcPr>
+          <w:p>
+            <w:pPr>
+              <w:spacing w:after="30"/>
+            </w:pPr>
+            <w:r>
+              <w:rPr>
+                <w:rFonts w:ascii="Calibri" w:cs="Calibri" w:eastAsia="Calibri" w:hAnsi="Calibri"/>
+                <w:color w:val="222B36"/>
+                <w:sz w:val="19"/>
+                <w:szCs w:val="19"/>
+              </w:rPr>
+              <w:t xml:space="preserve">Mise à jour de la base de données appliquée une seule fois</w:t>
             </w:r>
           </w:p>
         </w:tc>

</xml_diff>

<commit_message>
Flotte finale : 4 vehicules detoures, textes corriges du client
- Photos detourees du dossier Fiara (WebP transparent) : Prado TLX, Wrangler Rubicon, Hilux Double Cab Executive, Nissan Terra
- Textes corriges (accroche et description) en francais et en anglais, migration unique fleet_v3 ; anciens vehicules masques, pas supprimes
- Page Flotte : accroche et description affichees, voiture et texte sur des colonnes separees, ombre portee au sol, projecteur doux
- Cahier des charges 2.1

Co-Authored-By: Claude Sonnet 5.5 <noreply@anthropic.com>
</commit_message>
<xml_diff>
--- a/docs/CAHIER-DES-CHARGES.docx
+++ b/docs/CAHIER-DES-CHARGES.docx
@@ -81,7 +81,7 @@
           <w:sz w:val="21"/>
           <w:szCs w:val="21"/>
         </w:rPr>
-        <w:t xml:space="preserve">Version 2.0</w:t>
+        <w:t xml:space="preserve">Version 2.1</w:t>
       </w:r>
     </w:p>
     <w:p>
@@ -774,6 +774,106 @@
                 <w:sz w:val="19"/>
                 <w:szCs w:val="19"/>
               </w:rPr>
+              <w:t xml:space="preserve">2.1</w:t>
+            </w:r>
+          </w:p>
+        </w:tc>
+        <w:tc>
+          <w:tcPr>
+            <w:tcW w:type="dxa" w:w="1900"/>
+            <w:tcBorders>
+              <w:top w:val="single" w:color="C9D4E0" w:sz="4"/>
+              <w:left w:val="single" w:color="C9D4E0" w:sz="4"/>
+              <w:bottom w:val="single" w:color="C9D4E0" w:sz="4"/>
+              <w:right w:val="single" w:color="C9D4E0" w:sz="4"/>
+            </w:tcBorders>
+            <w:shd w:fill="EEF2F7" w:color="auto" w:val="clear"/>
+            <w:tcMar>
+              <w:top w:type="dxa" w:w="70"/>
+              <w:left w:type="dxa" w:w="110"/>
+              <w:bottom w:type="dxa" w:w="70"/>
+              <w:right w:type="dxa" w:w="110"/>
+            </w:tcMar>
+          </w:tcPr>
+          <w:p>
+            <w:pPr>
+              <w:spacing w:after="30"/>
+            </w:pPr>
+            <w:r>
+              <w:rPr>
+                <w:rFonts w:ascii="Calibri" w:cs="Calibri" w:eastAsia="Calibri" w:hAnsi="Calibri"/>
+                <w:color w:val="222B36"/>
+                <w:sz w:val="19"/>
+                <w:szCs w:val="19"/>
+              </w:rPr>
+              <w:t xml:space="preserve">12 octobre 2026</w:t>
+            </w:r>
+          </w:p>
+        </w:tc>
+        <w:tc>
+          <w:tcPr>
+            <w:tcW w:type="dxa" w:w="6360"/>
+            <w:tcBorders>
+              <w:top w:val="single" w:color="C9D4E0" w:sz="4"/>
+              <w:left w:val="single" w:color="C9D4E0" w:sz="4"/>
+              <w:bottom w:val="single" w:color="C9D4E0" w:sz="4"/>
+              <w:right w:val="single" w:color="C9D4E0" w:sz="4"/>
+            </w:tcBorders>
+            <w:shd w:fill="EEF2F7" w:color="auto" w:val="clear"/>
+            <w:tcMar>
+              <w:top w:type="dxa" w:w="70"/>
+              <w:left w:type="dxa" w:w="110"/>
+              <w:bottom w:type="dxa" w:w="70"/>
+              <w:right w:type="dxa" w:w="110"/>
+            </w:tcMar>
+          </w:tcPr>
+          <w:p>
+            <w:pPr>
+              <w:spacing w:after="30"/>
+            </w:pPr>
+            <w:r>
+              <w:rPr>
+                <w:rFonts w:ascii="Calibri" w:cs="Calibri" w:eastAsia="Calibri" w:hAnsi="Calibri"/>
+                <w:color w:val="222B36"/>
+                <w:sz w:val="19"/>
+                <w:szCs w:val="19"/>
+              </w:rPr>
+              <w:t xml:space="preserve">Flotte finale du client : quatre véhicules (Toyota Prado TLX, Jeep Wrangler Rubicon, Toyota Hilux Double Cab Executive, Nissan Terra) avec textes corrigés et photos détourées ; accroche et description affichées sur la page Flotte.</w:t>
+            </w:r>
+          </w:p>
+        </w:tc>
+      </w:tr>
+      <w:tr>
+        <w:trPr>
+          <w:cantSplit/>
+        </w:trPr>
+        <w:tc>
+          <w:tcPr>
+            <w:tcW w:type="dxa" w:w="1100"/>
+            <w:tcBorders>
+              <w:top w:val="single" w:color="C9D4E0" w:sz="4"/>
+              <w:left w:val="single" w:color="C9D4E0" w:sz="4"/>
+              <w:bottom w:val="single" w:color="C9D4E0" w:sz="4"/>
+              <w:right w:val="single" w:color="C9D4E0" w:sz="4"/>
+            </w:tcBorders>
+            <w:tcMar>
+              <w:top w:type="dxa" w:w="70"/>
+              <w:left w:type="dxa" w:w="110"/>
+              <w:bottom w:type="dxa" w:w="70"/>
+              <w:right w:type="dxa" w:w="110"/>
+            </w:tcMar>
+          </w:tcPr>
+          <w:p>
+            <w:pPr>
+              <w:spacing w:after="30"/>
+            </w:pPr>
+            <w:r>
+              <w:rPr>
+                <w:rFonts w:ascii="Calibri" w:cs="Calibri" w:eastAsia="Calibri" w:hAnsi="Calibri"/>
+                <w:color w:val="222B36"/>
+                <w:sz w:val="19"/>
+                <w:szCs w:val="19"/>
+              </w:rPr>
               <w:t xml:space="preserve">2.0</w:t>
             </w:r>
           </w:p>
@@ -787,7 +887,6 @@
               <w:bottom w:val="single" w:color="C9D4E0" w:sz="4"/>
               <w:right w:val="single" w:color="C9D4E0" w:sz="4"/>
             </w:tcBorders>
-            <w:shd w:fill="EEF2F7" w:color="auto" w:val="clear"/>
             <w:tcMar>
               <w:top w:type="dxa" w:w="70"/>
               <w:left w:type="dxa" w:w="110"/>
@@ -819,7 +918,6 @@
               <w:bottom w:val="single" w:color="C9D4E0" w:sz="4"/>
               <w:right w:val="single" w:color="C9D4E0" w:sz="4"/>
             </w:tcBorders>
-            <w:shd w:fill="EEF2F7" w:color="auto" w:val="clear"/>
             <w:tcMar>
               <w:top w:type="dxa" w:w="70"/>
               <w:left w:type="dxa" w:w="110"/>
@@ -2069,7 +2167,7 @@
           <w:sz w:val="26"/>
           <w:szCs w:val="26"/>
         </w:rPr>
-        <w:t xml:space="preserve">1.4 Flotte actuelle</w:t>
+        <w:t xml:space="preserve">1.4 Flotte (version finale du client)</w:t>
       </w:r>
     </w:p>
     <w:tbl>
@@ -2085,11 +2183,11 @@
         </w:tblBorders>
       </w:tblPr>
       <w:tblGrid>
-        <w:gridCol w:w="2500"/>
+        <w:gridCol w:w="2900"/>
         <w:gridCol w:w="1900"/>
         <w:gridCol w:w="1000"/>
         <w:gridCol w:w="900"/>
-        <w:gridCol w:w="3060"/>
+        <w:gridCol w:w="2660"/>
       </w:tblGrid>
       <w:tr>
         <w:trPr>
@@ -2097,7 +2195,7 @@
         </w:trPr>
         <w:tc>
           <w:tcPr>
-            <w:tcW w:type="dxa" w:w="2500"/>
+            <w:tcW w:type="dxa" w:w="2900"/>
             <w:tcBorders>
               <w:top w:val="single" w:color="C9D4E0" w:sz="4"/>
               <w:left w:val="single" w:color="C9D4E0" w:sz="4"/>
@@ -2233,7 +2331,7 @@
         </w:tc>
         <w:tc>
           <w:tcPr>
-            <w:tcW w:type="dxa" w:w="3060"/>
+            <w:tcW w:type="dxa" w:w="2660"/>
             <w:tcBorders>
               <w:top w:val="single" w:color="C9D4E0" w:sz="4"/>
               <w:left w:val="single" w:color="C9D4E0" w:sz="4"/>
@@ -2261,7 +2359,7 @@
                 <w:sz w:val="19"/>
                 <w:szCs w:val="19"/>
               </w:rPr>
-              <w:t xml:space="preserve">Usage recommandé</w:t>
+              <w:t xml:space="preserve">Accroche</w:t>
             </w:r>
           </w:p>
         </w:tc>
@@ -2272,7 +2370,7 @@
         </w:trPr>
         <w:tc>
           <w:tcPr>
-            <w:tcW w:type="dxa" w:w="2500"/>
+            <w:tcW w:type="dxa" w:w="2900"/>
             <w:tcBorders>
               <w:top w:val="single" w:color="C9D4E0" w:sz="4"/>
               <w:left w:val="single" w:color="C9D4E0" w:sz="4"/>
@@ -2396,32 +2494,32 @@
         </w:tc>
         <w:tc>
           <w:tcPr>
-            <w:tcW w:type="dxa" w:w="3060"/>
-            <w:tcBorders>
-              <w:top w:val="single" w:color="C9D4E0" w:sz="4"/>
-              <w:left w:val="single" w:color="C9D4E0" w:sz="4"/>
-              <w:bottom w:val="single" w:color="C9D4E0" w:sz="4"/>
-              <w:right w:val="single" w:color="C9D4E0" w:sz="4"/>
-            </w:tcBorders>
-            <w:tcMar>
-              <w:top w:type="dxa" w:w="70"/>
-              <w:left w:type="dxa" w:w="110"/>
-              <w:bottom w:type="dxa" w:w="70"/>
-              <w:right w:type="dxa" w:w="110"/>
-            </w:tcMar>
-          </w:tcPr>
-          <w:p>
-            <w:pPr>
-              <w:spacing w:after="30"/>
-            </w:pPr>
-            <w:r>
-              <w:rPr>
-                <w:rFonts w:ascii="Calibri" w:cs="Calibri" w:eastAsia="Calibri" w:hAnsi="Calibri"/>
-                <w:color w:val="222B36"/>
-                <w:sz w:val="19"/>
-                <w:szCs w:val="19"/>
-              </w:rPr>
-              <w:t xml:space="preserve">Familles, longues distances, personnalités</w:t>
+            <w:tcW w:type="dxa" w:w="2660"/>
+            <w:tcBorders>
+              <w:top w:val="single" w:color="C9D4E0" w:sz="4"/>
+              <w:left w:val="single" w:color="C9D4E0" w:sz="4"/>
+              <w:bottom w:val="single" w:color="C9D4E0" w:sz="4"/>
+              <w:right w:val="single" w:color="C9D4E0" w:sz="4"/>
+            </w:tcBorders>
+            <w:tcMar>
+              <w:top w:type="dxa" w:w="70"/>
+              <w:left w:type="dxa" w:w="110"/>
+              <w:bottom w:type="dxa" w:w="70"/>
+              <w:right w:type="dxa" w:w="110"/>
+            </w:tcMar>
+          </w:tcPr>
+          <w:p>
+            <w:pPr>
+              <w:spacing w:after="30"/>
+            </w:pPr>
+            <w:r>
+              <w:rPr>
+                <w:rFonts w:ascii="Calibri" w:cs="Calibri" w:eastAsia="Calibri" w:hAnsi="Calibri"/>
+                <w:color w:val="222B36"/>
+                <w:sz w:val="19"/>
+                <w:szCs w:val="19"/>
+              </w:rPr>
+              <w:t xml:space="preserve">Puissance. Élégance. Confiance absolue.</w:t>
             </w:r>
           </w:p>
         </w:tc>
@@ -2432,33 +2530,33 @@
         </w:trPr>
         <w:tc>
           <w:tcPr>
-            <w:tcW w:type="dxa" w:w="2500"/>
-            <w:tcBorders>
-              <w:top w:val="single" w:color="C9D4E0" w:sz="4"/>
-              <w:left w:val="single" w:color="C9D4E0" w:sz="4"/>
-              <w:bottom w:val="single" w:color="C9D4E0" w:sz="4"/>
-              <w:right w:val="single" w:color="C9D4E0" w:sz="4"/>
-            </w:tcBorders>
-            <w:shd w:fill="EEF2F7" w:color="auto" w:val="clear"/>
-            <w:tcMar>
-              <w:top w:type="dxa" w:w="70"/>
-              <w:left w:type="dxa" w:w="110"/>
-              <w:bottom w:type="dxa" w:w="70"/>
-              <w:right w:type="dxa" w:w="110"/>
-            </w:tcMar>
-          </w:tcPr>
-          <w:p>
-            <w:pPr>
-              <w:spacing w:after="30"/>
-            </w:pPr>
-            <w:r>
-              <w:rPr>
-                <w:rFonts w:ascii="Calibri" w:cs="Calibri" w:eastAsia="Calibri" w:hAnsi="Calibri"/>
-                <w:color w:val="222B36"/>
-                <w:sz w:val="19"/>
-                <w:szCs w:val="19"/>
-              </w:rPr>
-              <w:t xml:space="preserve">Ford Everest XLT</w:t>
+            <w:tcW w:type="dxa" w:w="2900"/>
+            <w:tcBorders>
+              <w:top w:val="single" w:color="C9D4E0" w:sz="4"/>
+              <w:left w:val="single" w:color="C9D4E0" w:sz="4"/>
+              <w:bottom w:val="single" w:color="C9D4E0" w:sz="4"/>
+              <w:right w:val="single" w:color="C9D4E0" w:sz="4"/>
+            </w:tcBorders>
+            <w:shd w:fill="EEF2F7" w:color="auto" w:val="clear"/>
+            <w:tcMar>
+              <w:top w:type="dxa" w:w="70"/>
+              <w:left w:type="dxa" w:w="110"/>
+              <w:bottom w:type="dxa" w:w="70"/>
+              <w:right w:type="dxa" w:w="110"/>
+            </w:tcMar>
+          </w:tcPr>
+          <w:p>
+            <w:pPr>
+              <w:spacing w:after="30"/>
+            </w:pPr>
+            <w:r>
+              <w:rPr>
+                <w:rFonts w:ascii="Calibri" w:cs="Calibri" w:eastAsia="Calibri" w:hAnsi="Calibri"/>
+                <w:color w:val="222B36"/>
+                <w:sz w:val="19"/>
+                <w:szCs w:val="19"/>
+              </w:rPr>
+              <w:t xml:space="preserve">Jeep Wrangler Rubicon</w:t>
             </w:r>
           </w:p>
         </w:tc>
@@ -2490,7 +2588,7 @@
                 <w:sz w:val="19"/>
                 <w:szCs w:val="19"/>
               </w:rPr>
-              <w:t xml:space="preserve">Premium SUV</w:t>
+              <w:t xml:space="preserve">4×4 / Field Mobility</w:t>
             </w:r>
           </w:p>
         </w:tc>
@@ -2522,7 +2620,7 @@
                 <w:sz w:val="19"/>
                 <w:szCs w:val="19"/>
               </w:rPr>
-              <w:t xml:space="preserve">7</w:t>
+              <w:t xml:space="preserve">4</w:t>
             </w:r>
           </w:p>
         </w:tc>
@@ -2554,39 +2652,39 @@
                 <w:sz w:val="19"/>
                 <w:szCs w:val="19"/>
               </w:rPr>
-              <w:t xml:space="preserve">4</w:t>
-            </w:r>
-          </w:p>
-        </w:tc>
-        <w:tc>
-          <w:tcPr>
-            <w:tcW w:type="dxa" w:w="3060"/>
-            <w:tcBorders>
-              <w:top w:val="single" w:color="C9D4E0" w:sz="4"/>
-              <w:left w:val="single" w:color="C9D4E0" w:sz="4"/>
-              <w:bottom w:val="single" w:color="C9D4E0" w:sz="4"/>
-              <w:right w:val="single" w:color="C9D4E0" w:sz="4"/>
-            </w:tcBorders>
-            <w:shd w:fill="EEF2F7" w:color="auto" w:val="clear"/>
-            <w:tcMar>
-              <w:top w:type="dxa" w:w="70"/>
-              <w:left w:type="dxa" w:w="110"/>
-              <w:bottom w:type="dxa" w:w="70"/>
-              <w:right w:type="dxa" w:w="110"/>
-            </w:tcMar>
-          </w:tcPr>
-          <w:p>
-            <w:pPr>
-              <w:spacing w:after="30"/>
-            </w:pPr>
-            <w:r>
-              <w:rPr>
-                <w:rFonts w:ascii="Calibri" w:cs="Calibri" w:eastAsia="Calibri" w:hAnsi="Calibri"/>
-                <w:color w:val="222B36"/>
-                <w:sz w:val="19"/>
-                <w:szCs w:val="19"/>
-              </w:rPr>
-              <w:t xml:space="preserve">Voyages en famille, excursions</w:t>
+              <w:t xml:space="preserve">2</w:t>
+            </w:r>
+          </w:p>
+        </w:tc>
+        <w:tc>
+          <w:tcPr>
+            <w:tcW w:type="dxa" w:w="2660"/>
+            <w:tcBorders>
+              <w:top w:val="single" w:color="C9D4E0" w:sz="4"/>
+              <w:left w:val="single" w:color="C9D4E0" w:sz="4"/>
+              <w:bottom w:val="single" w:color="C9D4E0" w:sz="4"/>
+              <w:right w:val="single" w:color="C9D4E0" w:sz="4"/>
+            </w:tcBorders>
+            <w:shd w:fill="EEF2F7" w:color="auto" w:val="clear"/>
+            <w:tcMar>
+              <w:top w:type="dxa" w:w="70"/>
+              <w:left w:type="dxa" w:w="110"/>
+              <w:bottom w:type="dxa" w:w="70"/>
+              <w:right w:type="dxa" w:w="110"/>
+            </w:tcMar>
+          </w:tcPr>
+          <w:p>
+            <w:pPr>
+              <w:spacing w:after="30"/>
+            </w:pPr>
+            <w:r>
+              <w:rPr>
+                <w:rFonts w:ascii="Calibri" w:cs="Calibri" w:eastAsia="Calibri" w:hAnsi="Calibri"/>
+                <w:color w:val="222B36"/>
+                <w:sz w:val="19"/>
+                <w:szCs w:val="19"/>
+              </w:rPr>
+              <w:t xml:space="preserve">Dominateur des routes • Roi des sentiers</w:t>
             </w:r>
           </w:p>
         </w:tc>
@@ -2597,32 +2695,32 @@
         </w:trPr>
         <w:tc>
           <w:tcPr>
-            <w:tcW w:type="dxa" w:w="2500"/>
-            <w:tcBorders>
-              <w:top w:val="single" w:color="C9D4E0" w:sz="4"/>
-              <w:left w:val="single" w:color="C9D4E0" w:sz="4"/>
-              <w:bottom w:val="single" w:color="C9D4E0" w:sz="4"/>
-              <w:right w:val="single" w:color="C9D4E0" w:sz="4"/>
-            </w:tcBorders>
-            <w:tcMar>
-              <w:top w:type="dxa" w:w="70"/>
-              <w:left w:type="dxa" w:w="110"/>
-              <w:bottom w:type="dxa" w:w="70"/>
-              <w:right w:type="dxa" w:w="110"/>
-            </w:tcMar>
-          </w:tcPr>
-          <w:p>
-            <w:pPr>
-              <w:spacing w:after="30"/>
-            </w:pPr>
-            <w:r>
-              <w:rPr>
-                <w:rFonts w:ascii="Calibri" w:cs="Calibri" w:eastAsia="Calibri" w:hAnsi="Calibri"/>
-                <w:color w:val="222B36"/>
-                <w:sz w:val="19"/>
-                <w:szCs w:val="19"/>
-              </w:rPr>
-              <w:t xml:space="preserve">Jeep Wrangler Rubicon</w:t>
+            <w:tcW w:type="dxa" w:w="2900"/>
+            <w:tcBorders>
+              <w:top w:val="single" w:color="C9D4E0" w:sz="4"/>
+              <w:left w:val="single" w:color="C9D4E0" w:sz="4"/>
+              <w:bottom w:val="single" w:color="C9D4E0" w:sz="4"/>
+              <w:right w:val="single" w:color="C9D4E0" w:sz="4"/>
+            </w:tcBorders>
+            <w:tcMar>
+              <w:top w:type="dxa" w:w="70"/>
+              <w:left w:type="dxa" w:w="110"/>
+              <w:bottom w:type="dxa" w:w="70"/>
+              <w:right w:type="dxa" w:w="110"/>
+            </w:tcMar>
+          </w:tcPr>
+          <w:p>
+            <w:pPr>
+              <w:spacing w:after="30"/>
+            </w:pPr>
+            <w:r>
+              <w:rPr>
+                <w:rFonts w:ascii="Calibri" w:cs="Calibri" w:eastAsia="Calibri" w:hAnsi="Calibri"/>
+                <w:color w:val="222B36"/>
+                <w:sz w:val="19"/>
+                <w:szCs w:val="19"/>
+              </w:rPr>
+              <w:t xml:space="preserve">Toyota Hilux Double Cab Executive</w:t>
             </w:r>
           </w:p>
         </w:tc>
@@ -2684,7 +2782,7 @@
                 <w:sz w:val="19"/>
                 <w:szCs w:val="19"/>
               </w:rPr>
-              <w:t xml:space="preserve">4</w:t>
+              <w:t xml:space="preserve">5</w:t>
             </w:r>
           </w:p>
         </w:tc>
@@ -2715,38 +2813,38 @@
                 <w:sz w:val="19"/>
                 <w:szCs w:val="19"/>
               </w:rPr>
-              <w:t xml:space="preserve">2</w:t>
-            </w:r>
-          </w:p>
-        </w:tc>
-        <w:tc>
-          <w:tcPr>
-            <w:tcW w:type="dxa" w:w="3060"/>
-            <w:tcBorders>
-              <w:top w:val="single" w:color="C9D4E0" w:sz="4"/>
-              <w:left w:val="single" w:color="C9D4E0" w:sz="4"/>
-              <w:bottom w:val="single" w:color="C9D4E0" w:sz="4"/>
-              <w:right w:val="single" w:color="C9D4E0" w:sz="4"/>
-            </w:tcBorders>
-            <w:tcMar>
-              <w:top w:type="dxa" w:w="70"/>
-              <w:left w:type="dxa" w:w="110"/>
-              <w:bottom w:type="dxa" w:w="70"/>
-              <w:right w:type="dxa" w:w="110"/>
-            </w:tcMar>
-          </w:tcPr>
-          <w:p>
-            <w:pPr>
-              <w:spacing w:after="30"/>
-            </w:pPr>
-            <w:r>
-              <w:rPr>
-                <w:rFonts w:ascii="Calibri" w:cs="Calibri" w:eastAsia="Calibri" w:hAnsi="Calibri"/>
-                <w:color w:val="222B36"/>
-                <w:sz w:val="19"/>
-                <w:szCs w:val="19"/>
-              </w:rPr>
-              <w:t xml:space="preserve">Aventure, tout-terrain, séjours privés</w:t>
+              <w:t xml:space="preserve">3</w:t>
+            </w:r>
+          </w:p>
+        </w:tc>
+        <w:tc>
+          <w:tcPr>
+            <w:tcW w:type="dxa" w:w="2660"/>
+            <w:tcBorders>
+              <w:top w:val="single" w:color="C9D4E0" w:sz="4"/>
+              <w:left w:val="single" w:color="C9D4E0" w:sz="4"/>
+              <w:bottom w:val="single" w:color="C9D4E0" w:sz="4"/>
+              <w:right w:val="single" w:color="C9D4E0" w:sz="4"/>
+            </w:tcBorders>
+            <w:tcMar>
+              <w:top w:type="dxa" w:w="70"/>
+              <w:left w:type="dxa" w:w="110"/>
+              <w:bottom w:type="dxa" w:w="70"/>
+              <w:right w:type="dxa" w:w="110"/>
+            </w:tcMar>
+          </w:tcPr>
+          <w:p>
+            <w:pPr>
+              <w:spacing w:after="30"/>
+            </w:pPr>
+            <w:r>
+              <w:rPr>
+                <w:rFonts w:ascii="Calibri" w:cs="Calibri" w:eastAsia="Calibri" w:hAnsi="Calibri"/>
+                <w:color w:val="222B36"/>
+                <w:sz w:val="19"/>
+                <w:szCs w:val="19"/>
+              </w:rPr>
+              <w:t xml:space="preserve">Robuste par nature • Fiable par excellence</w:t>
             </w:r>
           </w:p>
         </w:tc>
@@ -2757,33 +2855,33 @@
         </w:trPr>
         <w:tc>
           <w:tcPr>
-            <w:tcW w:type="dxa" w:w="2500"/>
-            <w:tcBorders>
-              <w:top w:val="single" w:color="C9D4E0" w:sz="4"/>
-              <w:left w:val="single" w:color="C9D4E0" w:sz="4"/>
-              <w:bottom w:val="single" w:color="C9D4E0" w:sz="4"/>
-              <w:right w:val="single" w:color="C9D4E0" w:sz="4"/>
-            </w:tcBorders>
-            <w:shd w:fill="EEF2F7" w:color="auto" w:val="clear"/>
-            <w:tcMar>
-              <w:top w:type="dxa" w:w="70"/>
-              <w:left w:type="dxa" w:w="110"/>
-              <w:bottom w:type="dxa" w:w="70"/>
-              <w:right w:type="dxa" w:w="110"/>
-            </w:tcMar>
-          </w:tcPr>
-          <w:p>
-            <w:pPr>
-              <w:spacing w:after="30"/>
-            </w:pPr>
-            <w:r>
-              <w:rPr>
-                <w:rFonts w:ascii="Calibri" w:cs="Calibri" w:eastAsia="Calibri" w:hAnsi="Calibri"/>
-                <w:color w:val="222B36"/>
-                <w:sz w:val="19"/>
-                <w:szCs w:val="19"/>
-              </w:rPr>
-              <w:t xml:space="preserve">Toyota Land Cruiser 76</w:t>
+            <w:tcW w:type="dxa" w:w="2900"/>
+            <w:tcBorders>
+              <w:top w:val="single" w:color="C9D4E0" w:sz="4"/>
+              <w:left w:val="single" w:color="C9D4E0" w:sz="4"/>
+              <w:bottom w:val="single" w:color="C9D4E0" w:sz="4"/>
+              <w:right w:val="single" w:color="C9D4E0" w:sz="4"/>
+            </w:tcBorders>
+            <w:shd w:fill="EEF2F7" w:color="auto" w:val="clear"/>
+            <w:tcMar>
+              <w:top w:type="dxa" w:w="70"/>
+              <w:left w:type="dxa" w:w="110"/>
+              <w:bottom w:type="dxa" w:w="70"/>
+              <w:right w:type="dxa" w:w="110"/>
+            </w:tcMar>
+          </w:tcPr>
+          <w:p>
+            <w:pPr>
+              <w:spacing w:after="30"/>
+            </w:pPr>
+            <w:r>
+              <w:rPr>
+                <w:rFonts w:ascii="Calibri" w:cs="Calibri" w:eastAsia="Calibri" w:hAnsi="Calibri"/>
+                <w:color w:val="222B36"/>
+                <w:sz w:val="19"/>
+                <w:szCs w:val="19"/>
+              </w:rPr>
+              <w:t xml:space="preserve">Nissan Terra</w:t>
             </w:r>
           </w:p>
         </w:tc>
@@ -2815,7 +2913,7 @@
                 <w:sz w:val="19"/>
                 <w:szCs w:val="19"/>
               </w:rPr>
-              <w:t xml:space="preserve">4×4 / Field Mobility</w:t>
+              <w:t xml:space="preserve">Premium SUV</w:t>
             </w:r>
           </w:p>
         </w:tc>
@@ -2847,7 +2945,7 @@
                 <w:sz w:val="19"/>
                 <w:szCs w:val="19"/>
               </w:rPr>
-              <w:t xml:space="preserve">5</w:t>
+              <w:t xml:space="preserve">7</w:t>
             </w:r>
           </w:p>
         </w:tc>
@@ -2879,364 +2977,39 @@
                 <w:sz w:val="19"/>
                 <w:szCs w:val="19"/>
               </w:rPr>
-              <w:t xml:space="preserve">4</w:t>
-            </w:r>
-          </w:p>
-        </w:tc>
-        <w:tc>
-          <w:tcPr>
-            <w:tcW w:type="dxa" w:w="3060"/>
-            <w:tcBorders>
-              <w:top w:val="single" w:color="C9D4E0" w:sz="4"/>
-              <w:left w:val="single" w:color="C9D4E0" w:sz="4"/>
-              <w:bottom w:val="single" w:color="C9D4E0" w:sz="4"/>
-              <w:right w:val="single" w:color="C9D4E0" w:sz="4"/>
-            </w:tcBorders>
-            <w:shd w:fill="EEF2F7" w:color="auto" w:val="clear"/>
-            <w:tcMar>
-              <w:top w:type="dxa" w:w="70"/>
-              <w:left w:type="dxa" w:w="110"/>
-              <w:bottom w:type="dxa" w:w="70"/>
-              <w:right w:type="dxa" w:w="110"/>
-            </w:tcMar>
-          </w:tcPr>
-          <w:p>
-            <w:pPr>
-              <w:spacing w:after="30"/>
-            </w:pPr>
-            <w:r>
-              <w:rPr>
-                <w:rFonts w:ascii="Calibri" w:cs="Calibri" w:eastAsia="Calibri" w:hAnsi="Calibri"/>
-                <w:color w:val="222B36"/>
-                <w:sz w:val="19"/>
-                <w:szCs w:val="19"/>
-              </w:rPr>
-              <w:t xml:space="preserve">Missions terrain, circuits, VIP</w:t>
-            </w:r>
-          </w:p>
-        </w:tc>
-      </w:tr>
-      <w:tr>
-        <w:trPr>
-          <w:cantSplit/>
-        </w:trPr>
-        <w:tc>
-          <w:tcPr>
-            <w:tcW w:type="dxa" w:w="2500"/>
-            <w:tcBorders>
-              <w:top w:val="single" w:color="C9D4E0" w:sz="4"/>
-              <w:left w:val="single" w:color="C9D4E0" w:sz="4"/>
-              <w:bottom w:val="single" w:color="C9D4E0" w:sz="4"/>
-              <w:right w:val="single" w:color="C9D4E0" w:sz="4"/>
-            </w:tcBorders>
-            <w:tcMar>
-              <w:top w:type="dxa" w:w="70"/>
-              <w:left w:type="dxa" w:w="110"/>
-              <w:bottom w:type="dxa" w:w="70"/>
-              <w:right w:type="dxa" w:w="110"/>
-            </w:tcMar>
-          </w:tcPr>
-          <w:p>
-            <w:pPr>
-              <w:spacing w:after="30"/>
-            </w:pPr>
-            <w:r>
-              <w:rPr>
-                <w:rFonts w:ascii="Calibri" w:cs="Calibri" w:eastAsia="Calibri" w:hAnsi="Calibri"/>
-                <w:color w:val="222B36"/>
-                <w:sz w:val="19"/>
-                <w:szCs w:val="19"/>
-              </w:rPr>
-              <w:t xml:space="preserve">Toyota Hilux 2.4GD Comfort</w:t>
-            </w:r>
-          </w:p>
-        </w:tc>
-        <w:tc>
-          <w:tcPr>
-            <w:tcW w:type="dxa" w:w="1900"/>
-            <w:tcBorders>
-              <w:top w:val="single" w:color="C9D4E0" w:sz="4"/>
-              <w:left w:val="single" w:color="C9D4E0" w:sz="4"/>
-              <w:bottom w:val="single" w:color="C9D4E0" w:sz="4"/>
-              <w:right w:val="single" w:color="C9D4E0" w:sz="4"/>
-            </w:tcBorders>
-            <w:tcMar>
-              <w:top w:type="dxa" w:w="70"/>
-              <w:left w:type="dxa" w:w="110"/>
-              <w:bottom w:type="dxa" w:w="70"/>
-              <w:right w:type="dxa" w:w="110"/>
-            </w:tcMar>
-          </w:tcPr>
-          <w:p>
-            <w:pPr>
-              <w:spacing w:after="30"/>
-            </w:pPr>
-            <w:r>
-              <w:rPr>
-                <w:rFonts w:ascii="Calibri" w:cs="Calibri" w:eastAsia="Calibri" w:hAnsi="Calibri"/>
-                <w:color w:val="222B36"/>
-                <w:sz w:val="19"/>
-                <w:szCs w:val="19"/>
-              </w:rPr>
-              <w:t xml:space="preserve">4×4 / Field Mobility</w:t>
-            </w:r>
-          </w:p>
-        </w:tc>
-        <w:tc>
-          <w:tcPr>
-            <w:tcW w:type="dxa" w:w="1000"/>
-            <w:tcBorders>
-              <w:top w:val="single" w:color="C9D4E0" w:sz="4"/>
-              <w:left w:val="single" w:color="C9D4E0" w:sz="4"/>
-              <w:bottom w:val="single" w:color="C9D4E0" w:sz="4"/>
-              <w:right w:val="single" w:color="C9D4E0" w:sz="4"/>
-            </w:tcBorders>
-            <w:tcMar>
-              <w:top w:type="dxa" w:w="70"/>
-              <w:left w:type="dxa" w:w="110"/>
-              <w:bottom w:type="dxa" w:w="70"/>
-              <w:right w:type="dxa" w:w="110"/>
-            </w:tcMar>
-          </w:tcPr>
-          <w:p>
-            <w:pPr>
-              <w:spacing w:after="30"/>
-            </w:pPr>
-            <w:r>
-              <w:rPr>
-                <w:rFonts w:ascii="Calibri" w:cs="Calibri" w:eastAsia="Calibri" w:hAnsi="Calibri"/>
-                <w:color w:val="222B36"/>
-                <w:sz w:val="19"/>
-                <w:szCs w:val="19"/>
-              </w:rPr>
-              <w:t xml:space="preserve">5</w:t>
-            </w:r>
-          </w:p>
-        </w:tc>
-        <w:tc>
-          <w:tcPr>
-            <w:tcW w:type="dxa" w:w="900"/>
-            <w:tcBorders>
-              <w:top w:val="single" w:color="C9D4E0" w:sz="4"/>
-              <w:left w:val="single" w:color="C9D4E0" w:sz="4"/>
-              <w:bottom w:val="single" w:color="C9D4E0" w:sz="4"/>
-              <w:right w:val="single" w:color="C9D4E0" w:sz="4"/>
-            </w:tcBorders>
-            <w:tcMar>
-              <w:top w:type="dxa" w:w="70"/>
-              <w:left w:type="dxa" w:w="110"/>
-              <w:bottom w:type="dxa" w:w="70"/>
-              <w:right w:type="dxa" w:w="110"/>
-            </w:tcMar>
-          </w:tcPr>
-          <w:p>
-            <w:pPr>
-              <w:spacing w:after="30"/>
-            </w:pPr>
-            <w:r>
-              <w:rPr>
-                <w:rFonts w:ascii="Calibri" w:cs="Calibri" w:eastAsia="Calibri" w:hAnsi="Calibri"/>
-                <w:color w:val="222B36"/>
-                <w:sz w:val="19"/>
-                <w:szCs w:val="19"/>
-              </w:rPr>
               <w:t xml:space="preserve">3</w:t>
             </w:r>
           </w:p>
         </w:tc>
         <w:tc>
           <w:tcPr>
-            <w:tcW w:type="dxa" w:w="3060"/>
-            <w:tcBorders>
-              <w:top w:val="single" w:color="C9D4E0" w:sz="4"/>
-              <w:left w:val="single" w:color="C9D4E0" w:sz="4"/>
-              <w:bottom w:val="single" w:color="C9D4E0" w:sz="4"/>
-              <w:right w:val="single" w:color="C9D4E0" w:sz="4"/>
-            </w:tcBorders>
-            <w:tcMar>
-              <w:top w:type="dxa" w:w="70"/>
-              <w:left w:type="dxa" w:w="110"/>
-              <w:bottom w:type="dxa" w:w="70"/>
-              <w:right w:type="dxa" w:w="110"/>
-            </w:tcMar>
-          </w:tcPr>
-          <w:p>
-            <w:pPr>
-              <w:spacing w:after="30"/>
-            </w:pPr>
-            <w:r>
-              <w:rPr>
-                <w:rFonts w:ascii="Calibri" w:cs="Calibri" w:eastAsia="Calibri" w:hAnsi="Calibri"/>
-                <w:color w:val="222B36"/>
-                <w:sz w:val="19"/>
-                <w:szCs w:val="19"/>
-              </w:rPr>
-              <w:t xml:space="preserve">Projets de terrain, ONG, missions</w:t>
-            </w:r>
-          </w:p>
-        </w:tc>
-      </w:tr>
-      <w:tr>
-        <w:trPr>
-          <w:cantSplit/>
-        </w:trPr>
-        <w:tc>
-          <w:tcPr>
-            <w:tcW w:type="dxa" w:w="2500"/>
-            <w:tcBorders>
-              <w:top w:val="single" w:color="C9D4E0" w:sz="4"/>
-              <w:left w:val="single" w:color="C9D4E0" w:sz="4"/>
-              <w:bottom w:val="single" w:color="C9D4E0" w:sz="4"/>
-              <w:right w:val="single" w:color="C9D4E0" w:sz="4"/>
-            </w:tcBorders>
-            <w:shd w:fill="EEF2F7" w:color="auto" w:val="clear"/>
-            <w:tcMar>
-              <w:top w:type="dxa" w:w="70"/>
-              <w:left w:type="dxa" w:w="110"/>
-              <w:bottom w:type="dxa" w:w="70"/>
-              <w:right w:type="dxa" w:w="110"/>
-            </w:tcMar>
-          </w:tcPr>
-          <w:p>
-            <w:pPr>
-              <w:spacing w:after="30"/>
-            </w:pPr>
-            <w:r>
-              <w:rPr>
-                <w:rFonts w:ascii="Calibri" w:cs="Calibri" w:eastAsia="Calibri" w:hAnsi="Calibri"/>
-                <w:color w:val="222B36"/>
-                <w:sz w:val="19"/>
-                <w:szCs w:val="19"/>
-              </w:rPr>
-              <w:t xml:space="preserve">Toyota Hilux 2.7L Standard</w:t>
-            </w:r>
-          </w:p>
-        </w:tc>
-        <w:tc>
-          <w:tcPr>
-            <w:tcW w:type="dxa" w:w="1900"/>
-            <w:tcBorders>
-              <w:top w:val="single" w:color="C9D4E0" w:sz="4"/>
-              <w:left w:val="single" w:color="C9D4E0" w:sz="4"/>
-              <w:bottom w:val="single" w:color="C9D4E0" w:sz="4"/>
-              <w:right w:val="single" w:color="C9D4E0" w:sz="4"/>
-            </w:tcBorders>
-            <w:shd w:fill="EEF2F7" w:color="auto" w:val="clear"/>
-            <w:tcMar>
-              <w:top w:type="dxa" w:w="70"/>
-              <w:left w:type="dxa" w:w="110"/>
-              <w:bottom w:type="dxa" w:w="70"/>
-              <w:right w:type="dxa" w:w="110"/>
-            </w:tcMar>
-          </w:tcPr>
-          <w:p>
-            <w:pPr>
-              <w:spacing w:after="30"/>
-            </w:pPr>
-            <w:r>
-              <w:rPr>
-                <w:rFonts w:ascii="Calibri" w:cs="Calibri" w:eastAsia="Calibri" w:hAnsi="Calibri"/>
-                <w:color w:val="222B36"/>
-                <w:sz w:val="19"/>
-                <w:szCs w:val="19"/>
-              </w:rPr>
-              <w:t xml:space="preserve">4×4 / Field Mobility</w:t>
-            </w:r>
-          </w:p>
-        </w:tc>
-        <w:tc>
-          <w:tcPr>
-            <w:tcW w:type="dxa" w:w="1000"/>
-            <w:tcBorders>
-              <w:top w:val="single" w:color="C9D4E0" w:sz="4"/>
-              <w:left w:val="single" w:color="C9D4E0" w:sz="4"/>
-              <w:bottom w:val="single" w:color="C9D4E0" w:sz="4"/>
-              <w:right w:val="single" w:color="C9D4E0" w:sz="4"/>
-            </w:tcBorders>
-            <w:shd w:fill="EEF2F7" w:color="auto" w:val="clear"/>
-            <w:tcMar>
-              <w:top w:type="dxa" w:w="70"/>
-              <w:left w:type="dxa" w:w="110"/>
-              <w:bottom w:type="dxa" w:w="70"/>
-              <w:right w:type="dxa" w:w="110"/>
-            </w:tcMar>
-          </w:tcPr>
-          <w:p>
-            <w:pPr>
-              <w:spacing w:after="30"/>
-            </w:pPr>
-            <w:r>
-              <w:rPr>
-                <w:rFonts w:ascii="Calibri" w:cs="Calibri" w:eastAsia="Calibri" w:hAnsi="Calibri"/>
-                <w:color w:val="222B36"/>
-                <w:sz w:val="19"/>
-                <w:szCs w:val="19"/>
-              </w:rPr>
-              <w:t xml:space="preserve">5</w:t>
-            </w:r>
-          </w:p>
-        </w:tc>
-        <w:tc>
-          <w:tcPr>
-            <w:tcW w:type="dxa" w:w="900"/>
-            <w:tcBorders>
-              <w:top w:val="single" w:color="C9D4E0" w:sz="4"/>
-              <w:left w:val="single" w:color="C9D4E0" w:sz="4"/>
-              <w:bottom w:val="single" w:color="C9D4E0" w:sz="4"/>
-              <w:right w:val="single" w:color="C9D4E0" w:sz="4"/>
-            </w:tcBorders>
-            <w:shd w:fill="EEF2F7" w:color="auto" w:val="clear"/>
-            <w:tcMar>
-              <w:top w:type="dxa" w:w="70"/>
-              <w:left w:type="dxa" w:w="110"/>
-              <w:bottom w:type="dxa" w:w="70"/>
-              <w:right w:type="dxa" w:w="110"/>
-            </w:tcMar>
-          </w:tcPr>
-          <w:p>
-            <w:pPr>
-              <w:spacing w:after="30"/>
-            </w:pPr>
-            <w:r>
-              <w:rPr>
-                <w:rFonts w:ascii="Calibri" w:cs="Calibri" w:eastAsia="Calibri" w:hAnsi="Calibri"/>
-                <w:color w:val="222B36"/>
-                <w:sz w:val="19"/>
-                <w:szCs w:val="19"/>
-              </w:rPr>
-              <w:t xml:space="preserve">3</w:t>
-            </w:r>
-          </w:p>
-        </w:tc>
-        <w:tc>
-          <w:tcPr>
-            <w:tcW w:type="dxa" w:w="3060"/>
-            <w:tcBorders>
-              <w:top w:val="single" w:color="C9D4E0" w:sz="4"/>
-              <w:left w:val="single" w:color="C9D4E0" w:sz="4"/>
-              <w:bottom w:val="single" w:color="C9D4E0" w:sz="4"/>
-              <w:right w:val="single" w:color="C9D4E0" w:sz="4"/>
-            </w:tcBorders>
-            <w:shd w:fill="EEF2F7" w:color="auto" w:val="clear"/>
-            <w:tcMar>
-              <w:top w:type="dxa" w:w="70"/>
-              <w:left w:type="dxa" w:w="110"/>
-              <w:bottom w:type="dxa" w:w="70"/>
-              <w:right w:type="dxa" w:w="110"/>
-            </w:tcMar>
-          </w:tcPr>
-          <w:p>
-            <w:pPr>
-              <w:spacing w:after="30"/>
-            </w:pPr>
-            <w:r>
-              <w:rPr>
-                <w:rFonts w:ascii="Calibri" w:cs="Calibri" w:eastAsia="Calibri" w:hAnsi="Calibri"/>
-                <w:color w:val="222B36"/>
-                <w:sz w:val="19"/>
-                <w:szCs w:val="19"/>
-              </w:rPr>
-              <w:t xml:space="preserve">Projets de terrain, ONG, missions</w:t>
+            <w:tcW w:type="dxa" w:w="2660"/>
+            <w:tcBorders>
+              <w:top w:val="single" w:color="C9D4E0" w:sz="4"/>
+              <w:left w:val="single" w:color="C9D4E0" w:sz="4"/>
+              <w:bottom w:val="single" w:color="C9D4E0" w:sz="4"/>
+              <w:right w:val="single" w:color="C9D4E0" w:sz="4"/>
+            </w:tcBorders>
+            <w:shd w:fill="EEF2F7" w:color="auto" w:val="clear"/>
+            <w:tcMar>
+              <w:top w:type="dxa" w:w="70"/>
+              <w:left w:type="dxa" w:w="110"/>
+              <w:bottom w:type="dxa" w:w="70"/>
+              <w:right w:type="dxa" w:w="110"/>
+            </w:tcMar>
+          </w:tcPr>
+          <w:p>
+            <w:pPr>
+              <w:spacing w:after="30"/>
+            </w:pPr>
+            <w:r>
+              <w:rPr>
+                <w:rFonts w:ascii="Calibri" w:cs="Calibri" w:eastAsia="Calibri" w:hAnsi="Calibri"/>
+                <w:color w:val="222B36"/>
+                <w:sz w:val="19"/>
+                <w:szCs w:val="19"/>
+              </w:rPr>
+              <w:t xml:space="preserve">Caractère. Raffinement. Assurance.</w:t>
             </w:r>
           </w:p>
         </w:tc>
@@ -3253,859 +3026,7 @@
           <w:sz w:val="21"/>
           <w:szCs w:val="21"/>
         </w:rPr>
-        <w:t xml:space="preserve">Les capacités en passagers et en bagages sont des valeurs de départ à confirmer par l'entreprise ; elles sont modifiables à tout moment dans l'espace d'administration.</w:t>
-      </w:r>
-    </w:p>
-    <w:p>
-      <w:pPr>
-        <w:pStyle w:val="Heading2"/>
-        <w:keepNext/>
-        <w:spacing w:after="100" w:before="280"/>
-      </w:pPr>
-      <w:r>
-        <w:rPr>
-          <w:rFonts w:ascii="Georgia" w:cs="Georgia" w:eastAsia="Georgia" w:hAnsi="Georgia"/>
-          <w:b/>
-          <w:bCs/>
-          <w:color w:val="0C2646"/>
-          <w:sz w:val="26"/>
-          <w:szCs w:val="26"/>
-        </w:rPr>
-        <w:t xml:space="preserve">1.5 Services (source : contenus finaux du client)</w:t>
-      </w:r>
-    </w:p>
-    <w:tbl>
-      <w:tblPr>
-        <w:tblW w:type="dxa" w:w="9360"/>
-        <w:tblBorders>
-          <w:top w:val="single" w:color="auto" w:sz="4"/>
-          <w:left w:val="single" w:color="auto" w:sz="4"/>
-          <w:bottom w:val="single" w:color="auto" w:sz="4"/>
-          <w:right w:val="single" w:color="auto" w:sz="4"/>
-          <w:insideH w:val="single" w:color="auto" w:sz="4"/>
-          <w:insideV w:val="single" w:color="auto" w:sz="4"/>
-        </w:tblBorders>
-      </w:tblPr>
-      <w:tblGrid>
-        <w:gridCol w:w="3300"/>
-        <w:gridCol w:w="3700"/>
-        <w:gridCol w:w="2360"/>
-      </w:tblGrid>
-      <w:tr>
-        <w:trPr>
-          <w:tblHeader/>
-        </w:trPr>
-        <w:tc>
-          <w:tcPr>
-            <w:tcW w:type="dxa" w:w="3300"/>
-            <w:tcBorders>
-              <w:top w:val="single" w:color="C9D4E0" w:sz="4"/>
-              <w:left w:val="single" w:color="C9D4E0" w:sz="4"/>
-              <w:bottom w:val="single" w:color="C9D4E0" w:sz="4"/>
-              <w:right w:val="single" w:color="C9D4E0" w:sz="4"/>
-            </w:tcBorders>
-            <w:shd w:fill="0C2646" w:color="auto" w:val="clear"/>
-            <w:tcMar>
-              <w:top w:type="dxa" w:w="70"/>
-              <w:left w:type="dxa" w:w="110"/>
-              <w:bottom w:type="dxa" w:w="70"/>
-              <w:right w:type="dxa" w:w="110"/>
-            </w:tcMar>
-          </w:tcPr>
-          <w:p>
-            <w:pPr>
-              <w:spacing w:after="30"/>
-            </w:pPr>
-            <w:r>
-              <w:rPr>
-                <w:rFonts w:ascii="Calibri" w:cs="Calibri" w:eastAsia="Calibri" w:hAnsi="Calibri"/>
-                <w:b/>
-                <w:bCs/>
-                <w:color w:val="FFFFFF"/>
-                <w:sz w:val="19"/>
-                <w:szCs w:val="19"/>
-              </w:rPr>
-              <w:t xml:space="preserve">Service</w:t>
-            </w:r>
-          </w:p>
-        </w:tc>
-        <w:tc>
-          <w:tcPr>
-            <w:tcW w:type="dxa" w:w="3700"/>
-            <w:tcBorders>
-              <w:top w:val="single" w:color="C9D4E0" w:sz="4"/>
-              <w:left w:val="single" w:color="C9D4E0" w:sz="4"/>
-              <w:bottom w:val="single" w:color="C9D4E0" w:sz="4"/>
-              <w:right w:val="single" w:color="C9D4E0" w:sz="4"/>
-            </w:tcBorders>
-            <w:shd w:fill="0C2646" w:color="auto" w:val="clear"/>
-            <w:tcMar>
-              <w:top w:type="dxa" w:w="70"/>
-              <w:left w:type="dxa" w:w="110"/>
-              <w:bottom w:type="dxa" w:w="70"/>
-              <w:right w:type="dxa" w:w="110"/>
-            </w:tcMar>
-          </w:tcPr>
-          <w:p>
-            <w:pPr>
-              <w:spacing w:after="30"/>
-            </w:pPr>
-            <w:r>
-              <w:rPr>
-                <w:rFonts w:ascii="Calibri" w:cs="Calibri" w:eastAsia="Calibri" w:hAnsi="Calibri"/>
-                <w:b/>
-                <w:bCs/>
-                <w:color w:val="FFFFFF"/>
-                <w:sz w:val="19"/>
-                <w:szCs w:val="19"/>
-              </w:rPr>
-              <w:t xml:space="preserve">Promesse</w:t>
-            </w:r>
-          </w:p>
-        </w:tc>
-        <w:tc>
-          <w:tcPr>
-            <w:tcW w:type="dxa" w:w="2360"/>
-            <w:tcBorders>
-              <w:top w:val="single" w:color="C9D4E0" w:sz="4"/>
-              <w:left w:val="single" w:color="C9D4E0" w:sz="4"/>
-              <w:bottom w:val="single" w:color="C9D4E0" w:sz="4"/>
-              <w:right w:val="single" w:color="C9D4E0" w:sz="4"/>
-            </w:tcBorders>
-            <w:shd w:fill="0C2646" w:color="auto" w:val="clear"/>
-            <w:tcMar>
-              <w:top w:type="dxa" w:w="70"/>
-              <w:left w:type="dxa" w:w="110"/>
-              <w:bottom w:type="dxa" w:w="70"/>
-              <w:right w:type="dxa" w:w="110"/>
-            </w:tcMar>
-          </w:tcPr>
-          <w:p>
-            <w:pPr>
-              <w:spacing w:after="30"/>
-            </w:pPr>
-            <w:r>
-              <w:rPr>
-                <w:rFonts w:ascii="Calibri" w:cs="Calibri" w:eastAsia="Calibri" w:hAnsi="Calibri"/>
-                <w:b/>
-                <w:bCs/>
-                <w:color w:val="FFFFFF"/>
-                <w:sz w:val="19"/>
-                <w:szCs w:val="19"/>
-              </w:rPr>
-              <w:t xml:space="preserve">Bouton d'action</w:t>
-            </w:r>
-          </w:p>
-        </w:tc>
-      </w:tr>
-      <w:tr>
-        <w:trPr>
-          <w:cantSplit/>
-        </w:trPr>
-        <w:tc>
-          <w:tcPr>
-            <w:tcW w:type="dxa" w:w="3300"/>
-            <w:tcBorders>
-              <w:top w:val="single" w:color="C9D4E0" w:sz="4"/>
-              <w:left w:val="single" w:color="C9D4E0" w:sz="4"/>
-              <w:bottom w:val="single" w:color="C9D4E0" w:sz="4"/>
-              <w:right w:val="single" w:color="C9D4E0" w:sz="4"/>
-            </w:tcBorders>
-            <w:tcMar>
-              <w:top w:type="dxa" w:w="70"/>
-              <w:left w:type="dxa" w:w="110"/>
-              <w:bottom w:type="dxa" w:w="70"/>
-              <w:right w:type="dxa" w:w="110"/>
-            </w:tcMar>
-          </w:tcPr>
-          <w:p>
-            <w:pPr>
-              <w:spacing w:after="30"/>
-            </w:pPr>
-            <w:r>
-              <w:rPr>
-                <w:rFonts w:ascii="Calibri" w:cs="Calibri" w:eastAsia="Calibri" w:hAnsi="Calibri"/>
-                <w:color w:val="222B36"/>
-                <w:sz w:val="19"/>
-                <w:szCs w:val="19"/>
-              </w:rPr>
-              <w:t xml:space="preserve">01 Transferts Aéroportuaires</w:t>
-            </w:r>
-          </w:p>
-        </w:tc>
-        <w:tc>
-          <w:tcPr>
-            <w:tcW w:type="dxa" w:w="3700"/>
-            <w:tcBorders>
-              <w:top w:val="single" w:color="C9D4E0" w:sz="4"/>
-              <w:left w:val="single" w:color="C9D4E0" w:sz="4"/>
-              <w:bottom w:val="single" w:color="C9D4E0" w:sz="4"/>
-              <w:right w:val="single" w:color="C9D4E0" w:sz="4"/>
-            </w:tcBorders>
-            <w:tcMar>
-              <w:top w:type="dxa" w:w="70"/>
-              <w:left w:type="dxa" w:w="110"/>
-              <w:bottom w:type="dxa" w:w="70"/>
-              <w:right w:type="dxa" w:w="110"/>
-            </w:tcMar>
-          </w:tcPr>
-          <w:p>
-            <w:pPr>
-              <w:spacing w:after="30"/>
-            </w:pPr>
-            <w:r>
-              <w:rPr>
-                <w:rFonts w:ascii="Calibri" w:cs="Calibri" w:eastAsia="Calibri" w:hAnsi="Calibri"/>
-                <w:color w:val="222B36"/>
-                <w:sz w:val="19"/>
-                <w:szCs w:val="19"/>
-              </w:rPr>
-              <w:t xml:space="preserve">Votre arrivée, orchestrée avec soin.</w:t>
-            </w:r>
-          </w:p>
-        </w:tc>
-        <w:tc>
-          <w:tcPr>
-            <w:tcW w:type="dxa" w:w="2360"/>
-            <w:tcBorders>
-              <w:top w:val="single" w:color="C9D4E0" w:sz="4"/>
-              <w:left w:val="single" w:color="C9D4E0" w:sz="4"/>
-              <w:bottom w:val="single" w:color="C9D4E0" w:sz="4"/>
-              <w:right w:val="single" w:color="C9D4E0" w:sz="4"/>
-            </w:tcBorders>
-            <w:tcMar>
-              <w:top w:type="dxa" w:w="70"/>
-              <w:left w:type="dxa" w:w="110"/>
-              <w:bottom w:type="dxa" w:w="70"/>
-              <w:right w:type="dxa" w:w="110"/>
-            </w:tcMar>
-          </w:tcPr>
-          <w:p>
-            <w:pPr>
-              <w:spacing w:after="30"/>
-            </w:pPr>
-            <w:r>
-              <w:rPr>
-                <w:rFonts w:ascii="Calibri" w:cs="Calibri" w:eastAsia="Calibri" w:hAnsi="Calibri"/>
-                <w:color w:val="222B36"/>
-                <w:sz w:val="19"/>
-                <w:szCs w:val="19"/>
-              </w:rPr>
-              <w:t xml:space="preserve">Organiser mon transfert</w:t>
-            </w:r>
-          </w:p>
-        </w:tc>
-      </w:tr>
-      <w:tr>
-        <w:trPr>
-          <w:cantSplit/>
-        </w:trPr>
-        <w:tc>
-          <w:tcPr>
-            <w:tcW w:type="dxa" w:w="3300"/>
-            <w:tcBorders>
-              <w:top w:val="single" w:color="C9D4E0" w:sz="4"/>
-              <w:left w:val="single" w:color="C9D4E0" w:sz="4"/>
-              <w:bottom w:val="single" w:color="C9D4E0" w:sz="4"/>
-              <w:right w:val="single" w:color="C9D4E0" w:sz="4"/>
-            </w:tcBorders>
-            <w:shd w:fill="EEF2F7" w:color="auto" w:val="clear"/>
-            <w:tcMar>
-              <w:top w:type="dxa" w:w="70"/>
-              <w:left w:type="dxa" w:w="110"/>
-              <w:bottom w:type="dxa" w:w="70"/>
-              <w:right w:type="dxa" w:w="110"/>
-            </w:tcMar>
-          </w:tcPr>
-          <w:p>
-            <w:pPr>
-              <w:spacing w:after="30"/>
-            </w:pPr>
-            <w:r>
-              <w:rPr>
-                <w:rFonts w:ascii="Calibri" w:cs="Calibri" w:eastAsia="Calibri" w:hAnsi="Calibri"/>
-                <w:color w:val="222B36"/>
-                <w:sz w:val="19"/>
-                <w:szCs w:val="19"/>
-              </w:rPr>
-              <w:t xml:space="preserve">02 Mobilité Exécutive</w:t>
-            </w:r>
-          </w:p>
-        </w:tc>
-        <w:tc>
-          <w:tcPr>
-            <w:tcW w:type="dxa" w:w="3700"/>
-            <w:tcBorders>
-              <w:top w:val="single" w:color="C9D4E0" w:sz="4"/>
-              <w:left w:val="single" w:color="C9D4E0" w:sz="4"/>
-              <w:bottom w:val="single" w:color="C9D4E0" w:sz="4"/>
-              <w:right w:val="single" w:color="C9D4E0" w:sz="4"/>
-            </w:tcBorders>
-            <w:shd w:fill="EEF2F7" w:color="auto" w:val="clear"/>
-            <w:tcMar>
-              <w:top w:type="dxa" w:w="70"/>
-              <w:left w:type="dxa" w:w="110"/>
-              <w:bottom w:type="dxa" w:w="70"/>
-              <w:right w:type="dxa" w:w="110"/>
-            </w:tcMar>
-          </w:tcPr>
-          <w:p>
-            <w:pPr>
-              <w:spacing w:after="30"/>
-            </w:pPr>
-            <w:r>
-              <w:rPr>
-                <w:rFonts w:ascii="Calibri" w:cs="Calibri" w:eastAsia="Calibri" w:hAnsi="Calibri"/>
-                <w:color w:val="222B36"/>
-                <w:sz w:val="19"/>
-                <w:szCs w:val="19"/>
-              </w:rPr>
-              <w:t xml:space="preserve">La mobilité au service de vos exigences.</w:t>
-            </w:r>
-          </w:p>
-        </w:tc>
-        <w:tc>
-          <w:tcPr>
-            <w:tcW w:type="dxa" w:w="2360"/>
-            <w:tcBorders>
-              <w:top w:val="single" w:color="C9D4E0" w:sz="4"/>
-              <w:left w:val="single" w:color="C9D4E0" w:sz="4"/>
-              <w:bottom w:val="single" w:color="C9D4E0" w:sz="4"/>
-              <w:right w:val="single" w:color="C9D4E0" w:sz="4"/>
-            </w:tcBorders>
-            <w:shd w:fill="EEF2F7" w:color="auto" w:val="clear"/>
-            <w:tcMar>
-              <w:top w:type="dxa" w:w="70"/>
-              <w:left w:type="dxa" w:w="110"/>
-              <w:bottom w:type="dxa" w:w="70"/>
-              <w:right w:type="dxa" w:w="110"/>
-            </w:tcMar>
-          </w:tcPr>
-          <w:p>
-            <w:pPr>
-              <w:spacing w:after="30"/>
-            </w:pPr>
-            <w:r>
-              <w:rPr>
-                <w:rFonts w:ascii="Calibri" w:cs="Calibri" w:eastAsia="Calibri" w:hAnsi="Calibri"/>
-                <w:color w:val="222B36"/>
-                <w:sz w:val="19"/>
-                <w:szCs w:val="19"/>
-              </w:rPr>
-              <w:t xml:space="preserve">Organiser mon arrivée / mes déplacements</w:t>
-            </w:r>
-          </w:p>
-        </w:tc>
-      </w:tr>
-      <w:tr>
-        <w:trPr>
-          <w:cantSplit/>
-        </w:trPr>
-        <w:tc>
-          <w:tcPr>
-            <w:tcW w:type="dxa" w:w="3300"/>
-            <w:tcBorders>
-              <w:top w:val="single" w:color="C9D4E0" w:sz="4"/>
-              <w:left w:val="single" w:color="C9D4E0" w:sz="4"/>
-              <w:bottom w:val="single" w:color="C9D4E0" w:sz="4"/>
-              <w:right w:val="single" w:color="C9D4E0" w:sz="4"/>
-            </w:tcBorders>
-            <w:tcMar>
-              <w:top w:type="dxa" w:w="70"/>
-              <w:left w:type="dxa" w:w="110"/>
-              <w:bottom w:type="dxa" w:w="70"/>
-              <w:right w:type="dxa" w:w="110"/>
-            </w:tcMar>
-          </w:tcPr>
-          <w:p>
-            <w:pPr>
-              <w:spacing w:after="30"/>
-            </w:pPr>
-            <w:r>
-              <w:rPr>
-                <w:rFonts w:ascii="Calibri" w:cs="Calibri" w:eastAsia="Calibri" w:hAnsi="Calibri"/>
-                <w:color w:val="222B36"/>
-                <w:sz w:val="19"/>
-                <w:szCs w:val="19"/>
-              </w:rPr>
-              <w:t xml:space="preserve">03 Solutions de Mobilité pour Entreprises</w:t>
-            </w:r>
-          </w:p>
-        </w:tc>
-        <w:tc>
-          <w:tcPr>
-            <w:tcW w:type="dxa" w:w="3700"/>
-            <w:tcBorders>
-              <w:top w:val="single" w:color="C9D4E0" w:sz="4"/>
-              <w:left w:val="single" w:color="C9D4E0" w:sz="4"/>
-              <w:bottom w:val="single" w:color="C9D4E0" w:sz="4"/>
-              <w:right w:val="single" w:color="C9D4E0" w:sz="4"/>
-            </w:tcBorders>
-            <w:tcMar>
-              <w:top w:type="dxa" w:w="70"/>
-              <w:left w:type="dxa" w:w="110"/>
-              <w:bottom w:type="dxa" w:w="70"/>
-              <w:right w:type="dxa" w:w="110"/>
-            </w:tcMar>
-          </w:tcPr>
-          <w:p>
-            <w:pPr>
-              <w:spacing w:after="30"/>
-            </w:pPr>
-            <w:r>
-              <w:rPr>
-                <w:rFonts w:ascii="Calibri" w:cs="Calibri" w:eastAsia="Calibri" w:hAnsi="Calibri"/>
-                <w:color w:val="222B36"/>
-                <w:sz w:val="19"/>
-                <w:szCs w:val="19"/>
-              </w:rPr>
-              <w:t xml:space="preserve">Un partenaire de mobilité pour votre organisation.</w:t>
-            </w:r>
-          </w:p>
-        </w:tc>
-        <w:tc>
-          <w:tcPr>
-            <w:tcW w:type="dxa" w:w="2360"/>
-            <w:tcBorders>
-              <w:top w:val="single" w:color="C9D4E0" w:sz="4"/>
-              <w:left w:val="single" w:color="C9D4E0" w:sz="4"/>
-              <w:bottom w:val="single" w:color="C9D4E0" w:sz="4"/>
-              <w:right w:val="single" w:color="C9D4E0" w:sz="4"/>
-            </w:tcBorders>
-            <w:tcMar>
-              <w:top w:type="dxa" w:w="70"/>
-              <w:left w:type="dxa" w:w="110"/>
-              <w:bottom w:type="dxa" w:w="70"/>
-              <w:right w:type="dxa" w:w="110"/>
-            </w:tcMar>
-          </w:tcPr>
-          <w:p>
-            <w:pPr>
-              <w:spacing w:after="30"/>
-            </w:pPr>
-            <w:r>
-              <w:rPr>
-                <w:rFonts w:ascii="Calibri" w:cs="Calibri" w:eastAsia="Calibri" w:hAnsi="Calibri"/>
-                <w:color w:val="222B36"/>
-                <w:sz w:val="19"/>
-                <w:szCs w:val="19"/>
-              </w:rPr>
-              <w:t xml:space="preserve">Demander une offre corporate</w:t>
-            </w:r>
-          </w:p>
-        </w:tc>
-      </w:tr>
-      <w:tr>
-        <w:trPr>
-          <w:cantSplit/>
-        </w:trPr>
-        <w:tc>
-          <w:tcPr>
-            <w:tcW w:type="dxa" w:w="3300"/>
-            <w:tcBorders>
-              <w:top w:val="single" w:color="C9D4E0" w:sz="4"/>
-              <w:left w:val="single" w:color="C9D4E0" w:sz="4"/>
-              <w:bottom w:val="single" w:color="C9D4E0" w:sz="4"/>
-              <w:right w:val="single" w:color="C9D4E0" w:sz="4"/>
-            </w:tcBorders>
-            <w:shd w:fill="EEF2F7" w:color="auto" w:val="clear"/>
-            <w:tcMar>
-              <w:top w:type="dxa" w:w="70"/>
-              <w:left w:type="dxa" w:w="110"/>
-              <w:bottom w:type="dxa" w:w="70"/>
-              <w:right w:type="dxa" w:w="110"/>
-            </w:tcMar>
-          </w:tcPr>
-          <w:p>
-            <w:pPr>
-              <w:spacing w:after="30"/>
-            </w:pPr>
-            <w:r>
-              <w:rPr>
-                <w:rFonts w:ascii="Calibri" w:cs="Calibri" w:eastAsia="Calibri" w:hAnsi="Calibri"/>
-                <w:color w:val="222B36"/>
-                <w:sz w:val="19"/>
-                <w:szCs w:val="19"/>
-              </w:rPr>
-              <w:t xml:space="preserve">04 Mobilité Événementielle &amp; Protocole</w:t>
-            </w:r>
-          </w:p>
-        </w:tc>
-        <w:tc>
-          <w:tcPr>
-            <w:tcW w:type="dxa" w:w="3700"/>
-            <w:tcBorders>
-              <w:top w:val="single" w:color="C9D4E0" w:sz="4"/>
-              <w:left w:val="single" w:color="C9D4E0" w:sz="4"/>
-              <w:bottom w:val="single" w:color="C9D4E0" w:sz="4"/>
-              <w:right w:val="single" w:color="C9D4E0" w:sz="4"/>
-            </w:tcBorders>
-            <w:shd w:fill="EEF2F7" w:color="auto" w:val="clear"/>
-            <w:tcMar>
-              <w:top w:type="dxa" w:w="70"/>
-              <w:left w:type="dxa" w:w="110"/>
-              <w:bottom w:type="dxa" w:w="70"/>
-              <w:right w:type="dxa" w:w="110"/>
-            </w:tcMar>
-          </w:tcPr>
-          <w:p>
-            <w:pPr>
-              <w:spacing w:after="30"/>
-            </w:pPr>
-            <w:r>
-              <w:rPr>
-                <w:rFonts w:ascii="Calibri" w:cs="Calibri" w:eastAsia="Calibri" w:hAnsi="Calibri"/>
-                <w:color w:val="222B36"/>
-                <w:sz w:val="19"/>
-                <w:szCs w:val="19"/>
-              </w:rPr>
-              <w:t xml:space="preserve">Au service de vos événements les plus exigeants.</w:t>
-            </w:r>
-          </w:p>
-        </w:tc>
-        <w:tc>
-          <w:tcPr>
-            <w:tcW w:type="dxa" w:w="2360"/>
-            <w:tcBorders>
-              <w:top w:val="single" w:color="C9D4E0" w:sz="4"/>
-              <w:left w:val="single" w:color="C9D4E0" w:sz="4"/>
-              <w:bottom w:val="single" w:color="C9D4E0" w:sz="4"/>
-              <w:right w:val="single" w:color="C9D4E0" w:sz="4"/>
-            </w:tcBorders>
-            <w:shd w:fill="EEF2F7" w:color="auto" w:val="clear"/>
-            <w:tcMar>
-              <w:top w:type="dxa" w:w="70"/>
-              <w:left w:type="dxa" w:w="110"/>
-              <w:bottom w:type="dxa" w:w="70"/>
-              <w:right w:type="dxa" w:w="110"/>
-            </w:tcMar>
-          </w:tcPr>
-          <w:p>
-            <w:pPr>
-              <w:spacing w:after="30"/>
-            </w:pPr>
-            <w:r>
-              <w:rPr>
-                <w:rFonts w:ascii="Calibri" w:cs="Calibri" w:eastAsia="Calibri" w:hAnsi="Calibri"/>
-                <w:color w:val="222B36"/>
-                <w:sz w:val="19"/>
-                <w:szCs w:val="19"/>
-              </w:rPr>
-              <w:t xml:space="preserve">Préparer la mobilité de mon événement</w:t>
-            </w:r>
-          </w:p>
-        </w:tc>
-      </w:tr>
-      <w:tr>
-        <w:trPr>
-          <w:cantSplit/>
-        </w:trPr>
-        <w:tc>
-          <w:tcPr>
-            <w:tcW w:type="dxa" w:w="3300"/>
-            <w:tcBorders>
-              <w:top w:val="single" w:color="C9D4E0" w:sz="4"/>
-              <w:left w:val="single" w:color="C9D4E0" w:sz="4"/>
-              <w:bottom w:val="single" w:color="C9D4E0" w:sz="4"/>
-              <w:right w:val="single" w:color="C9D4E0" w:sz="4"/>
-            </w:tcBorders>
-            <w:tcMar>
-              <w:top w:type="dxa" w:w="70"/>
-              <w:left w:type="dxa" w:w="110"/>
-              <w:bottom w:type="dxa" w:w="70"/>
-              <w:right w:type="dxa" w:w="110"/>
-            </w:tcMar>
-          </w:tcPr>
-          <w:p>
-            <w:pPr>
-              <w:spacing w:after="30"/>
-            </w:pPr>
-            <w:r>
-              <w:rPr>
-                <w:rFonts w:ascii="Calibri" w:cs="Calibri" w:eastAsia="Calibri" w:hAnsi="Calibri"/>
-                <w:color w:val="222B36"/>
-                <w:sz w:val="19"/>
-                <w:szCs w:val="19"/>
-              </w:rPr>
-              <w:t xml:space="preserve">05 Mise à disposition de véhicule</w:t>
-            </w:r>
-          </w:p>
-        </w:tc>
-        <w:tc>
-          <w:tcPr>
-            <w:tcW w:type="dxa" w:w="3700"/>
-            <w:tcBorders>
-              <w:top w:val="single" w:color="C9D4E0" w:sz="4"/>
-              <w:left w:val="single" w:color="C9D4E0" w:sz="4"/>
-              <w:bottom w:val="single" w:color="C9D4E0" w:sz="4"/>
-              <w:right w:val="single" w:color="C9D4E0" w:sz="4"/>
-            </w:tcBorders>
-            <w:tcMar>
-              <w:top w:type="dxa" w:w="70"/>
-              <w:left w:type="dxa" w:w="110"/>
-              <w:bottom w:type="dxa" w:w="70"/>
-              <w:right w:type="dxa" w:w="110"/>
-            </w:tcMar>
-          </w:tcPr>
-          <w:p>
-            <w:pPr>
-              <w:spacing w:after="30"/>
-            </w:pPr>
-            <w:r>
-              <w:rPr>
-                <w:rFonts w:ascii="Calibri" w:cs="Calibri" w:eastAsia="Calibri" w:hAnsi="Calibri"/>
-                <w:color w:val="222B36"/>
-                <w:sz w:val="19"/>
-                <w:szCs w:val="19"/>
-              </w:rPr>
-              <w:t xml:space="preserve">Votre temps, votre programme, votre mobilité.</w:t>
-            </w:r>
-          </w:p>
-        </w:tc>
-        <w:tc>
-          <w:tcPr>
-            <w:tcW w:type="dxa" w:w="2360"/>
-            <w:tcBorders>
-              <w:top w:val="single" w:color="C9D4E0" w:sz="4"/>
-              <w:left w:val="single" w:color="C9D4E0" w:sz="4"/>
-              <w:bottom w:val="single" w:color="C9D4E0" w:sz="4"/>
-              <w:right w:val="single" w:color="C9D4E0" w:sz="4"/>
-            </w:tcBorders>
-            <w:tcMar>
-              <w:top w:type="dxa" w:w="70"/>
-              <w:left w:type="dxa" w:w="110"/>
-              <w:bottom w:type="dxa" w:w="70"/>
-              <w:right w:type="dxa" w:w="110"/>
-            </w:tcMar>
-          </w:tcPr>
-          <w:p>
-            <w:pPr>
-              <w:spacing w:after="30"/>
-            </w:pPr>
-            <w:r>
-              <w:rPr>
-                <w:rFonts w:ascii="Calibri" w:cs="Calibri" w:eastAsia="Calibri" w:hAnsi="Calibri"/>
-                <w:color w:val="222B36"/>
-                <w:sz w:val="19"/>
-                <w:szCs w:val="19"/>
-              </w:rPr>
-              <w:t xml:space="preserve">Choisir ma formule</w:t>
-            </w:r>
-          </w:p>
-        </w:tc>
-      </w:tr>
-      <w:tr>
-        <w:trPr>
-          <w:cantSplit/>
-        </w:trPr>
-        <w:tc>
-          <w:tcPr>
-            <w:tcW w:type="dxa" w:w="3300"/>
-            <w:tcBorders>
-              <w:top w:val="single" w:color="C9D4E0" w:sz="4"/>
-              <w:left w:val="single" w:color="C9D4E0" w:sz="4"/>
-              <w:bottom w:val="single" w:color="C9D4E0" w:sz="4"/>
-              <w:right w:val="single" w:color="C9D4E0" w:sz="4"/>
-            </w:tcBorders>
-            <w:shd w:fill="EEF2F7" w:color="auto" w:val="clear"/>
-            <w:tcMar>
-              <w:top w:type="dxa" w:w="70"/>
-              <w:left w:type="dxa" w:w="110"/>
-              <w:bottom w:type="dxa" w:w="70"/>
-              <w:right w:type="dxa" w:w="110"/>
-            </w:tcMar>
-          </w:tcPr>
-          <w:p>
-            <w:pPr>
-              <w:spacing w:after="30"/>
-            </w:pPr>
-            <w:r>
-              <w:rPr>
-                <w:rFonts w:ascii="Calibri" w:cs="Calibri" w:eastAsia="Calibri" w:hAnsi="Calibri"/>
-                <w:color w:val="222B36"/>
-                <w:sz w:val="19"/>
-                <w:szCs w:val="19"/>
-              </w:rPr>
-              <w:t xml:space="preserve">06 Voyage Privé</w:t>
-            </w:r>
-          </w:p>
-        </w:tc>
-        <w:tc>
-          <w:tcPr>
-            <w:tcW w:type="dxa" w:w="3700"/>
-            <w:tcBorders>
-              <w:top w:val="single" w:color="C9D4E0" w:sz="4"/>
-              <w:left w:val="single" w:color="C9D4E0" w:sz="4"/>
-              <w:bottom w:val="single" w:color="C9D4E0" w:sz="4"/>
-              <w:right w:val="single" w:color="C9D4E0" w:sz="4"/>
-            </w:tcBorders>
-            <w:shd w:fill="EEF2F7" w:color="auto" w:val="clear"/>
-            <w:tcMar>
-              <w:top w:type="dxa" w:w="70"/>
-              <w:left w:type="dxa" w:w="110"/>
-              <w:bottom w:type="dxa" w:w="70"/>
-              <w:right w:type="dxa" w:w="110"/>
-            </w:tcMar>
-          </w:tcPr>
-          <w:p>
-            <w:pPr>
-              <w:spacing w:after="30"/>
-            </w:pPr>
-            <w:r>
-              <w:rPr>
-                <w:rFonts w:ascii="Calibri" w:cs="Calibri" w:eastAsia="Calibri" w:hAnsi="Calibri"/>
-                <w:color w:val="222B36"/>
-                <w:sz w:val="19"/>
-                <w:szCs w:val="19"/>
-              </w:rPr>
-              <w:t xml:space="preserve">Madagascar, à votre rythme et selon vos envies.</w:t>
-            </w:r>
-          </w:p>
-        </w:tc>
-        <w:tc>
-          <w:tcPr>
-            <w:tcW w:type="dxa" w:w="2360"/>
-            <w:tcBorders>
-              <w:top w:val="single" w:color="C9D4E0" w:sz="4"/>
-              <w:left w:val="single" w:color="C9D4E0" w:sz="4"/>
-              <w:bottom w:val="single" w:color="C9D4E0" w:sz="4"/>
-              <w:right w:val="single" w:color="C9D4E0" w:sz="4"/>
-            </w:tcBorders>
-            <w:shd w:fill="EEF2F7" w:color="auto" w:val="clear"/>
-            <w:tcMar>
-              <w:top w:type="dxa" w:w="70"/>
-              <w:left w:type="dxa" w:w="110"/>
-              <w:bottom w:type="dxa" w:w="70"/>
-              <w:right w:type="dxa" w:w="110"/>
-            </w:tcMar>
-          </w:tcPr>
-          <w:p>
-            <w:pPr>
-              <w:spacing w:after="30"/>
-            </w:pPr>
-            <w:r>
-              <w:rPr>
-                <w:rFonts w:ascii="Calibri" w:cs="Calibri" w:eastAsia="Calibri" w:hAnsi="Calibri"/>
-                <w:color w:val="222B36"/>
-                <w:sz w:val="19"/>
-                <w:szCs w:val="19"/>
-              </w:rPr>
-              <w:t xml:space="preserve">Créer mon expérience sur mesure</w:t>
-            </w:r>
-          </w:p>
-        </w:tc>
-      </w:tr>
-      <w:tr>
-        <w:trPr>
-          <w:cantSplit/>
-        </w:trPr>
-        <w:tc>
-          <w:tcPr>
-            <w:tcW w:type="dxa" w:w="3300"/>
-            <w:tcBorders>
-              <w:top w:val="single" w:color="C9D4E0" w:sz="4"/>
-              <w:left w:val="single" w:color="C9D4E0" w:sz="4"/>
-              <w:bottom w:val="single" w:color="C9D4E0" w:sz="4"/>
-              <w:right w:val="single" w:color="C9D4E0" w:sz="4"/>
-            </w:tcBorders>
-            <w:tcMar>
-              <w:top w:type="dxa" w:w="70"/>
-              <w:left w:type="dxa" w:w="110"/>
-              <w:bottom w:type="dxa" w:w="70"/>
-              <w:right w:type="dxa" w:w="110"/>
-            </w:tcMar>
-          </w:tcPr>
-          <w:p>
-            <w:pPr>
-              <w:spacing w:after="30"/>
-            </w:pPr>
-            <w:r>
-              <w:rPr>
-                <w:rFonts w:ascii="Calibri" w:cs="Calibri" w:eastAsia="Calibri" w:hAnsi="Calibri"/>
-                <w:color w:val="222B36"/>
-                <w:sz w:val="19"/>
-                <w:szCs w:val="19"/>
-              </w:rPr>
-              <w:t xml:space="preserve">07 Conciergerie Privée VIP</w:t>
-            </w:r>
-          </w:p>
-        </w:tc>
-        <w:tc>
-          <w:tcPr>
-            <w:tcW w:type="dxa" w:w="3700"/>
-            <w:tcBorders>
-              <w:top w:val="single" w:color="C9D4E0" w:sz="4"/>
-              <w:left w:val="single" w:color="C9D4E0" w:sz="4"/>
-              <w:bottom w:val="single" w:color="C9D4E0" w:sz="4"/>
-              <w:right w:val="single" w:color="C9D4E0" w:sz="4"/>
-            </w:tcBorders>
-            <w:tcMar>
-              <w:top w:type="dxa" w:w="70"/>
-              <w:left w:type="dxa" w:w="110"/>
-              <w:bottom w:type="dxa" w:w="70"/>
-              <w:right w:type="dxa" w:w="110"/>
-            </w:tcMar>
-          </w:tcPr>
-          <w:p>
-            <w:pPr>
-              <w:spacing w:after="30"/>
-            </w:pPr>
-            <w:r>
-              <w:rPr>
-                <w:rFonts w:ascii="Calibri" w:cs="Calibri" w:eastAsia="Calibri" w:hAnsi="Calibri"/>
-                <w:color w:val="222B36"/>
-                <w:sz w:val="19"/>
-                <w:szCs w:val="19"/>
-              </w:rPr>
-              <w:t xml:space="preserve">Des solutions pensées pour vous.</w:t>
-            </w:r>
-          </w:p>
-        </w:tc>
-        <w:tc>
-          <w:tcPr>
-            <w:tcW w:type="dxa" w:w="2360"/>
-            <w:tcBorders>
-              <w:top w:val="single" w:color="C9D4E0" w:sz="4"/>
-              <w:left w:val="single" w:color="C9D4E0" w:sz="4"/>
-              <w:bottom w:val="single" w:color="C9D4E0" w:sz="4"/>
-              <w:right w:val="single" w:color="C9D4E0" w:sz="4"/>
-            </w:tcBorders>
-            <w:tcMar>
-              <w:top w:type="dxa" w:w="70"/>
-              <w:left w:type="dxa" w:w="110"/>
-              <w:bottom w:type="dxa" w:w="70"/>
-              <w:right w:type="dxa" w:w="110"/>
-            </w:tcMar>
-          </w:tcPr>
-          <w:p>
-            <w:pPr>
-              <w:spacing w:after="30"/>
-            </w:pPr>
-            <w:r>
-              <w:rPr>
-                <w:rFonts w:ascii="Calibri" w:cs="Calibri" w:eastAsia="Calibri" w:hAnsi="Calibri"/>
-                <w:color w:val="222B36"/>
-                <w:sz w:val="19"/>
-                <w:szCs w:val="19"/>
-              </w:rPr>
-              <w:t xml:space="preserve">Répondre à mes besoins</w:t>
-            </w:r>
-          </w:p>
-        </w:tc>
-      </w:tr>
-    </w:tbl>
-    <w:p>
-      <w:pPr>
-        <w:spacing w:after="120" w:before="100"/>
-      </w:pPr>
-      <w:r>
-        <w:rPr>
-          <w:rFonts w:ascii="Calibri" w:cs="Calibri" w:eastAsia="Calibri" w:hAnsi="Calibri"/>
-          <w:color w:val="222B36"/>
-          <w:sz w:val="21"/>
-          <w:szCs w:val="21"/>
-        </w:rPr>
-        <w:t xml:space="preserve">Chaque service dispose de sa page avec accroche, texte, liste détaillée, phrase de clôture et bouton. Les textes complets sont ceux du document « contenus Site final » du client et se modifient dans l'administration.</w:t>
+        <w:t xml:space="preserve">Les textes (accroche et description) sont ceux fournis par le client. Les capacités en passagers et en bagages sont des valeurs de départ à confirmer par l'entreprise, notamment pour le Nissan Terra ; elles sont modifiables à tout moment dans l'espace d'administration. Les anciens véhicules (Ford Everest XLT, Toyota Land Cruiser 76, Toyota Hilux 2.7L Standard) sont masqués du site mais conservés dans l'administration, où ils peuvent être réactivés.</w:t>
       </w:r>
     </w:p>
     <w:p>
@@ -13242,7 +12163,7 @@
                 <w:sz w:val="19"/>
                 <w:szCs w:val="19"/>
               </w:rPr>
-              <w:t xml:space="preserve">Plaquette V3 (images de petite taille)</w:t>
+              <w:t xml:space="preserve">Photos détourées fournies par le client (dossier Fiara)</w:t>
             </w:r>
           </w:p>
         </w:tc>
@@ -13273,7 +12194,7 @@
                 <w:sz w:val="19"/>
                 <w:szCs w:val="19"/>
               </w:rPr>
-              <w:t xml:space="preserve">À remplacer par des photos haute définition</w:t>
+              <w:t xml:space="preserve">Intégrées (WebP à fond transparent, ombre portée au sol) ; la photo du Prado est coupée à la base de la roue avant gauche</w:t>
             </w:r>
           </w:p>
         </w:tc>
@@ -18970,7 +17891,7 @@
                 <w:sz w:val="19"/>
                 <w:szCs w:val="19"/>
               </w:rPr>
-              <w:t xml:space="preserve">Relecture de la traduction anglaise des contenus finaux</w:t>
+              <w:t xml:space="preserve">Flotte finale : quatre véhicules, textes corrigés, photos détourées</w:t>
             </w:r>
           </w:p>
         </w:tc>
@@ -19001,7 +17922,7 @@
                 <w:sz w:val="19"/>
                 <w:szCs w:val="19"/>
               </w:rPr>
-              <w:t xml:space="preserve">À faire par le client</w:t>
+              <w:t xml:space="preserve">Intégrée et en ligne</w:t>
             </w:r>
           </w:p>
         </w:tc>
@@ -19038,7 +17959,7 @@
                 <w:sz w:val="19"/>
                 <w:szCs w:val="19"/>
               </w:rPr>
-              <w:t xml:space="preserve">Envoi réel des emails</w:t>
+              <w:t xml:space="preserve">Relecture de la traduction anglaise des contenus finaux</w:t>
             </w:r>
           </w:p>
         </w:tc>
@@ -19070,7 +17991,7 @@
                 <w:sz w:val="19"/>
                 <w:szCs w:val="19"/>
               </w:rPr>
-              <w:t xml:space="preserve">À configurer (paramètres SMTP à fournir)</w:t>
+              <w:t xml:space="preserve">À faire par le client</w:t>
             </w:r>
           </w:p>
         </w:tc>
@@ -19106,7 +18027,7 @@
                 <w:sz w:val="19"/>
                 <w:szCs w:val="19"/>
               </w:rPr>
-              <w:t xml:space="preserve">Photographies propres à l'entreprise, témoignages, réseaux sociaux</w:t>
+              <w:t xml:space="preserve">Envoi réel des emails</w:t>
             </w:r>
           </w:p>
         </w:tc>
@@ -19137,7 +18058,7 @@
                 <w:sz w:val="19"/>
                 <w:szCs w:val="19"/>
               </w:rPr>
-              <w:t xml:space="preserve">À fournir</w:t>
+              <w:t xml:space="preserve">À configurer (paramètres SMTP à fournir)</w:t>
             </w:r>
           </w:p>
         </w:tc>
@@ -19174,7 +18095,7 @@
                 <w:sz w:val="19"/>
                 <w:szCs w:val="19"/>
               </w:rPr>
-              <w:t xml:space="preserve">Nom de domaine et pages légales</w:t>
+              <w:t xml:space="preserve">Photographies propres à l'entreprise, témoignages, réseaux sociaux</w:t>
             </w:r>
           </w:p>
         </w:tc>
@@ -19242,6 +18163,74 @@
                 <w:sz w:val="19"/>
                 <w:szCs w:val="19"/>
               </w:rPr>
+              <w:t xml:space="preserve">Nom de domaine et pages légales</w:t>
+            </w:r>
+          </w:p>
+        </w:tc>
+        <w:tc>
+          <w:tcPr>
+            <w:tcW w:type="dxa" w:w="2560"/>
+            <w:tcBorders>
+              <w:top w:val="single" w:color="C9D4E0" w:sz="4"/>
+              <w:left w:val="single" w:color="C9D4E0" w:sz="4"/>
+              <w:bottom w:val="single" w:color="C9D4E0" w:sz="4"/>
+              <w:right w:val="single" w:color="C9D4E0" w:sz="4"/>
+            </w:tcBorders>
+            <w:tcMar>
+              <w:top w:type="dxa" w:w="70"/>
+              <w:left w:type="dxa" w:w="110"/>
+              <w:bottom w:type="dxa" w:w="70"/>
+              <w:right w:type="dxa" w:w="110"/>
+            </w:tcMar>
+          </w:tcPr>
+          <w:p>
+            <w:pPr>
+              <w:spacing w:after="30"/>
+            </w:pPr>
+            <w:r>
+              <w:rPr>
+                <w:rFonts w:ascii="Calibri" w:cs="Calibri" w:eastAsia="Calibri" w:hAnsi="Calibri"/>
+                <w:color w:val="222B36"/>
+                <w:sz w:val="19"/>
+                <w:szCs w:val="19"/>
+              </w:rPr>
+              <w:t xml:space="preserve">À fournir</w:t>
+            </w:r>
+          </w:p>
+        </w:tc>
+      </w:tr>
+      <w:tr>
+        <w:trPr>
+          <w:cantSplit/>
+        </w:trPr>
+        <w:tc>
+          <w:tcPr>
+            <w:tcW w:type="dxa" w:w="6800"/>
+            <w:tcBorders>
+              <w:top w:val="single" w:color="C9D4E0" w:sz="4"/>
+              <w:left w:val="single" w:color="C9D4E0" w:sz="4"/>
+              <w:bottom w:val="single" w:color="C9D4E0" w:sz="4"/>
+              <w:right w:val="single" w:color="C9D4E0" w:sz="4"/>
+            </w:tcBorders>
+            <w:shd w:fill="EEF2F7" w:color="auto" w:val="clear"/>
+            <w:tcMar>
+              <w:top w:type="dxa" w:w="70"/>
+              <w:left w:type="dxa" w:w="110"/>
+              <w:bottom w:type="dxa" w:w="70"/>
+              <w:right w:type="dxa" w:w="110"/>
+            </w:tcMar>
+          </w:tcPr>
+          <w:p>
+            <w:pPr>
+              <w:spacing w:after="30"/>
+            </w:pPr>
+            <w:r>
+              <w:rPr>
+                <w:rFonts w:ascii="Calibri" w:cs="Calibri" w:eastAsia="Calibri" w:hAnsi="Calibri"/>
+                <w:color w:val="222B36"/>
+                <w:sz w:val="19"/>
+                <w:szCs w:val="19"/>
+              </w:rPr>
               <w:t xml:space="preserve">Recette finale par le client</w:t>
             </w:r>
           </w:p>
@@ -19255,6 +18244,7 @@
               <w:bottom w:val="single" w:color="C9D4E0" w:sz="4"/>
               <w:right w:val="single" w:color="C9D4E0" w:sz="4"/>
             </w:tcBorders>
+            <w:shd w:fill="EEF2F7" w:color="auto" w:val="clear"/>
             <w:tcMar>
               <w:top w:type="dxa" w:w="70"/>
               <w:left w:type="dxa" w:w="110"/>
@@ -21143,7 +20133,7 @@
                 <w:sz w:val="19"/>
                 <w:szCs w:val="19"/>
               </w:rPr>
-              <w:t xml:space="preserve">Parcourir la tuile « Notre flotte » avec les flèches</w:t>
+              <w:t xml:space="preserve">Parcourir la tuile « Notre flotte » avec les flèches, puis la page Flotte</w:t>
             </w:r>
           </w:p>
         </w:tc>
@@ -21175,7 +20165,7 @@
                 <w:sz w:val="19"/>
                 <w:szCs w:val="19"/>
               </w:rPr>
-              <w:t xml:space="preserve">Les véhicules défilent, la tuile s'adapte au fond de la photo</w:t>
+              <w:t xml:space="preserve">Les quatre véhicules défilent sans fond parasite ; accroche et description lisibles, texte jamais recouvert par la voiture</w:t>
             </w:r>
           </w:p>
         </w:tc>
@@ -22173,7 +21163,7 @@
                 <w:sz w:val="19"/>
                 <w:szCs w:val="19"/>
               </w:rPr>
-              <w:t xml:space="preserve">Photographies d'ambiance provisoires et photos de véhicules de petite taille</w:t>
+              <w:t xml:space="preserve">Photographies d'ambiance provisoires</w:t>
             </w:r>
           </w:p>
         </w:tc>
@@ -22204,7 +21194,7 @@
                 <w:sz w:val="19"/>
                 <w:szCs w:val="19"/>
               </w:rPr>
-              <w:t xml:space="preserve">Rendu moins premium, véhicules pixelisés</w:t>
+              <w:t xml:space="preserve">Rendu moins premium</w:t>
             </w:r>
           </w:p>
         </w:tc>
@@ -23312,7 +22302,7 @@
                 <w:sz w:val="19"/>
                 <w:szCs w:val="19"/>
               </w:rPr>
-              <w:t xml:space="preserve">Migration</w:t>
+              <w:t xml:space="preserve">Détourage</w:t>
             </w:r>
           </w:p>
         </w:tc>
@@ -23343,7 +22333,7 @@
                 <w:sz w:val="19"/>
                 <w:szCs w:val="19"/>
               </w:rPr>
-              <w:t xml:space="preserve">Mise à jour de la base de données appliquée une seule fois</w:t>
+              <w:t xml:space="preserve">Photo d'un véhicule dont le fond a été supprimé (fond transparent), pour le poser sur n'importe quelle couleur</w:t>
             </w:r>
           </w:p>
         </w:tc>
@@ -23380,7 +22370,7 @@
                 <w:sz w:val="19"/>
                 <w:szCs w:val="19"/>
               </w:rPr>
-              <w:t xml:space="preserve">Sprint</w:t>
+              <w:t xml:space="preserve">Migration</w:t>
             </w:r>
           </w:p>
         </w:tc>
@@ -23412,7 +22402,7 @@
                 <w:sz w:val="19"/>
                 <w:szCs w:val="19"/>
               </w:rPr>
-              <w:t xml:space="preserve">Période de travail Scrum au bout de laquelle une partie du site est livrée</w:t>
+              <w:t xml:space="preserve">Mise à jour de la base de données appliquée une seule fois</w:t>
             </w:r>
           </w:p>
         </w:tc>
@@ -23448,7 +22438,7 @@
                 <w:sz w:val="19"/>
                 <w:szCs w:val="19"/>
               </w:rPr>
-              <w:t xml:space="preserve">Backlog</w:t>
+              <w:t xml:space="preserve">Sprint</w:t>
             </w:r>
           </w:p>
         </w:tc>
@@ -23479,7 +22469,7 @@
                 <w:sz w:val="19"/>
                 <w:szCs w:val="19"/>
               </w:rPr>
-              <w:t xml:space="preserve">Liste priorisée de tout ce qui doit être réalisé</w:t>
+              <w:t xml:space="preserve">Période de travail Scrum au bout de laquelle une partie du site est livrée</w:t>
             </w:r>
           </w:p>
         </w:tc>
@@ -23516,7 +22506,7 @@
                 <w:sz w:val="19"/>
                 <w:szCs w:val="19"/>
               </w:rPr>
-              <w:t xml:space="preserve">CRUD</w:t>
+              <w:t xml:space="preserve">Backlog</w:t>
             </w:r>
           </w:p>
         </w:tc>
@@ -23548,7 +22538,7 @@
                 <w:sz w:val="19"/>
                 <w:szCs w:val="19"/>
               </w:rPr>
-              <w:t xml:space="preserve">Créer, lire, modifier, supprimer : les quatre actions de gestion d'un contenu</w:t>
+              <w:t xml:space="preserve">Liste priorisée de tout ce qui doit être réalisé</w:t>
             </w:r>
           </w:p>
         </w:tc>
@@ -23584,7 +22574,7 @@
                 <w:sz w:val="19"/>
                 <w:szCs w:val="19"/>
               </w:rPr>
-              <w:t xml:space="preserve">SEO</w:t>
+              <w:t xml:space="preserve">CRUD</w:t>
             </w:r>
           </w:p>
         </w:tc>
@@ -23615,7 +22605,7 @@
                 <w:sz w:val="19"/>
                 <w:szCs w:val="19"/>
               </w:rPr>
-              <w:t xml:space="preserve">Référencement naturel : être bien placé dans les moteurs de recherche</w:t>
+              <w:t xml:space="preserve">Créer, lire, modifier, supprimer : les quatre actions de gestion d'un contenu</w:t>
             </w:r>
           </w:p>
         </w:tc>
@@ -23652,7 +22642,7 @@
                 <w:sz w:val="19"/>
                 <w:szCs w:val="19"/>
               </w:rPr>
-              <w:t xml:space="preserve">hreflang</w:t>
+              <w:t xml:space="preserve">SEO</w:t>
             </w:r>
           </w:p>
         </w:tc>
@@ -23684,7 +22674,7 @@
                 <w:sz w:val="19"/>
                 <w:szCs w:val="19"/>
               </w:rPr>
-              <w:t xml:space="preserve">Balise qui indique aux moteurs de recherche les versions d'une page dans d'autres langues</w:t>
+              <w:t xml:space="preserve">Référencement naturel : être bien placé dans les moteurs de recherche</w:t>
             </w:r>
           </w:p>
         </w:tc>
@@ -23720,7 +22710,7 @@
                 <w:sz w:val="19"/>
                 <w:szCs w:val="19"/>
               </w:rPr>
-              <w:t xml:space="preserve">SMTP</w:t>
+              <w:t xml:space="preserve">hreflang</w:t>
             </w:r>
           </w:p>
         </w:tc>
@@ -23751,7 +22741,7 @@
                 <w:sz w:val="19"/>
                 <w:szCs w:val="19"/>
               </w:rPr>
-              <w:t xml:space="preserve">Protocole d'envoi d'emails</w:t>
+              <w:t xml:space="preserve">Balise qui indique aux moteurs de recherche les versions d'une page dans d'autres langues</w:t>
             </w:r>
           </w:p>
         </w:tc>
@@ -23788,7 +22778,7 @@
                 <w:sz w:val="19"/>
                 <w:szCs w:val="19"/>
               </w:rPr>
-              <w:t xml:space="preserve">SVG</w:t>
+              <w:t xml:space="preserve">SMTP</w:t>
             </w:r>
           </w:p>
         </w:tc>
@@ -23820,7 +22810,7 @@
                 <w:sz w:val="19"/>
                 <w:szCs w:val="19"/>
               </w:rPr>
-              <w:t xml:space="preserve">Format d'image vectorielle, net à toutes les tailles</w:t>
+              <w:t xml:space="preserve">Protocole d'envoi d'emails</w:t>
             </w:r>
           </w:p>
         </w:tc>
@@ -23856,6 +22846,74 @@
                 <w:sz w:val="19"/>
                 <w:szCs w:val="19"/>
               </w:rPr>
+              <w:t xml:space="preserve">SVG</w:t>
+            </w:r>
+          </w:p>
+        </w:tc>
+        <w:tc>
+          <w:tcPr>
+            <w:tcW w:type="dxa" w:w="6760"/>
+            <w:tcBorders>
+              <w:top w:val="single" w:color="C9D4E0" w:sz="4"/>
+              <w:left w:val="single" w:color="C9D4E0" w:sz="4"/>
+              <w:bottom w:val="single" w:color="C9D4E0" w:sz="4"/>
+              <w:right w:val="single" w:color="C9D4E0" w:sz="4"/>
+            </w:tcBorders>
+            <w:tcMar>
+              <w:top w:type="dxa" w:w="70"/>
+              <w:left w:type="dxa" w:w="110"/>
+              <w:bottom w:type="dxa" w:w="70"/>
+              <w:right w:type="dxa" w:w="110"/>
+            </w:tcMar>
+          </w:tcPr>
+          <w:p>
+            <w:pPr>
+              <w:spacing w:after="30"/>
+            </w:pPr>
+            <w:r>
+              <w:rPr>
+                <w:rFonts w:ascii="Calibri" w:cs="Calibri" w:eastAsia="Calibri" w:hAnsi="Calibri"/>
+                <w:color w:val="222B36"/>
+                <w:sz w:val="19"/>
+                <w:szCs w:val="19"/>
+              </w:rPr>
+              <w:t xml:space="preserve">Format d'image vectorielle, net à toutes les tailles</w:t>
+            </w:r>
+          </w:p>
+        </w:tc>
+      </w:tr>
+      <w:tr>
+        <w:trPr>
+          <w:cantSplit/>
+        </w:trPr>
+        <w:tc>
+          <w:tcPr>
+            <w:tcW w:type="dxa" w:w="2600"/>
+            <w:tcBorders>
+              <w:top w:val="single" w:color="C9D4E0" w:sz="4"/>
+              <w:left w:val="single" w:color="C9D4E0" w:sz="4"/>
+              <w:bottom w:val="single" w:color="C9D4E0" w:sz="4"/>
+              <w:right w:val="single" w:color="C9D4E0" w:sz="4"/>
+            </w:tcBorders>
+            <w:shd w:fill="EEF2F7" w:color="auto" w:val="clear"/>
+            <w:tcMar>
+              <w:top w:type="dxa" w:w="70"/>
+              <w:left w:type="dxa" w:w="110"/>
+              <w:bottom w:type="dxa" w:w="70"/>
+              <w:right w:type="dxa" w:w="110"/>
+            </w:tcMar>
+          </w:tcPr>
+          <w:p>
+            <w:pPr>
+              <w:spacing w:after="30"/>
+            </w:pPr>
+            <w:r>
+              <w:rPr>
+                <w:rFonts w:ascii="Calibri" w:cs="Calibri" w:eastAsia="Calibri" w:hAnsi="Calibri"/>
+                <w:color w:val="222B36"/>
+                <w:sz w:val="19"/>
+                <w:szCs w:val="19"/>
+              </w:rPr>
               <w:t xml:space="preserve">Tonga soa / Misaotra</w:t>
             </w:r>
           </w:p>
@@ -23869,6 +22927,7 @@
               <w:bottom w:val="single" w:color="C9D4E0" w:sz="4"/>
               <w:right w:val="single" w:color="C9D4E0" w:sz="4"/>
             </w:tcBorders>
+            <w:shd w:fill="EEF2F7" w:color="auto" w:val="clear"/>
             <w:tcMar>
               <w:top w:type="dxa" w:w="70"/>
               <w:left w:type="dxa" w:w="110"/>

</xml_diff>

<commit_message>
Cahier des charges v2.3 : carte de Madagascar fidele, section Destinations, ronds du parcours
Co-Authored-By: Claude Sonnet 5.5 <noreply@anthropic.com>
</commit_message>
<xml_diff>
--- a/docs/CAHIER-DES-CHARGES.docx
+++ b/docs/CAHIER-DES-CHARGES.docx
@@ -81,7 +81,7 @@
           <w:sz w:val="21"/>
           <w:szCs w:val="21"/>
         </w:rPr>
-        <w:t xml:space="preserve">Version 2.2</w:t>
+        <w:t xml:space="preserve">Version 2.3</w:t>
       </w:r>
     </w:p>
     <w:p>
@@ -774,7 +774,7 @@
                 <w:sz w:val="19"/>
                 <w:szCs w:val="19"/>
               </w:rPr>
-              <w:t xml:space="preserve">2.2</w:t>
+              <w:t xml:space="preserve">2.3</w:t>
             </w:r>
           </w:p>
         </w:tc>
@@ -838,7 +838,7 @@
                 <w:sz w:val="19"/>
                 <w:szCs w:val="19"/>
               </w:rPr>
-              <w:t xml:space="preserve">Touche dorée discrète (filets, numéros, boutons d'action) et bouton « Voir les offres » en onglet doré bien visible ; accroches de services plus percutantes ; contenu et bouton d'action sur chaque service (accueil, page Services, page de service) ; conciergerie privée VIP en service à part, sans numéro ; numérotation réservée aux services ; trois valeurs seulement ; français et anglais strictement séparés.</w:t>
+              <w:t xml:space="preserve">Carte de Madagascar fidèle (contour géographique réel, villes placées par leurs coordonnées) ; bloc de droite de la section Destinations décalé vers la gauche et jamais coupé (grands écrans et mobile) ; ronds du parcours « L'expérience TS » qui se colorent quand la ligne les atteint.</w:t>
             </w:r>
           </w:p>
         </w:tc>
@@ -874,7 +874,7 @@
                 <w:sz w:val="19"/>
                 <w:szCs w:val="19"/>
               </w:rPr>
-              <w:t xml:space="preserve">2.1</w:t>
+              <w:t xml:space="preserve">2.2</w:t>
             </w:r>
           </w:p>
         </w:tc>
@@ -905,7 +905,7 @@
                 <w:sz w:val="19"/>
                 <w:szCs w:val="19"/>
               </w:rPr>
-              <w:t xml:space="preserve">12 octobre 2026</w:t>
+              <w:t xml:space="preserve">13 octobre 2026</w:t>
             </w:r>
           </w:p>
         </w:tc>
@@ -936,7 +936,7 @@
                 <w:sz w:val="19"/>
                 <w:szCs w:val="19"/>
               </w:rPr>
-              <w:t xml:space="preserve">Flotte finale du client : quatre véhicules (Toyota Prado TLX, Jeep Wrangler Rubicon, Toyota Hilux Double Cab Executive, Nissan Terra) avec textes corrigés et photos détourées ; accroche et description affichées sur la page Flotte.</w:t>
+              <w:t xml:space="preserve">Touche dorée discrète (filets, numéros, boutons d'action) et bouton « Voir les offres » en onglet doré bien visible ; accroches de services plus percutantes ; contenu et bouton d'action sur chaque service (accueil, page Services, page de service) ; conciergerie privée VIP en service à part, sans numéro ; numérotation réservée aux services ; trois valeurs seulement ; français et anglais strictement séparés.</w:t>
             </w:r>
           </w:p>
         </w:tc>
@@ -973,6 +973,106 @@
                 <w:sz w:val="19"/>
                 <w:szCs w:val="19"/>
               </w:rPr>
+              <w:t xml:space="preserve">2.1</w:t>
+            </w:r>
+          </w:p>
+        </w:tc>
+        <w:tc>
+          <w:tcPr>
+            <w:tcW w:type="dxa" w:w="1900"/>
+            <w:tcBorders>
+              <w:top w:val="single" w:color="C9D4E0" w:sz="4"/>
+              <w:left w:val="single" w:color="C9D4E0" w:sz="4"/>
+              <w:bottom w:val="single" w:color="C9D4E0" w:sz="4"/>
+              <w:right w:val="single" w:color="C9D4E0" w:sz="4"/>
+            </w:tcBorders>
+            <w:shd w:fill="EEF2F7" w:color="auto" w:val="clear"/>
+            <w:tcMar>
+              <w:top w:type="dxa" w:w="70"/>
+              <w:left w:type="dxa" w:w="110"/>
+              <w:bottom w:type="dxa" w:w="70"/>
+              <w:right w:type="dxa" w:w="110"/>
+            </w:tcMar>
+          </w:tcPr>
+          <w:p>
+            <w:pPr>
+              <w:spacing w:after="30"/>
+            </w:pPr>
+            <w:r>
+              <w:rPr>
+                <w:rFonts w:ascii="Calibri" w:cs="Calibri" w:eastAsia="Calibri" w:hAnsi="Calibri"/>
+                <w:color w:val="222B36"/>
+                <w:sz w:val="19"/>
+                <w:szCs w:val="19"/>
+              </w:rPr>
+              <w:t xml:space="preserve">12 octobre 2026</w:t>
+            </w:r>
+          </w:p>
+        </w:tc>
+        <w:tc>
+          <w:tcPr>
+            <w:tcW w:type="dxa" w:w="6360"/>
+            <w:tcBorders>
+              <w:top w:val="single" w:color="C9D4E0" w:sz="4"/>
+              <w:left w:val="single" w:color="C9D4E0" w:sz="4"/>
+              <w:bottom w:val="single" w:color="C9D4E0" w:sz="4"/>
+              <w:right w:val="single" w:color="C9D4E0" w:sz="4"/>
+            </w:tcBorders>
+            <w:shd w:fill="EEF2F7" w:color="auto" w:val="clear"/>
+            <w:tcMar>
+              <w:top w:type="dxa" w:w="70"/>
+              <w:left w:type="dxa" w:w="110"/>
+              <w:bottom w:type="dxa" w:w="70"/>
+              <w:right w:type="dxa" w:w="110"/>
+            </w:tcMar>
+          </w:tcPr>
+          <w:p>
+            <w:pPr>
+              <w:spacing w:after="30"/>
+            </w:pPr>
+            <w:r>
+              <w:rPr>
+                <w:rFonts w:ascii="Calibri" w:cs="Calibri" w:eastAsia="Calibri" w:hAnsi="Calibri"/>
+                <w:color w:val="222B36"/>
+                <w:sz w:val="19"/>
+                <w:szCs w:val="19"/>
+              </w:rPr>
+              <w:t xml:space="preserve">Flotte finale du client : quatre véhicules (Toyota Prado TLX, Jeep Wrangler Rubicon, Toyota Hilux Double Cab Executive, Nissan Terra) avec textes corrigés et photos détourées ; accroche et description affichées sur la page Flotte.</w:t>
+            </w:r>
+          </w:p>
+        </w:tc>
+      </w:tr>
+      <w:tr>
+        <w:trPr>
+          <w:cantSplit/>
+        </w:trPr>
+        <w:tc>
+          <w:tcPr>
+            <w:tcW w:type="dxa" w:w="1100"/>
+            <w:tcBorders>
+              <w:top w:val="single" w:color="C9D4E0" w:sz="4"/>
+              <w:left w:val="single" w:color="C9D4E0" w:sz="4"/>
+              <w:bottom w:val="single" w:color="C9D4E0" w:sz="4"/>
+              <w:right w:val="single" w:color="C9D4E0" w:sz="4"/>
+            </w:tcBorders>
+            <w:tcMar>
+              <w:top w:type="dxa" w:w="70"/>
+              <w:left w:type="dxa" w:w="110"/>
+              <w:bottom w:type="dxa" w:w="70"/>
+              <w:right w:type="dxa" w:w="110"/>
+            </w:tcMar>
+          </w:tcPr>
+          <w:p>
+            <w:pPr>
+              <w:spacing w:after="30"/>
+            </w:pPr>
+            <w:r>
+              <w:rPr>
+                <w:rFonts w:ascii="Calibri" w:cs="Calibri" w:eastAsia="Calibri" w:hAnsi="Calibri"/>
+                <w:color w:val="222B36"/>
+                <w:sz w:val="19"/>
+                <w:szCs w:val="19"/>
+              </w:rPr>
               <w:t xml:space="preserve">2.0</w:t>
             </w:r>
           </w:p>
@@ -986,7 +1086,6 @@
               <w:bottom w:val="single" w:color="C9D4E0" w:sz="4"/>
               <w:right w:val="single" w:color="C9D4E0" w:sz="4"/>
             </w:tcBorders>
-            <w:shd w:fill="EEF2F7" w:color="auto" w:val="clear"/>
             <w:tcMar>
               <w:top w:type="dxa" w:w="70"/>
               <w:left w:type="dxa" w:w="110"/>
@@ -1018,7 +1117,6 @@
               <w:bottom w:val="single" w:color="C9D4E0" w:sz="4"/>
               <w:right w:val="single" w:color="C9D4E0" w:sz="4"/>
             </w:tcBorders>
-            <w:shd w:fill="EEF2F7" w:color="auto" w:val="clear"/>
             <w:tcMar>
               <w:top w:type="dxa" w:w="70"/>
               <w:left w:type="dxa" w:w="110"/>
@@ -6556,7 +6654,7 @@
                 <w:sz w:val="19"/>
                 <w:szCs w:val="19"/>
               </w:rPr>
-              <w:t xml:space="preserve">Explorateur : image, texte et repère de carte qui changent au survol</w:t>
+              <w:t xml:space="preserve">Explorateur : image, texte et carte réelle de Madagascar dont le repère de la ville active s'anime au survol</w:t>
             </w:r>
           </w:p>
         </w:tc>
@@ -8313,7 +8411,7 @@
                 <w:sz w:val="19"/>
                 <w:szCs w:val="19"/>
               </w:rPr>
-              <w:t xml:space="preserve">Destinations : liste éditoriale, la grande image, la description et le repère sur la carte de Madagascar changent au survol (ou au toucher).</w:t>
+              <w:t xml:space="preserve">Destinations : liste éditoriale ; au survol (ou au toucher), la grande image, la description et le repère changent. La carte reprend le vrai contour de Madagascar et chaque ville est placée par ses coordonnées géographiques. Le bloc de droite reste entièrement visible sur tous les écrans (nom à la ligne si besoin, décalage vers la gauche).</w:t>
             </w:r>
           </w:p>
         </w:tc>
@@ -9540,6 +9638,104 @@
                 <w:szCs w:val="19"/>
               </w:rPr>
               <w:t xml:space="preserve">Haute</w:t>
+            </w:r>
+          </w:p>
+        </w:tc>
+      </w:tr>
+      <w:tr>
+        <w:trPr>
+          <w:cantSplit/>
+        </w:trPr>
+        <w:tc>
+          <w:tcPr>
+            <w:tcW w:type="dxa" w:w="900"/>
+            <w:tcBorders>
+              <w:top w:val="single" w:color="C9D4E0" w:sz="4"/>
+              <w:left w:val="single" w:color="C9D4E0" w:sz="4"/>
+              <w:bottom w:val="single" w:color="C9D4E0" w:sz="4"/>
+              <w:right w:val="single" w:color="C9D4E0" w:sz="4"/>
+            </w:tcBorders>
+            <w:tcMar>
+              <w:top w:type="dxa" w:w="70"/>
+              <w:left w:type="dxa" w:w="110"/>
+              <w:bottom w:type="dxa" w:w="70"/>
+              <w:right w:type="dxa" w:w="110"/>
+            </w:tcMar>
+          </w:tcPr>
+          <w:p>
+            <w:pPr>
+              <w:spacing w:after="30"/>
+            </w:pPr>
+            <w:r>
+              <w:rPr>
+                <w:rFonts w:ascii="Calibri" w:cs="Calibri" w:eastAsia="Calibri" w:hAnsi="Calibri"/>
+                <w:color w:val="222B36"/>
+                <w:sz w:val="19"/>
+                <w:szCs w:val="19"/>
+              </w:rPr>
+              <w:t xml:space="preserve">EF-19</w:t>
+            </w:r>
+          </w:p>
+        </w:tc>
+        <w:tc>
+          <w:tcPr>
+            <w:tcW w:type="dxa" w:w="7000"/>
+            <w:tcBorders>
+              <w:top w:val="single" w:color="C9D4E0" w:sz="4"/>
+              <w:left w:val="single" w:color="C9D4E0" w:sz="4"/>
+              <w:bottom w:val="single" w:color="C9D4E0" w:sz="4"/>
+              <w:right w:val="single" w:color="C9D4E0" w:sz="4"/>
+            </w:tcBorders>
+            <w:tcMar>
+              <w:top w:type="dxa" w:w="70"/>
+              <w:left w:type="dxa" w:w="110"/>
+              <w:bottom w:type="dxa" w:w="70"/>
+              <w:right w:type="dxa" w:w="110"/>
+            </w:tcMar>
+          </w:tcPr>
+          <w:p>
+            <w:pPr>
+              <w:spacing w:after="30"/>
+            </w:pPr>
+            <w:r>
+              <w:rPr>
+                <w:rFonts w:ascii="Calibri" w:cs="Calibri" w:eastAsia="Calibri" w:hAnsi="Calibri"/>
+                <w:color w:val="222B36"/>
+                <w:sz w:val="19"/>
+                <w:szCs w:val="19"/>
+              </w:rPr>
+              <w:t xml:space="preserve">Parcours « L'expérience TS » : une ligne se dessine au défilement et l'intérieur de chaque rond se colore quand la ligne l'atteint, puis se vide quand on remonte.</w:t>
+            </w:r>
+          </w:p>
+        </w:tc>
+        <w:tc>
+          <w:tcPr>
+            <w:tcW w:type="dxa" w:w="1460"/>
+            <w:tcBorders>
+              <w:top w:val="single" w:color="C9D4E0" w:sz="4"/>
+              <w:left w:val="single" w:color="C9D4E0" w:sz="4"/>
+              <w:bottom w:val="single" w:color="C9D4E0" w:sz="4"/>
+              <w:right w:val="single" w:color="C9D4E0" w:sz="4"/>
+            </w:tcBorders>
+            <w:tcMar>
+              <w:top w:type="dxa" w:w="70"/>
+              <w:left w:type="dxa" w:w="110"/>
+              <w:bottom w:type="dxa" w:w="70"/>
+              <w:right w:type="dxa" w:w="110"/>
+            </w:tcMar>
+          </w:tcPr>
+          <w:p>
+            <w:pPr>
+              <w:spacing w:after="30"/>
+            </w:pPr>
+            <w:r>
+              <w:rPr>
+                <w:rFonts w:ascii="Calibri" w:cs="Calibri" w:eastAsia="Calibri" w:hAnsi="Calibri"/>
+                <w:color w:val="222B36"/>
+                <w:sz w:val="19"/>
+                <w:szCs w:val="19"/>
+              </w:rPr>
+              <w:t xml:space="preserve">Moyenne</w:t>
             </w:r>
           </w:p>
         </w:tc>
@@ -12310,6 +12506,25 @@
           <w:sz w:val="21"/>
           <w:szCs w:val="21"/>
         </w:rPr>
+        <w:t xml:space="preserve">Parcours « L'expérience TS » : la ligne se dessine au défilement et colore l'intérieur des ronds qu'elle atteint (bleu marine, halo doré léger).</w:t>
+      </w:r>
+    </w:p>
+    <w:p>
+      <w:pPr>
+        <w:pStyle w:val="ListParagraph"/>
+        <w:numPr>
+          <w:ilvl w:val="0"/>
+          <w:numId w:val="2"/>
+        </w:numPr>
+        <w:spacing w:after="70" w:line="280"/>
+      </w:pPr>
+      <w:r>
+        <w:rPr>
+          <w:rFonts w:ascii="Calibri" w:cs="Calibri" w:eastAsia="Calibri" w:hAnsi="Calibri"/>
+          <w:color w:val="222B36"/>
+          <w:sz w:val="21"/>
+          <w:szCs w:val="21"/>
+        </w:rPr>
         <w:t xml:space="preserve">Menu plein écran avec animation échelonnée et image associée à chaque entrée.</w:t>
       </w:r>
     </w:p>
@@ -13484,7 +13699,7 @@
                 <w:sz w:val="19"/>
                 <w:szCs w:val="19"/>
               </w:rPr>
-              <w:t xml:space="preserve">Photographies des véhicules</w:t>
+              <w:t xml:space="preserve">Contour de Madagascar (carte des destinations)</w:t>
             </w:r>
           </w:p>
         </w:tc>
@@ -13516,7 +13731,7 @@
                 <w:sz w:val="19"/>
                 <w:szCs w:val="19"/>
               </w:rPr>
-              <w:t xml:space="preserve">Photos détourées fournies par le client (dossier Fiara)</w:t>
+              <w:t xml:space="preserve">Natural Earth 1:50m, domaine public</w:t>
             </w:r>
           </w:p>
         </w:tc>
@@ -13548,7 +13763,7 @@
                 <w:sz w:val="19"/>
                 <w:szCs w:val="19"/>
               </w:rPr>
-              <w:t xml:space="preserve">Intégrées (WebP à fond transparent, ombre portée au sol) ; la photo du Prado est coupée à la base de la roue avant gauche</w:t>
+              <w:t xml:space="preserve">Intégré ; simplifié et lissé, villes placées par leurs coordonnées géographiques</w:t>
             </w:r>
           </w:p>
         </w:tc>
@@ -13584,7 +13799,7 @@
                 <w:sz w:val="19"/>
                 <w:szCs w:val="19"/>
               </w:rPr>
-              <w:t xml:space="preserve">Témoignages</w:t>
+              <w:t xml:space="preserve">Photographies des véhicules</w:t>
             </w:r>
           </w:p>
         </w:tc>
@@ -13615,7 +13830,7 @@
                 <w:sz w:val="19"/>
                 <w:szCs w:val="19"/>
               </w:rPr>
-              <w:t xml:space="preserve">Clients réels</w:t>
+              <w:t xml:space="preserve">Photos détourées fournies par le client (dossier Fiara)</w:t>
             </w:r>
           </w:p>
         </w:tc>
@@ -13646,7 +13861,7 @@
                 <w:sz w:val="19"/>
                 <w:szCs w:val="19"/>
               </w:rPr>
-              <w:t xml:space="preserve">À fournir (aucun témoignage inventé)</w:t>
+              <w:t xml:space="preserve">Intégrées (WebP à fond transparent, ombre portée au sol) ; la photo du Prado est coupée à la base de la roue avant gauche</w:t>
             </w:r>
           </w:p>
         </w:tc>
@@ -13683,7 +13898,7 @@
                 <w:sz w:val="19"/>
                 <w:szCs w:val="19"/>
               </w:rPr>
-              <w:t xml:space="preserve">Réseaux sociaux</w:t>
+              <w:t xml:space="preserve">Témoignages</w:t>
             </w:r>
           </w:p>
         </w:tc>
@@ -13715,7 +13930,7 @@
                 <w:sz w:val="19"/>
                 <w:szCs w:val="19"/>
               </w:rPr>
-              <w:t xml:space="preserve">Entreprise</w:t>
+              <w:t xml:space="preserve">Clients réels</w:t>
             </w:r>
           </w:p>
         </w:tc>
@@ -13747,7 +13962,7 @@
                 <w:sz w:val="19"/>
                 <w:szCs w:val="19"/>
               </w:rPr>
-              <w:t xml:space="preserve">À fournir (liens Instagram, LinkedIn, Facebook)</w:t>
+              <w:t xml:space="preserve">À fournir (aucun témoignage inventé)</w:t>
             </w:r>
           </w:p>
         </w:tc>
@@ -13783,6 +13998,105 @@
                 <w:sz w:val="19"/>
                 <w:szCs w:val="19"/>
               </w:rPr>
+              <w:t xml:space="preserve">Réseaux sociaux</w:t>
+            </w:r>
+          </w:p>
+        </w:tc>
+        <w:tc>
+          <w:tcPr>
+            <w:tcW w:type="dxa" w:w="3560"/>
+            <w:tcBorders>
+              <w:top w:val="single" w:color="C9D4E0" w:sz="4"/>
+              <w:left w:val="single" w:color="C9D4E0" w:sz="4"/>
+              <w:bottom w:val="single" w:color="C9D4E0" w:sz="4"/>
+              <w:right w:val="single" w:color="C9D4E0" w:sz="4"/>
+            </w:tcBorders>
+            <w:tcMar>
+              <w:top w:type="dxa" w:w="70"/>
+              <w:left w:type="dxa" w:w="110"/>
+              <w:bottom w:type="dxa" w:w="70"/>
+              <w:right w:type="dxa" w:w="110"/>
+            </w:tcMar>
+          </w:tcPr>
+          <w:p>
+            <w:pPr>
+              <w:spacing w:after="30"/>
+            </w:pPr>
+            <w:r>
+              <w:rPr>
+                <w:rFonts w:ascii="Calibri" w:cs="Calibri" w:eastAsia="Calibri" w:hAnsi="Calibri"/>
+                <w:color w:val="222B36"/>
+                <w:sz w:val="19"/>
+                <w:szCs w:val="19"/>
+              </w:rPr>
+              <w:t xml:space="preserve">Entreprise</w:t>
+            </w:r>
+          </w:p>
+        </w:tc>
+        <w:tc>
+          <w:tcPr>
+            <w:tcW w:type="dxa" w:w="2500"/>
+            <w:tcBorders>
+              <w:top w:val="single" w:color="C9D4E0" w:sz="4"/>
+              <w:left w:val="single" w:color="C9D4E0" w:sz="4"/>
+              <w:bottom w:val="single" w:color="C9D4E0" w:sz="4"/>
+              <w:right w:val="single" w:color="C9D4E0" w:sz="4"/>
+            </w:tcBorders>
+            <w:tcMar>
+              <w:top w:type="dxa" w:w="70"/>
+              <w:left w:type="dxa" w:w="110"/>
+              <w:bottom w:type="dxa" w:w="70"/>
+              <w:right w:type="dxa" w:w="110"/>
+            </w:tcMar>
+          </w:tcPr>
+          <w:p>
+            <w:pPr>
+              <w:spacing w:after="30"/>
+            </w:pPr>
+            <w:r>
+              <w:rPr>
+                <w:rFonts w:ascii="Calibri" w:cs="Calibri" w:eastAsia="Calibri" w:hAnsi="Calibri"/>
+                <w:color w:val="222B36"/>
+                <w:sz w:val="19"/>
+                <w:szCs w:val="19"/>
+              </w:rPr>
+              <w:t xml:space="preserve">À fournir (liens Instagram, LinkedIn, Facebook)</w:t>
+            </w:r>
+          </w:p>
+        </w:tc>
+      </w:tr>
+      <w:tr>
+        <w:trPr>
+          <w:cantSplit/>
+        </w:trPr>
+        <w:tc>
+          <w:tcPr>
+            <w:tcW w:type="dxa" w:w="3300"/>
+            <w:tcBorders>
+              <w:top w:val="single" w:color="C9D4E0" w:sz="4"/>
+              <w:left w:val="single" w:color="C9D4E0" w:sz="4"/>
+              <w:bottom w:val="single" w:color="C9D4E0" w:sz="4"/>
+              <w:right w:val="single" w:color="C9D4E0" w:sz="4"/>
+            </w:tcBorders>
+            <w:shd w:fill="EEF2F7" w:color="auto" w:val="clear"/>
+            <w:tcMar>
+              <w:top w:type="dxa" w:w="70"/>
+              <w:left w:type="dxa" w:w="110"/>
+              <w:bottom w:type="dxa" w:w="70"/>
+              <w:right w:type="dxa" w:w="110"/>
+            </w:tcMar>
+          </w:tcPr>
+          <w:p>
+            <w:pPr>
+              <w:spacing w:after="30"/>
+            </w:pPr>
+            <w:r>
+              <w:rPr>
+                <w:rFonts w:ascii="Calibri" w:cs="Calibri" w:eastAsia="Calibri" w:hAnsi="Calibri"/>
+                <w:color w:val="222B36"/>
+                <w:sz w:val="19"/>
+                <w:szCs w:val="19"/>
+              </w:rPr>
               <w:t xml:space="preserve">Mentions légales, conditions générales, politique de confidentialité</w:t>
             </w:r>
           </w:p>
@@ -13796,6 +14110,7 @@
               <w:bottom w:val="single" w:color="C9D4E0" w:sz="4"/>
               <w:right w:val="single" w:color="C9D4E0" w:sz="4"/>
             </w:tcBorders>
+            <w:shd w:fill="EEF2F7" w:color="auto" w:val="clear"/>
             <w:tcMar>
               <w:top w:type="dxa" w:w="70"/>
               <w:left w:type="dxa" w:w="110"/>
@@ -13827,6 +14142,7 @@
               <w:bottom w:val="single" w:color="C9D4E0" w:sz="4"/>
               <w:right w:val="single" w:color="C9D4E0" w:sz="4"/>
             </w:tcBorders>
+            <w:shd w:fill="EEF2F7" w:color="auto" w:val="clear"/>
             <w:tcMar>
               <w:top w:type="dxa" w:w="70"/>
               <w:left w:type="dxa" w:w="110"/>
@@ -19310,7 +19626,7 @@
                 <w:sz w:val="19"/>
                 <w:szCs w:val="19"/>
               </w:rPr>
-              <w:t xml:space="preserve">Contenus finaux du client (slogan, trois valeurs, sept services, À propos)</w:t>
+              <w:t xml:space="preserve">Carte de Madagascar fidèle, section Destinations sans élément coupé, ronds du parcours qui se colorent</w:t>
             </w:r>
           </w:p>
         </w:tc>
@@ -19342,7 +19658,7 @@
                 <w:sz w:val="19"/>
                 <w:szCs w:val="19"/>
               </w:rPr>
-              <w:t xml:space="preserve">Intégrés et en ligne</w:t>
+              <w:t xml:space="preserve">Livrés et en ligne</w:t>
             </w:r>
           </w:p>
         </w:tc>
@@ -19378,7 +19694,7 @@
                 <w:sz w:val="19"/>
                 <w:szCs w:val="19"/>
               </w:rPr>
-              <w:t xml:space="preserve">Flotte finale : quatre véhicules, textes corrigés, photos détourées</w:t>
+              <w:t xml:space="preserve">Contenus finaux du client (slogan, trois valeurs, sept services, À propos)</w:t>
             </w:r>
           </w:p>
         </w:tc>
@@ -19409,7 +19725,7 @@
                 <w:sz w:val="19"/>
                 <w:szCs w:val="19"/>
               </w:rPr>
-              <w:t xml:space="preserve">Intégrée et en ligne</w:t>
+              <w:t xml:space="preserve">Intégrés et en ligne</w:t>
             </w:r>
           </w:p>
         </w:tc>
@@ -19446,7 +19762,7 @@
                 <w:sz w:val="19"/>
                 <w:szCs w:val="19"/>
               </w:rPr>
-              <w:t xml:space="preserve">Relecture de la traduction anglaise des contenus finaux</w:t>
+              <w:t xml:space="preserve">Flotte finale : quatre véhicules, textes corrigés, photos détourées</w:t>
             </w:r>
           </w:p>
         </w:tc>
@@ -19478,7 +19794,7 @@
                 <w:sz w:val="19"/>
                 <w:szCs w:val="19"/>
               </w:rPr>
-              <w:t xml:space="preserve">À faire par le client</w:t>
+              <w:t xml:space="preserve">Intégrée et en ligne</w:t>
             </w:r>
           </w:p>
         </w:tc>
@@ -19514,7 +19830,7 @@
                 <w:sz w:val="19"/>
                 <w:szCs w:val="19"/>
               </w:rPr>
-              <w:t xml:space="preserve">Envoi réel des emails</w:t>
+              <w:t xml:space="preserve">Relecture de la traduction anglaise des contenus finaux</w:t>
             </w:r>
           </w:p>
         </w:tc>
@@ -19545,7 +19861,7 @@
                 <w:sz w:val="19"/>
                 <w:szCs w:val="19"/>
               </w:rPr>
-              <w:t xml:space="preserve">À configurer (paramètres SMTP à fournir)</w:t>
+              <w:t xml:space="preserve">À faire par le client</w:t>
             </w:r>
           </w:p>
         </w:tc>
@@ -19582,7 +19898,7 @@
                 <w:sz w:val="19"/>
                 <w:szCs w:val="19"/>
               </w:rPr>
-              <w:t xml:space="preserve">Photographies propres à l'entreprise, témoignages, réseaux sociaux</w:t>
+              <w:t xml:space="preserve">Envoi réel des emails</w:t>
             </w:r>
           </w:p>
         </w:tc>
@@ -19614,7 +19930,7 @@
                 <w:sz w:val="19"/>
                 <w:szCs w:val="19"/>
               </w:rPr>
-              <w:t xml:space="preserve">À fournir</w:t>
+              <w:t xml:space="preserve">À configurer (paramètres SMTP à fournir)</w:t>
             </w:r>
           </w:p>
         </w:tc>
@@ -19650,7 +19966,7 @@
                 <w:sz w:val="19"/>
                 <w:szCs w:val="19"/>
               </w:rPr>
-              <w:t xml:space="preserve">Nom de domaine et pages légales</w:t>
+              <w:t xml:space="preserve">Photographies propres à l'entreprise, témoignages, réseaux sociaux</w:t>
             </w:r>
           </w:p>
         </w:tc>
@@ -19718,6 +20034,74 @@
                 <w:sz w:val="19"/>
                 <w:szCs w:val="19"/>
               </w:rPr>
+              <w:t xml:space="preserve">Nom de domaine et pages légales</w:t>
+            </w:r>
+          </w:p>
+        </w:tc>
+        <w:tc>
+          <w:tcPr>
+            <w:tcW w:type="dxa" w:w="2560"/>
+            <w:tcBorders>
+              <w:top w:val="single" w:color="C9D4E0" w:sz="4"/>
+              <w:left w:val="single" w:color="C9D4E0" w:sz="4"/>
+              <w:bottom w:val="single" w:color="C9D4E0" w:sz="4"/>
+              <w:right w:val="single" w:color="C9D4E0" w:sz="4"/>
+            </w:tcBorders>
+            <w:shd w:fill="EEF2F7" w:color="auto" w:val="clear"/>
+            <w:tcMar>
+              <w:top w:type="dxa" w:w="70"/>
+              <w:left w:type="dxa" w:w="110"/>
+              <w:bottom w:type="dxa" w:w="70"/>
+              <w:right w:type="dxa" w:w="110"/>
+            </w:tcMar>
+          </w:tcPr>
+          <w:p>
+            <w:pPr>
+              <w:spacing w:after="30"/>
+            </w:pPr>
+            <w:r>
+              <w:rPr>
+                <w:rFonts w:ascii="Calibri" w:cs="Calibri" w:eastAsia="Calibri" w:hAnsi="Calibri"/>
+                <w:color w:val="222B36"/>
+                <w:sz w:val="19"/>
+                <w:szCs w:val="19"/>
+              </w:rPr>
+              <w:t xml:space="preserve">À fournir</w:t>
+            </w:r>
+          </w:p>
+        </w:tc>
+      </w:tr>
+      <w:tr>
+        <w:trPr>
+          <w:cantSplit/>
+        </w:trPr>
+        <w:tc>
+          <w:tcPr>
+            <w:tcW w:type="dxa" w:w="6800"/>
+            <w:tcBorders>
+              <w:top w:val="single" w:color="C9D4E0" w:sz="4"/>
+              <w:left w:val="single" w:color="C9D4E0" w:sz="4"/>
+              <w:bottom w:val="single" w:color="C9D4E0" w:sz="4"/>
+              <w:right w:val="single" w:color="C9D4E0" w:sz="4"/>
+            </w:tcBorders>
+            <w:tcMar>
+              <w:top w:type="dxa" w:w="70"/>
+              <w:left w:type="dxa" w:w="110"/>
+              <w:bottom w:type="dxa" w:w="70"/>
+              <w:right w:type="dxa" w:w="110"/>
+            </w:tcMar>
+          </w:tcPr>
+          <w:p>
+            <w:pPr>
+              <w:spacing w:after="30"/>
+            </w:pPr>
+            <w:r>
+              <w:rPr>
+                <w:rFonts w:ascii="Calibri" w:cs="Calibri" w:eastAsia="Calibri" w:hAnsi="Calibri"/>
+                <w:color w:val="222B36"/>
+                <w:sz w:val="19"/>
+                <w:szCs w:val="19"/>
+              </w:rPr>
               <w:t xml:space="preserve">Recette finale par le client</w:t>
             </w:r>
           </w:p>
@@ -19731,7 +20115,6 @@
               <w:bottom w:val="single" w:color="C9D4E0" w:sz="4"/>
               <w:right w:val="single" w:color="C9D4E0" w:sz="4"/>
             </w:tcBorders>
-            <w:shd w:fill="EEF2F7" w:color="auto" w:val="clear"/>
             <w:tcMar>
               <w:top w:type="dxa" w:w="70"/>
               <w:left w:type="dxa" w:w="110"/>
@@ -22153,6 +22536,205 @@
           </w:p>
         </w:tc>
       </w:tr>
+      <w:tr>
+        <w:trPr>
+          <w:cantSplit/>
+        </w:trPr>
+        <w:tc>
+          <w:tcPr>
+            <w:tcW w:type="dxa" w:w="700"/>
+            <w:tcBorders>
+              <w:top w:val="single" w:color="C9D4E0" w:sz="4"/>
+              <w:left w:val="single" w:color="C9D4E0" w:sz="4"/>
+              <w:bottom w:val="single" w:color="C9D4E0" w:sz="4"/>
+              <w:right w:val="single" w:color="C9D4E0" w:sz="4"/>
+            </w:tcBorders>
+            <w:shd w:fill="EEF2F7" w:color="auto" w:val="clear"/>
+            <w:tcMar>
+              <w:top w:type="dxa" w:w="70"/>
+              <w:left w:type="dxa" w:w="110"/>
+              <w:bottom w:type="dxa" w:w="70"/>
+              <w:right w:type="dxa" w:w="110"/>
+            </w:tcMar>
+          </w:tcPr>
+          <w:p>
+            <w:pPr>
+              <w:spacing w:after="30"/>
+            </w:pPr>
+            <w:r>
+              <w:rPr>
+                <w:rFonts w:ascii="Calibri" w:cs="Calibri" w:eastAsia="Calibri" w:hAnsi="Calibri"/>
+                <w:color w:val="222B36"/>
+                <w:sz w:val="19"/>
+                <w:szCs w:val="19"/>
+              </w:rPr>
+              <w:t xml:space="preserve">22</w:t>
+            </w:r>
+          </w:p>
+        </w:tc>
+        <w:tc>
+          <w:tcPr>
+            <w:tcW w:type="dxa" w:w="4300"/>
+            <w:tcBorders>
+              <w:top w:val="single" w:color="C9D4E0" w:sz="4"/>
+              <w:left w:val="single" w:color="C9D4E0" w:sz="4"/>
+              <w:bottom w:val="single" w:color="C9D4E0" w:sz="4"/>
+              <w:right w:val="single" w:color="C9D4E0" w:sz="4"/>
+            </w:tcBorders>
+            <w:shd w:fill="EEF2F7" w:color="auto" w:val="clear"/>
+            <w:tcMar>
+              <w:top w:type="dxa" w:w="70"/>
+              <w:left w:type="dxa" w:w="110"/>
+              <w:bottom w:type="dxa" w:w="70"/>
+              <w:right w:type="dxa" w:w="110"/>
+            </w:tcMar>
+          </w:tcPr>
+          <w:p>
+            <w:pPr>
+              <w:spacing w:after="30"/>
+            </w:pPr>
+            <w:r>
+              <w:rPr>
+                <w:rFonts w:ascii="Calibri" w:cs="Calibri" w:eastAsia="Calibri" w:hAnsi="Calibri"/>
+                <w:color w:val="222B36"/>
+                <w:sz w:val="19"/>
+                <w:szCs w:val="19"/>
+              </w:rPr>
+              <w:t xml:space="preserve">Ouvrir la section Destinations sur grand écran (1900 px et plus), sur ordinateur portable et sur téléphone</w:t>
+            </w:r>
+          </w:p>
+        </w:tc>
+        <w:tc>
+          <w:tcPr>
+            <w:tcW w:type="dxa" w:w="4360"/>
+            <w:tcBorders>
+              <w:top w:val="single" w:color="C9D4E0" w:sz="4"/>
+              <w:left w:val="single" w:color="C9D4E0" w:sz="4"/>
+              <w:bottom w:val="single" w:color="C9D4E0" w:sz="4"/>
+              <w:right w:val="single" w:color="C9D4E0" w:sz="4"/>
+            </w:tcBorders>
+            <w:shd w:fill="EEF2F7" w:color="auto" w:val="clear"/>
+            <w:tcMar>
+              <w:top w:type="dxa" w:w="70"/>
+              <w:left w:type="dxa" w:w="110"/>
+              <w:bottom w:type="dxa" w:w="70"/>
+              <w:right w:type="dxa" w:w="110"/>
+            </w:tcMar>
+          </w:tcPr>
+          <w:p>
+            <w:pPr>
+              <w:spacing w:after="30"/>
+            </w:pPr>
+            <w:r>
+              <w:rPr>
+                <w:rFonts w:ascii="Calibri" w:cs="Calibri" w:eastAsia="Calibri" w:hAnsi="Calibri"/>
+                <w:color w:val="222B36"/>
+                <w:sz w:val="19"/>
+                <w:szCs w:val="19"/>
+              </w:rPr>
+              <w:t xml:space="preserve">Rien n'est coupé à droite ; la carte a le vrai contour de Madagascar et le repère de la ville survolée est au bon endroit</w:t>
+            </w:r>
+          </w:p>
+        </w:tc>
+      </w:tr>
+      <w:tr>
+        <w:trPr>
+          <w:cantSplit/>
+        </w:trPr>
+        <w:tc>
+          <w:tcPr>
+            <w:tcW w:type="dxa" w:w="700"/>
+            <w:tcBorders>
+              <w:top w:val="single" w:color="C9D4E0" w:sz="4"/>
+              <w:left w:val="single" w:color="C9D4E0" w:sz="4"/>
+              <w:bottom w:val="single" w:color="C9D4E0" w:sz="4"/>
+              <w:right w:val="single" w:color="C9D4E0" w:sz="4"/>
+            </w:tcBorders>
+            <w:tcMar>
+              <w:top w:type="dxa" w:w="70"/>
+              <w:left w:type="dxa" w:w="110"/>
+              <w:bottom w:type="dxa" w:w="70"/>
+              <w:right w:type="dxa" w:w="110"/>
+            </w:tcMar>
+          </w:tcPr>
+          <w:p>
+            <w:pPr>
+              <w:spacing w:after="30"/>
+            </w:pPr>
+            <w:r>
+              <w:rPr>
+                <w:rFonts w:ascii="Calibri" w:cs="Calibri" w:eastAsia="Calibri" w:hAnsi="Calibri"/>
+                <w:color w:val="222B36"/>
+                <w:sz w:val="19"/>
+                <w:szCs w:val="19"/>
+              </w:rPr>
+              <w:t xml:space="preserve">23</w:t>
+            </w:r>
+          </w:p>
+        </w:tc>
+        <w:tc>
+          <w:tcPr>
+            <w:tcW w:type="dxa" w:w="4300"/>
+            <w:tcBorders>
+              <w:top w:val="single" w:color="C9D4E0" w:sz="4"/>
+              <w:left w:val="single" w:color="C9D4E0" w:sz="4"/>
+              <w:bottom w:val="single" w:color="C9D4E0" w:sz="4"/>
+              <w:right w:val="single" w:color="C9D4E0" w:sz="4"/>
+            </w:tcBorders>
+            <w:tcMar>
+              <w:top w:type="dxa" w:w="70"/>
+              <w:left w:type="dxa" w:w="110"/>
+              <w:bottom w:type="dxa" w:w="70"/>
+              <w:right w:type="dxa" w:w="110"/>
+            </w:tcMar>
+          </w:tcPr>
+          <w:p>
+            <w:pPr>
+              <w:spacing w:after="30"/>
+            </w:pPr>
+            <w:r>
+              <w:rPr>
+                <w:rFonts w:ascii="Calibri" w:cs="Calibri" w:eastAsia="Calibri" w:hAnsi="Calibri"/>
+                <w:color w:val="222B36"/>
+                <w:sz w:val="19"/>
+                <w:szCs w:val="19"/>
+              </w:rPr>
+              <w:t xml:space="preserve">Faire défiler le parcours « L'expérience TS » vers le bas puis vers le haut</w:t>
+            </w:r>
+          </w:p>
+        </w:tc>
+        <w:tc>
+          <w:tcPr>
+            <w:tcW w:type="dxa" w:w="4360"/>
+            <w:tcBorders>
+              <w:top w:val="single" w:color="C9D4E0" w:sz="4"/>
+              <w:left w:val="single" w:color="C9D4E0" w:sz="4"/>
+              <w:bottom w:val="single" w:color="C9D4E0" w:sz="4"/>
+              <w:right w:val="single" w:color="C9D4E0" w:sz="4"/>
+            </w:tcBorders>
+            <w:tcMar>
+              <w:top w:type="dxa" w:w="70"/>
+              <w:left w:type="dxa" w:w="110"/>
+              <w:bottom w:type="dxa" w:w="70"/>
+              <w:right w:type="dxa" w:w="110"/>
+            </w:tcMar>
+          </w:tcPr>
+          <w:p>
+            <w:pPr>
+              <w:spacing w:after="30"/>
+            </w:pPr>
+            <w:r>
+              <w:rPr>
+                <w:rFonts w:ascii="Calibri" w:cs="Calibri" w:eastAsia="Calibri" w:hAnsi="Calibri"/>
+                <w:color w:val="222B36"/>
+                <w:sz w:val="19"/>
+                <w:szCs w:val="19"/>
+              </w:rPr>
+              <w:t xml:space="preserve">Les ronds se colorent à mesure que la ligne les atteint et se vident quand on remonte</w:t>
+            </w:r>
+          </w:p>
+        </w:tc>
+      </w:tr>
     </w:tbl>
     <w:p>
       <w:pPr>
@@ -23545,7 +24127,7 @@
                 <w:sz w:val="19"/>
                 <w:szCs w:val="19"/>
               </w:rPr>
-              <w:t xml:space="preserve">Phrase « offres installation, offres vie quotidienne » de la conciergerie</w:t>
+              <w:t xml:space="preserve">Destination ajoutée dans l'administration sans coordonnées sur la carte</w:t>
             </w:r>
           </w:p>
         </w:tc>
@@ -23577,7 +24159,7 @@
                 <w:sz w:val="19"/>
                 <w:szCs w:val="19"/>
               </w:rPr>
-              <w:t xml:space="preserve">Offres annoncées mais non détaillées</w:t>
+              <w:t xml:space="preserve">Repère placé au centre de l'île</w:t>
             </w:r>
           </w:p>
         </w:tc>
@@ -23609,7 +24191,7 @@
                 <w:sz w:val="19"/>
                 <w:szCs w:val="19"/>
               </w:rPr>
-              <w:t xml:space="preserve">Fournir le détail pour créer des cartes d'offres, ou retirer la phrase</w:t>
+              <w:t xml:space="preserve">Fournir la ville à ajouter ; ses coordonnées s'ajoutent à la liste des villes de la carte</w:t>
             </w:r>
           </w:p>
         </w:tc>
@@ -23645,7 +24227,7 @@
                 <w:sz w:val="19"/>
                 <w:szCs w:val="19"/>
               </w:rPr>
-              <w:t xml:space="preserve">Secret de base de données exposé lors des échanges</w:t>
+              <w:t xml:space="preserve">Phrase « offres installation, offres vie quotidienne » de la conciergerie</w:t>
             </w:r>
           </w:p>
         </w:tc>
@@ -23676,7 +24258,7 @@
                 <w:sz w:val="19"/>
                 <w:szCs w:val="19"/>
               </w:rPr>
-              <w:t xml:space="preserve">Risque d'accès aux données</w:t>
+              <w:t xml:space="preserve">Offres annoncées mais non détaillées</w:t>
             </w:r>
           </w:p>
         </w:tc>
@@ -23707,7 +24289,7 @@
                 <w:sz w:val="19"/>
                 <w:szCs w:val="19"/>
               </w:rPr>
-              <w:t xml:space="preserve">Renouveler le mot de passe Neon avant le lancement officiel et mettre à jour la variable sur Vercel</w:t>
+              <w:t xml:space="preserve">Fournir le détail pour créer des cartes d'offres, ou retirer la phrase</w:t>
             </w:r>
           </w:p>
         </w:tc>
@@ -23744,7 +24326,7 @@
                 <w:sz w:val="19"/>
                 <w:szCs w:val="19"/>
               </w:rPr>
-              <w:t xml:space="preserve">Pas de nom de domaine propre</w:t>
+              <w:t xml:space="preserve">Secret de base de données exposé lors des échanges</w:t>
             </w:r>
           </w:p>
         </w:tc>
@@ -23776,7 +24358,7 @@
                 <w:sz w:val="19"/>
                 <w:szCs w:val="19"/>
               </w:rPr>
-              <w:t xml:space="preserve">Adresse en vercel.app, moins crédible</w:t>
+              <w:t xml:space="preserve">Risque d'accès aux données</w:t>
             </w:r>
           </w:p>
         </w:tc>
@@ -23808,7 +24390,7 @@
                 <w:sz w:val="19"/>
                 <w:szCs w:val="19"/>
               </w:rPr>
-              <w:t xml:space="preserve">Acheter un domaine, le brancher sur Vercel, mettre à jour SITE_URL</w:t>
+              <w:t xml:space="preserve">Renouveler le mot de passe Neon avant le lancement officiel et mettre à jour la variable sur Vercel</w:t>
             </w:r>
           </w:p>
         </w:tc>
@@ -23844,7 +24426,7 @@
                 <w:sz w:val="19"/>
                 <w:szCs w:val="19"/>
               </w:rPr>
-              <w:t xml:space="preserve">Pages légales absentes</w:t>
+              <w:t xml:space="preserve">Pas de nom de domaine propre</w:t>
             </w:r>
           </w:p>
         </w:tc>
@@ -23875,7 +24457,7 @@
                 <w:sz w:val="19"/>
                 <w:szCs w:val="19"/>
               </w:rPr>
-              <w:t xml:space="preserve">Non-conformité</w:t>
+              <w:t xml:space="preserve">Adresse en vercel.app, moins crédible</w:t>
             </w:r>
           </w:p>
         </w:tc>
@@ -23906,7 +24488,7 @@
                 <w:sz w:val="19"/>
                 <w:szCs w:val="19"/>
               </w:rPr>
-              <w:t xml:space="preserve">Fournir ou rédiger mentions légales et politique de confidentialité</w:t>
+              <w:t xml:space="preserve">Acheter un domaine, le brancher sur Vercel, mettre à jour SITE_URL</w:t>
             </w:r>
           </w:p>
         </w:tc>
@@ -23943,6 +24525,106 @@
                 <w:sz w:val="19"/>
                 <w:szCs w:val="19"/>
               </w:rPr>
+              <w:t xml:space="preserve">Pages légales absentes</w:t>
+            </w:r>
+          </w:p>
+        </w:tc>
+        <w:tc>
+          <w:tcPr>
+            <w:tcW w:type="dxa" w:w="2700"/>
+            <w:tcBorders>
+              <w:top w:val="single" w:color="C9D4E0" w:sz="4"/>
+              <w:left w:val="single" w:color="C9D4E0" w:sz="4"/>
+              <w:bottom w:val="single" w:color="C9D4E0" w:sz="4"/>
+              <w:right w:val="single" w:color="C9D4E0" w:sz="4"/>
+            </w:tcBorders>
+            <w:shd w:fill="EEF2F7" w:color="auto" w:val="clear"/>
+            <w:tcMar>
+              <w:top w:type="dxa" w:w="70"/>
+              <w:left w:type="dxa" w:w="110"/>
+              <w:bottom w:type="dxa" w:w="70"/>
+              <w:right w:type="dxa" w:w="110"/>
+            </w:tcMar>
+          </w:tcPr>
+          <w:p>
+            <w:pPr>
+              <w:spacing w:after="30"/>
+            </w:pPr>
+            <w:r>
+              <w:rPr>
+                <w:rFonts w:ascii="Calibri" w:cs="Calibri" w:eastAsia="Calibri" w:hAnsi="Calibri"/>
+                <w:color w:val="222B36"/>
+                <w:sz w:val="19"/>
+                <w:szCs w:val="19"/>
+              </w:rPr>
+              <w:t xml:space="preserve">Non-conformité</w:t>
+            </w:r>
+          </w:p>
+        </w:tc>
+        <w:tc>
+          <w:tcPr>
+            <w:tcW w:type="dxa" w:w="3360"/>
+            <w:tcBorders>
+              <w:top w:val="single" w:color="C9D4E0" w:sz="4"/>
+              <w:left w:val="single" w:color="C9D4E0" w:sz="4"/>
+              <w:bottom w:val="single" w:color="C9D4E0" w:sz="4"/>
+              <w:right w:val="single" w:color="C9D4E0" w:sz="4"/>
+            </w:tcBorders>
+            <w:shd w:fill="EEF2F7" w:color="auto" w:val="clear"/>
+            <w:tcMar>
+              <w:top w:type="dxa" w:w="70"/>
+              <w:left w:type="dxa" w:w="110"/>
+              <w:bottom w:type="dxa" w:w="70"/>
+              <w:right w:type="dxa" w:w="110"/>
+            </w:tcMar>
+          </w:tcPr>
+          <w:p>
+            <w:pPr>
+              <w:spacing w:after="30"/>
+            </w:pPr>
+            <w:r>
+              <w:rPr>
+                <w:rFonts w:ascii="Calibri" w:cs="Calibri" w:eastAsia="Calibri" w:hAnsi="Calibri"/>
+                <w:color w:val="222B36"/>
+                <w:sz w:val="19"/>
+                <w:szCs w:val="19"/>
+              </w:rPr>
+              <w:t xml:space="preserve">Fournir ou rédiger mentions légales et politique de confidentialité</w:t>
+            </w:r>
+          </w:p>
+        </w:tc>
+      </w:tr>
+      <w:tr>
+        <w:trPr>
+          <w:cantSplit/>
+        </w:trPr>
+        <w:tc>
+          <w:tcPr>
+            <w:tcW w:type="dxa" w:w="3300"/>
+            <w:tcBorders>
+              <w:top w:val="single" w:color="C9D4E0" w:sz="4"/>
+              <w:left w:val="single" w:color="C9D4E0" w:sz="4"/>
+              <w:bottom w:val="single" w:color="C9D4E0" w:sz="4"/>
+              <w:right w:val="single" w:color="C9D4E0" w:sz="4"/>
+            </w:tcBorders>
+            <w:tcMar>
+              <w:top w:type="dxa" w:w="70"/>
+              <w:left w:type="dxa" w:w="110"/>
+              <w:bottom w:type="dxa" w:w="70"/>
+              <w:right w:type="dxa" w:w="110"/>
+            </w:tcMar>
+          </w:tcPr>
+          <w:p>
+            <w:pPr>
+              <w:spacing w:after="30"/>
+            </w:pPr>
+            <w:r>
+              <w:rPr>
+                <w:rFonts w:ascii="Calibri" w:cs="Calibri" w:eastAsia="Calibri" w:hAnsi="Calibri"/>
+                <w:color w:val="222B36"/>
+                <w:sz w:val="19"/>
+                <w:szCs w:val="19"/>
+              </w:rPr>
               <w:t xml:space="preserve">Hypothèse : trafic modéré au lancement</w:t>
             </w:r>
           </w:p>
@@ -23956,7 +24638,6 @@
               <w:bottom w:val="single" w:color="C9D4E0" w:sz="4"/>
               <w:right w:val="single" w:color="C9D4E0" w:sz="4"/>
             </w:tcBorders>
-            <w:shd w:fill="EEF2F7" w:color="auto" w:val="clear"/>
             <w:tcMar>
               <w:top w:type="dxa" w:w="70"/>
               <w:left w:type="dxa" w:w="110"/>
@@ -23988,7 +24669,6 @@
               <w:bottom w:val="single" w:color="C9D4E0" w:sz="4"/>
               <w:right w:val="single" w:color="C9D4E0" w:sz="4"/>
             </w:tcBorders>
-            <w:shd w:fill="EEF2F7" w:color="auto" w:val="clear"/>
             <w:tcMar>
               <w:top w:type="dxa" w:w="70"/>
               <w:left w:type="dxa" w:w="110"/>

</xml_diff>

<commit_message>
Cahier des charges v2.4 : nouveau logo, dore accentue, images gerees depuis l'admin, Tarifs, tuile flotte
Co-Authored-By: Claude Sonnet 5.5 <noreply@anthropic.com>
</commit_message>
<xml_diff>
--- a/docs/CAHIER-DES-CHARGES.docx
+++ b/docs/CAHIER-DES-CHARGES.docx
@@ -81,7 +81,7 @@
           <w:sz w:val="21"/>
           <w:szCs w:val="21"/>
         </w:rPr>
-        <w:t xml:space="preserve">Version 2.3</w:t>
+        <w:t xml:space="preserve">Version 2.4</w:t>
       </w:r>
     </w:p>
     <w:p>
@@ -92,7 +92,7 @@
           <w:sz w:val="21"/>
           <w:szCs w:val="21"/>
         </w:rPr>
-        <w:t xml:space="preserve">Date : 13 octobre 2026</w:t>
+        <w:t xml:space="preserve">Date : 22 octobre 2026</w:t>
       </w:r>
     </w:p>
     <w:p>
@@ -774,7 +774,7 @@
                 <w:sz w:val="19"/>
                 <w:szCs w:val="19"/>
               </w:rPr>
-              <w:t xml:space="preserve">2.3</w:t>
+              <w:t xml:space="preserve">2.4</w:t>
             </w:r>
           </w:p>
         </w:tc>
@@ -806,7 +806,7 @@
                 <w:sz w:val="19"/>
                 <w:szCs w:val="19"/>
               </w:rPr>
-              <w:t xml:space="preserve">13 octobre 2026</w:t>
+              <w:t xml:space="preserve">22 octobre 2026</w:t>
             </w:r>
           </w:p>
         </w:tc>
@@ -838,7 +838,7 @@
                 <w:sz w:val="19"/>
                 <w:szCs w:val="19"/>
               </w:rPr>
-              <w:t xml:space="preserve">Carte de Madagascar fidèle (contour géographique réel, villes placées par leurs coordonnées) ; bloc de droite de la section Destinations décalé vers la gauche et jamais coupé (grands écrans et mobile) ; ronds du parcours « L'expérience TS » qui se colorent quand la ligne les atteint.</w:t>
+              <w:t xml:space="preserve">Nouveau logo fourni par le client (bleu marine, bleu acier, or ; deux versions vectorisées, monogramme TS pour l'icône du site) ; doré accentué (boutons d'action principaux en or, mot mis en avant des titres, chiffres du hero, ruban incliné acier + or du logo repris comme repère) ; gestion de toutes les images du site depuis l'administration (page Images du site, sélecteur de médiathèque, réduction automatique des photos lourdes) ; page Tarifs sans la mention « À partir de » ; véhicule de la tuile flotte remonté pour ne plus recouvrir son nom.</w:t>
             </w:r>
           </w:p>
         </w:tc>
@@ -874,7 +874,7 @@
                 <w:sz w:val="19"/>
                 <w:szCs w:val="19"/>
               </w:rPr>
-              <w:t xml:space="preserve">2.2</w:t>
+              <w:t xml:space="preserve">2.3</w:t>
             </w:r>
           </w:p>
         </w:tc>
@@ -936,7 +936,7 @@
                 <w:sz w:val="19"/>
                 <w:szCs w:val="19"/>
               </w:rPr>
-              <w:t xml:space="preserve">Touche dorée discrète (filets, numéros, boutons d'action) et bouton « Voir les offres » en onglet doré bien visible ; accroches de services plus percutantes ; contenu et bouton d'action sur chaque service (accueil, page Services, page de service) ; conciergerie privée VIP en service à part, sans numéro ; numérotation réservée aux services ; trois valeurs seulement ; français et anglais strictement séparés.</w:t>
+              <w:t xml:space="preserve">Carte de Madagascar fidèle (contour géographique réel, villes placées par leurs coordonnées) ; bloc de droite de la section Destinations décalé vers la gauche et jamais coupé (grands écrans et mobile) ; ronds du parcours « L'expérience TS » qui se colorent quand la ligne les atteint.</w:t>
             </w:r>
           </w:p>
         </w:tc>
@@ -973,7 +973,7 @@
                 <w:sz w:val="19"/>
                 <w:szCs w:val="19"/>
               </w:rPr>
-              <w:t xml:space="preserve">2.1</w:t>
+              <w:t xml:space="preserve">2.2</w:t>
             </w:r>
           </w:p>
         </w:tc>
@@ -1005,7 +1005,7 @@
                 <w:sz w:val="19"/>
                 <w:szCs w:val="19"/>
               </w:rPr>
-              <w:t xml:space="preserve">12 octobre 2026</w:t>
+              <w:t xml:space="preserve">13 octobre 2026</w:t>
             </w:r>
           </w:p>
         </w:tc>
@@ -1037,7 +1037,7 @@
                 <w:sz w:val="19"/>
                 <w:szCs w:val="19"/>
               </w:rPr>
-              <w:t xml:space="preserve">Flotte finale du client : quatre véhicules (Toyota Prado TLX, Jeep Wrangler Rubicon, Toyota Hilux Double Cab Executive, Nissan Terra) avec textes corrigés et photos détourées ; accroche et description affichées sur la page Flotte.</w:t>
+              <w:t xml:space="preserve">Touche dorée discrète (filets, numéros, boutons d'action) et bouton « Voir les offres » en onglet doré bien visible ; accroches de services plus percutantes ; contenu et bouton d'action sur chaque service (accueil, page Services, page de service) ; conciergerie privée VIP en service à part, sans numéro ; numérotation réservée aux services ; trois valeurs seulement ; français et anglais strictement séparés.</w:t>
             </w:r>
           </w:p>
         </w:tc>
@@ -1073,6 +1073,105 @@
                 <w:sz w:val="19"/>
                 <w:szCs w:val="19"/>
               </w:rPr>
+              <w:t xml:space="preserve">2.1</w:t>
+            </w:r>
+          </w:p>
+        </w:tc>
+        <w:tc>
+          <w:tcPr>
+            <w:tcW w:type="dxa" w:w="1900"/>
+            <w:tcBorders>
+              <w:top w:val="single" w:color="C9D4E0" w:sz="4"/>
+              <w:left w:val="single" w:color="C9D4E0" w:sz="4"/>
+              <w:bottom w:val="single" w:color="C9D4E0" w:sz="4"/>
+              <w:right w:val="single" w:color="C9D4E0" w:sz="4"/>
+            </w:tcBorders>
+            <w:tcMar>
+              <w:top w:type="dxa" w:w="70"/>
+              <w:left w:type="dxa" w:w="110"/>
+              <w:bottom w:type="dxa" w:w="70"/>
+              <w:right w:type="dxa" w:w="110"/>
+            </w:tcMar>
+          </w:tcPr>
+          <w:p>
+            <w:pPr>
+              <w:spacing w:after="30"/>
+            </w:pPr>
+            <w:r>
+              <w:rPr>
+                <w:rFonts w:ascii="Calibri" w:cs="Calibri" w:eastAsia="Calibri" w:hAnsi="Calibri"/>
+                <w:color w:val="222B36"/>
+                <w:sz w:val="19"/>
+                <w:szCs w:val="19"/>
+              </w:rPr>
+              <w:t xml:space="preserve">12 octobre 2026</w:t>
+            </w:r>
+          </w:p>
+        </w:tc>
+        <w:tc>
+          <w:tcPr>
+            <w:tcW w:type="dxa" w:w="6360"/>
+            <w:tcBorders>
+              <w:top w:val="single" w:color="C9D4E0" w:sz="4"/>
+              <w:left w:val="single" w:color="C9D4E0" w:sz="4"/>
+              <w:bottom w:val="single" w:color="C9D4E0" w:sz="4"/>
+              <w:right w:val="single" w:color="C9D4E0" w:sz="4"/>
+            </w:tcBorders>
+            <w:tcMar>
+              <w:top w:type="dxa" w:w="70"/>
+              <w:left w:type="dxa" w:w="110"/>
+              <w:bottom w:type="dxa" w:w="70"/>
+              <w:right w:type="dxa" w:w="110"/>
+            </w:tcMar>
+          </w:tcPr>
+          <w:p>
+            <w:pPr>
+              <w:spacing w:after="30"/>
+            </w:pPr>
+            <w:r>
+              <w:rPr>
+                <w:rFonts w:ascii="Calibri" w:cs="Calibri" w:eastAsia="Calibri" w:hAnsi="Calibri"/>
+                <w:color w:val="222B36"/>
+                <w:sz w:val="19"/>
+                <w:szCs w:val="19"/>
+              </w:rPr>
+              <w:t xml:space="preserve">Flotte finale du client : quatre véhicules (Toyota Prado TLX, Jeep Wrangler Rubicon, Toyota Hilux Double Cab Executive, Nissan Terra) avec textes corrigés et photos détourées ; accroche et description affichées sur la page Flotte.</w:t>
+            </w:r>
+          </w:p>
+        </w:tc>
+      </w:tr>
+      <w:tr>
+        <w:trPr>
+          <w:cantSplit/>
+        </w:trPr>
+        <w:tc>
+          <w:tcPr>
+            <w:tcW w:type="dxa" w:w="1100"/>
+            <w:tcBorders>
+              <w:top w:val="single" w:color="C9D4E0" w:sz="4"/>
+              <w:left w:val="single" w:color="C9D4E0" w:sz="4"/>
+              <w:bottom w:val="single" w:color="C9D4E0" w:sz="4"/>
+              <w:right w:val="single" w:color="C9D4E0" w:sz="4"/>
+            </w:tcBorders>
+            <w:shd w:fill="EEF2F7" w:color="auto" w:val="clear"/>
+            <w:tcMar>
+              <w:top w:type="dxa" w:w="70"/>
+              <w:left w:type="dxa" w:w="110"/>
+              <w:bottom w:type="dxa" w:w="70"/>
+              <w:right w:type="dxa" w:w="110"/>
+            </w:tcMar>
+          </w:tcPr>
+          <w:p>
+            <w:pPr>
+              <w:spacing w:after="30"/>
+            </w:pPr>
+            <w:r>
+              <w:rPr>
+                <w:rFonts w:ascii="Calibri" w:cs="Calibri" w:eastAsia="Calibri" w:hAnsi="Calibri"/>
+                <w:color w:val="222B36"/>
+                <w:sz w:val="19"/>
+                <w:szCs w:val="19"/>
+              </w:rPr>
               <w:t xml:space="preserve">2.0</w:t>
             </w:r>
           </w:p>
@@ -1086,6 +1185,7 @@
               <w:bottom w:val="single" w:color="C9D4E0" w:sz="4"/>
               <w:right w:val="single" w:color="C9D4E0" w:sz="4"/>
             </w:tcBorders>
+            <w:shd w:fill="EEF2F7" w:color="auto" w:val="clear"/>
             <w:tcMar>
               <w:top w:type="dxa" w:w="70"/>
               <w:left w:type="dxa" w:w="110"/>
@@ -1117,6 +1217,7 @@
               <w:bottom w:val="single" w:color="C9D4E0" w:sz="4"/>
               <w:right w:val="single" w:color="C9D4E0" w:sz="4"/>
             </w:tcBorders>
+            <w:shd w:fill="EEF2F7" w:color="auto" w:val="clear"/>
             <w:tcMar>
               <w:top w:type="dxa" w:w="70"/>
               <w:left w:type="dxa" w:w="110"/>
@@ -5589,7 +5690,7 @@
           <w:sz w:val="21"/>
           <w:szCs w:val="21"/>
         </w:rPr>
-        <w:t xml:space="preserve">Espace d'administration : tableau de bord, demandes de devis, gestion de tout le contenu, médiathèque, comptes utilisateurs, coordonnées.</w:t>
+        <w:t xml:space="preserve">Espace d'administration : tableau de bord, demandes de devis, gestion de tout le contenu et de toutes les images du site, médiathèque, comptes utilisateurs, coordonnées.</w:t>
       </w:r>
     </w:p>
     <w:p>
@@ -7311,7 +7412,7 @@
                 <w:sz w:val="19"/>
                 <w:szCs w:val="19"/>
               </w:rPr>
-              <w:t xml:space="preserve">Trois offres, conditions de location</w:t>
+              <w:t xml:space="preserve">Trois offres (le prix n'apparaît que s'il est renseigné), conditions de location</w:t>
             </w:r>
           </w:p>
         </w:tc>
@@ -8013,7 +8114,7 @@
                 <w:sz w:val="19"/>
                 <w:szCs w:val="19"/>
               </w:rPr>
-              <w:t xml:space="preserve">Hero plein écran avec photographie sombre d'une voiture de direction teintée marine, slogan à droite (« Au-delà du transport » en français, « Beyond Transportation » en anglais), onglet doré « Voir les offres », deux appels à l'action (devis, WhatsApp) et chiffres clés calculés à partir des données réelles (nombre de véhicules, capacité maximale, assistance 24/7, prix de départ).</w:t>
+              <w:t xml:space="preserve">Hero plein écran avec photographie sombre d'une voiture de direction teintée marine, slogan à droite (« Au-delà du transport » en français, « Beyond Transportation » en anglais), onglet doré « Voir les offres », deux appels à l'action (devis, WhatsApp) et chiffres clés calculés à partir des données réelles (nombre de véhicules, capacité maximale, assistance 24/7, prix de départ affiché seulement s'il est renseigné).</w:t>
             </w:r>
           </w:p>
         </w:tc>
@@ -8311,7 +8412,7 @@
                 <w:sz w:val="19"/>
                 <w:szCs w:val="19"/>
               </w:rPr>
-              <w:t xml:space="preserve">Flotte présentée comme un catalogue : un véhicule par écran, nom, catégorie, passagers, bagages, bouton de demande de disponibilité qui préremplit le devis ; filtre par catégorie. Sur l'accueil, la tuile « Notre flotte » permet de parcourir les véhicules avec des flèches.</w:t>
+              <w:t xml:space="preserve">Flotte présentée comme un catalogue : un véhicule par écran, nom, catégorie, passagers, bagages, bouton de demande de disponibilité qui préremplit le devis ; filtre par catégorie. Sur l'accueil, la tuile « Notre flotte » permet de parcourir les véhicules avec des flèches ; le véhicule est cadré au-dessus de son nom et de sa catégorie, sans les recouvrir.</w:t>
             </w:r>
           </w:p>
         </w:tc>
@@ -8709,7 +8810,7 @@
                 <w:sz w:val="19"/>
                 <w:szCs w:val="19"/>
               </w:rPr>
-              <w:t xml:space="preserve">Offres et prix de départ affichés avec leurs conditions ; mention que le devis final dépend du véhicule, de la distance, de la durée, du kilométrage, du carburant et du niveau de prestation.</w:t>
+              <w:t xml:space="preserve">Offres affichées avec leurs conditions ; le prix n'apparaît que s'il est renseigné dans l'administration, sans mention « À partir de » (« From » en anglais) ; mention que le devis final dépend du véhicule, de la distance, de la durée, du kilométrage, du carburant et du niveau de prestation.</w:t>
             </w:r>
           </w:p>
         </w:tc>
@@ -9736,6 +9837,107 @@
                 <w:szCs w:val="19"/>
               </w:rPr>
               <w:t xml:space="preserve">Moyenne</w:t>
+            </w:r>
+          </w:p>
+        </w:tc>
+      </w:tr>
+      <w:tr>
+        <w:trPr>
+          <w:cantSplit/>
+        </w:trPr>
+        <w:tc>
+          <w:tcPr>
+            <w:tcW w:type="dxa" w:w="900"/>
+            <w:tcBorders>
+              <w:top w:val="single" w:color="C9D4E0" w:sz="4"/>
+              <w:left w:val="single" w:color="C9D4E0" w:sz="4"/>
+              <w:bottom w:val="single" w:color="C9D4E0" w:sz="4"/>
+              <w:right w:val="single" w:color="C9D4E0" w:sz="4"/>
+            </w:tcBorders>
+            <w:shd w:fill="EEF2F7" w:color="auto" w:val="clear"/>
+            <w:tcMar>
+              <w:top w:type="dxa" w:w="70"/>
+              <w:left w:type="dxa" w:w="110"/>
+              <w:bottom w:type="dxa" w:w="70"/>
+              <w:right w:type="dxa" w:w="110"/>
+            </w:tcMar>
+          </w:tcPr>
+          <w:p>
+            <w:pPr>
+              <w:spacing w:after="30"/>
+            </w:pPr>
+            <w:r>
+              <w:rPr>
+                <w:rFonts w:ascii="Calibri" w:cs="Calibri" w:eastAsia="Calibri" w:hAnsi="Calibri"/>
+                <w:color w:val="222B36"/>
+                <w:sz w:val="19"/>
+                <w:szCs w:val="19"/>
+              </w:rPr>
+              <w:t xml:space="preserve">EF-20</w:t>
+            </w:r>
+          </w:p>
+        </w:tc>
+        <w:tc>
+          <w:tcPr>
+            <w:tcW w:type="dxa" w:w="7000"/>
+            <w:tcBorders>
+              <w:top w:val="single" w:color="C9D4E0" w:sz="4"/>
+              <w:left w:val="single" w:color="C9D4E0" w:sz="4"/>
+              <w:bottom w:val="single" w:color="C9D4E0" w:sz="4"/>
+              <w:right w:val="single" w:color="C9D4E0" w:sz="4"/>
+            </w:tcBorders>
+            <w:shd w:fill="EEF2F7" w:color="auto" w:val="clear"/>
+            <w:tcMar>
+              <w:top w:type="dxa" w:w="70"/>
+              <w:left w:type="dxa" w:w="110"/>
+              <w:bottom w:type="dxa" w:w="70"/>
+              <w:right w:type="dxa" w:w="110"/>
+            </w:tcMar>
+          </w:tcPr>
+          <w:p>
+            <w:pPr>
+              <w:spacing w:after="30"/>
+            </w:pPr>
+            <w:r>
+              <w:rPr>
+                <w:rFonts w:ascii="Calibri" w:cs="Calibri" w:eastAsia="Calibri" w:hAnsi="Calibri"/>
+                <w:color w:val="222B36"/>
+                <w:sz w:val="19"/>
+                <w:szCs w:val="19"/>
+              </w:rPr>
+              <w:t xml:space="preserve">Identité visuelle : logo fourni par le client (bleu marine #0D2E5B, bleu acier #93ACB9, or #C9A45C) en deux versions vectorielles (fond clair, fond sombre), monogramme TS pour l'icône de l'onglet et de l'écran d'accueil du téléphone. L'or est accentué : boutons d'action principaux en aplat, mot mis en avant des titres, chiffres du hero, icônes et filets des valeurs, contour des boutons des tuiles, ligne et ronds du parcours, repère actif de la carte, bandeau du pied de page. Le ruban incliné acier + or du logo sert de repère (étiquettes de section, hero, pied de page).</w:t>
+            </w:r>
+          </w:p>
+        </w:tc>
+        <w:tc>
+          <w:tcPr>
+            <w:tcW w:type="dxa" w:w="1460"/>
+            <w:tcBorders>
+              <w:top w:val="single" w:color="C9D4E0" w:sz="4"/>
+              <w:left w:val="single" w:color="C9D4E0" w:sz="4"/>
+              <w:bottom w:val="single" w:color="C9D4E0" w:sz="4"/>
+              <w:right w:val="single" w:color="C9D4E0" w:sz="4"/>
+            </w:tcBorders>
+            <w:shd w:fill="EEF2F7" w:color="auto" w:val="clear"/>
+            <w:tcMar>
+              <w:top w:type="dxa" w:w="70"/>
+              <w:left w:type="dxa" w:w="110"/>
+              <w:bottom w:type="dxa" w:w="70"/>
+              <w:right w:type="dxa" w:w="110"/>
+            </w:tcMar>
+          </w:tcPr>
+          <w:p>
+            <w:pPr>
+              <w:spacing w:after="30"/>
+            </w:pPr>
+            <w:r>
+              <w:rPr>
+                <w:rFonts w:ascii="Calibri" w:cs="Calibri" w:eastAsia="Calibri" w:hAnsi="Calibri"/>
+                <w:color w:val="222B36"/>
+                <w:sz w:val="19"/>
+                <w:szCs w:val="19"/>
+              </w:rPr>
+              <w:t xml:space="preserve">Haute</w:t>
             </w:r>
           </w:p>
         </w:tc>
@@ -10725,7 +10927,7 @@
                 <w:sz w:val="19"/>
                 <w:szCs w:val="19"/>
               </w:rPr>
-              <w:t xml:space="preserve">Médiathèque</w:t>
+              <w:t xml:space="preserve">Images du site</w:t>
             </w:r>
           </w:p>
         </w:tc>
@@ -10756,7 +10958,7 @@
                 <w:sz w:val="19"/>
                 <w:szCs w:val="19"/>
               </w:rPr>
-              <w:t xml:space="preserve">Envoi d'images (JPG, PNG, WEBP, GIF, SVG, 5 Mo maximum), copie du lien, suppression ; envoi direct depuis chaque fiche</w:t>
+              <w:t xml:space="preserve">Remplacement de toutes les images affichées : photo d'en-tête et bandeau final de chaque page, photo principale et tuile À propos de l'accueil, photo de la page Contact, aperçus du menu, deux logos, image de partage (WhatsApp, Facebook, Google), fond de la page de connexion ; puis photos des véhicules, des services et des destinations. Pour chaque image : téléverser, choisir dans la médiathèque, rétablir l'image d'origine (pages et services), aperçu et lien vers la page concernée ; changement visible tout de suite sur le site</w:t>
             </w:r>
           </w:p>
         </w:tc>
@@ -10793,7 +10995,7 @@
                 <w:sz w:val="19"/>
                 <w:szCs w:val="19"/>
               </w:rPr>
-              <w:t xml:space="preserve">Utilisateurs</w:t>
+              <w:t xml:space="preserve">Médiathèque</w:t>
             </w:r>
           </w:p>
         </w:tc>
@@ -10825,7 +11027,7 @@
                 <w:sz w:val="19"/>
                 <w:szCs w:val="19"/>
               </w:rPr>
-              <w:t xml:space="preserve">Création de comptes, rôles Administrateur et Éditeur, changement de mot de passe, suppression</w:t>
+              <w:t xml:space="preserve">Envoi d'images (JPG, PNG, WEBP, GIF, SVG) ; les grandes photos sont réduites à 2400 px dans le navigateur avant l'envoi (4 Mo maximum, limite de l'hébergeur) ; nombre d'utilisations de chaque image, copie du lien, suppression protégée (refusée tant qu'un véhicule ou une destination s'en sert) ; fenêtre « Choisir une image » dans chaque fiche</w:t>
             </w:r>
           </w:p>
         </w:tc>
@@ -10861,6 +11063,74 @@
                 <w:sz w:val="19"/>
                 <w:szCs w:val="19"/>
               </w:rPr>
+              <w:t xml:space="preserve">Utilisateurs</w:t>
+            </w:r>
+          </w:p>
+        </w:tc>
+        <w:tc>
+          <w:tcPr>
+            <w:tcW w:type="dxa" w:w="7160"/>
+            <w:tcBorders>
+              <w:top w:val="single" w:color="C9D4E0" w:sz="4"/>
+              <w:left w:val="single" w:color="C9D4E0" w:sz="4"/>
+              <w:bottom w:val="single" w:color="C9D4E0" w:sz="4"/>
+              <w:right w:val="single" w:color="C9D4E0" w:sz="4"/>
+            </w:tcBorders>
+            <w:tcMar>
+              <w:top w:type="dxa" w:w="70"/>
+              <w:left w:type="dxa" w:w="110"/>
+              <w:bottom w:type="dxa" w:w="70"/>
+              <w:right w:type="dxa" w:w="110"/>
+            </w:tcMar>
+          </w:tcPr>
+          <w:p>
+            <w:pPr>
+              <w:spacing w:after="30"/>
+            </w:pPr>
+            <w:r>
+              <w:rPr>
+                <w:rFonts w:ascii="Calibri" w:cs="Calibri" w:eastAsia="Calibri" w:hAnsi="Calibri"/>
+                <w:color w:val="222B36"/>
+                <w:sz w:val="19"/>
+                <w:szCs w:val="19"/>
+              </w:rPr>
+              <w:t xml:space="preserve">Création de comptes, rôles Administrateur et Éditeur, changement de mot de passe, suppression</w:t>
+            </w:r>
+          </w:p>
+        </w:tc>
+      </w:tr>
+      <w:tr>
+        <w:trPr>
+          <w:cantSplit/>
+        </w:trPr>
+        <w:tc>
+          <w:tcPr>
+            <w:tcW w:type="dxa" w:w="2200"/>
+            <w:tcBorders>
+              <w:top w:val="single" w:color="C9D4E0" w:sz="4"/>
+              <w:left w:val="single" w:color="C9D4E0" w:sz="4"/>
+              <w:bottom w:val="single" w:color="C9D4E0" w:sz="4"/>
+              <w:right w:val="single" w:color="C9D4E0" w:sz="4"/>
+            </w:tcBorders>
+            <w:shd w:fill="EEF2F7" w:color="auto" w:val="clear"/>
+            <w:tcMar>
+              <w:top w:type="dxa" w:w="70"/>
+              <w:left w:type="dxa" w:w="110"/>
+              <w:bottom w:type="dxa" w:w="70"/>
+              <w:right w:type="dxa" w:w="110"/>
+            </w:tcMar>
+          </w:tcPr>
+          <w:p>
+            <w:pPr>
+              <w:spacing w:after="30"/>
+            </w:pPr>
+            <w:r>
+              <w:rPr>
+                <w:rFonts w:ascii="Calibri" w:cs="Calibri" w:eastAsia="Calibri" w:hAnsi="Calibri"/>
+                <w:color w:val="222B36"/>
+                <w:sz w:val="19"/>
+                <w:szCs w:val="19"/>
+              </w:rPr>
               <w:t xml:space="preserve">Coordonnées</w:t>
             </w:r>
           </w:p>
@@ -10874,6 +11144,7 @@
               <w:bottom w:val="single" w:color="C9D4E0" w:sz="4"/>
               <w:right w:val="single" w:color="C9D4E0" w:sz="4"/>
             </w:tcBorders>
+            <w:shd w:fill="EEF2F7" w:color="auto" w:val="clear"/>
             <w:tcMar>
               <w:top w:type="dxa" w:w="70"/>
               <w:left w:type="dxa" w:w="110"/>
@@ -11655,7 +11926,7 @@
           <w:sz w:val="21"/>
           <w:szCs w:val="21"/>
         </w:rPr>
-        <w:t xml:space="preserve">Visuel client TS EXCLUSIVE : logo, bleu marine et acier, valeurs, carte de Madagascar.</w:t>
+        <w:t xml:space="preserve">Visuel client TS EXCLUSIVE : logo (version sur fond clair et sur fond bleu, palette #0D2E5B, #93ACB9, #C9A45C), valeurs, carte de Madagascar.</w:t>
       </w:r>
     </w:p>
     <w:p>
@@ -11693,7 +11964,7 @@
           <w:sz w:val="21"/>
           <w:szCs w:val="21"/>
         </w:rPr>
-        <w:t xml:space="preserve">Consigne du client : le doré reste une touche discrète (filets, numéros, boutons d'action, bouton « Voir les offres », conciergerie) ; l'accent principal est le bleu acier.</w:t>
+        <w:t xml:space="preserve">Consigne du client (17 octobre) : le logo fourni reprend le bleu marine, le bleu acier et l'or ; le doré est accentué sur tout le site (boutons d'action, titres, chiffres, repères) sans devenir un grand fond.</w:t>
       </w:r>
     </w:p>
     <w:p>
@@ -11865,7 +12136,7 @@
                 <w:sz w:val="19"/>
                 <w:szCs w:val="19"/>
               </w:rPr>
-              <w:t xml:space="preserve">Marine profond #07182E (fonds sombres) · Marine #0C2646 (logo, boutons) · Bleu acier #4B7096 et #8AA4BD (accent, tuile 01) · Gris-bleu #A7B5C6 (tuile 03) · Gris clair #C9D2DE (tuile 04) · Ardoise #33465E (tuile 05) · Fond clair #E1E6ED · Blanc #FFFFFF · Or champagne #C9A45C en touche (filets, numéros, boutons d'action).</w:t>
+              <w:t xml:space="preserve">Marine profond #07182E (fonds sombres) · Marine #0C2646 (fonds, titres sur fond clair ; marine du logo #0D2E5B) · Bleu acier #93ACB9 (logo) et #4B7096 (sur fond clair) · Gris-bleu #A7B5C6 (tuile 03) · Gris clair #C9D2DE (tuile 04) · Ardoise #33465E (tuile 05) · Fond clair #E1E6ED · Blanc #FFFFFF · Or #C9A45C du logo, clair #E3CB92 sur fond sombre et foncé #A07A30 sur fond clair, accentué (boutons d'action, mot mis en avant des titres, chiffres, repères).</w:t>
             </w:r>
           </w:p>
         </w:tc>
@@ -12070,7 +12341,7 @@
                 <w:sz w:val="19"/>
                 <w:szCs w:val="19"/>
               </w:rPr>
-              <w:t xml:space="preserve">Logo TS EXCLUSIVE du visuel client, redessiné en vectoriel (SVG) en deux versions : marine pour fonds clairs, blanc et acier pour fonds sombres</w:t>
+              <w:t xml:space="preserve">Logo TS EXCLUSIVE fourni par le client (bleu marine, bleu acier, or ; ruban « EXECUTIVE &amp; PRIVATE MOBILITY » acier et or), vectorisé en SVG en deux versions : lettres marine pour fonds clairs, lettres blanches pour fonds sombres ; monogramme TS (carré marine, T blanc, S acier, trait or) pour l'icône de l'onglet et de l'écran d'accueil du téléphone ; remplaçable depuis l'administration</w:t>
             </w:r>
           </w:p>
         </w:tc>
@@ -12137,7 +12408,7 @@
                 <w:sz w:val="19"/>
                 <w:szCs w:val="19"/>
               </w:rPr>
-              <w:t xml:space="preserve">Toujours avec une bordure fine, coins à peine adoucis ; inversion de couleur au survol ; flèche animée</w:t>
+              <w:t xml:space="preserve">Appel à l'action principal en aplat or (texte marine), boutons secondaires à bordure fine ; coins à peine adoucis ; au survol le fond or disparaît et le contour reste or ; flèche animée</w:t>
             </w:r>
           </w:p>
         </w:tc>
@@ -12409,7 +12680,7 @@
                 <w:sz w:val="19"/>
                 <w:szCs w:val="19"/>
               </w:rPr>
-              <w:t xml:space="preserve">Salutations malgaches, pancarte d'accueil à l'aéroport, parcours en pointillés, logo en pied de page</w:t>
+              <w:t xml:space="preserve">Salutations malgaches, pancarte d'accueil à l'aéroport, parcours en pointillés, ruban incliné acier et or repris du logo, logo en pied de page</w:t>
             </w:r>
           </w:p>
         </w:tc>
@@ -12506,7 +12777,26 @@
           <w:sz w:val="21"/>
           <w:szCs w:val="21"/>
         </w:rPr>
-        <w:t xml:space="preserve">Parcours « L'expérience TS » : la ligne se dessine au défilement et colore l'intérieur des ronds qu'elle atteint (bleu marine, halo doré léger).</w:t>
+        <w:t xml:space="preserve">Filet d'or qui se trace en bas d'une tuile de service au survol, bouton d'action qui se remplit d'or.</w:t>
+      </w:r>
+    </w:p>
+    <w:p>
+      <w:pPr>
+        <w:pStyle w:val="ListParagraph"/>
+        <w:numPr>
+          <w:ilvl w:val="0"/>
+          <w:numId w:val="2"/>
+        </w:numPr>
+        <w:spacing w:after="70" w:line="280"/>
+      </w:pPr>
+      <w:r>
+        <w:rPr>
+          <w:rFonts w:ascii="Calibri" w:cs="Calibri" w:eastAsia="Calibri" w:hAnsi="Calibri"/>
+          <w:color w:val="222B36"/>
+          <w:sz w:val="21"/>
+          <w:szCs w:val="21"/>
+        </w:rPr>
+        <w:t xml:space="preserve">Parcours « L'expérience TS » : la ligne se dessine au défilement et colore en or l'intérieur des ronds qu'elle atteint (ligne dorée, halo doré léger).</w:t>
       </w:r>
     </w:p>
     <w:p>
@@ -13432,7 +13722,7 @@
                 <w:sz w:val="19"/>
                 <w:szCs w:val="19"/>
               </w:rPr>
-              <w:t xml:space="preserve">Visuel client</w:t>
+              <w:t xml:space="preserve">Visuel client (version sur fond clair et sur fond bleu)</w:t>
             </w:r>
           </w:p>
         </w:tc>
@@ -13463,7 +13753,7 @@
                 <w:sz w:val="19"/>
                 <w:szCs w:val="19"/>
               </w:rPr>
-              <w:t xml:space="preserve">Redessiné en vectoriel ; fichier d'origine en haute définition souhaité</w:t>
+              <w:t xml:space="preserve">Remplacé le 17 octobre par le nouveau logo du client, vectorisé ; fichier d'origine (Illustrator ou SVG) souhaité pour un rendu exact</w:t>
             </w:r>
           </w:p>
         </w:tc>
@@ -13564,7 +13854,7 @@
                 <w:sz w:val="19"/>
                 <w:szCs w:val="19"/>
               </w:rPr>
-              <w:t xml:space="preserve">Provisoires ; à remplacer par des photos propres à l'entreprise</w:t>
+              <w:t xml:space="preserve">Provisoires ; à remplacer par des photos propres à l'entreprise, depuis la page Images du site de l'administration</w:t>
             </w:r>
           </w:p>
         </w:tc>
@@ -14678,7 +14968,7 @@
                 <w:sz w:val="19"/>
                 <w:szCs w:val="19"/>
               </w:rPr>
-              <w:t xml:space="preserve">Photographies chargées à la demande et redimensionnées ; images téléversées stockées en base et servies avec cache longue durée</w:t>
+              <w:t xml:space="preserve">Photographies chargées à la demande et redimensionnées ; images téléversées stockées en base (4 Mo maximum, limite d'envoi de l'hébergeur de 4,5 Mo), grandes photos réduites à 2400 px dans le navigateur avant l'envoi, adresses avec extension (/api/media/12.jpg) servies avec cache longue durée ; chaque emplacement d'image du site a une image par défaut remplaçable depuis l'administration</w:t>
             </w:r>
           </w:p>
         </w:tc>
@@ -17549,6 +17839,105 @@
                 <w:sz w:val="19"/>
                 <w:szCs w:val="19"/>
               </w:rPr>
+              <w:t xml:space="preserve">site_images</w:t>
+            </w:r>
+          </w:p>
+        </w:tc>
+        <w:tc>
+          <w:tcPr>
+            <w:tcW w:type="dxa" w:w="6000"/>
+            <w:tcBorders>
+              <w:top w:val="single" w:color="C9D4E0" w:sz="4"/>
+              <w:left w:val="single" w:color="C9D4E0" w:sz="4"/>
+              <w:bottom w:val="single" w:color="C9D4E0" w:sz="4"/>
+              <w:right w:val="single" w:color="C9D4E0" w:sz="4"/>
+            </w:tcBorders>
+            <w:tcMar>
+              <w:top w:type="dxa" w:w="70"/>
+              <w:left w:type="dxa" w:w="110"/>
+              <w:bottom w:type="dxa" w:w="70"/>
+              <w:right w:type="dxa" w:w="110"/>
+            </w:tcMar>
+          </w:tcPr>
+          <w:p>
+            <w:pPr>
+              <w:spacing w:after="30"/>
+            </w:pPr>
+            <w:r>
+              <w:rPr>
+                <w:rFonts w:ascii="Calibri" w:cs="Calibri" w:eastAsia="Calibri" w:hAnsi="Calibri"/>
+                <w:color w:val="222B36"/>
+                <w:sz w:val="19"/>
+                <w:szCs w:val="19"/>
+              </w:rPr>
+              <w:t xml:space="preserve">Images des pages choisies dans l'administration (emplacement, adresse de l'image)</w:t>
+            </w:r>
+          </w:p>
+        </w:tc>
+        <w:tc>
+          <w:tcPr>
+            <w:tcW w:type="dxa" w:w="1560"/>
+            <w:tcBorders>
+              <w:top w:val="single" w:color="C9D4E0" w:sz="4"/>
+              <w:left w:val="single" w:color="C9D4E0" w:sz="4"/>
+              <w:bottom w:val="single" w:color="C9D4E0" w:sz="4"/>
+              <w:right w:val="single" w:color="C9D4E0" w:sz="4"/>
+            </w:tcBorders>
+            <w:tcMar>
+              <w:top w:type="dxa" w:w="70"/>
+              <w:left w:type="dxa" w:w="110"/>
+              <w:bottom w:type="dxa" w:w="70"/>
+              <w:right w:type="dxa" w:w="110"/>
+            </w:tcMar>
+          </w:tcPr>
+          <w:p>
+            <w:pPr>
+              <w:spacing w:after="30"/>
+            </w:pPr>
+            <w:r>
+              <w:rPr>
+                <w:rFonts w:ascii="Calibri" w:cs="Calibri" w:eastAsia="Calibri" w:hAnsi="Calibri"/>
+                <w:color w:val="222B36"/>
+                <w:sz w:val="19"/>
+                <w:szCs w:val="19"/>
+              </w:rPr>
+              <w:t xml:space="preserve">Non</w:t>
+            </w:r>
+          </w:p>
+        </w:tc>
+      </w:tr>
+      <w:tr>
+        <w:trPr>
+          <w:cantSplit/>
+        </w:trPr>
+        <w:tc>
+          <w:tcPr>
+            <w:tcW w:type="dxa" w:w="1800"/>
+            <w:tcBorders>
+              <w:top w:val="single" w:color="C9D4E0" w:sz="4"/>
+              <w:left w:val="single" w:color="C9D4E0" w:sz="4"/>
+              <w:bottom w:val="single" w:color="C9D4E0" w:sz="4"/>
+              <w:right w:val="single" w:color="C9D4E0" w:sz="4"/>
+            </w:tcBorders>
+            <w:shd w:fill="EEF2F7" w:color="auto" w:val="clear"/>
+            <w:tcMar>
+              <w:top w:type="dxa" w:w="70"/>
+              <w:left w:type="dxa" w:w="110"/>
+              <w:bottom w:type="dxa" w:w="70"/>
+              <w:right w:type="dxa" w:w="110"/>
+            </w:tcMar>
+          </w:tcPr>
+          <w:p>
+            <w:pPr>
+              <w:spacing w:after="30"/>
+            </w:pPr>
+            <w:r>
+              <w:rPr>
+                <w:rFonts w:ascii="Calibri" w:cs="Calibri" w:eastAsia="Calibri" w:hAnsi="Calibri"/>
+                <w:color w:val="222B36"/>
+                <w:sz w:val="19"/>
+                <w:szCs w:val="19"/>
+              </w:rPr>
               <w:t xml:space="preserve">migrations</w:t>
             </w:r>
           </w:p>
@@ -17562,6 +17951,7 @@
               <w:bottom w:val="single" w:color="C9D4E0" w:sz="4"/>
               <w:right w:val="single" w:color="C9D4E0" w:sz="4"/>
             </w:tcBorders>
+            <w:shd w:fill="EEF2F7" w:color="auto" w:val="clear"/>
             <w:tcMar>
               <w:top w:type="dxa" w:w="70"/>
               <w:left w:type="dxa" w:w="110"/>
@@ -17593,6 +17983,7 @@
               <w:bottom w:val="single" w:color="C9D4E0" w:sz="4"/>
               <w:right w:val="single" w:color="C9D4E0" w:sz="4"/>
             </w:tcBorders>
+            <w:shd w:fill="EEF2F7" w:color="auto" w:val="clear"/>
             <w:tcMar>
               <w:top w:type="dxa" w:w="70"/>
               <w:left w:type="dxa" w:w="110"/>
@@ -19163,7 +19554,7 @@
           <w:sz w:val="26"/>
           <w:szCs w:val="26"/>
         </w:rPr>
-        <w:t xml:space="preserve">14.1 État d'avancement au 12 octobre 2026</w:t>
+        <w:t xml:space="preserve">14.1 État d'avancement au 22 octobre 2026</w:t>
       </w:r>
     </w:p>
     <w:tbl>
@@ -19422,7 +19813,7 @@
                 <w:sz w:val="19"/>
                 <w:szCs w:val="19"/>
               </w:rPr>
-              <w:t xml:space="preserve">Nouveau design d'après le modèle validé par le client (hero sombre, mosaïque, bloc clair, pied de page clair, doré en simple touche)</w:t>
+              <w:t xml:space="preserve">Nouveau design d'après le modèle validé par le client (hero sombre, mosaïque, bloc clair, pied de page clair, doré en touche, accentué ensuite)</w:t>
             </w:r>
           </w:p>
         </w:tc>
@@ -19694,7 +20085,7 @@
                 <w:sz w:val="19"/>
                 <w:szCs w:val="19"/>
               </w:rPr>
-              <w:t xml:space="preserve">Contenus finaux du client (slogan, trois valeurs, sept services, À propos)</w:t>
+              <w:t xml:space="preserve">Nouveau logo du client et doré accentué sur tout le site</w:t>
             </w:r>
           </w:p>
         </w:tc>
@@ -19725,7 +20116,7 @@
                 <w:sz w:val="19"/>
                 <w:szCs w:val="19"/>
               </w:rPr>
-              <w:t xml:space="preserve">Intégrés et en ligne</w:t>
+              <w:t xml:space="preserve">Livrés et en ligne</w:t>
             </w:r>
           </w:p>
         </w:tc>
@@ -19762,7 +20153,7 @@
                 <w:sz w:val="19"/>
                 <w:szCs w:val="19"/>
               </w:rPr>
-              <w:t xml:space="preserve">Flotte finale : quatre véhicules, textes corrigés, photos détourées</w:t>
+              <w:t xml:space="preserve">Gestion de toutes les images du site depuis l'administration (page Images du site)</w:t>
             </w:r>
           </w:p>
         </w:tc>
@@ -19794,7 +20185,7 @@
                 <w:sz w:val="19"/>
                 <w:szCs w:val="19"/>
               </w:rPr>
-              <w:t xml:space="preserve">Intégrée et en ligne</w:t>
+              <w:t xml:space="preserve">Livrée et en ligne</w:t>
             </w:r>
           </w:p>
         </w:tc>
@@ -19830,7 +20221,7 @@
                 <w:sz w:val="19"/>
                 <w:szCs w:val="19"/>
               </w:rPr>
-              <w:t xml:space="preserve">Relecture de la traduction anglaise des contenus finaux</w:t>
+              <w:t xml:space="preserve">Page Tarifs sans « À partir de » ; véhicule de la tuile flotte remonté pour ne plus recouvrir son nom</w:t>
             </w:r>
           </w:p>
         </w:tc>
@@ -19861,7 +20252,7 @@
                 <w:sz w:val="19"/>
                 <w:szCs w:val="19"/>
               </w:rPr>
-              <w:t xml:space="preserve">À faire par le client</w:t>
+              <w:t xml:space="preserve">Livrés et en ligne</w:t>
             </w:r>
           </w:p>
         </w:tc>
@@ -19898,7 +20289,7 @@
                 <w:sz w:val="19"/>
                 <w:szCs w:val="19"/>
               </w:rPr>
-              <w:t xml:space="preserve">Envoi réel des emails</w:t>
+              <w:t xml:space="preserve">Contenus finaux du client (slogan, trois valeurs, sept services, À propos)</w:t>
             </w:r>
           </w:p>
         </w:tc>
@@ -19930,7 +20321,7 @@
                 <w:sz w:val="19"/>
                 <w:szCs w:val="19"/>
               </w:rPr>
-              <w:t xml:space="preserve">À configurer (paramètres SMTP à fournir)</w:t>
+              <w:t xml:space="preserve">Intégrés et en ligne</w:t>
             </w:r>
           </w:p>
         </w:tc>
@@ -19966,7 +20357,7 @@
                 <w:sz w:val="19"/>
                 <w:szCs w:val="19"/>
               </w:rPr>
-              <w:t xml:space="preserve">Photographies propres à l'entreprise, témoignages, réseaux sociaux</w:t>
+              <w:t xml:space="preserve">Flotte finale : quatre véhicules, textes corrigés, photos détourées</w:t>
             </w:r>
           </w:p>
         </w:tc>
@@ -19997,7 +20388,7 @@
                 <w:sz w:val="19"/>
                 <w:szCs w:val="19"/>
               </w:rPr>
-              <w:t xml:space="preserve">À fournir</w:t>
+              <w:t xml:space="preserve">Intégrée et en ligne</w:t>
             </w:r>
           </w:p>
         </w:tc>
@@ -20034,7 +20425,7 @@
                 <w:sz w:val="19"/>
                 <w:szCs w:val="19"/>
               </w:rPr>
-              <w:t xml:space="preserve">Nom de domaine et pages légales</w:t>
+              <w:t xml:space="preserve">Relecture de la traduction anglaise des contenus finaux</w:t>
             </w:r>
           </w:p>
         </w:tc>
@@ -20066,7 +20457,7 @@
                 <w:sz w:val="19"/>
                 <w:szCs w:val="19"/>
               </w:rPr>
-              <w:t xml:space="preserve">À fournir</w:t>
+              <w:t xml:space="preserve">À faire par le client</w:t>
             </w:r>
           </w:p>
         </w:tc>
@@ -20102,6 +20493,210 @@
                 <w:sz w:val="19"/>
                 <w:szCs w:val="19"/>
               </w:rPr>
+              <w:t xml:space="preserve">Envoi réel des emails</w:t>
+            </w:r>
+          </w:p>
+        </w:tc>
+        <w:tc>
+          <w:tcPr>
+            <w:tcW w:type="dxa" w:w="2560"/>
+            <w:tcBorders>
+              <w:top w:val="single" w:color="C9D4E0" w:sz="4"/>
+              <w:left w:val="single" w:color="C9D4E0" w:sz="4"/>
+              <w:bottom w:val="single" w:color="C9D4E0" w:sz="4"/>
+              <w:right w:val="single" w:color="C9D4E0" w:sz="4"/>
+            </w:tcBorders>
+            <w:tcMar>
+              <w:top w:type="dxa" w:w="70"/>
+              <w:left w:type="dxa" w:w="110"/>
+              <w:bottom w:type="dxa" w:w="70"/>
+              <w:right w:type="dxa" w:w="110"/>
+            </w:tcMar>
+          </w:tcPr>
+          <w:p>
+            <w:pPr>
+              <w:spacing w:after="30"/>
+            </w:pPr>
+            <w:r>
+              <w:rPr>
+                <w:rFonts w:ascii="Calibri" w:cs="Calibri" w:eastAsia="Calibri" w:hAnsi="Calibri"/>
+                <w:color w:val="222B36"/>
+                <w:sz w:val="19"/>
+                <w:szCs w:val="19"/>
+              </w:rPr>
+              <w:t xml:space="preserve">À configurer (paramètres SMTP à fournir)</w:t>
+            </w:r>
+          </w:p>
+        </w:tc>
+      </w:tr>
+      <w:tr>
+        <w:trPr>
+          <w:cantSplit/>
+        </w:trPr>
+        <w:tc>
+          <w:tcPr>
+            <w:tcW w:type="dxa" w:w="6800"/>
+            <w:tcBorders>
+              <w:top w:val="single" w:color="C9D4E0" w:sz="4"/>
+              <w:left w:val="single" w:color="C9D4E0" w:sz="4"/>
+              <w:bottom w:val="single" w:color="C9D4E0" w:sz="4"/>
+              <w:right w:val="single" w:color="C9D4E0" w:sz="4"/>
+            </w:tcBorders>
+            <w:shd w:fill="EEF2F7" w:color="auto" w:val="clear"/>
+            <w:tcMar>
+              <w:top w:type="dxa" w:w="70"/>
+              <w:left w:type="dxa" w:w="110"/>
+              <w:bottom w:type="dxa" w:w="70"/>
+              <w:right w:type="dxa" w:w="110"/>
+            </w:tcMar>
+          </w:tcPr>
+          <w:p>
+            <w:pPr>
+              <w:spacing w:after="30"/>
+            </w:pPr>
+            <w:r>
+              <w:rPr>
+                <w:rFonts w:ascii="Calibri" w:cs="Calibri" w:eastAsia="Calibri" w:hAnsi="Calibri"/>
+                <w:color w:val="222B36"/>
+                <w:sz w:val="19"/>
+                <w:szCs w:val="19"/>
+              </w:rPr>
+              <w:t xml:space="preserve">Photographies propres à l'entreprise, témoignages, réseaux sociaux</w:t>
+            </w:r>
+          </w:p>
+        </w:tc>
+        <w:tc>
+          <w:tcPr>
+            <w:tcW w:type="dxa" w:w="2560"/>
+            <w:tcBorders>
+              <w:top w:val="single" w:color="C9D4E0" w:sz="4"/>
+              <w:left w:val="single" w:color="C9D4E0" w:sz="4"/>
+              <w:bottom w:val="single" w:color="C9D4E0" w:sz="4"/>
+              <w:right w:val="single" w:color="C9D4E0" w:sz="4"/>
+            </w:tcBorders>
+            <w:shd w:fill="EEF2F7" w:color="auto" w:val="clear"/>
+            <w:tcMar>
+              <w:top w:type="dxa" w:w="70"/>
+              <w:left w:type="dxa" w:w="110"/>
+              <w:bottom w:type="dxa" w:w="70"/>
+              <w:right w:type="dxa" w:w="110"/>
+            </w:tcMar>
+          </w:tcPr>
+          <w:p>
+            <w:pPr>
+              <w:spacing w:after="30"/>
+            </w:pPr>
+            <w:r>
+              <w:rPr>
+                <w:rFonts w:ascii="Calibri" w:cs="Calibri" w:eastAsia="Calibri" w:hAnsi="Calibri"/>
+                <w:color w:val="222B36"/>
+                <w:sz w:val="19"/>
+                <w:szCs w:val="19"/>
+              </w:rPr>
+              <w:t xml:space="preserve">À fournir</w:t>
+            </w:r>
+          </w:p>
+        </w:tc>
+      </w:tr>
+      <w:tr>
+        <w:trPr>
+          <w:cantSplit/>
+        </w:trPr>
+        <w:tc>
+          <w:tcPr>
+            <w:tcW w:type="dxa" w:w="6800"/>
+            <w:tcBorders>
+              <w:top w:val="single" w:color="C9D4E0" w:sz="4"/>
+              <w:left w:val="single" w:color="C9D4E0" w:sz="4"/>
+              <w:bottom w:val="single" w:color="C9D4E0" w:sz="4"/>
+              <w:right w:val="single" w:color="C9D4E0" w:sz="4"/>
+            </w:tcBorders>
+            <w:tcMar>
+              <w:top w:type="dxa" w:w="70"/>
+              <w:left w:type="dxa" w:w="110"/>
+              <w:bottom w:type="dxa" w:w="70"/>
+              <w:right w:type="dxa" w:w="110"/>
+            </w:tcMar>
+          </w:tcPr>
+          <w:p>
+            <w:pPr>
+              <w:spacing w:after="30"/>
+            </w:pPr>
+            <w:r>
+              <w:rPr>
+                <w:rFonts w:ascii="Calibri" w:cs="Calibri" w:eastAsia="Calibri" w:hAnsi="Calibri"/>
+                <w:color w:val="222B36"/>
+                <w:sz w:val="19"/>
+                <w:szCs w:val="19"/>
+              </w:rPr>
+              <w:t xml:space="preserve">Nom de domaine et pages légales</w:t>
+            </w:r>
+          </w:p>
+        </w:tc>
+        <w:tc>
+          <w:tcPr>
+            <w:tcW w:type="dxa" w:w="2560"/>
+            <w:tcBorders>
+              <w:top w:val="single" w:color="C9D4E0" w:sz="4"/>
+              <w:left w:val="single" w:color="C9D4E0" w:sz="4"/>
+              <w:bottom w:val="single" w:color="C9D4E0" w:sz="4"/>
+              <w:right w:val="single" w:color="C9D4E0" w:sz="4"/>
+            </w:tcBorders>
+            <w:tcMar>
+              <w:top w:type="dxa" w:w="70"/>
+              <w:left w:type="dxa" w:w="110"/>
+              <w:bottom w:type="dxa" w:w="70"/>
+              <w:right w:type="dxa" w:w="110"/>
+            </w:tcMar>
+          </w:tcPr>
+          <w:p>
+            <w:pPr>
+              <w:spacing w:after="30"/>
+            </w:pPr>
+            <w:r>
+              <w:rPr>
+                <w:rFonts w:ascii="Calibri" w:cs="Calibri" w:eastAsia="Calibri" w:hAnsi="Calibri"/>
+                <w:color w:val="222B36"/>
+                <w:sz w:val="19"/>
+                <w:szCs w:val="19"/>
+              </w:rPr>
+              <w:t xml:space="preserve">À fournir</w:t>
+            </w:r>
+          </w:p>
+        </w:tc>
+      </w:tr>
+      <w:tr>
+        <w:trPr>
+          <w:cantSplit/>
+        </w:trPr>
+        <w:tc>
+          <w:tcPr>
+            <w:tcW w:type="dxa" w:w="6800"/>
+            <w:tcBorders>
+              <w:top w:val="single" w:color="C9D4E0" w:sz="4"/>
+              <w:left w:val="single" w:color="C9D4E0" w:sz="4"/>
+              <w:bottom w:val="single" w:color="C9D4E0" w:sz="4"/>
+              <w:right w:val="single" w:color="C9D4E0" w:sz="4"/>
+            </w:tcBorders>
+            <w:shd w:fill="EEF2F7" w:color="auto" w:val="clear"/>
+            <w:tcMar>
+              <w:top w:type="dxa" w:w="70"/>
+              <w:left w:type="dxa" w:w="110"/>
+              <w:bottom w:type="dxa" w:w="70"/>
+              <w:right w:type="dxa" w:w="110"/>
+            </w:tcMar>
+          </w:tcPr>
+          <w:p>
+            <w:pPr>
+              <w:spacing w:after="30"/>
+            </w:pPr>
+            <w:r>
+              <w:rPr>
+                <w:rFonts w:ascii="Calibri" w:cs="Calibri" w:eastAsia="Calibri" w:hAnsi="Calibri"/>
+                <w:color w:val="222B36"/>
+                <w:sz w:val="19"/>
+                <w:szCs w:val="19"/>
+              </w:rPr>
               <w:t xml:space="preserve">Recette finale par le client</w:t>
             </w:r>
           </w:p>
@@ -20115,6 +20710,7 @@
               <w:bottom w:val="single" w:color="C9D4E0" w:sz="4"/>
               <w:right w:val="single" w:color="C9D4E0" w:sz="4"/>
             </w:tcBorders>
+            <w:shd w:fill="EEF2F7" w:color="auto" w:val="clear"/>
             <w:tcMar>
               <w:top w:type="dxa" w:w="70"/>
               <w:left w:type="dxa" w:w="110"/>
@@ -20231,7 +20827,7 @@
           <w:sz w:val="21"/>
           <w:szCs w:val="21"/>
         </w:rPr>
-        <w:t xml:space="preserve">Logo vectoriel en deux versions (SVG).</w:t>
+        <w:t xml:space="preserve">Logo du client vectorisé en deux versions (SVG et PNG) et monogramme TS pour l'icône du site.</w:t>
       </w:r>
     </w:p>
     <w:p>
@@ -22133,7 +22729,7 @@
                 <w:sz w:val="19"/>
                 <w:szCs w:val="19"/>
               </w:rPr>
-              <w:t xml:space="preserve">Même structure : hero sombre, mosaïque, bloc clair, pied de page clair ; doré présent seulement en touche discrète</w:t>
+              <w:t xml:space="preserve">Même structure : hero sombre, mosaïque, bloc clair, pied de page clair ; doré présent en accent (boutons d'action, mot du titre, chiffres, repères), jamais en grand fond</w:t>
             </w:r>
           </w:p>
         </w:tc>
@@ -22731,6 +23327,505 @@
                 <w:szCs w:val="19"/>
               </w:rPr>
               <w:t xml:space="preserve">Les ronds se colorent à mesure que la ligne les atteint et se vident quand on remonte</w:t>
+            </w:r>
+          </w:p>
+        </w:tc>
+      </w:tr>
+      <w:tr>
+        <w:trPr>
+          <w:cantSplit/>
+        </w:trPr>
+        <w:tc>
+          <w:tcPr>
+            <w:tcW w:type="dxa" w:w="700"/>
+            <w:tcBorders>
+              <w:top w:val="single" w:color="C9D4E0" w:sz="4"/>
+              <w:left w:val="single" w:color="C9D4E0" w:sz="4"/>
+              <w:bottom w:val="single" w:color="C9D4E0" w:sz="4"/>
+              <w:right w:val="single" w:color="C9D4E0" w:sz="4"/>
+            </w:tcBorders>
+            <w:shd w:fill="EEF2F7" w:color="auto" w:val="clear"/>
+            <w:tcMar>
+              <w:top w:type="dxa" w:w="70"/>
+              <w:left w:type="dxa" w:w="110"/>
+              <w:bottom w:type="dxa" w:w="70"/>
+              <w:right w:type="dxa" w:w="110"/>
+            </w:tcMar>
+          </w:tcPr>
+          <w:p>
+            <w:pPr>
+              <w:spacing w:after="30"/>
+            </w:pPr>
+            <w:r>
+              <w:rPr>
+                <w:rFonts w:ascii="Calibri" w:cs="Calibri" w:eastAsia="Calibri" w:hAnsi="Calibri"/>
+                <w:color w:val="222B36"/>
+                <w:sz w:val="19"/>
+                <w:szCs w:val="19"/>
+              </w:rPr>
+              <w:t xml:space="preserve">24</w:t>
+            </w:r>
+          </w:p>
+        </w:tc>
+        <w:tc>
+          <w:tcPr>
+            <w:tcW w:type="dxa" w:w="4300"/>
+            <w:tcBorders>
+              <w:top w:val="single" w:color="C9D4E0" w:sz="4"/>
+              <w:left w:val="single" w:color="C9D4E0" w:sz="4"/>
+              <w:bottom w:val="single" w:color="C9D4E0" w:sz="4"/>
+              <w:right w:val="single" w:color="C9D4E0" w:sz="4"/>
+            </w:tcBorders>
+            <w:shd w:fill="EEF2F7" w:color="auto" w:val="clear"/>
+            <w:tcMar>
+              <w:top w:type="dxa" w:w="70"/>
+              <w:left w:type="dxa" w:w="110"/>
+              <w:bottom w:type="dxa" w:w="70"/>
+              <w:right w:type="dxa" w:w="110"/>
+            </w:tcMar>
+          </w:tcPr>
+          <w:p>
+            <w:pPr>
+              <w:spacing w:after="30"/>
+            </w:pPr>
+            <w:r>
+              <w:rPr>
+                <w:rFonts w:ascii="Calibri" w:cs="Calibri" w:eastAsia="Calibri" w:hAnsi="Calibri"/>
+                <w:color w:val="222B36"/>
+                <w:sz w:val="19"/>
+                <w:szCs w:val="19"/>
+              </w:rPr>
+              <w:t xml:space="preserve">Comparer le logo du site à la fiche du client, dans l'en-tête (fond sombre) et dans le pied de page (fond clair)</w:t>
+            </w:r>
+          </w:p>
+        </w:tc>
+        <w:tc>
+          <w:tcPr>
+            <w:tcW w:type="dxa" w:w="4360"/>
+            <w:tcBorders>
+              <w:top w:val="single" w:color="C9D4E0" w:sz="4"/>
+              <w:left w:val="single" w:color="C9D4E0" w:sz="4"/>
+              <w:bottom w:val="single" w:color="C9D4E0" w:sz="4"/>
+              <w:right w:val="single" w:color="C9D4E0" w:sz="4"/>
+            </w:tcBorders>
+            <w:shd w:fill="EEF2F7" w:color="auto" w:val="clear"/>
+            <w:tcMar>
+              <w:top w:type="dxa" w:w="70"/>
+              <w:left w:type="dxa" w:w="110"/>
+              <w:bottom w:type="dxa" w:w="70"/>
+              <w:right w:type="dxa" w:w="110"/>
+            </w:tcMar>
+          </w:tcPr>
+          <w:p>
+            <w:pPr>
+              <w:spacing w:after="30"/>
+            </w:pPr>
+            <w:r>
+              <w:rPr>
+                <w:rFonts w:ascii="Calibri" w:cs="Calibri" w:eastAsia="Calibri" w:hAnsi="Calibri"/>
+                <w:color w:val="222B36"/>
+                <w:sz w:val="19"/>
+                <w:szCs w:val="19"/>
+              </w:rPr>
+              <w:t xml:space="preserve">Mêmes formes et mêmes couleurs que le logo fourni (marine, acier, or) dans les deux versions ; icône de l'onglet en monogramme TS</w:t>
+            </w:r>
+          </w:p>
+        </w:tc>
+      </w:tr>
+      <w:tr>
+        <w:trPr>
+          <w:cantSplit/>
+        </w:trPr>
+        <w:tc>
+          <w:tcPr>
+            <w:tcW w:type="dxa" w:w="700"/>
+            <w:tcBorders>
+              <w:top w:val="single" w:color="C9D4E0" w:sz="4"/>
+              <w:left w:val="single" w:color="C9D4E0" w:sz="4"/>
+              <w:bottom w:val="single" w:color="C9D4E0" w:sz="4"/>
+              <w:right w:val="single" w:color="C9D4E0" w:sz="4"/>
+            </w:tcBorders>
+            <w:tcMar>
+              <w:top w:type="dxa" w:w="70"/>
+              <w:left w:type="dxa" w:w="110"/>
+              <w:bottom w:type="dxa" w:w="70"/>
+              <w:right w:type="dxa" w:w="110"/>
+            </w:tcMar>
+          </w:tcPr>
+          <w:p>
+            <w:pPr>
+              <w:spacing w:after="30"/>
+            </w:pPr>
+            <w:r>
+              <w:rPr>
+                <w:rFonts w:ascii="Calibri" w:cs="Calibri" w:eastAsia="Calibri" w:hAnsi="Calibri"/>
+                <w:color w:val="222B36"/>
+                <w:sz w:val="19"/>
+                <w:szCs w:val="19"/>
+              </w:rPr>
+              <w:t xml:space="preserve">25</w:t>
+            </w:r>
+          </w:p>
+        </w:tc>
+        <w:tc>
+          <w:tcPr>
+            <w:tcW w:type="dxa" w:w="4300"/>
+            <w:tcBorders>
+              <w:top w:val="single" w:color="C9D4E0" w:sz="4"/>
+              <w:left w:val="single" w:color="C9D4E0" w:sz="4"/>
+              <w:bottom w:val="single" w:color="C9D4E0" w:sz="4"/>
+              <w:right w:val="single" w:color="C9D4E0" w:sz="4"/>
+            </w:tcBorders>
+            <w:tcMar>
+              <w:top w:type="dxa" w:w="70"/>
+              <w:left w:type="dxa" w:w="110"/>
+              <w:bottom w:type="dxa" w:w="70"/>
+              <w:right w:type="dxa" w:w="110"/>
+            </w:tcMar>
+          </w:tcPr>
+          <w:p>
+            <w:pPr>
+              <w:spacing w:after="30"/>
+            </w:pPr>
+            <w:r>
+              <w:rPr>
+                <w:rFonts w:ascii="Calibri" w:cs="Calibri" w:eastAsia="Calibri" w:hAnsi="Calibri"/>
+                <w:color w:val="222B36"/>
+                <w:sz w:val="19"/>
+                <w:szCs w:val="19"/>
+              </w:rPr>
+              <w:t xml:space="preserve">Parcourir l'accueil et les pages de services en repérant l'or</w:t>
+            </w:r>
+          </w:p>
+        </w:tc>
+        <w:tc>
+          <w:tcPr>
+            <w:tcW w:type="dxa" w:w="4360"/>
+            <w:tcBorders>
+              <w:top w:val="single" w:color="C9D4E0" w:sz="4"/>
+              <w:left w:val="single" w:color="C9D4E0" w:sz="4"/>
+              <w:bottom w:val="single" w:color="C9D4E0" w:sz="4"/>
+              <w:right w:val="single" w:color="C9D4E0" w:sz="4"/>
+            </w:tcBorders>
+            <w:tcMar>
+              <w:top w:type="dxa" w:w="70"/>
+              <w:left w:type="dxa" w:w="110"/>
+              <w:bottom w:type="dxa" w:w="70"/>
+              <w:right w:type="dxa" w:w="110"/>
+            </w:tcMar>
+          </w:tcPr>
+          <w:p>
+            <w:pPr>
+              <w:spacing w:after="30"/>
+            </w:pPr>
+            <w:r>
+              <w:rPr>
+                <w:rFonts w:ascii="Calibri" w:cs="Calibri" w:eastAsia="Calibri" w:hAnsi="Calibri"/>
+                <w:color w:val="222B36"/>
+                <w:sz w:val="19"/>
+                <w:szCs w:val="19"/>
+              </w:rPr>
+              <w:t xml:space="preserve">Boutons d'action principaux en or, mot du titre du hero en or, chiffres du hero, icônes des valeurs, filets des tuiles et ronds du parcours en or ; aucun grand fond doré</w:t>
+            </w:r>
+          </w:p>
+        </w:tc>
+      </w:tr>
+      <w:tr>
+        <w:trPr>
+          <w:cantSplit/>
+        </w:trPr>
+        <w:tc>
+          <w:tcPr>
+            <w:tcW w:type="dxa" w:w="700"/>
+            <w:tcBorders>
+              <w:top w:val="single" w:color="C9D4E0" w:sz="4"/>
+              <w:left w:val="single" w:color="C9D4E0" w:sz="4"/>
+              <w:bottom w:val="single" w:color="C9D4E0" w:sz="4"/>
+              <w:right w:val="single" w:color="C9D4E0" w:sz="4"/>
+            </w:tcBorders>
+            <w:shd w:fill="EEF2F7" w:color="auto" w:val="clear"/>
+            <w:tcMar>
+              <w:top w:type="dxa" w:w="70"/>
+              <w:left w:type="dxa" w:w="110"/>
+              <w:bottom w:type="dxa" w:w="70"/>
+              <w:right w:type="dxa" w:w="110"/>
+            </w:tcMar>
+          </w:tcPr>
+          <w:p>
+            <w:pPr>
+              <w:spacing w:after="30"/>
+            </w:pPr>
+            <w:r>
+              <w:rPr>
+                <w:rFonts w:ascii="Calibri" w:cs="Calibri" w:eastAsia="Calibri" w:hAnsi="Calibri"/>
+                <w:color w:val="222B36"/>
+                <w:sz w:val="19"/>
+                <w:szCs w:val="19"/>
+              </w:rPr>
+              <w:t xml:space="preserve">26</w:t>
+            </w:r>
+          </w:p>
+        </w:tc>
+        <w:tc>
+          <w:tcPr>
+            <w:tcW w:type="dxa" w:w="4300"/>
+            <w:tcBorders>
+              <w:top w:val="single" w:color="C9D4E0" w:sz="4"/>
+              <w:left w:val="single" w:color="C9D4E0" w:sz="4"/>
+              <w:bottom w:val="single" w:color="C9D4E0" w:sz="4"/>
+              <w:right w:val="single" w:color="C9D4E0" w:sz="4"/>
+            </w:tcBorders>
+            <w:shd w:fill="EEF2F7" w:color="auto" w:val="clear"/>
+            <w:tcMar>
+              <w:top w:type="dxa" w:w="70"/>
+              <w:left w:type="dxa" w:w="110"/>
+              <w:bottom w:type="dxa" w:w="70"/>
+              <w:right w:type="dxa" w:w="110"/>
+            </w:tcMar>
+          </w:tcPr>
+          <w:p>
+            <w:pPr>
+              <w:spacing w:after="30"/>
+            </w:pPr>
+            <w:r>
+              <w:rPr>
+                <w:rFonts w:ascii="Calibri" w:cs="Calibri" w:eastAsia="Calibri" w:hAnsi="Calibri"/>
+                <w:color w:val="222B36"/>
+                <w:sz w:val="19"/>
+                <w:szCs w:val="19"/>
+              </w:rPr>
+              <w:t xml:space="preserve">Dans l'administration, ouvrir Images du site, remplacer l'image d'en-tête d'une page par une photo de plus de 4 Mo, puis la rétablir</w:t>
+            </w:r>
+          </w:p>
+        </w:tc>
+        <w:tc>
+          <w:tcPr>
+            <w:tcW w:type="dxa" w:w="4360"/>
+            <w:tcBorders>
+              <w:top w:val="single" w:color="C9D4E0" w:sz="4"/>
+              <w:left w:val="single" w:color="C9D4E0" w:sz="4"/>
+              <w:bottom w:val="single" w:color="C9D4E0" w:sz="4"/>
+              <w:right w:val="single" w:color="C9D4E0" w:sz="4"/>
+            </w:tcBorders>
+            <w:shd w:fill="EEF2F7" w:color="auto" w:val="clear"/>
+            <w:tcMar>
+              <w:top w:type="dxa" w:w="70"/>
+              <w:left w:type="dxa" w:w="110"/>
+              <w:bottom w:type="dxa" w:w="70"/>
+              <w:right w:type="dxa" w:w="110"/>
+            </w:tcMar>
+          </w:tcPr>
+          <w:p>
+            <w:pPr>
+              <w:spacing w:after="30"/>
+            </w:pPr>
+            <w:r>
+              <w:rPr>
+                <w:rFonts w:ascii="Calibri" w:cs="Calibri" w:eastAsia="Calibri" w:hAnsi="Calibri"/>
+                <w:color w:val="222B36"/>
+                <w:sz w:val="19"/>
+                <w:szCs w:val="19"/>
+              </w:rPr>
+              <w:t xml:space="preserve">La photo est réduite et envoyée, la page publique l'affiche tout de suite ; « Rétablir » ramène l'image d'origine</w:t>
+            </w:r>
+          </w:p>
+        </w:tc>
+      </w:tr>
+      <w:tr>
+        <w:trPr>
+          <w:cantSplit/>
+        </w:trPr>
+        <w:tc>
+          <w:tcPr>
+            <w:tcW w:type="dxa" w:w="700"/>
+            <w:tcBorders>
+              <w:top w:val="single" w:color="C9D4E0" w:sz="4"/>
+              <w:left w:val="single" w:color="C9D4E0" w:sz="4"/>
+              <w:bottom w:val="single" w:color="C9D4E0" w:sz="4"/>
+              <w:right w:val="single" w:color="C9D4E0" w:sz="4"/>
+            </w:tcBorders>
+            <w:tcMar>
+              <w:top w:type="dxa" w:w="70"/>
+              <w:left w:type="dxa" w:w="110"/>
+              <w:bottom w:type="dxa" w:w="70"/>
+              <w:right w:type="dxa" w:w="110"/>
+            </w:tcMar>
+          </w:tcPr>
+          <w:p>
+            <w:pPr>
+              <w:spacing w:after="30"/>
+            </w:pPr>
+            <w:r>
+              <w:rPr>
+                <w:rFonts w:ascii="Calibri" w:cs="Calibri" w:eastAsia="Calibri" w:hAnsi="Calibri"/>
+                <w:color w:val="222B36"/>
+                <w:sz w:val="19"/>
+                <w:szCs w:val="19"/>
+              </w:rPr>
+              <w:t xml:space="preserve">27</w:t>
+            </w:r>
+          </w:p>
+        </w:tc>
+        <w:tc>
+          <w:tcPr>
+            <w:tcW w:type="dxa" w:w="4300"/>
+            <w:tcBorders>
+              <w:top w:val="single" w:color="C9D4E0" w:sz="4"/>
+              <w:left w:val="single" w:color="C9D4E0" w:sz="4"/>
+              <w:bottom w:val="single" w:color="C9D4E0" w:sz="4"/>
+              <w:right w:val="single" w:color="C9D4E0" w:sz="4"/>
+            </w:tcBorders>
+            <w:tcMar>
+              <w:top w:type="dxa" w:w="70"/>
+              <w:left w:type="dxa" w:w="110"/>
+              <w:bottom w:type="dxa" w:w="70"/>
+              <w:right w:type="dxa" w:w="110"/>
+            </w:tcMar>
+          </w:tcPr>
+          <w:p>
+            <w:pPr>
+              <w:spacing w:after="30"/>
+            </w:pPr>
+            <w:r>
+              <w:rPr>
+                <w:rFonts w:ascii="Calibri" w:cs="Calibri" w:eastAsia="Calibri" w:hAnsi="Calibri"/>
+                <w:color w:val="222B36"/>
+                <w:sz w:val="19"/>
+                <w:szCs w:val="19"/>
+              </w:rPr>
+              <w:t xml:space="preserve">Ouvrir la page Tarifs en français et en anglais</w:t>
+            </w:r>
+          </w:p>
+        </w:tc>
+        <w:tc>
+          <w:tcPr>
+            <w:tcW w:type="dxa" w:w="4360"/>
+            <w:tcBorders>
+              <w:top w:val="single" w:color="C9D4E0" w:sz="4"/>
+              <w:left w:val="single" w:color="C9D4E0" w:sz="4"/>
+              <w:bottom w:val="single" w:color="C9D4E0" w:sz="4"/>
+              <w:right w:val="single" w:color="C9D4E0" w:sz="4"/>
+            </w:tcBorders>
+            <w:tcMar>
+              <w:top w:type="dxa" w:w="70"/>
+              <w:left w:type="dxa" w:w="110"/>
+              <w:bottom w:type="dxa" w:w="70"/>
+              <w:right w:type="dxa" w:w="110"/>
+            </w:tcMar>
+          </w:tcPr>
+          <w:p>
+            <w:pPr>
+              <w:spacing w:after="30"/>
+            </w:pPr>
+            <w:r>
+              <w:rPr>
+                <w:rFonts w:ascii="Calibri" w:cs="Calibri" w:eastAsia="Calibri" w:hAnsi="Calibri"/>
+                <w:color w:val="222B36"/>
+                <w:sz w:val="19"/>
+                <w:szCs w:val="19"/>
+              </w:rPr>
+              <w:t xml:space="preserve">Aucune mention « À partir de » ni « From » devant les offres ; le prix n'apparaît que s'il est renseigné</w:t>
+            </w:r>
+          </w:p>
+        </w:tc>
+      </w:tr>
+      <w:tr>
+        <w:trPr>
+          <w:cantSplit/>
+        </w:trPr>
+        <w:tc>
+          <w:tcPr>
+            <w:tcW w:type="dxa" w:w="700"/>
+            <w:tcBorders>
+              <w:top w:val="single" w:color="C9D4E0" w:sz="4"/>
+              <w:left w:val="single" w:color="C9D4E0" w:sz="4"/>
+              <w:bottom w:val="single" w:color="C9D4E0" w:sz="4"/>
+              <w:right w:val="single" w:color="C9D4E0" w:sz="4"/>
+            </w:tcBorders>
+            <w:shd w:fill="EEF2F7" w:color="auto" w:val="clear"/>
+            <w:tcMar>
+              <w:top w:type="dxa" w:w="70"/>
+              <w:left w:type="dxa" w:w="110"/>
+              <w:bottom w:type="dxa" w:w="70"/>
+              <w:right w:type="dxa" w:w="110"/>
+            </w:tcMar>
+          </w:tcPr>
+          <w:p>
+            <w:pPr>
+              <w:spacing w:after="30"/>
+            </w:pPr>
+            <w:r>
+              <w:rPr>
+                <w:rFonts w:ascii="Calibri" w:cs="Calibri" w:eastAsia="Calibri" w:hAnsi="Calibri"/>
+                <w:color w:val="222B36"/>
+                <w:sz w:val="19"/>
+                <w:szCs w:val="19"/>
+              </w:rPr>
+              <w:t xml:space="preserve">28</w:t>
+            </w:r>
+          </w:p>
+        </w:tc>
+        <w:tc>
+          <w:tcPr>
+            <w:tcW w:type="dxa" w:w="4300"/>
+            <w:tcBorders>
+              <w:top w:val="single" w:color="C9D4E0" w:sz="4"/>
+              <w:left w:val="single" w:color="C9D4E0" w:sz="4"/>
+              <w:bottom w:val="single" w:color="C9D4E0" w:sz="4"/>
+              <w:right w:val="single" w:color="C9D4E0" w:sz="4"/>
+            </w:tcBorders>
+            <w:shd w:fill="EEF2F7" w:color="auto" w:val="clear"/>
+            <w:tcMar>
+              <w:top w:type="dxa" w:w="70"/>
+              <w:left w:type="dxa" w:w="110"/>
+              <w:bottom w:type="dxa" w:w="70"/>
+              <w:right w:type="dxa" w:w="110"/>
+            </w:tcMar>
+          </w:tcPr>
+          <w:p>
+            <w:pPr>
+              <w:spacing w:after="30"/>
+            </w:pPr>
+            <w:r>
+              <w:rPr>
+                <w:rFonts w:ascii="Calibri" w:cs="Calibri" w:eastAsia="Calibri" w:hAnsi="Calibri"/>
+                <w:color w:val="222B36"/>
+                <w:sz w:val="19"/>
+                <w:szCs w:val="19"/>
+              </w:rPr>
+              <w:t xml:space="preserve">Parcourir les quatre véhicules de la tuile « Notre flotte » de l'accueil, sur grand écran, ordinateur portable et téléphone</w:t>
+            </w:r>
+          </w:p>
+        </w:tc>
+        <w:tc>
+          <w:tcPr>
+            <w:tcW w:type="dxa" w:w="4360"/>
+            <w:tcBorders>
+              <w:top w:val="single" w:color="C9D4E0" w:sz="4"/>
+              <w:left w:val="single" w:color="C9D4E0" w:sz="4"/>
+              <w:bottom w:val="single" w:color="C9D4E0" w:sz="4"/>
+              <w:right w:val="single" w:color="C9D4E0" w:sz="4"/>
+            </w:tcBorders>
+            <w:shd w:fill="EEF2F7" w:color="auto" w:val="clear"/>
+            <w:tcMar>
+              <w:top w:type="dxa" w:w="70"/>
+              <w:left w:type="dxa" w:w="110"/>
+              <w:bottom w:type="dxa" w:w="70"/>
+              <w:right w:type="dxa" w:w="110"/>
+            </w:tcMar>
+          </w:tcPr>
+          <w:p>
+            <w:pPr>
+              <w:spacing w:after="30"/>
+            </w:pPr>
+            <w:r>
+              <w:rPr>
+                <w:rFonts w:ascii="Calibri" w:cs="Calibri" w:eastAsia="Calibri" w:hAnsi="Calibri"/>
+                <w:color w:val="222B36"/>
+                <w:sz w:val="19"/>
+                <w:szCs w:val="19"/>
+              </w:rPr>
+              <w:t xml:space="preserve">Le véhicule ne recouvre ni son nom, ni sa catégorie, ni « Toute la flotte »</w:t>
             </w:r>
           </w:p>
         </w:tc>
@@ -23729,6 +24824,205 @@
                 <w:sz w:val="19"/>
                 <w:szCs w:val="19"/>
               </w:rPr>
+              <w:t xml:space="preserve">Photo de véhicule envoyée sans détourage</w:t>
+            </w:r>
+          </w:p>
+        </w:tc>
+        <w:tc>
+          <w:tcPr>
+            <w:tcW w:type="dxa" w:w="2700"/>
+            <w:tcBorders>
+              <w:top w:val="single" w:color="C9D4E0" w:sz="4"/>
+              <w:left w:val="single" w:color="C9D4E0" w:sz="4"/>
+              <w:bottom w:val="single" w:color="C9D4E0" w:sz="4"/>
+              <w:right w:val="single" w:color="C9D4E0" w:sz="4"/>
+            </w:tcBorders>
+            <w:shd w:fill="EEF2F7" w:color="auto" w:val="clear"/>
+            <w:tcMar>
+              <w:top w:type="dxa" w:w="70"/>
+              <w:left w:type="dxa" w:w="110"/>
+              <w:bottom w:type="dxa" w:w="70"/>
+              <w:right w:type="dxa" w:w="110"/>
+            </w:tcMar>
+          </w:tcPr>
+          <w:p>
+            <w:pPr>
+              <w:spacing w:after="30"/>
+            </w:pPr>
+            <w:r>
+              <w:rPr>
+                <w:rFonts w:ascii="Calibri" w:cs="Calibri" w:eastAsia="Calibri" w:hAnsi="Calibri"/>
+                <w:color w:val="222B36"/>
+                <w:sz w:val="19"/>
+                <w:szCs w:val="19"/>
+              </w:rPr>
+              <w:t xml:space="preserve">Le véhicule est fondu dans le fond de la tuile au lieu d'être posé dessus</w:t>
+            </w:r>
+          </w:p>
+        </w:tc>
+        <w:tc>
+          <w:tcPr>
+            <w:tcW w:type="dxa" w:w="3360"/>
+            <w:tcBorders>
+              <w:top w:val="single" w:color="C9D4E0" w:sz="4"/>
+              <w:left w:val="single" w:color="C9D4E0" w:sz="4"/>
+              <w:bottom w:val="single" w:color="C9D4E0" w:sz="4"/>
+              <w:right w:val="single" w:color="C9D4E0" w:sz="4"/>
+            </w:tcBorders>
+            <w:shd w:fill="EEF2F7" w:color="auto" w:val="clear"/>
+            <w:tcMar>
+              <w:top w:type="dxa" w:w="70"/>
+              <w:left w:type="dxa" w:w="110"/>
+              <w:bottom w:type="dxa" w:w="70"/>
+              <w:right w:type="dxa" w:w="110"/>
+            </w:tcMar>
+          </w:tcPr>
+          <w:p>
+            <w:pPr>
+              <w:spacing w:after="30"/>
+            </w:pPr>
+            <w:r>
+              <w:rPr>
+                <w:rFonts w:ascii="Calibri" w:cs="Calibri" w:eastAsia="Calibri" w:hAnsi="Calibri"/>
+                <w:color w:val="222B36"/>
+                <w:sz w:val="19"/>
+                <w:szCs w:val="19"/>
+              </w:rPr>
+              <w:t xml:space="preserve">Envoyer une photo détourée (PNG ou WEBP à fond transparent), qui reçoit une ombre au sol</w:t>
+            </w:r>
+          </w:p>
+        </w:tc>
+      </w:tr>
+      <w:tr>
+        <w:trPr>
+          <w:cantSplit/>
+        </w:trPr>
+        <w:tc>
+          <w:tcPr>
+            <w:tcW w:type="dxa" w:w="3300"/>
+            <w:tcBorders>
+              <w:top w:val="single" w:color="C9D4E0" w:sz="4"/>
+              <w:left w:val="single" w:color="C9D4E0" w:sz="4"/>
+              <w:bottom w:val="single" w:color="C9D4E0" w:sz="4"/>
+              <w:right w:val="single" w:color="C9D4E0" w:sz="4"/>
+            </w:tcBorders>
+            <w:tcMar>
+              <w:top w:type="dxa" w:w="70"/>
+              <w:left w:type="dxa" w:w="110"/>
+              <w:bottom w:type="dxa" w:w="70"/>
+              <w:right w:type="dxa" w:w="110"/>
+            </w:tcMar>
+          </w:tcPr>
+          <w:p>
+            <w:pPr>
+              <w:spacing w:after="30"/>
+            </w:pPr>
+            <w:r>
+              <w:rPr>
+                <w:rFonts w:ascii="Calibri" w:cs="Calibri" w:eastAsia="Calibri" w:hAnsi="Calibri"/>
+                <w:color w:val="222B36"/>
+                <w:sz w:val="19"/>
+                <w:szCs w:val="19"/>
+              </w:rPr>
+              <w:t xml:space="preserve">Logo vectorisé à partir d'une image</w:t>
+            </w:r>
+          </w:p>
+        </w:tc>
+        <w:tc>
+          <w:tcPr>
+            <w:tcW w:type="dxa" w:w="2700"/>
+            <w:tcBorders>
+              <w:top w:val="single" w:color="C9D4E0" w:sz="4"/>
+              <w:left w:val="single" w:color="C9D4E0" w:sz="4"/>
+              <w:bottom w:val="single" w:color="C9D4E0" w:sz="4"/>
+              <w:right w:val="single" w:color="C9D4E0" w:sz="4"/>
+            </w:tcBorders>
+            <w:tcMar>
+              <w:top w:type="dxa" w:w="70"/>
+              <w:left w:type="dxa" w:w="110"/>
+              <w:bottom w:type="dxa" w:w="70"/>
+              <w:right w:type="dxa" w:w="110"/>
+            </w:tcMar>
+          </w:tcPr>
+          <w:p>
+            <w:pPr>
+              <w:spacing w:after="30"/>
+            </w:pPr>
+            <w:r>
+              <w:rPr>
+                <w:rFonts w:ascii="Calibri" w:cs="Calibri" w:eastAsia="Calibri" w:hAnsi="Calibri"/>
+                <w:color w:val="222B36"/>
+                <w:sz w:val="19"/>
+                <w:szCs w:val="19"/>
+              </w:rPr>
+              <w:t xml:space="preserve">Contours très légèrement différents de l'original</w:t>
+            </w:r>
+          </w:p>
+        </w:tc>
+        <w:tc>
+          <w:tcPr>
+            <w:tcW w:type="dxa" w:w="3360"/>
+            <w:tcBorders>
+              <w:top w:val="single" w:color="C9D4E0" w:sz="4"/>
+              <w:left w:val="single" w:color="C9D4E0" w:sz="4"/>
+              <w:bottom w:val="single" w:color="C9D4E0" w:sz="4"/>
+              <w:right w:val="single" w:color="C9D4E0" w:sz="4"/>
+            </w:tcBorders>
+            <w:tcMar>
+              <w:top w:type="dxa" w:w="70"/>
+              <w:left w:type="dxa" w:w="110"/>
+              <w:bottom w:type="dxa" w:w="70"/>
+              <w:right w:type="dxa" w:w="110"/>
+            </w:tcMar>
+          </w:tcPr>
+          <w:p>
+            <w:pPr>
+              <w:spacing w:after="30"/>
+            </w:pPr>
+            <w:r>
+              <w:rPr>
+                <w:rFonts w:ascii="Calibri" w:cs="Calibri" w:eastAsia="Calibri" w:hAnsi="Calibri"/>
+                <w:color w:val="222B36"/>
+                <w:sz w:val="19"/>
+                <w:szCs w:val="19"/>
+              </w:rPr>
+              <w:t xml:space="preserve">Fournir le fichier d'origine (Illustrator, SVG) et le charger dans Images du site, rubrique Menu et marque</w:t>
+            </w:r>
+          </w:p>
+        </w:tc>
+      </w:tr>
+      <w:tr>
+        <w:trPr>
+          <w:cantSplit/>
+        </w:trPr>
+        <w:tc>
+          <w:tcPr>
+            <w:tcW w:type="dxa" w:w="3300"/>
+            <w:tcBorders>
+              <w:top w:val="single" w:color="C9D4E0" w:sz="4"/>
+              <w:left w:val="single" w:color="C9D4E0" w:sz="4"/>
+              <w:bottom w:val="single" w:color="C9D4E0" w:sz="4"/>
+              <w:right w:val="single" w:color="C9D4E0" w:sz="4"/>
+            </w:tcBorders>
+            <w:shd w:fill="EEF2F7" w:color="auto" w:val="clear"/>
+            <w:tcMar>
+              <w:top w:type="dxa" w:w="70"/>
+              <w:left w:type="dxa" w:w="110"/>
+              <w:bottom w:type="dxa" w:w="70"/>
+              <w:right w:type="dxa" w:w="110"/>
+            </w:tcMar>
+          </w:tcPr>
+          <w:p>
+            <w:pPr>
+              <w:spacing w:after="30"/>
+            </w:pPr>
+            <w:r>
+              <w:rPr>
+                <w:rFonts w:ascii="Calibri" w:cs="Calibri" w:eastAsia="Calibri" w:hAnsi="Calibri"/>
+                <w:color w:val="222B36"/>
+                <w:sz w:val="19"/>
+                <w:szCs w:val="19"/>
+              </w:rPr>
               <w:t xml:space="preserve">Emails non configurés</w:t>
             </w:r>
           </w:p>
@@ -25104,7 +26398,7 @@
                 <w:sz w:val="19"/>
                 <w:szCs w:val="19"/>
               </w:rPr>
-              <w:t xml:space="preserve">Migration</w:t>
+              <w:t xml:space="preserve">Emplacement d'image</w:t>
             </w:r>
           </w:p>
         </w:tc>
@@ -25135,7 +26429,7 @@
                 <w:sz w:val="19"/>
                 <w:szCs w:val="19"/>
               </w:rPr>
-              <w:t xml:space="preserve">Mise à jour de la base de données appliquée une seule fois</w:t>
+              <w:t xml:space="preserve">Place du site où s'affiche une image (photo d'en-tête, bandeau final, logo…) ; chacun a une image par défaut et se remplace dans l'administration</w:t>
             </w:r>
           </w:p>
         </w:tc>
@@ -25172,7 +26466,7 @@
                 <w:sz w:val="19"/>
                 <w:szCs w:val="19"/>
               </w:rPr>
-              <w:t xml:space="preserve">Sprint</w:t>
+              <w:t xml:space="preserve">Migration</w:t>
             </w:r>
           </w:p>
         </w:tc>
@@ -25204,7 +26498,7 @@
                 <w:sz w:val="19"/>
                 <w:szCs w:val="19"/>
               </w:rPr>
-              <w:t xml:space="preserve">Période de travail Scrum au bout de laquelle une partie du site est livrée</w:t>
+              <w:t xml:space="preserve">Mise à jour de la base de données appliquée une seule fois</w:t>
             </w:r>
           </w:p>
         </w:tc>
@@ -25240,7 +26534,7 @@
                 <w:sz w:val="19"/>
                 <w:szCs w:val="19"/>
               </w:rPr>
-              <w:t xml:space="preserve">Backlog</w:t>
+              <w:t xml:space="preserve">Sprint</w:t>
             </w:r>
           </w:p>
         </w:tc>
@@ -25271,7 +26565,7 @@
                 <w:sz w:val="19"/>
                 <w:szCs w:val="19"/>
               </w:rPr>
-              <w:t xml:space="preserve">Liste priorisée de tout ce qui doit être réalisé</w:t>
+              <w:t xml:space="preserve">Période de travail Scrum au bout de laquelle une partie du site est livrée</w:t>
             </w:r>
           </w:p>
         </w:tc>
@@ -25308,7 +26602,7 @@
                 <w:sz w:val="19"/>
                 <w:szCs w:val="19"/>
               </w:rPr>
-              <w:t xml:space="preserve">CRUD</w:t>
+              <w:t xml:space="preserve">Backlog</w:t>
             </w:r>
           </w:p>
         </w:tc>
@@ -25340,7 +26634,7 @@
                 <w:sz w:val="19"/>
                 <w:szCs w:val="19"/>
               </w:rPr>
-              <w:t xml:space="preserve">Créer, lire, modifier, supprimer : les quatre actions de gestion d'un contenu</w:t>
+              <w:t xml:space="preserve">Liste priorisée de tout ce qui doit être réalisé</w:t>
             </w:r>
           </w:p>
         </w:tc>
@@ -25376,7 +26670,7 @@
                 <w:sz w:val="19"/>
                 <w:szCs w:val="19"/>
               </w:rPr>
-              <w:t xml:space="preserve">SEO</w:t>
+              <w:t xml:space="preserve">CRUD</w:t>
             </w:r>
           </w:p>
         </w:tc>
@@ -25407,7 +26701,7 @@
                 <w:sz w:val="19"/>
                 <w:szCs w:val="19"/>
               </w:rPr>
-              <w:t xml:space="preserve">Référencement naturel : être bien placé dans les moteurs de recherche</w:t>
+              <w:t xml:space="preserve">Créer, lire, modifier, supprimer : les quatre actions de gestion d'un contenu</w:t>
             </w:r>
           </w:p>
         </w:tc>
@@ -25444,7 +26738,7 @@
                 <w:sz w:val="19"/>
                 <w:szCs w:val="19"/>
               </w:rPr>
-              <w:t xml:space="preserve">hreflang</w:t>
+              <w:t xml:space="preserve">SEO</w:t>
             </w:r>
           </w:p>
         </w:tc>
@@ -25476,7 +26770,7 @@
                 <w:sz w:val="19"/>
                 <w:szCs w:val="19"/>
               </w:rPr>
-              <w:t xml:space="preserve">Balise qui indique aux moteurs de recherche les versions d'une page dans d'autres langues</w:t>
+              <w:t xml:space="preserve">Référencement naturel : être bien placé dans les moteurs de recherche</w:t>
             </w:r>
           </w:p>
         </w:tc>
@@ -25512,7 +26806,7 @@
                 <w:sz w:val="19"/>
                 <w:szCs w:val="19"/>
               </w:rPr>
-              <w:t xml:space="preserve">SMTP</w:t>
+              <w:t xml:space="preserve">hreflang</w:t>
             </w:r>
           </w:p>
         </w:tc>
@@ -25543,7 +26837,7 @@
                 <w:sz w:val="19"/>
                 <w:szCs w:val="19"/>
               </w:rPr>
-              <w:t xml:space="preserve">Protocole d'envoi d'emails</w:t>
+              <w:t xml:space="preserve">Balise qui indique aux moteurs de recherche les versions d'une page dans d'autres langues</w:t>
             </w:r>
           </w:p>
         </w:tc>
@@ -25580,7 +26874,7 @@
                 <w:sz w:val="19"/>
                 <w:szCs w:val="19"/>
               </w:rPr>
-              <w:t xml:space="preserve">SVG</w:t>
+              <w:t xml:space="preserve">SMTP</w:t>
             </w:r>
           </w:p>
         </w:tc>
@@ -25612,7 +26906,7 @@
                 <w:sz w:val="19"/>
                 <w:szCs w:val="19"/>
               </w:rPr>
-              <w:t xml:space="preserve">Format d'image vectorielle, net à toutes les tailles</w:t>
+              <w:t xml:space="preserve">Protocole d'envoi d'emails</w:t>
             </w:r>
           </w:p>
         </w:tc>
@@ -25648,6 +26942,74 @@
                 <w:sz w:val="19"/>
                 <w:szCs w:val="19"/>
               </w:rPr>
+              <w:t xml:space="preserve">SVG</w:t>
+            </w:r>
+          </w:p>
+        </w:tc>
+        <w:tc>
+          <w:tcPr>
+            <w:tcW w:type="dxa" w:w="6760"/>
+            <w:tcBorders>
+              <w:top w:val="single" w:color="C9D4E0" w:sz="4"/>
+              <w:left w:val="single" w:color="C9D4E0" w:sz="4"/>
+              <w:bottom w:val="single" w:color="C9D4E0" w:sz="4"/>
+              <w:right w:val="single" w:color="C9D4E0" w:sz="4"/>
+            </w:tcBorders>
+            <w:tcMar>
+              <w:top w:type="dxa" w:w="70"/>
+              <w:left w:type="dxa" w:w="110"/>
+              <w:bottom w:type="dxa" w:w="70"/>
+              <w:right w:type="dxa" w:w="110"/>
+            </w:tcMar>
+          </w:tcPr>
+          <w:p>
+            <w:pPr>
+              <w:spacing w:after="30"/>
+            </w:pPr>
+            <w:r>
+              <w:rPr>
+                <w:rFonts w:ascii="Calibri" w:cs="Calibri" w:eastAsia="Calibri" w:hAnsi="Calibri"/>
+                <w:color w:val="222B36"/>
+                <w:sz w:val="19"/>
+                <w:szCs w:val="19"/>
+              </w:rPr>
+              <w:t xml:space="preserve">Format d'image vectorielle, net à toutes les tailles</w:t>
+            </w:r>
+          </w:p>
+        </w:tc>
+      </w:tr>
+      <w:tr>
+        <w:trPr>
+          <w:cantSplit/>
+        </w:trPr>
+        <w:tc>
+          <w:tcPr>
+            <w:tcW w:type="dxa" w:w="2600"/>
+            <w:tcBorders>
+              <w:top w:val="single" w:color="C9D4E0" w:sz="4"/>
+              <w:left w:val="single" w:color="C9D4E0" w:sz="4"/>
+              <w:bottom w:val="single" w:color="C9D4E0" w:sz="4"/>
+              <w:right w:val="single" w:color="C9D4E0" w:sz="4"/>
+            </w:tcBorders>
+            <w:shd w:fill="EEF2F7" w:color="auto" w:val="clear"/>
+            <w:tcMar>
+              <w:top w:type="dxa" w:w="70"/>
+              <w:left w:type="dxa" w:w="110"/>
+              <w:bottom w:type="dxa" w:w="70"/>
+              <w:right w:type="dxa" w:w="110"/>
+            </w:tcMar>
+          </w:tcPr>
+          <w:p>
+            <w:pPr>
+              <w:spacing w:after="30"/>
+            </w:pPr>
+            <w:r>
+              <w:rPr>
+                <w:rFonts w:ascii="Calibri" w:cs="Calibri" w:eastAsia="Calibri" w:hAnsi="Calibri"/>
+                <w:color w:val="222B36"/>
+                <w:sz w:val="19"/>
+                <w:szCs w:val="19"/>
+              </w:rPr>
               <w:t xml:space="preserve">Tonga soa / Misaotra</w:t>
             </w:r>
           </w:p>
@@ -25661,6 +27023,7 @@
               <w:bottom w:val="single" w:color="C9D4E0" w:sz="4"/>
               <w:right w:val="single" w:color="C9D4E0" w:sz="4"/>
             </w:tcBorders>
+            <w:shd w:fill="EEF2F7" w:color="auto" w:val="clear"/>
             <w:tcMar>
               <w:top w:type="dxa" w:w="70"/>
               <w:left w:type="dxa" w:w="110"/>

</xml_diff>

<commit_message>
Cahier des charges v2.6 et documents : chiffres cles de l'accueil (7j/7, 100%, 24/7), lien GitHub gingerrhr-ui
- Cahier des charges : lien GitHub mis a jour, exigence EF-02, page de garde sans version ni date
- Wireframes, DESIGN, BACKLOG, ESTIMATION-CHECKLIST mis a jour

Co-Authored-By: Claude Sonnet 5.5 <noreply@anthropic.com>
</commit_message>
<xml_diff>
--- a/docs/CAHIER-DES-CHARGES.docx
+++ b/docs/CAHIER-DES-CHARGES.docx
@@ -66,55 +66,6 @@
           <w:szCs w:val="24"/>
         </w:rPr>
         <w:t xml:space="preserve">Executive &amp; Private Mobility, Madagascar</w:t>
-      </w:r>
-    </w:p>
-    <w:p>
-      <w:pPr>
-        <w:spacing w:before="2600"/>
-      </w:pPr>
-      <w:r>
-        <w:rPr>
-          <w:rFonts w:ascii="Calibri" w:cs="Calibri" w:eastAsia="Calibri" w:hAnsi="Calibri"/>
-          <w:b/>
-          <w:bCs/>
-          <w:color w:val="222B36"/>
-          <w:sz w:val="21"/>
-          <w:szCs w:val="21"/>
-        </w:rPr>
-        <w:t xml:space="preserve">Version 2.4</w:t>
-      </w:r>
-    </w:p>
-    <w:p>
-      <w:r>
-        <w:rPr>
-          <w:rFonts w:ascii="Calibri" w:cs="Calibri" w:eastAsia="Calibri" w:hAnsi="Calibri"/>
-          <w:color w:val="222B36"/>
-          <w:sz w:val="21"/>
-          <w:szCs w:val="21"/>
-        </w:rPr>
-        <w:t xml:space="preserve">Date : 22 octobre 2026</w:t>
-      </w:r>
-    </w:p>
-    <w:p>
-      <w:r>
-        <w:rPr>
-          <w:rFonts w:ascii="Calibri" w:cs="Calibri" w:eastAsia="Calibri" w:hAnsi="Calibri"/>
-          <w:color w:val="222B36"/>
-          <w:sz w:val="21"/>
-          <w:szCs w:val="21"/>
-        </w:rPr>
-        <w:t xml:space="preserve">Site en ligne : https://ts-exclusive.vercel.app</w:t>
-      </w:r>
-    </w:p>
-    <w:p>
-      <w:r>
-        <w:rPr>
-          <w:rFonts w:ascii="Calibri" w:cs="Calibri" w:eastAsia="Calibri" w:hAnsi="Calibri"/>
-          <w:color w:val="222B36"/>
-          <w:sz w:val="21"/>
-          <w:szCs w:val="21"/>
-        </w:rPr>
-        <w:t xml:space="preserve">Code source : https://github.com/djibril-mamitiana/ts-exclusive</w:t>
       </w:r>
     </w:p>
     <w:p>
@@ -738,6 +689,205 @@
                 <w:szCs w:val="19"/>
               </w:rPr>
               <w:t xml:space="preserve">Version initiale : périmètre, pages, exigences, charte, planning, recette</w:t>
+            </w:r>
+          </w:p>
+        </w:tc>
+      </w:tr>
+      <w:tr>
+        <w:trPr>
+          <w:cantSplit/>
+        </w:trPr>
+        <w:tc>
+          <w:tcPr>
+            <w:tcW w:type="dxa" w:w="1100"/>
+            <w:tcBorders>
+              <w:top w:val="single" w:color="C9D4E0" w:sz="4"/>
+              <w:left w:val="single" w:color="C9D4E0" w:sz="4"/>
+              <w:bottom w:val="single" w:color="C9D4E0" w:sz="4"/>
+              <w:right w:val="single" w:color="C9D4E0" w:sz="4"/>
+            </w:tcBorders>
+            <w:shd w:fill="EEF2F7" w:color="auto" w:val="clear"/>
+            <w:tcMar>
+              <w:top w:type="dxa" w:w="70"/>
+              <w:left w:type="dxa" w:w="110"/>
+              <w:bottom w:type="dxa" w:w="70"/>
+              <w:right w:type="dxa" w:w="110"/>
+            </w:tcMar>
+          </w:tcPr>
+          <w:p>
+            <w:pPr>
+              <w:spacing w:after="30"/>
+            </w:pPr>
+            <w:r>
+              <w:rPr>
+                <w:rFonts w:ascii="Calibri" w:cs="Calibri" w:eastAsia="Calibri" w:hAnsi="Calibri"/>
+                <w:color w:val="222B36"/>
+                <w:sz w:val="19"/>
+                <w:szCs w:val="19"/>
+              </w:rPr>
+              <w:t xml:space="preserve">2.6</w:t>
+            </w:r>
+          </w:p>
+        </w:tc>
+        <w:tc>
+          <w:tcPr>
+            <w:tcW w:type="dxa" w:w="1900"/>
+            <w:tcBorders>
+              <w:top w:val="single" w:color="C9D4E0" w:sz="4"/>
+              <w:left w:val="single" w:color="C9D4E0" w:sz="4"/>
+              <w:bottom w:val="single" w:color="C9D4E0" w:sz="4"/>
+              <w:right w:val="single" w:color="C9D4E0" w:sz="4"/>
+            </w:tcBorders>
+            <w:shd w:fill="EEF2F7" w:color="auto" w:val="clear"/>
+            <w:tcMar>
+              <w:top w:type="dxa" w:w="70"/>
+              <w:left w:type="dxa" w:w="110"/>
+              <w:bottom w:type="dxa" w:w="70"/>
+              <w:right w:type="dxa" w:w="110"/>
+            </w:tcMar>
+          </w:tcPr>
+          <w:p>
+            <w:pPr>
+              <w:spacing w:after="30"/>
+            </w:pPr>
+            <w:r>
+              <w:rPr>
+                <w:rFonts w:ascii="Calibri" w:cs="Calibri" w:eastAsia="Calibri" w:hAnsi="Calibri"/>
+                <w:color w:val="222B36"/>
+                <w:sz w:val="19"/>
+                <w:szCs w:val="19"/>
+              </w:rPr>
+              <w:t xml:space="preserve">29 octobre 2026</w:t>
+            </w:r>
+          </w:p>
+        </w:tc>
+        <w:tc>
+          <w:tcPr>
+            <w:tcW w:type="dxa" w:w="6360"/>
+            <w:tcBorders>
+              <w:top w:val="single" w:color="C9D4E0" w:sz="4"/>
+              <w:left w:val="single" w:color="C9D4E0" w:sz="4"/>
+              <w:bottom w:val="single" w:color="C9D4E0" w:sz="4"/>
+              <w:right w:val="single" w:color="C9D4E0" w:sz="4"/>
+            </w:tcBorders>
+            <w:shd w:fill="EEF2F7" w:color="auto" w:val="clear"/>
+            <w:tcMar>
+              <w:top w:type="dxa" w:w="70"/>
+              <w:left w:type="dxa" w:w="110"/>
+              <w:bottom w:type="dxa" w:w="70"/>
+              <w:right w:type="dxa" w:w="110"/>
+            </w:tcMar>
+          </w:tcPr>
+          <w:p>
+            <w:pPr>
+              <w:spacing w:after="30"/>
+            </w:pPr>
+            <w:r>
+              <w:rPr>
+                <w:rFonts w:ascii="Calibri" w:cs="Calibri" w:eastAsia="Calibri" w:hAnsi="Calibri"/>
+                <w:color w:val="222B36"/>
+                <w:sz w:val="19"/>
+                <w:szCs w:val="19"/>
+              </w:rPr>
+              <w:t xml:space="preserve">Chiffres clés de l'accueil remplacés par trois chiffres fixes : 7j/7 (disponibilité de service), 100 % (accompagnement) et 24/7 (assistance), en français et en anglais. Page de garde sans version ni date, comme dans le fichier enregistré par le client : le tableau d'historique donne la version en cours.</w:t>
+            </w:r>
+          </w:p>
+        </w:tc>
+      </w:tr>
+      <w:tr>
+        <w:trPr>
+          <w:cantSplit/>
+        </w:trPr>
+        <w:tc>
+          <w:tcPr>
+            <w:tcW w:type="dxa" w:w="1100"/>
+            <w:tcBorders>
+              <w:top w:val="single" w:color="C9D4E0" w:sz="4"/>
+              <w:left w:val="single" w:color="C9D4E0" w:sz="4"/>
+              <w:bottom w:val="single" w:color="C9D4E0" w:sz="4"/>
+              <w:right w:val="single" w:color="C9D4E0" w:sz="4"/>
+            </w:tcBorders>
+            <w:tcMar>
+              <w:top w:type="dxa" w:w="70"/>
+              <w:left w:type="dxa" w:w="110"/>
+              <w:bottom w:type="dxa" w:w="70"/>
+              <w:right w:type="dxa" w:w="110"/>
+            </w:tcMar>
+          </w:tcPr>
+          <w:p>
+            <w:pPr>
+              <w:spacing w:after="30"/>
+            </w:pPr>
+            <w:r>
+              <w:rPr>
+                <w:rFonts w:ascii="Calibri" w:cs="Calibri" w:eastAsia="Calibri" w:hAnsi="Calibri"/>
+                <w:color w:val="222B36"/>
+                <w:sz w:val="19"/>
+                <w:szCs w:val="19"/>
+              </w:rPr>
+              <w:t xml:space="preserve">2.5</w:t>
+            </w:r>
+          </w:p>
+        </w:tc>
+        <w:tc>
+          <w:tcPr>
+            <w:tcW w:type="dxa" w:w="1900"/>
+            <w:tcBorders>
+              <w:top w:val="single" w:color="C9D4E0" w:sz="4"/>
+              <w:left w:val="single" w:color="C9D4E0" w:sz="4"/>
+              <w:bottom w:val="single" w:color="C9D4E0" w:sz="4"/>
+              <w:right w:val="single" w:color="C9D4E0" w:sz="4"/>
+            </w:tcBorders>
+            <w:tcMar>
+              <w:top w:type="dxa" w:w="70"/>
+              <w:left w:type="dxa" w:w="110"/>
+              <w:bottom w:type="dxa" w:w="70"/>
+              <w:right w:type="dxa" w:w="110"/>
+            </w:tcMar>
+          </w:tcPr>
+          <w:p>
+            <w:pPr>
+              <w:spacing w:after="30"/>
+            </w:pPr>
+            <w:r>
+              <w:rPr>
+                <w:rFonts w:ascii="Calibri" w:cs="Calibri" w:eastAsia="Calibri" w:hAnsi="Calibri"/>
+                <w:color w:val="222B36"/>
+                <w:sz w:val="19"/>
+                <w:szCs w:val="19"/>
+              </w:rPr>
+              <w:t xml:space="preserve">24 octobre 2026</w:t>
+            </w:r>
+          </w:p>
+        </w:tc>
+        <w:tc>
+          <w:tcPr>
+            <w:tcW w:type="dxa" w:w="6360"/>
+            <w:tcBorders>
+              <w:top w:val="single" w:color="C9D4E0" w:sz="4"/>
+              <w:left w:val="single" w:color="C9D4E0" w:sz="4"/>
+              <w:bottom w:val="single" w:color="C9D4E0" w:sz="4"/>
+              <w:right w:val="single" w:color="C9D4E0" w:sz="4"/>
+            </w:tcBorders>
+            <w:tcMar>
+              <w:top w:type="dxa" w:w="70"/>
+              <w:left w:type="dxa" w:w="110"/>
+              <w:bottom w:type="dxa" w:w="70"/>
+              <w:right w:type="dxa" w:w="110"/>
+            </w:tcMar>
+          </w:tcPr>
+          <w:p>
+            <w:pPr>
+              <w:spacing w:after="30"/>
+            </w:pPr>
+            <w:r>
+              <w:rPr>
+                <w:rFonts w:ascii="Calibri" w:cs="Calibri" w:eastAsia="Calibri" w:hAnsi="Calibri"/>
+                <w:color w:val="222B36"/>
+                <w:sz w:val="19"/>
+                <w:szCs w:val="19"/>
+              </w:rPr>
+              <w:t xml:space="preserve">Dépôt GitHub du projet : https://github.com/gingerrhr-ui/ts-exclusive (cahier des charges et documents). Documents du dossier docs mis à jour : architecture, backlog, suivi de l'estimation, identité visuelle, lisez-moi, et schémas de l'accueil (ordinateur et téléphone) refaits d'après le site actuel.</w:t>
             </w:r>
           </w:p>
         </w:tc>
@@ -8114,7 +8264,7 @@
                 <w:sz w:val="19"/>
                 <w:szCs w:val="19"/>
               </w:rPr>
-              <w:t xml:space="preserve">Hero plein écran avec photographie sombre d'une voiture de direction teintée marine, slogan à droite (« Au-delà du transport » en français, « Beyond Transportation » en anglais), onglet doré « Voir les offres », deux appels à l'action (devis, WhatsApp) et chiffres clés calculés à partir des données réelles (nombre de véhicules, capacité maximale, assistance 24/7, prix de départ affiché seulement s'il est renseigné).</w:t>
+              <w:t xml:space="preserve">Hero plein écran avec photographie sombre d'une voiture de direction teintée marine, slogan à droite (« Au-delà du transport » en français, « Beyond Transportation » en anglais), onglet doré « Voir les offres », deux appels à l'action (devis, WhatsApp) et trois chiffres clés fixes : 7j/7 disponibilité de service, 100 % accompagnement, 24/7 assistance (7/7 en anglais).</w:t>
             </w:r>
           </w:p>
         </w:tc>
@@ -15240,7 +15390,7 @@
                 <w:sz w:val="19"/>
                 <w:szCs w:val="19"/>
               </w:rPr>
-              <w:t xml:space="preserve">Dépôt GitHub : https://github.com/djibril-mamitiana/ts-exclusive</w:t>
+              <w:t xml:space="preserve">Dépôt GitHub : https://github.com/gingerrhr-ui/ts-exclusive</w:t>
             </w:r>
           </w:p>
         </w:tc>
@@ -19554,7 +19704,7 @@
           <w:sz w:val="26"/>
           <w:szCs w:val="26"/>
         </w:rPr>
-        <w:t xml:space="preserve">14.1 État d'avancement au 22 octobre 2026</w:t>
+        <w:t xml:space="preserve">14.1 État d'avancement au 24 octobre 2026</w:t>
       </w:r>
     </w:p>
     <w:tbl>
@@ -20222,6 +20372,142 @@
                 <w:szCs w:val="19"/>
               </w:rPr>
               <w:t xml:space="preserve">Page Tarifs sans « À partir de » ; véhicule de la tuile flotte remonté pour ne plus recouvrir son nom</w:t>
+            </w:r>
+          </w:p>
+        </w:tc>
+        <w:tc>
+          <w:tcPr>
+            <w:tcW w:type="dxa" w:w="2560"/>
+            <w:tcBorders>
+              <w:top w:val="single" w:color="C9D4E0" w:sz="4"/>
+              <w:left w:val="single" w:color="C9D4E0" w:sz="4"/>
+              <w:bottom w:val="single" w:color="C9D4E0" w:sz="4"/>
+              <w:right w:val="single" w:color="C9D4E0" w:sz="4"/>
+            </w:tcBorders>
+            <w:tcMar>
+              <w:top w:type="dxa" w:w="70"/>
+              <w:left w:type="dxa" w:w="110"/>
+              <w:bottom w:type="dxa" w:w="70"/>
+              <w:right w:type="dxa" w:w="110"/>
+            </w:tcMar>
+          </w:tcPr>
+          <w:p>
+            <w:pPr>
+              <w:spacing w:after="30"/>
+            </w:pPr>
+            <w:r>
+              <w:rPr>
+                <w:rFonts w:ascii="Calibri" w:cs="Calibri" w:eastAsia="Calibri" w:hAnsi="Calibri"/>
+                <w:color w:val="222B36"/>
+                <w:sz w:val="19"/>
+                <w:szCs w:val="19"/>
+              </w:rPr>
+              <w:t xml:space="preserve">Livrés et en ligne</w:t>
+            </w:r>
+          </w:p>
+        </w:tc>
+      </w:tr>
+      <w:tr>
+        <w:trPr>
+          <w:cantSplit/>
+        </w:trPr>
+        <w:tc>
+          <w:tcPr>
+            <w:tcW w:type="dxa" w:w="6800"/>
+            <w:tcBorders>
+              <w:top w:val="single" w:color="C9D4E0" w:sz="4"/>
+              <w:left w:val="single" w:color="C9D4E0" w:sz="4"/>
+              <w:bottom w:val="single" w:color="C9D4E0" w:sz="4"/>
+              <w:right w:val="single" w:color="C9D4E0" w:sz="4"/>
+            </w:tcBorders>
+            <w:shd w:fill="EEF2F7" w:color="auto" w:val="clear"/>
+            <w:tcMar>
+              <w:top w:type="dxa" w:w="70"/>
+              <w:left w:type="dxa" w:w="110"/>
+              <w:bottom w:type="dxa" w:w="70"/>
+              <w:right w:type="dxa" w:w="110"/>
+            </w:tcMar>
+          </w:tcPr>
+          <w:p>
+            <w:pPr>
+              <w:spacing w:after="30"/>
+            </w:pPr>
+            <w:r>
+              <w:rPr>
+                <w:rFonts w:ascii="Calibri" w:cs="Calibri" w:eastAsia="Calibri" w:hAnsi="Calibri"/>
+                <w:color w:val="222B36"/>
+                <w:sz w:val="19"/>
+                <w:szCs w:val="19"/>
+              </w:rPr>
+              <w:t xml:space="preserve">Documents du dossier docs (architecture, backlog, suivi de l'estimation, identité visuelle, wireframes de l'accueil, lisez-moi) mis à jour</w:t>
+            </w:r>
+          </w:p>
+        </w:tc>
+        <w:tc>
+          <w:tcPr>
+            <w:tcW w:type="dxa" w:w="2560"/>
+            <w:tcBorders>
+              <w:top w:val="single" w:color="C9D4E0" w:sz="4"/>
+              <w:left w:val="single" w:color="C9D4E0" w:sz="4"/>
+              <w:bottom w:val="single" w:color="C9D4E0" w:sz="4"/>
+              <w:right w:val="single" w:color="C9D4E0" w:sz="4"/>
+            </w:tcBorders>
+            <w:shd w:fill="EEF2F7" w:color="auto" w:val="clear"/>
+            <w:tcMar>
+              <w:top w:type="dxa" w:w="70"/>
+              <w:left w:type="dxa" w:w="110"/>
+              <w:bottom w:type="dxa" w:w="70"/>
+              <w:right w:type="dxa" w:w="110"/>
+            </w:tcMar>
+          </w:tcPr>
+          <w:p>
+            <w:pPr>
+              <w:spacing w:after="30"/>
+            </w:pPr>
+            <w:r>
+              <w:rPr>
+                <w:rFonts w:ascii="Calibri" w:cs="Calibri" w:eastAsia="Calibri" w:hAnsi="Calibri"/>
+                <w:color w:val="222B36"/>
+                <w:sz w:val="19"/>
+                <w:szCs w:val="19"/>
+              </w:rPr>
+              <w:t xml:space="preserve">Livrés</w:t>
+            </w:r>
+          </w:p>
+        </w:tc>
+      </w:tr>
+      <w:tr>
+        <w:trPr>
+          <w:cantSplit/>
+        </w:trPr>
+        <w:tc>
+          <w:tcPr>
+            <w:tcW w:type="dxa" w:w="6800"/>
+            <w:tcBorders>
+              <w:top w:val="single" w:color="C9D4E0" w:sz="4"/>
+              <w:left w:val="single" w:color="C9D4E0" w:sz="4"/>
+              <w:bottom w:val="single" w:color="C9D4E0" w:sz="4"/>
+              <w:right w:val="single" w:color="C9D4E0" w:sz="4"/>
+            </w:tcBorders>
+            <w:tcMar>
+              <w:top w:type="dxa" w:w="70"/>
+              <w:left w:type="dxa" w:w="110"/>
+              <w:bottom w:type="dxa" w:w="70"/>
+              <w:right w:type="dxa" w:w="110"/>
+            </w:tcMar>
+          </w:tcPr>
+          <w:p>
+            <w:pPr>
+              <w:spacing w:after="30"/>
+            </w:pPr>
+            <w:r>
+              <w:rPr>
+                <w:rFonts w:ascii="Calibri" w:cs="Calibri" w:eastAsia="Calibri" w:hAnsi="Calibri"/>
+                <w:color w:val="222B36"/>
+                <w:sz w:val="19"/>
+                <w:szCs w:val="19"/>
+              </w:rPr>
+              <w:t xml:space="preserve">Chiffres clés de l'accueil : 7j/7 disponibilité de service, 100 % accompagnement, 24/7 assistance</w:t>
             </w:r>
           </w:p>
         </w:tc>
@@ -20789,7 +21075,7 @@
           <w:sz w:val="21"/>
           <w:szCs w:val="21"/>
         </w:rPr>
-        <w:t xml:space="preserve">Code source complet sur GitHub, avec historique des modifications.</w:t>
+        <w:t xml:space="preserve">Code source complet sur GitHub (https://github.com/gingerrhr-ui/ts-exclusive), avec historique des modifications.</w:t>
       </w:r>
     </w:p>
     <w:p>
@@ -20846,7 +21132,7 @@
           <w:sz w:val="21"/>
           <w:szCs w:val="21"/>
         </w:rPr>
-        <w:t xml:space="preserve">Documentation : architecture, backlog, charte graphique, wireframes, suivi de l'estimation, ce cahier des charges, guide de démarrage.</w:t>
+        <w:t xml:space="preserve">Documentation : architecture, backlog, charte graphique, wireframes, suivi de l'estimation, ce cahier des charges, guide de démarrage ; documents du dossier docs mis à jour le 24 octobre 2026.</w:t>
       </w:r>
     </w:p>
     <w:p>

</xml_diff>